<commit_message>
palabras de negrita a normal
</commit_message>
<xml_diff>
--- a/2026-1_MODELO CONTENIDO PERFIL PIC2.docx
+++ b/2026-1_MODELO CONTENIDO PERFIL PIC2.docx
@@ -61,7 +61,7 @@
           <w:lang w:val="en-US"/>
         </w:rPr>
         <w:drawing>
-          <wp:inline distT="0" distB="0" distL="0" distR="0" wp14:anchorId="323F8FAD" wp14:editId="30FD8D19">
+          <wp:inline distT="0" distB="0" distL="0" distR="0" wp14:anchorId="323F8FAD" wp14:editId="55094AB6">
             <wp:extent cx="2004060" cy="2004060"/>
             <wp:effectExtent l="0" t="0" r="0" b="0"/>
             <wp:docPr id="1419612950" name="Imagen 11" descr="Logotipo&#10;&#10;Descripción generada automáticamente"/>
@@ -2781,27 +2781,7 @@
           <w:sz w:val="24"/>
           <w:szCs w:val="24"/>
         </w:rPr>
-        <w:t>(</w:t>
-      </w:r>
-      <w:proofErr w:type="spellStart"/>
-      <w:r>
-        <w:rPr>
-          <w:rFonts w:cs="Times New Roman"/>
-          <w:kern w:val="0"/>
-          <w:sz w:val="24"/>
-          <w:szCs w:val="24"/>
-        </w:rPr>
-        <w:t>Vuorimaa</w:t>
-      </w:r>
-      <w:proofErr w:type="spellEnd"/>
-      <w:r>
-        <w:rPr>
-          <w:rFonts w:cs="Times New Roman"/>
-          <w:kern w:val="0"/>
-          <w:sz w:val="24"/>
-          <w:szCs w:val="24"/>
-        </w:rPr>
-        <w:t xml:space="preserve"> et al., 2016)</w:t>
+        <w:t>(Vuorimaa et al., 2016)</w:t>
       </w:r>
       <w:r>
         <w:rPr>
@@ -3095,8 +3075,6 @@
       <w:r>
         <w:rPr>
           <w:rFonts w:ascii="Times New Roman" w:hAnsi="Times New Roman" w:cs="Times New Roman"/>
-          <w:b/>
-          <w:bCs/>
           <w:sz w:val="24"/>
           <w:szCs w:val="24"/>
         </w:rPr>
@@ -3105,8 +3083,6 @@
       <w:r>
         <w:rPr>
           <w:rFonts w:ascii="Times New Roman" w:hAnsi="Times New Roman" w:cs="Times New Roman"/>
-          <w:b/>
-          <w:bCs/>
           <w:sz w:val="24"/>
           <w:szCs w:val="24"/>
         </w:rPr>
@@ -3115,8 +3091,6 @@
       <w:r>
         <w:rPr>
           <w:rFonts w:ascii="Times New Roman" w:hAnsi="Times New Roman" w:cs="Times New Roman"/>
-          <w:b/>
-          <w:bCs/>
           <w:sz w:val="24"/>
           <w:szCs w:val="24"/>
         </w:rPr>
@@ -3125,8 +3099,6 @@
       <w:r>
         <w:rPr>
           <w:rFonts w:ascii="Times New Roman" w:hAnsi="Times New Roman" w:cs="Times New Roman"/>
-          <w:b/>
-          <w:bCs/>
           <w:kern w:val="0"/>
           <w:sz w:val="24"/>
           <w:szCs w:val="24"/>
@@ -3136,8 +3108,6 @@
       <w:r>
         <w:rPr>
           <w:rFonts w:ascii="Times New Roman" w:hAnsi="Times New Roman" w:cs="Times New Roman"/>
-          <w:b/>
-          <w:bCs/>
           <w:sz w:val="24"/>
           <w:szCs w:val="24"/>
         </w:rPr>
@@ -3146,8 +3116,6 @@
       <w:r>
         <w:rPr>
           <w:rFonts w:ascii="Times New Roman" w:hAnsi="Times New Roman" w:cs="Times New Roman"/>
-          <w:b/>
-          <w:bCs/>
           <w:sz w:val="24"/>
           <w:szCs w:val="24"/>
         </w:rPr>
@@ -3620,7 +3588,7 @@
     </w:p>
     <w:p>
       <w:pPr>
-        <w:spacing w:before="240" w:after="0" w:line="360" w:lineRule="auto"/>
+        <w:spacing w:before="240" w:line="360" w:lineRule="auto"/>
         <w:jc w:val="both"/>
         <w:rPr>
           <w:rFonts w:ascii="Times New Roman" w:hAnsi="Times New Roman" w:cs="Times New Roman"/>
@@ -3645,7 +3613,7 @@
     </w:p>
     <w:p>
       <w:pPr>
-        <w:spacing w:before="240" w:after="0" w:line="360" w:lineRule="auto"/>
+        <w:spacing w:before="240" w:line="360" w:lineRule="auto"/>
         <w:ind w:firstLine="708"/>
         <w:jc w:val="both"/>
         <w:rPr>
@@ -3667,7 +3635,7 @@
     </w:p>
     <w:p>
       <w:pPr>
-        <w:spacing w:after="0" w:line="360" w:lineRule="auto"/>
+        <w:spacing w:line="360" w:lineRule="auto"/>
         <w:jc w:val="both"/>
         <w:rPr>
           <w:rFonts w:ascii="Times New Roman" w:hAnsi="Times New Roman" w:cs="Times New Roman"/>
@@ -3678,11 +3646,7 @@
           <w:lang w:val="es-ES"/>
         </w:rPr>
       </w:pPr>
-    </w:p>
-    <w:p>
-      <w:pPr>
-        <w:spacing w:after="0" w:line="360" w:lineRule="auto"/>
-        <w:jc w:val="both"/>
+      <w:r>
         <w:rPr>
           <w:rFonts w:ascii="Times New Roman" w:hAnsi="Times New Roman" w:cs="Times New Roman"/>
           <w:b/>
@@ -3691,22 +3655,12 @@
           <w:szCs w:val="24"/>
           <w:lang w:val="es-ES"/>
         </w:rPr>
-      </w:pPr>
-      <w:r>
-        <w:rPr>
-          <w:rFonts w:ascii="Times New Roman" w:hAnsi="Times New Roman" w:cs="Times New Roman"/>
-          <w:b/>
-          <w:bCs/>
-          <w:sz w:val="24"/>
-          <w:szCs w:val="24"/>
-          <w:lang w:val="es-ES"/>
-        </w:rPr>
         <w:t>Ficha de análisis documental</w:t>
       </w:r>
     </w:p>
     <w:p>
       <w:pPr>
-        <w:spacing w:after="0" w:line="360" w:lineRule="auto"/>
+        <w:spacing w:line="360" w:lineRule="auto"/>
         <w:ind w:firstLine="708"/>
         <w:jc w:val="both"/>
         <w:rPr>
@@ -3728,7 +3682,7 @@
     </w:p>
     <w:p>
       <w:pPr>
-        <w:spacing w:after="0" w:line="360" w:lineRule="auto"/>
+        <w:spacing w:line="360" w:lineRule="auto"/>
         <w:jc w:val="both"/>
         <w:rPr>
           <w:rFonts w:ascii="Times New Roman" w:hAnsi="Times New Roman" w:cs="Times New Roman"/>
@@ -3753,7 +3707,7 @@
     </w:p>
     <w:p>
       <w:pPr>
-        <w:spacing w:after="0" w:line="360" w:lineRule="auto"/>
+        <w:spacing w:line="360" w:lineRule="auto"/>
         <w:ind w:firstLine="360"/>
         <w:jc w:val="both"/>
         <w:rPr>
@@ -7086,6 +7040,7 @@
         <w:rPr>
           <w:sz w:val="24"/>
           <w:szCs w:val="24"/>
+          <w:lang w:val="en-US"/>
         </w:rPr>
       </w:pPr>
       <w:r>
@@ -7123,151 +7078,15 @@
           <w:sz w:val="24"/>
           <w:szCs w:val="24"/>
         </w:rPr>
-        <w:t xml:space="preserve">Almeida, J. R., Gini, R., Roberto, G., </w:t>
-      </w:r>
-      <w:proofErr w:type="spellStart"/>
-      <w:r>
-        <w:rPr>
-          <w:sz w:val="24"/>
-          <w:szCs w:val="24"/>
-        </w:rPr>
-        <w:t>Rijnbeek</w:t>
-      </w:r>
-      <w:proofErr w:type="spellEnd"/>
-      <w:r>
-        <w:rPr>
-          <w:sz w:val="24"/>
-          <w:szCs w:val="24"/>
-        </w:rPr>
-        <w:t xml:space="preserve">, P., &amp; Oliveira, J. L. (2019). TASKA: A modular </w:t>
-      </w:r>
-      <w:proofErr w:type="spellStart"/>
-      <w:r>
-        <w:rPr>
-          <w:sz w:val="24"/>
-          <w:szCs w:val="24"/>
-        </w:rPr>
-        <w:t>task</w:t>
-      </w:r>
-      <w:proofErr w:type="spellEnd"/>
-      <w:r>
-        <w:rPr>
-          <w:sz w:val="24"/>
-          <w:szCs w:val="24"/>
-        </w:rPr>
-        <w:t xml:space="preserve"> </w:t>
-      </w:r>
-      <w:proofErr w:type="spellStart"/>
-      <w:r>
-        <w:rPr>
-          <w:sz w:val="24"/>
-          <w:szCs w:val="24"/>
-        </w:rPr>
-        <w:t>management</w:t>
-      </w:r>
-      <w:proofErr w:type="spellEnd"/>
-      <w:r>
-        <w:rPr>
-          <w:sz w:val="24"/>
-          <w:szCs w:val="24"/>
-        </w:rPr>
-        <w:t xml:space="preserve"> </w:t>
-      </w:r>
-      <w:proofErr w:type="spellStart"/>
-      <w:r>
-        <w:rPr>
-          <w:sz w:val="24"/>
-          <w:szCs w:val="24"/>
-        </w:rPr>
-        <w:t>system</w:t>
-      </w:r>
-      <w:proofErr w:type="spellEnd"/>
-      <w:r>
-        <w:rPr>
-          <w:sz w:val="24"/>
-          <w:szCs w:val="24"/>
-        </w:rPr>
-        <w:t xml:space="preserve"> </w:t>
-      </w:r>
-      <w:proofErr w:type="spellStart"/>
-      <w:r>
-        <w:rPr>
-          <w:sz w:val="24"/>
-          <w:szCs w:val="24"/>
-        </w:rPr>
-        <w:t>to</w:t>
-      </w:r>
-      <w:proofErr w:type="spellEnd"/>
-      <w:r>
-        <w:rPr>
-          <w:sz w:val="24"/>
-          <w:szCs w:val="24"/>
-        </w:rPr>
-        <w:t xml:space="preserve"> </w:t>
-      </w:r>
-      <w:proofErr w:type="spellStart"/>
-      <w:r>
-        <w:rPr>
-          <w:sz w:val="24"/>
-          <w:szCs w:val="24"/>
-        </w:rPr>
-        <w:t>support</w:t>
-      </w:r>
-      <w:proofErr w:type="spellEnd"/>
-      <w:r>
-        <w:rPr>
-          <w:sz w:val="24"/>
-          <w:szCs w:val="24"/>
-        </w:rPr>
-        <w:t xml:space="preserve"> </w:t>
-      </w:r>
-      <w:proofErr w:type="spellStart"/>
-      <w:r>
-        <w:rPr>
-          <w:sz w:val="24"/>
-          <w:szCs w:val="24"/>
-        </w:rPr>
-        <w:t>health</w:t>
-      </w:r>
-      <w:proofErr w:type="spellEnd"/>
-      <w:r>
-        <w:rPr>
-          <w:sz w:val="24"/>
-          <w:szCs w:val="24"/>
-        </w:rPr>
-        <w:t xml:space="preserve"> </w:t>
-      </w:r>
-      <w:proofErr w:type="spellStart"/>
-      <w:r>
-        <w:rPr>
-          <w:sz w:val="24"/>
-          <w:szCs w:val="24"/>
-        </w:rPr>
-        <w:t>research</w:t>
-      </w:r>
-      <w:proofErr w:type="spellEnd"/>
-      <w:r>
-        <w:rPr>
-          <w:sz w:val="24"/>
-          <w:szCs w:val="24"/>
-        </w:rPr>
-        <w:t xml:space="preserve"> </w:t>
-      </w:r>
-      <w:proofErr w:type="spellStart"/>
-      <w:r>
-        <w:rPr>
-          <w:sz w:val="24"/>
-          <w:szCs w:val="24"/>
-        </w:rPr>
-        <w:t>studies</w:t>
-      </w:r>
-      <w:proofErr w:type="spellEnd"/>
-      <w:r>
-        <w:rPr>
-          <w:sz w:val="24"/>
-          <w:szCs w:val="24"/>
-        </w:rPr>
-        <w:t xml:space="preserve">. </w:t>
+        <w:t xml:space="preserve">Almeida, J. R., Gini, R., Roberto, G., Rijnbeek, P., &amp; Oliveira, J. L. (2019). </w:t>
+      </w:r>
+      <w:r>
+        <w:rPr>
+          <w:sz w:val="24"/>
+          <w:szCs w:val="24"/>
+          <w:lang w:val="en-US"/>
+        </w:rPr>
+        <w:t xml:space="preserve">TASKA: A modular task management system to support health research studies. </w:t>
       </w:r>
       <w:r>
         <w:rPr>
@@ -7275,66 +7094,178 @@
           <w:iCs/>
           <w:sz w:val="24"/>
           <w:szCs w:val="24"/>
-        </w:rPr>
-        <w:t xml:space="preserve">BMC Medical </w:t>
-      </w:r>
-      <w:proofErr w:type="spellStart"/>
+          <w:lang w:val="en-US"/>
+        </w:rPr>
+        <w:t>BMC Medical Informatics and Decision Making</w:t>
+      </w:r>
+      <w:r>
+        <w:rPr>
+          <w:sz w:val="24"/>
+          <w:szCs w:val="24"/>
+          <w:lang w:val="en-US"/>
+        </w:rPr>
+        <w:t xml:space="preserve">, </w:t>
+      </w:r>
       <w:r>
         <w:rPr>
           <w:i/>
           <w:iCs/>
           <w:sz w:val="24"/>
           <w:szCs w:val="24"/>
-        </w:rPr>
-        <w:t>Informatics</w:t>
-      </w:r>
-      <w:proofErr w:type="spellEnd"/>
+          <w:lang w:val="en-US"/>
+        </w:rPr>
+        <w:t>19</w:t>
+      </w:r>
+      <w:r>
+        <w:rPr>
+          <w:sz w:val="24"/>
+          <w:szCs w:val="24"/>
+          <w:lang w:val="en-US"/>
+        </w:rPr>
+        <w:t>(1), 121. https://doi.org/10.1186/s12911-019-0844-6</w:t>
+      </w:r>
+    </w:p>
+    <w:p>
+      <w:pPr>
+        <w:pStyle w:val="Bibliografa"/>
+        <w:rPr>
+          <w:sz w:val="24"/>
+          <w:szCs w:val="24"/>
+          <w:lang w:val="en-US"/>
+        </w:rPr>
+      </w:pPr>
+      <w:r>
+        <w:rPr>
+          <w:sz w:val="24"/>
+          <w:szCs w:val="24"/>
+          <w:lang w:val="en-US"/>
+        </w:rPr>
+        <w:t xml:space="preserve">Kacmar, M. (2013). Implementation of Link-based DMS Supporting ISO 9001 QMS: Case Study. </w:t>
+      </w:r>
       <w:r>
         <w:rPr>
           <w:i/>
           <w:iCs/>
           <w:sz w:val="24"/>
           <w:szCs w:val="24"/>
-        </w:rPr>
-        <w:t xml:space="preserve"> and </w:t>
-      </w:r>
-      <w:proofErr w:type="spellStart"/>
+          <w:lang w:val="en-US"/>
+        </w:rPr>
+        <w:t>Quality Innovation Prosperity</w:t>
+      </w:r>
+      <w:r>
+        <w:rPr>
+          <w:sz w:val="24"/>
+          <w:szCs w:val="24"/>
+          <w:lang w:val="en-US"/>
+        </w:rPr>
+        <w:t xml:space="preserve">, </w:t>
+      </w:r>
       <w:r>
         <w:rPr>
           <w:i/>
           <w:iCs/>
           <w:sz w:val="24"/>
           <w:szCs w:val="24"/>
-        </w:rPr>
-        <w:t>Decision</w:t>
-      </w:r>
-      <w:proofErr w:type="spellEnd"/>
+          <w:lang w:val="en-US"/>
+        </w:rPr>
+        <w:t>17</w:t>
+      </w:r>
+      <w:r>
+        <w:rPr>
+          <w:sz w:val="24"/>
+          <w:szCs w:val="24"/>
+          <w:lang w:val="en-US"/>
+        </w:rPr>
+        <w:t>(2), 77–88. https://doi.org/10.12776/qip.v17i2.241</w:t>
+      </w:r>
+    </w:p>
+    <w:p>
+      <w:pPr>
+        <w:pStyle w:val="Bibliografa"/>
+        <w:rPr>
+          <w:sz w:val="24"/>
+          <w:szCs w:val="24"/>
+          <w:lang w:val="en-US"/>
+        </w:rPr>
+      </w:pPr>
+      <w:r>
+        <w:rPr>
+          <w:sz w:val="24"/>
+          <w:szCs w:val="24"/>
+          <w:lang w:val="en-US"/>
+        </w:rPr>
+        <w:t xml:space="preserve">Kuhn, D. R., Wallace, D. R., &amp; Gallo, A. M. (2004). Software fault interactions and implications for software testing. </w:t>
+      </w:r>
       <w:r>
         <w:rPr>
           <w:i/>
           <w:iCs/>
           <w:sz w:val="24"/>
           <w:szCs w:val="24"/>
-        </w:rPr>
-        <w:t xml:space="preserve"> </w:t>
-      </w:r>
-      <w:proofErr w:type="spellStart"/>
+          <w:lang w:val="en-US"/>
+        </w:rPr>
+        <w:t>IEEE Transactions on Software Engineering</w:t>
+      </w:r>
+      <w:r>
+        <w:rPr>
+          <w:sz w:val="24"/>
+          <w:szCs w:val="24"/>
+          <w:lang w:val="en-US"/>
+        </w:rPr>
+        <w:t xml:space="preserve">, </w:t>
+      </w:r>
       <w:r>
         <w:rPr>
           <w:i/>
           <w:iCs/>
           <w:sz w:val="24"/>
           <w:szCs w:val="24"/>
-        </w:rPr>
-        <w:t>Making</w:t>
+          <w:lang w:val="en-US"/>
+        </w:rPr>
+        <w:t>30</w:t>
+      </w:r>
+      <w:r>
+        <w:rPr>
+          <w:sz w:val="24"/>
+          <w:szCs w:val="24"/>
+          <w:lang w:val="en-US"/>
+        </w:rPr>
+        <w:t>(6), 418–421. https://doi.org/10.1109/TSE.2004.24</w:t>
+      </w:r>
+    </w:p>
+    <w:p>
+      <w:pPr>
+        <w:pStyle w:val="Bibliografa"/>
+        <w:rPr>
+          <w:sz w:val="24"/>
+          <w:szCs w:val="24"/>
+        </w:rPr>
+      </w:pPr>
+      <w:r>
+        <w:rPr>
+          <w:sz w:val="24"/>
+          <w:szCs w:val="24"/>
+          <w:lang w:val="en-US"/>
+        </w:rPr>
+        <w:t xml:space="preserve">Santana-Mancilla, P. C., Fajardo-Flores, S. B., Rodríguez-Ortiz, M. Á., Argenis Mondragón, E. Á., &amp; </w:t>
+      </w:r>
+      <w:proofErr w:type="spellStart"/>
+      <w:r>
+        <w:rPr>
+          <w:sz w:val="24"/>
+          <w:szCs w:val="24"/>
+          <w:lang w:val="en-US"/>
+        </w:rPr>
+        <w:t>Gaytán</w:t>
       </w:r>
       <w:proofErr w:type="spellEnd"/>
       <w:r>
         <w:rPr>
           <w:sz w:val="24"/>
           <w:szCs w:val="24"/>
-        </w:rPr>
-        <w:t xml:space="preserve">, </w:t>
+          <w:lang w:val="en-US"/>
+        </w:rPr>
+        <w:t xml:space="preserve">-Lugo, L. S. (2025). Beyond Navigation: Understanding Semantic Gaps in the Information Architecture of a University Portal. </w:t>
       </w:r>
       <w:r>
         <w:rPr>
@@ -7343,96 +7274,15 @@
           <w:sz w:val="24"/>
           <w:szCs w:val="24"/>
         </w:rPr>
-        <w:t>19</w:t>
-      </w:r>
-      <w:r>
-        <w:rPr>
-          <w:sz w:val="24"/>
-          <w:szCs w:val="24"/>
-        </w:rPr>
-        <w:t>(1), 121. https://doi.org/10.1186/s12911-019-0844-6</w:t>
-      </w:r>
-    </w:p>
-    <w:p>
-      <w:pPr>
-        <w:pStyle w:val="Bibliografa"/>
-        <w:rPr>
-          <w:sz w:val="24"/>
-          <w:szCs w:val="24"/>
-        </w:rPr>
-      </w:pPr>
-      <w:r>
-        <w:rPr>
-          <w:sz w:val="24"/>
-          <w:szCs w:val="24"/>
-        </w:rPr>
-        <w:t xml:space="preserve">Kacmar, M. (2013). </w:t>
-      </w:r>
-      <w:proofErr w:type="spellStart"/>
-      <w:r>
-        <w:rPr>
-          <w:sz w:val="24"/>
-          <w:szCs w:val="24"/>
-        </w:rPr>
-        <w:t>Implementation</w:t>
-      </w:r>
-      <w:proofErr w:type="spellEnd"/>
-      <w:r>
-        <w:rPr>
-          <w:sz w:val="24"/>
-          <w:szCs w:val="24"/>
-        </w:rPr>
-        <w:t xml:space="preserve"> </w:t>
-      </w:r>
-      <w:proofErr w:type="spellStart"/>
-      <w:r>
-        <w:rPr>
-          <w:sz w:val="24"/>
-          <w:szCs w:val="24"/>
-        </w:rPr>
-        <w:t>of</w:t>
-      </w:r>
-      <w:proofErr w:type="spellEnd"/>
-      <w:r>
-        <w:rPr>
-          <w:sz w:val="24"/>
-          <w:szCs w:val="24"/>
-        </w:rPr>
-        <w:t xml:space="preserve"> Link-</w:t>
-      </w:r>
-      <w:proofErr w:type="spellStart"/>
-      <w:r>
-        <w:rPr>
-          <w:sz w:val="24"/>
-          <w:szCs w:val="24"/>
-        </w:rPr>
-        <w:t>based</w:t>
-      </w:r>
-      <w:proofErr w:type="spellEnd"/>
-      <w:r>
-        <w:rPr>
-          <w:sz w:val="24"/>
-          <w:szCs w:val="24"/>
-        </w:rPr>
-        <w:t xml:space="preserve"> DMS </w:t>
-      </w:r>
-      <w:proofErr w:type="spellStart"/>
-      <w:r>
-        <w:rPr>
-          <w:sz w:val="24"/>
-          <w:szCs w:val="24"/>
-        </w:rPr>
-        <w:t>Supporting</w:t>
-      </w:r>
-      <w:proofErr w:type="spellEnd"/>
-      <w:r>
-        <w:rPr>
-          <w:sz w:val="24"/>
-          <w:szCs w:val="24"/>
-        </w:rPr>
-        <w:t xml:space="preserve"> ISO 9001 QMS: Case Study. </w:t>
-      </w:r>
-      <w:proofErr w:type="spellStart"/>
+        <w:t>Avances en Interacción Humano-Computadora</w:t>
+      </w:r>
+      <w:r>
+        <w:rPr>
+          <w:sz w:val="24"/>
+          <w:szCs w:val="24"/>
+        </w:rPr>
+        <w:t xml:space="preserve">, </w:t>
+      </w:r>
       <w:r>
         <w:rPr>
           <w:i/>
@@ -7440,495 +7290,41 @@
           <w:sz w:val="24"/>
           <w:szCs w:val="24"/>
         </w:rPr>
-        <w:t>Quality</w:t>
+        <w:t>10</w:t>
+      </w:r>
+      <w:r>
+        <w:rPr>
+          <w:sz w:val="24"/>
+          <w:szCs w:val="24"/>
+        </w:rPr>
+        <w:t>(1), 60–69. https://doi.org/10.47756/aihc.y10i1.203</w:t>
+      </w:r>
+    </w:p>
+    <w:p>
+      <w:pPr>
+        <w:pStyle w:val="Bibliografa"/>
+        <w:rPr>
+          <w:sz w:val="24"/>
+          <w:szCs w:val="24"/>
+        </w:rPr>
+      </w:pPr>
+      <w:proofErr w:type="spellStart"/>
+      <w:r>
+        <w:rPr>
+          <w:sz w:val="24"/>
+          <w:szCs w:val="24"/>
+          <w:lang w:val="en-US"/>
+        </w:rPr>
+        <w:t>Vuorimaa</w:t>
       </w:r>
       <w:proofErr w:type="spellEnd"/>
       <w:r>
         <w:rPr>
-          <w:i/>
-          <w:iCs/>
-          <w:sz w:val="24"/>
-          <w:szCs w:val="24"/>
-        </w:rPr>
-        <w:t xml:space="preserve"> </w:t>
-      </w:r>
-      <w:proofErr w:type="spellStart"/>
-      <w:r>
-        <w:rPr>
-          <w:i/>
-          <w:iCs/>
-          <w:sz w:val="24"/>
-          <w:szCs w:val="24"/>
-        </w:rPr>
-        <w:t>Innovation</w:t>
-      </w:r>
-      <w:proofErr w:type="spellEnd"/>
-      <w:r>
-        <w:rPr>
-          <w:i/>
-          <w:iCs/>
-          <w:sz w:val="24"/>
-          <w:szCs w:val="24"/>
-        </w:rPr>
-        <w:t xml:space="preserve"> Prosperity</w:t>
-      </w:r>
-      <w:r>
-        <w:rPr>
-          <w:sz w:val="24"/>
-          <w:szCs w:val="24"/>
-        </w:rPr>
-        <w:t xml:space="preserve">, </w:t>
-      </w:r>
-      <w:r>
-        <w:rPr>
-          <w:i/>
-          <w:iCs/>
-          <w:sz w:val="24"/>
-          <w:szCs w:val="24"/>
-        </w:rPr>
-        <w:t>17</w:t>
-      </w:r>
-      <w:r>
-        <w:rPr>
-          <w:sz w:val="24"/>
-          <w:szCs w:val="24"/>
-        </w:rPr>
-        <w:t>(2), 77–88. https://doi.org/10.12776/qip.v17i2.241</w:t>
-      </w:r>
-    </w:p>
-    <w:p>
-      <w:pPr>
-        <w:pStyle w:val="Bibliografa"/>
-        <w:rPr>
-          <w:sz w:val="24"/>
-          <w:szCs w:val="24"/>
-        </w:rPr>
-      </w:pPr>
-      <w:r>
-        <w:rPr>
-          <w:sz w:val="24"/>
-          <w:szCs w:val="24"/>
-        </w:rPr>
-        <w:t xml:space="preserve">Kuhn, D. R., Wallace, D. R., &amp; Gallo, A. M. (2004). Software </w:t>
-      </w:r>
-      <w:proofErr w:type="spellStart"/>
-      <w:r>
-        <w:rPr>
-          <w:sz w:val="24"/>
-          <w:szCs w:val="24"/>
-        </w:rPr>
-        <w:t>fault</w:t>
-      </w:r>
-      <w:proofErr w:type="spellEnd"/>
-      <w:r>
-        <w:rPr>
-          <w:sz w:val="24"/>
-          <w:szCs w:val="24"/>
-        </w:rPr>
-        <w:t xml:space="preserve"> </w:t>
-      </w:r>
-      <w:proofErr w:type="spellStart"/>
-      <w:r>
-        <w:rPr>
-          <w:sz w:val="24"/>
-          <w:szCs w:val="24"/>
-        </w:rPr>
-        <w:t>interactions</w:t>
-      </w:r>
-      <w:proofErr w:type="spellEnd"/>
-      <w:r>
-        <w:rPr>
-          <w:sz w:val="24"/>
-          <w:szCs w:val="24"/>
-        </w:rPr>
-        <w:t xml:space="preserve"> and </w:t>
-      </w:r>
-      <w:proofErr w:type="spellStart"/>
-      <w:r>
-        <w:rPr>
-          <w:sz w:val="24"/>
-          <w:szCs w:val="24"/>
-        </w:rPr>
-        <w:t>implications</w:t>
-      </w:r>
-      <w:proofErr w:type="spellEnd"/>
-      <w:r>
-        <w:rPr>
-          <w:sz w:val="24"/>
-          <w:szCs w:val="24"/>
-        </w:rPr>
-        <w:t xml:space="preserve"> </w:t>
-      </w:r>
-      <w:proofErr w:type="spellStart"/>
-      <w:r>
-        <w:rPr>
-          <w:sz w:val="24"/>
-          <w:szCs w:val="24"/>
-        </w:rPr>
-        <w:t>for</w:t>
-      </w:r>
-      <w:proofErr w:type="spellEnd"/>
-      <w:r>
-        <w:rPr>
-          <w:sz w:val="24"/>
-          <w:szCs w:val="24"/>
-        </w:rPr>
-        <w:t xml:space="preserve"> software </w:t>
-      </w:r>
-      <w:proofErr w:type="spellStart"/>
-      <w:r>
-        <w:rPr>
-          <w:sz w:val="24"/>
-          <w:szCs w:val="24"/>
-        </w:rPr>
-        <w:t>testing</w:t>
-      </w:r>
-      <w:proofErr w:type="spellEnd"/>
-      <w:r>
-        <w:rPr>
-          <w:sz w:val="24"/>
-          <w:szCs w:val="24"/>
-        </w:rPr>
-        <w:t xml:space="preserve">. </w:t>
-      </w:r>
-      <w:r>
-        <w:rPr>
-          <w:i/>
-          <w:iCs/>
-          <w:sz w:val="24"/>
-          <w:szCs w:val="24"/>
-        </w:rPr>
-        <w:t xml:space="preserve">IEEE </w:t>
-      </w:r>
-      <w:proofErr w:type="spellStart"/>
-      <w:r>
-        <w:rPr>
-          <w:i/>
-          <w:iCs/>
-          <w:sz w:val="24"/>
-          <w:szCs w:val="24"/>
-        </w:rPr>
-        <w:t>Transactions</w:t>
-      </w:r>
-      <w:proofErr w:type="spellEnd"/>
-      <w:r>
-        <w:rPr>
-          <w:i/>
-          <w:iCs/>
-          <w:sz w:val="24"/>
-          <w:szCs w:val="24"/>
-        </w:rPr>
-        <w:t xml:space="preserve"> </w:t>
-      </w:r>
-      <w:proofErr w:type="spellStart"/>
-      <w:r>
-        <w:rPr>
-          <w:i/>
-          <w:iCs/>
-          <w:sz w:val="24"/>
-          <w:szCs w:val="24"/>
-        </w:rPr>
-        <w:t>on</w:t>
-      </w:r>
-      <w:proofErr w:type="spellEnd"/>
-      <w:r>
-        <w:rPr>
-          <w:i/>
-          <w:iCs/>
-          <w:sz w:val="24"/>
-          <w:szCs w:val="24"/>
-        </w:rPr>
-        <w:t xml:space="preserve"> Software </w:t>
-      </w:r>
-      <w:proofErr w:type="spellStart"/>
-      <w:r>
-        <w:rPr>
-          <w:i/>
-          <w:iCs/>
-          <w:sz w:val="24"/>
-          <w:szCs w:val="24"/>
-        </w:rPr>
-        <w:t>Engineering</w:t>
-      </w:r>
-      <w:proofErr w:type="spellEnd"/>
-      <w:r>
-        <w:rPr>
-          <w:sz w:val="24"/>
-          <w:szCs w:val="24"/>
-        </w:rPr>
-        <w:t xml:space="preserve">, </w:t>
-      </w:r>
-      <w:r>
-        <w:rPr>
-          <w:i/>
-          <w:iCs/>
-          <w:sz w:val="24"/>
-          <w:szCs w:val="24"/>
-        </w:rPr>
-        <w:t>30</w:t>
-      </w:r>
-      <w:r>
-        <w:rPr>
-          <w:sz w:val="24"/>
-          <w:szCs w:val="24"/>
-        </w:rPr>
-        <w:t>(6), 418–421. https://doi.org/10.1109/TSE.2004.24</w:t>
-      </w:r>
-    </w:p>
-    <w:p>
-      <w:pPr>
-        <w:pStyle w:val="Bibliografa"/>
-        <w:rPr>
-          <w:sz w:val="24"/>
-          <w:szCs w:val="24"/>
-        </w:rPr>
-      </w:pPr>
-      <w:r>
-        <w:rPr>
-          <w:sz w:val="24"/>
-          <w:szCs w:val="24"/>
-        </w:rPr>
-        <w:t xml:space="preserve">Santana-Mancilla, P. C., Fajardo-Flores, S. B., Rodríguez-Ortiz, M. Á., Argenis Mondragón, E. Á., &amp; Gaytán-Lugo, L. S. (2025). </w:t>
-      </w:r>
-      <w:proofErr w:type="spellStart"/>
-      <w:r>
-        <w:rPr>
-          <w:sz w:val="24"/>
-          <w:szCs w:val="24"/>
-        </w:rPr>
-        <w:t>Beyond</w:t>
-      </w:r>
-      <w:proofErr w:type="spellEnd"/>
-      <w:r>
-        <w:rPr>
-          <w:sz w:val="24"/>
-          <w:szCs w:val="24"/>
-        </w:rPr>
-        <w:t xml:space="preserve"> </w:t>
-      </w:r>
-      <w:proofErr w:type="spellStart"/>
-      <w:r>
-        <w:rPr>
-          <w:sz w:val="24"/>
-          <w:szCs w:val="24"/>
-        </w:rPr>
-        <w:t>Navigation</w:t>
-      </w:r>
-      <w:proofErr w:type="spellEnd"/>
-      <w:r>
-        <w:rPr>
-          <w:sz w:val="24"/>
-          <w:szCs w:val="24"/>
-        </w:rPr>
-        <w:t xml:space="preserve">: </w:t>
-      </w:r>
-      <w:proofErr w:type="spellStart"/>
-      <w:r>
-        <w:rPr>
-          <w:sz w:val="24"/>
-          <w:szCs w:val="24"/>
-        </w:rPr>
-        <w:t>Understanding</w:t>
-      </w:r>
-      <w:proofErr w:type="spellEnd"/>
-      <w:r>
-        <w:rPr>
-          <w:sz w:val="24"/>
-          <w:szCs w:val="24"/>
-        </w:rPr>
-        <w:t xml:space="preserve"> </w:t>
-      </w:r>
-      <w:proofErr w:type="spellStart"/>
-      <w:r>
-        <w:rPr>
-          <w:sz w:val="24"/>
-          <w:szCs w:val="24"/>
-        </w:rPr>
-        <w:t>Semantic</w:t>
-      </w:r>
-      <w:proofErr w:type="spellEnd"/>
-      <w:r>
-        <w:rPr>
-          <w:sz w:val="24"/>
-          <w:szCs w:val="24"/>
-        </w:rPr>
-        <w:t xml:space="preserve"> Gaps in </w:t>
-      </w:r>
-      <w:proofErr w:type="spellStart"/>
-      <w:r>
-        <w:rPr>
-          <w:sz w:val="24"/>
-          <w:szCs w:val="24"/>
-        </w:rPr>
-        <w:t>the</w:t>
-      </w:r>
-      <w:proofErr w:type="spellEnd"/>
-      <w:r>
-        <w:rPr>
-          <w:sz w:val="24"/>
-          <w:szCs w:val="24"/>
-        </w:rPr>
-        <w:t xml:space="preserve"> </w:t>
-      </w:r>
-      <w:proofErr w:type="spellStart"/>
-      <w:r>
-        <w:rPr>
-          <w:sz w:val="24"/>
-          <w:szCs w:val="24"/>
-        </w:rPr>
-        <w:t>Information</w:t>
-      </w:r>
-      <w:proofErr w:type="spellEnd"/>
-      <w:r>
-        <w:rPr>
-          <w:sz w:val="24"/>
-          <w:szCs w:val="24"/>
-        </w:rPr>
-        <w:t xml:space="preserve"> </w:t>
-      </w:r>
-      <w:proofErr w:type="spellStart"/>
-      <w:r>
-        <w:rPr>
-          <w:sz w:val="24"/>
-          <w:szCs w:val="24"/>
-        </w:rPr>
-        <w:t>Architecture</w:t>
-      </w:r>
-      <w:proofErr w:type="spellEnd"/>
-      <w:r>
-        <w:rPr>
-          <w:sz w:val="24"/>
-          <w:szCs w:val="24"/>
-        </w:rPr>
-        <w:t xml:space="preserve"> </w:t>
-      </w:r>
-      <w:proofErr w:type="spellStart"/>
-      <w:r>
-        <w:rPr>
-          <w:sz w:val="24"/>
-          <w:szCs w:val="24"/>
-        </w:rPr>
-        <w:t>of</w:t>
-      </w:r>
-      <w:proofErr w:type="spellEnd"/>
-      <w:r>
-        <w:rPr>
-          <w:sz w:val="24"/>
-          <w:szCs w:val="24"/>
-        </w:rPr>
-        <w:t xml:space="preserve"> a University Portal. </w:t>
-      </w:r>
-      <w:r>
-        <w:rPr>
-          <w:i/>
-          <w:iCs/>
-          <w:sz w:val="24"/>
-          <w:szCs w:val="24"/>
-        </w:rPr>
-        <w:t>Avances en Interacción Humano-Computadora</w:t>
-      </w:r>
-      <w:r>
-        <w:rPr>
-          <w:sz w:val="24"/>
-          <w:szCs w:val="24"/>
-        </w:rPr>
-        <w:t xml:space="preserve">, </w:t>
-      </w:r>
-      <w:r>
-        <w:rPr>
-          <w:i/>
-          <w:iCs/>
-          <w:sz w:val="24"/>
-          <w:szCs w:val="24"/>
-        </w:rPr>
-        <w:t>10</w:t>
-      </w:r>
-      <w:r>
-        <w:rPr>
-          <w:sz w:val="24"/>
-          <w:szCs w:val="24"/>
-        </w:rPr>
-        <w:t>(1), 60–69. https://doi.org/10.47756/aihc.y10i1.203</w:t>
-      </w:r>
-    </w:p>
-    <w:p>
-      <w:pPr>
-        <w:pStyle w:val="Bibliografa"/>
-        <w:rPr>
-          <w:sz w:val="24"/>
-          <w:szCs w:val="24"/>
-        </w:rPr>
-      </w:pPr>
-      <w:r>
-        <w:rPr>
-          <w:sz w:val="24"/>
-          <w:szCs w:val="24"/>
-        </w:rPr>
-        <w:t xml:space="preserve">Vuorimaa, P., Laine, M., Litvinova, E., &amp; Shestakov, D. (2016). </w:t>
-      </w:r>
-      <w:proofErr w:type="spellStart"/>
-      <w:r>
-        <w:rPr>
-          <w:sz w:val="24"/>
-          <w:szCs w:val="24"/>
-        </w:rPr>
-        <w:t>Leveraging</w:t>
-      </w:r>
-      <w:proofErr w:type="spellEnd"/>
-      <w:r>
-        <w:rPr>
-          <w:sz w:val="24"/>
-          <w:szCs w:val="24"/>
-        </w:rPr>
-        <w:t xml:space="preserve"> declarative </w:t>
-      </w:r>
-      <w:proofErr w:type="spellStart"/>
-      <w:r>
-        <w:rPr>
-          <w:sz w:val="24"/>
-          <w:szCs w:val="24"/>
-        </w:rPr>
-        <w:t>languages</w:t>
-      </w:r>
-      <w:proofErr w:type="spellEnd"/>
-      <w:r>
-        <w:rPr>
-          <w:sz w:val="24"/>
-          <w:szCs w:val="24"/>
-        </w:rPr>
-        <w:t xml:space="preserve"> in web </w:t>
-      </w:r>
-      <w:proofErr w:type="spellStart"/>
-      <w:r>
-        <w:rPr>
-          <w:sz w:val="24"/>
-          <w:szCs w:val="24"/>
-        </w:rPr>
-        <w:t>application</w:t>
-      </w:r>
-      <w:proofErr w:type="spellEnd"/>
-      <w:r>
-        <w:rPr>
-          <w:sz w:val="24"/>
-          <w:szCs w:val="24"/>
-        </w:rPr>
-        <w:t xml:space="preserve"> </w:t>
-      </w:r>
-      <w:proofErr w:type="spellStart"/>
-      <w:r>
-        <w:rPr>
-          <w:sz w:val="24"/>
-          <w:szCs w:val="24"/>
-        </w:rPr>
-        <w:t>development</w:t>
-      </w:r>
-      <w:proofErr w:type="spellEnd"/>
-      <w:r>
-        <w:rPr>
-          <w:sz w:val="24"/>
-          <w:szCs w:val="24"/>
-        </w:rPr>
-        <w:t xml:space="preserve">. </w:t>
+          <w:sz w:val="24"/>
+          <w:szCs w:val="24"/>
+          <w:lang w:val="en-US"/>
+        </w:rPr>
+        <w:t xml:space="preserve">, P., Laine, M., Litvinova, E., &amp; Shestakov, D. (2016). Leveraging declarative languages in web application development. </w:t>
       </w:r>
       <w:r>
         <w:rPr>

</xml_diff>

<commit_message>
Cambio de Presupuesto y modificación estética
</commit_message>
<xml_diff>
--- a/2026-1_MODELO CONTENIDO PERFIL PIC2.docx
+++ b/2026-1_MODELO CONTENIDO PERFIL PIC2.docx
@@ -922,6 +922,7 @@
     <w:p>
       <w:pPr>
         <w:spacing w:after="0" w:line="360" w:lineRule="auto"/>
+        <w:ind w:firstLine="360"/>
         <w:rPr>
           <w:rFonts w:ascii="Times New Roman" w:hAnsi="Times New Roman" w:cs="Times New Roman"/>
           <w:sz w:val="24"/>
@@ -983,7 +984,7 @@
       <w:pPr>
         <w:pStyle w:val="isselectedend"/>
         <w:spacing w:line="360" w:lineRule="auto"/>
-        <w:ind w:firstLine="360"/>
+        <w:ind w:left="360" w:firstLine="360"/>
         <w:jc w:val="both"/>
       </w:pPr>
       <w:r>
@@ -1000,7 +1001,7 @@
       <w:pPr>
         <w:pStyle w:val="isselectedend"/>
         <w:spacing w:line="360" w:lineRule="auto"/>
-        <w:ind w:firstLine="360"/>
+        <w:ind w:left="360" w:firstLine="360"/>
         <w:jc w:val="both"/>
       </w:pPr>
       <w:r>
@@ -1053,7 +1054,7 @@
       <w:pPr>
         <w:pStyle w:val="isselectedend"/>
         <w:spacing w:line="360" w:lineRule="auto"/>
-        <w:ind w:firstLine="360"/>
+        <w:ind w:left="360" w:firstLine="360"/>
         <w:jc w:val="both"/>
       </w:pPr>
       <w:r>
@@ -1064,7 +1065,7 @@
       <w:pPr>
         <w:pStyle w:val="isselectedend"/>
         <w:spacing w:line="360" w:lineRule="auto"/>
-        <w:ind w:firstLine="360"/>
+        <w:ind w:left="360" w:firstLine="360"/>
         <w:jc w:val="both"/>
       </w:pPr>
       <w:r>
@@ -1081,7 +1082,7 @@
       <w:pPr>
         <w:pStyle w:val="NormalWeb"/>
         <w:spacing w:line="360" w:lineRule="auto"/>
-        <w:ind w:firstLine="360"/>
+        <w:ind w:left="360" w:firstLine="360"/>
         <w:jc w:val="both"/>
       </w:pPr>
       <w:r>
@@ -1298,7 +1299,7 @@
       <w:pPr>
         <w:pStyle w:val="isselectedend"/>
         <w:spacing w:line="360" w:lineRule="auto"/>
-        <w:ind w:firstLine="360"/>
+        <w:ind w:left="360" w:firstLine="360"/>
         <w:jc w:val="both"/>
       </w:pPr>
       <w:r>
@@ -1342,7 +1343,7 @@
       <w:pPr>
         <w:pStyle w:val="isselectedend"/>
         <w:spacing w:line="360" w:lineRule="auto"/>
-        <w:ind w:firstLine="360"/>
+        <w:ind w:left="360" w:firstLine="360"/>
         <w:jc w:val="both"/>
       </w:pPr>
       <w:r>
@@ -1355,17 +1356,17 @@
         <w:t xml:space="preserve">informática de gestión documental de proyectos </w:t>
       </w:r>
       <w:r>
-        <w:t>contribuirá a optimizar el control y la organización de la información generada durante el desarrollo de los trabajos académico</w:t>
+        <w:t xml:space="preserve">contribuirá a optimizar el control y la organización de </w:t>
+      </w:r>
+      <w:r>
+        <w:lastRenderedPageBreak/>
+        <w:t>la información generada durante el desarrollo de los trabajos académico</w:t>
       </w:r>
       <w:r>
         <w:t>s</w:t>
       </w:r>
       <w:r>
-        <w:t xml:space="preserve">, permitirá registrar </w:t>
-      </w:r>
-      <w:r>
-        <w:lastRenderedPageBreak/>
-        <w:t>observaciones, gestionar documentación y mantener un seguimiento de los estados y avances de cada trabajo, favoreciendo un control más estructurado de las actividades realizadas durante su ejecución.</w:t>
+        <w:t>, permitirá registrar observaciones, gestionar documentación y mantener un seguimiento de los estados y avances de cada trabajo, favoreciendo un control más estructurado de las actividades realizadas durante su ejecución.</w:t>
       </w:r>
       <w:r>
         <w:t xml:space="preserve"> L</w:t>
@@ -1378,22 +1379,17 @@
       <w:pPr>
         <w:pStyle w:val="isselectedend"/>
         <w:spacing w:line="360" w:lineRule="auto"/>
-        <w:ind w:firstLine="360"/>
+        <w:ind w:left="360" w:firstLine="360"/>
         <w:jc w:val="both"/>
       </w:pPr>
       <w:r>
         <w:t xml:space="preserve">Como complemento a las funciones de seguimiento y gestión documental, la incorporación de un repositorio digital facilitará la consulta de trabajos finalizados y de la documentación asociada a estos. </w:t>
       </w:r>
-    </w:p>
-    <w:p>
-      <w:pPr>
-        <w:pStyle w:val="NormalWeb"/>
-        <w:spacing w:line="360" w:lineRule="auto"/>
-        <w:ind w:firstLine="360"/>
-        <w:jc w:val="both"/>
-      </w:pPr>
-      <w:r>
-        <w:t xml:space="preserve">Finalmente, el desarrollo de esta plataforma permitirá aplicar conocimientos relacionados con el diseño de sistemas, bases de datos y gestión de información digital, constituyéndose en una solución alineada con las necesidades de la Carrera de Desarrollo de Software del Instituto Superior Tecnológico “El Libertador”. </w:t>
+      <w:r>
+        <w:t>E</w:t>
+      </w:r>
+      <w:r>
+        <w:t xml:space="preserve">l desarrollo de esta plataforma permitirá aplicar conocimientos relacionados con el diseño de sistemas, bases de datos y gestión de información digital, constituyéndose en una solución alineada con las necesidades de la Carrera de Desarrollo de Software del Instituto Superior Tecnológico “El Libertador”. </w:t>
       </w:r>
     </w:p>
     <w:p>
@@ -1429,7 +1425,7 @@
     <w:p>
       <w:pPr>
         <w:spacing w:before="240" w:after="0" w:line="360" w:lineRule="auto"/>
-        <w:ind w:firstLine="360"/>
+        <w:ind w:left="360" w:firstLine="360"/>
         <w:jc w:val="both"/>
         <w:rPr>
           <w:rFonts w:ascii="Times New Roman" w:hAnsi="Times New Roman" w:cs="Times New Roman"/>
@@ -1452,7 +1448,7 @@
       <w:pPr>
         <w:pStyle w:val="isselectedend"/>
         <w:spacing w:line="360" w:lineRule="auto"/>
-        <w:ind w:firstLine="360"/>
+        <w:ind w:left="360" w:firstLine="360"/>
         <w:jc w:val="both"/>
       </w:pPr>
       <w:r>
@@ -1516,10 +1512,11 @@
       <w:pPr>
         <w:pStyle w:val="isselectedend"/>
         <w:spacing w:line="360" w:lineRule="auto"/>
-        <w:ind w:firstLine="360"/>
+        <w:ind w:left="360" w:firstLine="360"/>
         <w:jc w:val="both"/>
       </w:pPr>
       <w:r>
+        <w:lastRenderedPageBreak/>
         <w:t>Para continuar tenemos</w:t>
       </w:r>
       <w:r>
@@ -1532,11 +1529,7 @@
         <w:t>”,</w:t>
       </w:r>
       <w:r>
-        <w:t xml:space="preserve"> de los </w:t>
-      </w:r>
-      <w:r>
-        <w:lastRenderedPageBreak/>
-        <w:t xml:space="preserve">autores </w:t>
+        <w:t xml:space="preserve"> de los autores </w:t>
       </w:r>
       <w:sdt>
         <w:sdtPr>
@@ -1580,7 +1573,18 @@
         <w:t xml:space="preserve"> mejorar la organización y administración de la información institucional, obteniendo una valoración favorable por parte de los usuarios.</w:t>
       </w:r>
       <w:r>
-        <w:t xml:space="preserve"> Tenemos también</w:t>
+        <w:t xml:space="preserve"> </w:t>
+      </w:r>
+    </w:p>
+    <w:p>
+      <w:pPr>
+        <w:pStyle w:val="isselectedend"/>
+        <w:spacing w:line="360" w:lineRule="auto"/>
+        <w:ind w:left="360" w:firstLine="360"/>
+        <w:jc w:val="both"/>
+      </w:pPr>
+      <w:r>
+        <w:t>Tenemos también</w:t>
       </w:r>
       <w:r>
         <w:t xml:space="preserve"> </w:t>
@@ -1637,7 +1641,7 @@
       <w:pPr>
         <w:pStyle w:val="NormalWeb"/>
         <w:spacing w:line="360" w:lineRule="auto"/>
-        <w:ind w:firstLine="360"/>
+        <w:ind w:left="360" w:firstLine="360"/>
         <w:jc w:val="both"/>
       </w:pPr>
       <w:r>
@@ -1726,7 +1730,7 @@
     <w:p>
       <w:pPr>
         <w:spacing w:before="240" w:after="0" w:line="360" w:lineRule="auto"/>
-        <w:ind w:firstLine="708"/>
+        <w:ind w:left="708" w:firstLine="708"/>
         <w:jc w:val="both"/>
         <w:rPr>
           <w:rFonts w:ascii="Times New Roman" w:hAnsi="Times New Roman" w:cs="Times New Roman"/>
@@ -1748,7 +1752,7 @@
     <w:p>
       <w:pPr>
         <w:spacing w:before="240" w:after="0" w:line="360" w:lineRule="auto"/>
-        <w:ind w:firstLine="708"/>
+        <w:ind w:left="708" w:firstLine="708"/>
         <w:jc w:val="both"/>
         <w:rPr>
           <w:rFonts w:ascii="Times New Roman" w:hAnsi="Times New Roman" w:cs="Times New Roman"/>
@@ -1818,7 +1822,7 @@
           <w:szCs w:val="24"/>
           <w:lang w:val="es-ES"/>
         </w:rPr>
-        <w:t xml:space="preserve">, "los portales universitarios funcionan como puntos de acceso primarios a los servicios académicos, administrativos y de comunicación" (p. 60). Esta idea permite comprender que una plataforma institucional no solo comunica información, sino que organiza el acceso a servicios y procesos que sostienen la vida </w:t>
+        <w:t xml:space="preserve">, "los portales universitarios </w:t>
       </w:r>
       <w:r>
         <w:rPr>
@@ -1828,13 +1832,13 @@
           <w:lang w:val="es-ES"/>
         </w:rPr>
         <w:lastRenderedPageBreak/>
-        <w:t>académica. Por ello, su diseño debe responder a necesidades reales de navegación, gestión, consulta y seguimiento.</w:t>
+        <w:t>funcionan como puntos de acceso primarios a los servicios académicos, administrativos y de comunicación" (p. 60). Esta idea permite comprender que una plataforma institucional no solo comunica información, sino que organiza el acceso a servicios y procesos que sostienen la vida académica. Por ello, su diseño debe responder a necesidades reales de navegación, gestión, consulta y seguimiento.</w:t>
       </w:r>
     </w:p>
     <w:p>
       <w:pPr>
         <w:spacing w:before="240" w:after="0" w:line="360" w:lineRule="auto"/>
-        <w:ind w:firstLine="708"/>
+        <w:ind w:left="708" w:firstLine="708"/>
         <w:jc w:val="both"/>
         <w:rPr>
           <w:rFonts w:ascii="Times New Roman" w:hAnsi="Times New Roman" w:cs="Times New Roman"/>
@@ -1856,7 +1860,7 @@
     <w:p>
       <w:pPr>
         <w:spacing w:before="240" w:after="0" w:line="360" w:lineRule="auto"/>
-        <w:ind w:firstLine="708"/>
+        <w:ind w:left="708" w:firstLine="708"/>
         <w:jc w:val="both"/>
         <w:rPr>
           <w:rFonts w:ascii="Times New Roman" w:hAnsi="Times New Roman" w:cs="Times New Roman"/>
@@ -1878,7 +1882,7 @@
     <w:p>
       <w:pPr>
         <w:spacing w:before="240" w:after="0" w:line="360" w:lineRule="auto"/>
-        <w:ind w:firstLine="708"/>
+        <w:ind w:left="708" w:firstLine="708"/>
         <w:jc w:val="both"/>
         <w:rPr>
           <w:rFonts w:ascii="Times New Roman" w:hAnsi="Times New Roman" w:cs="Times New Roman"/>
@@ -1900,6 +1904,7 @@
     <w:p>
       <w:pPr>
         <w:spacing w:before="240" w:after="0" w:line="360" w:lineRule="auto"/>
+        <w:ind w:left="708"/>
         <w:jc w:val="both"/>
         <w:rPr>
           <w:rFonts w:ascii="Times New Roman" w:hAnsi="Times New Roman" w:cs="Times New Roman"/>
@@ -1915,8 +1920,327 @@
           <w:szCs w:val="24"/>
           <w:lang w:val="es-ES"/>
         </w:rPr>
+        <w:lastRenderedPageBreak/>
         <w:tab/>
-        <w:t xml:space="preserve">En consecuencia, una plataforma web institucional para proyectos académicos debe diseñarse como un ecosistema de servicios. No basta con almacenar archivos o mostrar listados: el sistema debe integrar navegación, gestión de usuarios, control documental, seguimiento de estados, notificaciones, historial de cambios y generación de reportes. Esta integración convierte la plataforma en un punto de convergencia entre gestión académica y gestión tecnológica, permitiendo que la carrera disponga de información oportuna para </w:t>
+        <w:t>En consecuencia, una plataforma web institucional para proyectos académicos debe diseñarse como un ecosistema de servicios. No basta con almacenar archivos o mostrar listados: el sistema debe integrar navegación, gestión de usuarios, control documental, seguimiento de estados, notificaciones, historial de cambios y generación de reportes. Esta integración convierte la plataforma en un punto de convergencia entre gestión académica y gestión tecnológica, permitiendo que la carrera disponga de información oportuna para tomar decisiones, detectar retrasos, identificar cuellos de botella y asegurar que los proyectos cumplan con los lineamientos establecidos.</w:t>
+      </w:r>
+    </w:p>
+    <w:p>
+      <w:pPr>
+        <w:pStyle w:val="tesis"/>
+        <w:rPr>
+          <w:sz w:val="24"/>
+          <w:szCs w:val="24"/>
+        </w:rPr>
+      </w:pPr>
+      <w:r>
+        <w:rPr>
+          <w:sz w:val="24"/>
+          <w:szCs w:val="24"/>
+        </w:rPr>
+        <w:t xml:space="preserve">      </w:t>
+      </w:r>
+      <w:r>
+        <w:rPr>
+          <w:sz w:val="24"/>
+          <w:szCs w:val="24"/>
+        </w:rPr>
+        <w:t>7.2 Gestión documental digital</w:t>
+      </w:r>
+      <w:r>
+        <w:rPr>
+          <w:sz w:val="24"/>
+          <w:szCs w:val="24"/>
+        </w:rPr>
+        <w:t>.</w:t>
+      </w:r>
+    </w:p>
+    <w:p>
+      <w:pPr>
+        <w:spacing w:before="240" w:after="0" w:line="360" w:lineRule="auto"/>
+        <w:ind w:left="708" w:firstLine="708"/>
+        <w:jc w:val="both"/>
+        <w:rPr>
+          <w:rFonts w:ascii="Times New Roman" w:hAnsi="Times New Roman" w:cs="Times New Roman"/>
+          <w:sz w:val="24"/>
+          <w:szCs w:val="24"/>
+          <w:lang w:val="es-ES"/>
+        </w:rPr>
+      </w:pPr>
+      <w:r>
+        <w:rPr>
+          <w:rFonts w:ascii="Times New Roman" w:hAnsi="Times New Roman" w:cs="Times New Roman"/>
+          <w:sz w:val="24"/>
+          <w:szCs w:val="24"/>
+          <w:lang w:val="es-ES"/>
+        </w:rPr>
+        <w:t>La gestión documental digital se refiere al conjunto de procesos, reglas y herramientas que permiten crear, almacenar, clasificar, revisar, aprobar, conservar y consultar documentos en medios electrónicos. En una plataforma académica, este componente resulta esencial porque los proyectos generan múltiples evidencias: anteproyectos, cronogramas, informes de avance, versiones revisadas, actas, rúbricas, observaciones, anexos y documentos finales. Si estos archivos se manejan sin estructura, el seguimiento se vuelve dependiente de la memoria de los actores y de canales informales.</w:t>
+      </w:r>
+    </w:p>
+    <w:p>
+      <w:pPr>
+        <w:spacing w:before="240" w:after="0" w:line="360" w:lineRule="auto"/>
+        <w:ind w:left="708" w:firstLine="708"/>
+        <w:jc w:val="both"/>
+        <w:rPr>
+          <w:rFonts w:ascii="Times New Roman" w:hAnsi="Times New Roman" w:cs="Times New Roman"/>
+          <w:sz w:val="24"/>
+          <w:szCs w:val="24"/>
+          <w:lang w:val="es-ES"/>
+        </w:rPr>
+      </w:pPr>
+      <w:r>
+        <w:rPr>
+          <w:rFonts w:ascii="Times New Roman" w:hAnsi="Times New Roman" w:cs="Times New Roman"/>
+          <w:sz w:val="24"/>
+          <w:szCs w:val="24"/>
+          <w:lang w:val="es-ES"/>
+        </w:rPr>
+        <w:t>Un sistema de gestión documental digital debe resolver problemas de disponibilidad, control y trazabilidad. La disponibilidad implica que los documentos puedan consultarse cuando se requieren y por quienes tienen autorización. El control se relaciona con la identificación de versiones vigentes, documentos obsoletos, responsables de revisión y fechas de actualización. La trazabilidad permite reconstruir el historial de un documento: quién lo subió, cuándo fue revisado, qué observaciones recibió y cuál fue su estado final.</w:t>
+      </w:r>
+    </w:p>
+    <w:p>
+      <w:pPr>
+        <w:spacing w:before="240" w:after="0" w:line="360" w:lineRule="auto"/>
+        <w:ind w:left="708" w:firstLine="708"/>
+        <w:jc w:val="both"/>
+        <w:rPr>
+          <w:rFonts w:ascii="Times New Roman" w:hAnsi="Times New Roman" w:cs="Times New Roman"/>
+          <w:sz w:val="24"/>
+          <w:szCs w:val="24"/>
+          <w:lang w:val="es-ES"/>
+        </w:rPr>
+      </w:pPr>
+      <w:r>
+        <w:rPr>
+          <w:rFonts w:ascii="Times New Roman" w:hAnsi="Times New Roman" w:cs="Times New Roman"/>
+          <w:sz w:val="24"/>
+          <w:szCs w:val="24"/>
+          <w:lang w:val="es-ES"/>
+        </w:rPr>
+        <w:t>La importancia de este componente se aprecia en el planteamiento de</w:t>
+      </w:r>
+      <w:r>
+        <w:rPr>
+          <w:rFonts w:ascii="Times New Roman" w:hAnsi="Times New Roman" w:cs="Times New Roman"/>
+          <w:sz w:val="24"/>
+          <w:szCs w:val="24"/>
+          <w:lang w:val="es-ES"/>
+        </w:rPr>
+        <w:fldChar w:fldCharType="begin"/>
+      </w:r>
+      <w:r>
+        <w:rPr>
+          <w:rFonts w:ascii="Times New Roman" w:hAnsi="Times New Roman" w:cs="Times New Roman"/>
+          <w:sz w:val="24"/>
+          <w:szCs w:val="24"/>
+          <w:lang w:val="es-ES"/>
+        </w:rPr>
+        <w:instrText xml:space="preserve"> ADDIN ZOTERO_ITEM CSL_CITATION {"citationID":"UFgHbCTk","properties":{"unsorted":false,"formattedCitation":"(Kacmar, 2013)","plainCitation":"(Kacmar, 2013)","noteIndex":0},"citationItems":[{"id":"0ccfRIuB/JWg93jao","uris":["http://zotero.org/users/local/3NWqkcVE/items/PM8I9BNC"],"itemData":{"id":138,"type":"article-journal","container-title":"Quality Innovation Prosperity","DOI":"10.12776/qip.v17i2.241","ISSN":"1338-984X, 1335-1745","issue":"2","journalAbbreviation":"QIP Journal","page":"77-88","source":"DOI.org (Crossref)","title":"Implementation of Link-based DMS Supporting ISO 9001 QMS: Case Study","title-short":"Implementation of Link-based DMS Supporting ISO 9001 QMS","volume":"17","author":[{"family":"Kacmar","given":"Marek"}],"issued":{"date-parts":[["2013",12,27]]}}}],"schema":"https://github.com/citation-style-language/schema/raw/master/csl-citation.json"} </w:instrText>
+      </w:r>
+      <w:r>
+        <w:rPr>
+          <w:rFonts w:ascii="Times New Roman" w:hAnsi="Times New Roman" w:cs="Times New Roman"/>
+          <w:sz w:val="24"/>
+          <w:szCs w:val="24"/>
+          <w:lang w:val="es-ES"/>
+        </w:rPr>
+        <w:fldChar w:fldCharType="separate"/>
+      </w:r>
+      <w:r>
+        <w:rPr>
+          <w:rFonts w:ascii="Times New Roman" w:hAnsi="Times New Roman" w:cs="Times New Roman"/>
+          <w:sz w:val="24"/>
+          <w:szCs w:val="24"/>
+        </w:rPr>
+        <w:t>(Kacmar, 2013)</w:t>
+      </w:r>
+      <w:r>
+        <w:rPr>
+          <w:rFonts w:ascii="Times New Roman" w:hAnsi="Times New Roman" w:cs="Times New Roman"/>
+          <w:sz w:val="24"/>
+          <w:szCs w:val="24"/>
+          <w:lang w:val="es-ES"/>
+        </w:rPr>
+        <w:fldChar w:fldCharType="end"/>
+      </w:r>
+      <w:r>
+        <w:rPr>
+          <w:rFonts w:ascii="Times New Roman" w:hAnsi="Times New Roman" w:cs="Times New Roman"/>
+          <w:sz w:val="24"/>
+          <w:szCs w:val="24"/>
+          <w:lang w:val="es-ES"/>
+        </w:rPr>
+        <w:t>, quien afirma que la gestión documental debe "</w:t>
+      </w:r>
+      <w:proofErr w:type="spellStart"/>
+      <w:r>
+        <w:rPr>
+          <w:rFonts w:ascii="Times New Roman" w:hAnsi="Times New Roman" w:cs="Times New Roman"/>
+          <w:sz w:val="24"/>
+          <w:szCs w:val="24"/>
+          <w:lang w:val="es-ES"/>
+        </w:rPr>
+        <w:t>ensure</w:t>
+      </w:r>
+      <w:proofErr w:type="spellEnd"/>
+      <w:r>
+        <w:rPr>
+          <w:rFonts w:ascii="Times New Roman" w:hAnsi="Times New Roman" w:cs="Times New Roman"/>
+          <w:sz w:val="24"/>
+          <w:szCs w:val="24"/>
+          <w:lang w:val="es-ES"/>
+        </w:rPr>
+        <w:t xml:space="preserve"> </w:t>
+      </w:r>
+      <w:proofErr w:type="spellStart"/>
+      <w:r>
+        <w:rPr>
+          <w:rFonts w:ascii="Times New Roman" w:hAnsi="Times New Roman" w:cs="Times New Roman"/>
+          <w:sz w:val="24"/>
+          <w:szCs w:val="24"/>
+          <w:lang w:val="es-ES"/>
+        </w:rPr>
+        <w:t>an</w:t>
+      </w:r>
+      <w:proofErr w:type="spellEnd"/>
+      <w:r>
+        <w:rPr>
+          <w:rFonts w:ascii="Times New Roman" w:hAnsi="Times New Roman" w:cs="Times New Roman"/>
+          <w:sz w:val="24"/>
+          <w:szCs w:val="24"/>
+          <w:lang w:val="es-ES"/>
+        </w:rPr>
+        <w:t xml:space="preserve"> </w:t>
+      </w:r>
+      <w:proofErr w:type="spellStart"/>
+      <w:r>
+        <w:rPr>
+          <w:rFonts w:ascii="Times New Roman" w:hAnsi="Times New Roman" w:cs="Times New Roman"/>
+          <w:sz w:val="24"/>
+          <w:szCs w:val="24"/>
+          <w:lang w:val="es-ES"/>
+        </w:rPr>
+        <w:t>effective</w:t>
+      </w:r>
+      <w:proofErr w:type="spellEnd"/>
+      <w:r>
+        <w:rPr>
+          <w:rFonts w:ascii="Times New Roman" w:hAnsi="Times New Roman" w:cs="Times New Roman"/>
+          <w:sz w:val="24"/>
+          <w:szCs w:val="24"/>
+          <w:lang w:val="es-ES"/>
+        </w:rPr>
+        <w:t xml:space="preserve"> and </w:t>
+      </w:r>
+      <w:proofErr w:type="spellStart"/>
+      <w:r>
+        <w:rPr>
+          <w:rFonts w:ascii="Times New Roman" w:hAnsi="Times New Roman" w:cs="Times New Roman"/>
+          <w:sz w:val="24"/>
+          <w:szCs w:val="24"/>
+          <w:lang w:val="es-ES"/>
+        </w:rPr>
+        <w:t>efficient</w:t>
+      </w:r>
+      <w:proofErr w:type="spellEnd"/>
+      <w:r>
+        <w:rPr>
+          <w:rFonts w:ascii="Times New Roman" w:hAnsi="Times New Roman" w:cs="Times New Roman"/>
+          <w:sz w:val="24"/>
+          <w:szCs w:val="24"/>
+          <w:lang w:val="es-ES"/>
+        </w:rPr>
+        <w:t xml:space="preserve"> </w:t>
+      </w:r>
+      <w:proofErr w:type="spellStart"/>
+      <w:r>
+        <w:rPr>
+          <w:rFonts w:ascii="Times New Roman" w:hAnsi="Times New Roman" w:cs="Times New Roman"/>
+          <w:sz w:val="24"/>
+          <w:szCs w:val="24"/>
+          <w:lang w:val="es-ES"/>
+        </w:rPr>
+        <w:t>application</w:t>
+      </w:r>
+      <w:proofErr w:type="spellEnd"/>
+      <w:r>
+        <w:rPr>
+          <w:rFonts w:ascii="Times New Roman" w:hAnsi="Times New Roman" w:cs="Times New Roman"/>
+          <w:sz w:val="24"/>
+          <w:szCs w:val="24"/>
+          <w:lang w:val="es-ES"/>
+        </w:rPr>
+        <w:t xml:space="preserve"> </w:t>
+      </w:r>
+      <w:proofErr w:type="spellStart"/>
+      <w:r>
+        <w:rPr>
+          <w:rFonts w:ascii="Times New Roman" w:hAnsi="Times New Roman" w:cs="Times New Roman"/>
+          <w:sz w:val="24"/>
+          <w:szCs w:val="24"/>
+          <w:lang w:val="es-ES"/>
+        </w:rPr>
+        <w:t>of</w:t>
+      </w:r>
+      <w:proofErr w:type="spellEnd"/>
+      <w:r>
+        <w:rPr>
+          <w:rFonts w:ascii="Times New Roman" w:hAnsi="Times New Roman" w:cs="Times New Roman"/>
+          <w:sz w:val="24"/>
+          <w:szCs w:val="24"/>
+          <w:lang w:val="es-ES"/>
+        </w:rPr>
+        <w:t xml:space="preserve"> </w:t>
+      </w:r>
+      <w:proofErr w:type="spellStart"/>
+      <w:r>
+        <w:rPr>
+          <w:rFonts w:ascii="Times New Roman" w:hAnsi="Times New Roman" w:cs="Times New Roman"/>
+          <w:sz w:val="24"/>
+          <w:szCs w:val="24"/>
+          <w:lang w:val="es-ES"/>
+        </w:rPr>
+        <w:t>the</w:t>
+      </w:r>
+      <w:proofErr w:type="spellEnd"/>
+      <w:r>
+        <w:rPr>
+          <w:rFonts w:ascii="Times New Roman" w:hAnsi="Times New Roman" w:cs="Times New Roman"/>
+          <w:sz w:val="24"/>
+          <w:szCs w:val="24"/>
+          <w:lang w:val="es-ES"/>
+        </w:rPr>
+        <w:t xml:space="preserve"> </w:t>
+      </w:r>
+      <w:proofErr w:type="spellStart"/>
+      <w:r>
+        <w:rPr>
+          <w:rFonts w:ascii="Times New Roman" w:hAnsi="Times New Roman" w:cs="Times New Roman"/>
+          <w:sz w:val="24"/>
+          <w:szCs w:val="24"/>
+          <w:lang w:val="es-ES"/>
+        </w:rPr>
+        <w:t>strategies</w:t>
+      </w:r>
+      <w:proofErr w:type="spellEnd"/>
+      <w:r>
+        <w:rPr>
+          <w:rFonts w:ascii="Times New Roman" w:hAnsi="Times New Roman" w:cs="Times New Roman"/>
+          <w:sz w:val="24"/>
+          <w:szCs w:val="24"/>
+          <w:lang w:val="es-ES"/>
+        </w:rPr>
+        <w:t>" (p. 78). En el contexto de proyectos académicos, esta eficiencia no se reduce al almacenamiento de archivos, sino que implica alinear los documentos con las reglas institucionales de entrega, revisión,</w:t>
+      </w:r>
+      <w:r>
+        <w:rPr>
+          <w:rFonts w:ascii="Times New Roman" w:hAnsi="Times New Roman" w:cs="Times New Roman"/>
+          <w:sz w:val="24"/>
+          <w:szCs w:val="24"/>
+          <w:lang w:val="es-ES"/>
+        </w:rPr>
+        <w:t xml:space="preserve"> </w:t>
       </w:r>
       <w:r>
         <w:rPr>
@@ -1926,7 +2250,73 @@
           <w:lang w:val="es-ES"/>
         </w:rPr>
         <w:lastRenderedPageBreak/>
-        <w:t>tomar decisiones, detectar retrasos, identificar cuellos de botella y asegurar que los proyectos cumplan con los lineamientos establecidos.</w:t>
+        <w:t>corrección y aprobación. De ese modo, cada documento se convierte en evidencia verificable del avance del proyecto.</w:t>
+      </w:r>
+    </w:p>
+    <w:p>
+      <w:pPr>
+        <w:spacing w:before="240" w:after="0" w:line="360" w:lineRule="auto"/>
+        <w:ind w:left="708" w:firstLine="708"/>
+        <w:jc w:val="both"/>
+        <w:rPr>
+          <w:rFonts w:ascii="Times New Roman" w:hAnsi="Times New Roman" w:cs="Times New Roman"/>
+          <w:sz w:val="24"/>
+          <w:szCs w:val="24"/>
+          <w:lang w:val="es-ES"/>
+        </w:rPr>
+      </w:pPr>
+      <w:r>
+        <w:rPr>
+          <w:rFonts w:ascii="Times New Roman" w:hAnsi="Times New Roman" w:cs="Times New Roman"/>
+          <w:sz w:val="24"/>
+          <w:szCs w:val="24"/>
+          <w:lang w:val="es-ES"/>
+        </w:rPr>
+        <w:t>Para proyectos académicos, la gestión documental no debe limitarse a un repositorio de archivos. Debe operar con reglas institucionales: formatos aceptados, estados de revisión, permisos por rol, validación de entregas y conservación de evidencias. Un estudiante puede cargar un avance, pero no debería modificar una versión ya revisada sin que el sistema registre una nueva versión. Un revisor puede emitir observaciones, pero no debería alterar el archivo original. La coordinación puede requerir reportes de documentos pendientes, rechazados, aprobados o vencidos. Estas funciones convierten el documento en una unidad gestionable dentro de un proceso académico.</w:t>
+      </w:r>
+    </w:p>
+    <w:p>
+      <w:pPr>
+        <w:spacing w:before="240" w:after="0" w:line="360" w:lineRule="auto"/>
+        <w:ind w:left="708" w:firstLine="708"/>
+        <w:jc w:val="both"/>
+        <w:rPr>
+          <w:rFonts w:ascii="Times New Roman" w:hAnsi="Times New Roman" w:cs="Times New Roman"/>
+          <w:sz w:val="24"/>
+          <w:szCs w:val="24"/>
+          <w:lang w:val="es-ES"/>
+        </w:rPr>
+      </w:pPr>
+      <w:r>
+        <w:rPr>
+          <w:rFonts w:ascii="Times New Roman" w:hAnsi="Times New Roman" w:cs="Times New Roman"/>
+          <w:sz w:val="24"/>
+          <w:szCs w:val="24"/>
+          <w:lang w:val="es-ES"/>
+        </w:rPr>
+        <w:t>La gestión documental digital también fortalece la calidad administrativa. Al centralizar los documentos, se reducen pérdidas de información, duplicidad de archivos, confusión entre versiones y retrasos por búsquedas manuales. Además, permite que la carrera establezca criterios uniformes para todos los proyectos, evitando que cada grupo maneje sus entregas con métodos diferentes. Esta estandarización es relevante en procesos de evaluación, acreditación o auditoría académica, donde la evidencia documental debe estar ordenada y disponible.</w:t>
+      </w:r>
+    </w:p>
+    <w:p>
+      <w:pPr>
+        <w:spacing w:before="240" w:after="0" w:line="360" w:lineRule="auto"/>
+        <w:ind w:left="708" w:firstLine="708"/>
+        <w:jc w:val="both"/>
+        <w:rPr>
+          <w:rFonts w:ascii="Times New Roman" w:hAnsi="Times New Roman" w:cs="Times New Roman"/>
+          <w:sz w:val="24"/>
+          <w:szCs w:val="24"/>
+          <w:lang w:val="es-ES"/>
+        </w:rPr>
+      </w:pPr>
+      <w:r>
+        <w:rPr>
+          <w:rFonts w:ascii="Times New Roman" w:hAnsi="Times New Roman" w:cs="Times New Roman"/>
+          <w:sz w:val="24"/>
+          <w:szCs w:val="24"/>
+          <w:lang w:val="es-ES"/>
+        </w:rPr>
+        <w:t>En el diseño de la plataforma, la gestión documental debe incluir al menos: carga segura de archivos, metadatos básicos, clasificación por proyecto, control de versiones, historial de revisión, permisos de acceso, comentarios u observaciones, estados documentales y mecanismos de descarga. Estos elementos permiten que la revisión académica sea transparente y que cada documento tenga una relación clara con el flujo de seguimiento del proyecto. Así, el sistema deja de ser un simple contenedor de archivos y se convierte en un soporte formal para la toma de decisiones académicas.</w:t>
       </w:r>
     </w:p>
     <w:p>
@@ -1942,14 +2332,14 @@
           <w:sz w:val="24"/>
           <w:szCs w:val="24"/>
         </w:rPr>
-        <w:t xml:space="preserve">      </w:t>
-      </w:r>
-      <w:r>
-        <w:rPr>
-          <w:sz w:val="24"/>
-          <w:szCs w:val="24"/>
-        </w:rPr>
-        <w:t>7.2 Gestión documental digital</w:t>
+        <w:t xml:space="preserve">       </w:t>
+      </w:r>
+      <w:r>
+        <w:rPr>
+          <w:sz w:val="24"/>
+          <w:szCs w:val="24"/>
+        </w:rPr>
+        <w:t>7.3 Seguimiento y control de proyectos académicos</w:t>
       </w:r>
       <w:r>
         <w:rPr>
@@ -1962,7 +2352,7 @@
     <w:p>
       <w:pPr>
         <w:spacing w:before="240" w:after="0" w:line="360" w:lineRule="auto"/>
-        <w:ind w:firstLine="708"/>
+        <w:ind w:left="708" w:firstLine="708"/>
         <w:jc w:val="both"/>
         <w:rPr>
           <w:rFonts w:ascii="Times New Roman" w:hAnsi="Times New Roman" w:cs="Times New Roman"/>
@@ -1978,13 +2368,23 @@
           <w:szCs w:val="24"/>
           <w:lang w:val="es-ES"/>
         </w:rPr>
-        <w:t>La gestión documental digital se refiere al conjunto de procesos, reglas y herramientas que permiten crear, almacenar, clasificar, revisar, aprobar, conservar y consultar documentos en medios electrónicos. En una plataforma académica, este componente resulta esencial porque los proyectos generan múltiples evidencias: anteproyectos, cronogramas, informes de avance, versiones revisadas, actas, rúbricas, observaciones, anexos y documentos finales. Si estos archivos se manejan sin estructura, el seguimiento se vuelve dependiente de la memoria de los actores y de canales informales.</w:t>
+        <w:t xml:space="preserve">El seguimiento y control de proyectos académicos consiste en observar, registrar, evaluar y orientar el avance de una propuesta formativa o investigativa desde su inicio hasta su cierre. En la carrera de Desarrollo de Software, este </w:t>
+      </w:r>
+      <w:r>
+        <w:rPr>
+          <w:rFonts w:ascii="Times New Roman" w:hAnsi="Times New Roman" w:cs="Times New Roman"/>
+          <w:sz w:val="24"/>
+          <w:szCs w:val="24"/>
+          <w:lang w:val="es-ES"/>
+        </w:rPr>
+        <w:lastRenderedPageBreak/>
+        <w:t>seguimiento es especialmente importante porque los proyectos suelen involucrar planificación, análisis, diseño, construcción, pruebas, documentación, revisión docente y entrega final. Sin una herramienta centralizada, el control puede fragmentarse entre mensajes, hojas de cálculo, actas dispersas y archivos sin historial.</w:t>
       </w:r>
     </w:p>
     <w:p>
       <w:pPr>
         <w:spacing w:before="240" w:after="0" w:line="360" w:lineRule="auto"/>
-        <w:ind w:firstLine="708"/>
+        <w:ind w:left="708" w:firstLine="708"/>
         <w:jc w:val="both"/>
         <w:rPr>
           <w:rFonts w:ascii="Times New Roman" w:hAnsi="Times New Roman" w:cs="Times New Roman"/>
@@ -2000,13 +2400,13 @@
           <w:szCs w:val="24"/>
           <w:lang w:val="es-ES"/>
         </w:rPr>
-        <w:t>Un sistema de gestión documental digital debe resolver problemas de disponibilidad, control y trazabilidad. La disponibilidad implica que los documentos puedan consultarse cuando se requieren y por quienes tienen autorización. El control se relaciona con la identificación de versiones vigentes, documentos obsoletos, responsables de revisión y fechas de actualización. La trazabilidad permite reconstruir el historial de un documento: quién lo subió, cuándo fue revisado, qué observaciones recibió y cuál fue su estado final.</w:t>
+        <w:t>Una plataforma institucional debe traducir el seguimiento académico en un flujo de trabajo claro. Cada proyecto puede avanzar por estados como registrado, asignado, en desarrollo, en revisión, observado, corregido, aprobado y finalizado. Estos estados permiten que los responsables conozcan la situación actual sin depender de consultas manuales. Además, facilitan la identificación de retrasos, entregas pendientes, revisiones no atendidas y proyectos que requieren intervención de coordinación.</w:t>
       </w:r>
     </w:p>
     <w:p>
       <w:pPr>
         <w:spacing w:before="240" w:after="0" w:line="360" w:lineRule="auto"/>
-        <w:ind w:firstLine="708"/>
+        <w:ind w:left="708" w:firstLine="708"/>
         <w:jc w:val="both"/>
         <w:rPr>
           <w:rFonts w:ascii="Times New Roman" w:hAnsi="Times New Roman" w:cs="Times New Roman"/>
@@ -2022,7 +2422,7 @@
           <w:szCs w:val="24"/>
           <w:lang w:val="es-ES"/>
         </w:rPr>
-        <w:t>La importancia de este componente se aprecia en el planteamiento de</w:t>
+        <w:t xml:space="preserve">La pertinencia de utilizar sistemas de gestión de tareas y flujos se sostiene en </w:t>
       </w:r>
       <w:r>
         <w:rPr>
@@ -2040,7 +2440,7 @@
           <w:szCs w:val="24"/>
           <w:lang w:val="es-ES"/>
         </w:rPr>
-        <w:instrText xml:space="preserve"> ADDIN ZOTERO_ITEM CSL_CITATION {"citationID":"UFgHbCTk","properties":{"unsorted":false,"formattedCitation":"(Kacmar, 2013)","plainCitation":"(Kacmar, 2013)","noteIndex":0},"citationItems":[{"id":"0ccfRIuB/JWg93jao","uris":["http://zotero.org/users/local/3NWqkcVE/items/PM8I9BNC"],"itemData":{"id":138,"type":"article-journal","container-title":"Quality Innovation Prosperity","DOI":"10.12776/qip.v17i2.241","ISSN":"1338-984X, 1335-1745","issue":"2","journalAbbreviation":"QIP Journal","page":"77-88","source":"DOI.org (Crossref)","title":"Implementation of Link-based DMS Supporting ISO 9001 QMS: Case Study","title-short":"Implementation of Link-based DMS Supporting ISO 9001 QMS","volume":"17","author":[{"family":"Kacmar","given":"Marek"}],"issued":{"date-parts":[["2013",12,27]]}}}],"schema":"https://github.com/citation-style-language/schema/raw/master/csl-citation.json"} </w:instrText>
+        <w:instrText xml:space="preserve"> ADDIN ZOTERO_ITEM CSL_CITATION {"citationID":"7B6ivRTx","properties":{"unsorted":false,"formattedCitation":"(Almeida et\\uc0\\u160{}al., 2019)","plainCitation":"(Almeida et al., 2019)","noteIndex":0},"citationItems":[{"id":"0ccfRIuB/BskDTAdb","uris":["http://zotero.org/users/local/3NWqkcVE/items/CVY6ZES7"],"itemData":{"id":139,"type":"article-journal","container-title":"BMC Medical Informatics and Decision Making","DOI":"10.1186/s12911-019-0844-6","ISSN":"1472-6947","issue":"1","journalAbbreviation":"BMC Med Inform Decis Mak","language":"en","page":"121","source":"DOI.org (Crossref)","title":"TASKA: A modular task management system to support health research studies","title-short":"TASKA","volume":"19","author":[{"family":"Almeida","given":"João Rafael"},{"family":"Gini","given":"Rosa"},{"family":"Roberto","given":"Giuseppe"},{"family":"Rijnbeek","given":"Peter"},{"family":"Oliveira","given":"José Luís"}],"issued":{"date-parts":[["2019",12]]}}}],"schema":"https://github.com/citation-style-language/schema/raw/master/csl-citation.json"} </w:instrText>
       </w:r>
       <w:r>
         <w:rPr>
@@ -2054,10 +2454,11 @@
       <w:r>
         <w:rPr>
           <w:rFonts w:ascii="Times New Roman" w:hAnsi="Times New Roman" w:cs="Times New Roman"/>
-          <w:sz w:val="24"/>
-          <w:szCs w:val="24"/>
-        </w:rPr>
-        <w:t>(Kacmar, 2013)</w:t>
+          <w:kern w:val="0"/>
+          <w:sz w:val="24"/>
+          <w:szCs w:val="24"/>
+        </w:rPr>
+        <w:t>(Almeida et al., 2019)</w:t>
       </w:r>
       <w:r>
         <w:rPr>
@@ -2075,7 +2476,7 @@
           <w:szCs w:val="24"/>
           <w:lang w:val="es-ES"/>
         </w:rPr>
-        <w:t>, quien afirma que la gestión documental debe "</w:t>
+        <w:t xml:space="preserve">, quienes explican que ciertos procesos "can be </w:t>
       </w:r>
       <w:proofErr w:type="spellStart"/>
       <w:r>
@@ -2085,7 +2486,7 @@
           <w:szCs w:val="24"/>
           <w:lang w:val="es-ES"/>
         </w:rPr>
-        <w:t>ensure</w:t>
+        <w:t>simplified</w:t>
       </w:r>
       <w:proofErr w:type="spellEnd"/>
       <w:r>
@@ -2105,7 +2506,7 @@
           <w:szCs w:val="24"/>
           <w:lang w:val="es-ES"/>
         </w:rPr>
-        <w:t>an</w:t>
+        <w:t>by</w:t>
       </w:r>
       <w:proofErr w:type="spellEnd"/>
       <w:r>
@@ -2125,7 +2526,7 @@
           <w:szCs w:val="24"/>
           <w:lang w:val="es-ES"/>
         </w:rPr>
-        <w:t>effective</w:t>
+        <w:t>using</w:t>
       </w:r>
       <w:proofErr w:type="spellEnd"/>
       <w:r>
@@ -2135,6 +2536,26 @@
           <w:szCs w:val="24"/>
           <w:lang w:val="es-ES"/>
         </w:rPr>
+        <w:t xml:space="preserve"> </w:t>
+      </w:r>
+      <w:proofErr w:type="spellStart"/>
+      <w:r>
+        <w:rPr>
+          <w:rFonts w:ascii="Times New Roman" w:hAnsi="Times New Roman" w:cs="Times New Roman"/>
+          <w:sz w:val="24"/>
+          <w:szCs w:val="24"/>
+          <w:lang w:val="es-ES"/>
+        </w:rPr>
+        <w:t>task</w:t>
+      </w:r>
+      <w:proofErr w:type="spellEnd"/>
+      <w:r>
+        <w:rPr>
+          <w:rFonts w:ascii="Times New Roman" w:hAnsi="Times New Roman" w:cs="Times New Roman"/>
+          <w:sz w:val="24"/>
+          <w:szCs w:val="24"/>
+          <w:lang w:val="es-ES"/>
+        </w:rPr>
         <w:t xml:space="preserve"> and </w:t>
       </w:r>
       <w:proofErr w:type="spellStart"/>
@@ -2145,7 +2566,7 @@
           <w:szCs w:val="24"/>
           <w:lang w:val="es-ES"/>
         </w:rPr>
-        <w:t>efficient</w:t>
+        <w:t>workflow</w:t>
       </w:r>
       <w:proofErr w:type="spellEnd"/>
       <w:r>
@@ -2165,7 +2586,7 @@
           <w:szCs w:val="24"/>
           <w:lang w:val="es-ES"/>
         </w:rPr>
-        <w:t>application</w:t>
+        <w:t>management</w:t>
       </w:r>
       <w:proofErr w:type="spellEnd"/>
       <w:r>
@@ -2185,7 +2606,7 @@
           <w:szCs w:val="24"/>
           <w:lang w:val="es-ES"/>
         </w:rPr>
-        <w:t>of</w:t>
+        <w:t>systems</w:t>
       </w:r>
       <w:proofErr w:type="spellEnd"/>
       <w:r>
@@ -2195,71 +2616,13 @@
           <w:szCs w:val="24"/>
           <w:lang w:val="es-ES"/>
         </w:rPr>
-        <w:t xml:space="preserve"> </w:t>
-      </w:r>
-      <w:proofErr w:type="spellStart"/>
-      <w:r>
-        <w:rPr>
-          <w:rFonts w:ascii="Times New Roman" w:hAnsi="Times New Roman" w:cs="Times New Roman"/>
-          <w:sz w:val="24"/>
-          <w:szCs w:val="24"/>
-          <w:lang w:val="es-ES"/>
-        </w:rPr>
-        <w:t>the</w:t>
-      </w:r>
-      <w:proofErr w:type="spellEnd"/>
-      <w:r>
-        <w:rPr>
-          <w:rFonts w:ascii="Times New Roman" w:hAnsi="Times New Roman" w:cs="Times New Roman"/>
-          <w:sz w:val="24"/>
-          <w:szCs w:val="24"/>
-          <w:lang w:val="es-ES"/>
-        </w:rPr>
-        <w:t xml:space="preserve"> </w:t>
-      </w:r>
-      <w:proofErr w:type="spellStart"/>
-      <w:r>
-        <w:rPr>
-          <w:rFonts w:ascii="Times New Roman" w:hAnsi="Times New Roman" w:cs="Times New Roman"/>
-          <w:sz w:val="24"/>
-          <w:szCs w:val="24"/>
-          <w:lang w:val="es-ES"/>
-        </w:rPr>
-        <w:t>strategies</w:t>
-      </w:r>
-      <w:proofErr w:type="spellEnd"/>
-      <w:r>
-        <w:rPr>
-          <w:rFonts w:ascii="Times New Roman" w:hAnsi="Times New Roman" w:cs="Times New Roman"/>
-          <w:sz w:val="24"/>
-          <w:szCs w:val="24"/>
-          <w:lang w:val="es-ES"/>
-        </w:rPr>
-        <w:t>" (p. 78). En el contexto de proyectos académicos, esta eficiencia no se reduce al almacenamiento de archivos, sino que implica alinear los documentos con las reglas institucionales de entrega, revisión,</w:t>
-      </w:r>
-      <w:r>
-        <w:rPr>
-          <w:rFonts w:ascii="Times New Roman" w:hAnsi="Times New Roman" w:cs="Times New Roman"/>
-          <w:sz w:val="24"/>
-          <w:szCs w:val="24"/>
-          <w:lang w:val="es-ES"/>
-        </w:rPr>
-        <w:t xml:space="preserve"> </w:t>
-      </w:r>
-      <w:r>
-        <w:rPr>
-          <w:rFonts w:ascii="Times New Roman" w:hAnsi="Times New Roman" w:cs="Times New Roman"/>
-          <w:sz w:val="24"/>
-          <w:szCs w:val="24"/>
-          <w:lang w:val="es-ES"/>
-        </w:rPr>
-        <w:t>corrección y aprobación. De ese modo, cada documento se convierte en evidencia verificable del avance del proyecto.</w:t>
+        <w:t>" (p. 2). Esta afirmación resulta aplicable al seguimiento de proyectos académicos porque el avance de un proyecto no depende de una sola actividad, sino de una secuencia de tareas, responsables, entregas, revisiones y decisiones que deben coordinarse de manera ordenada.</w:t>
       </w:r>
     </w:p>
     <w:p>
       <w:pPr>
         <w:spacing w:before="240" w:after="0" w:line="360" w:lineRule="auto"/>
-        <w:ind w:firstLine="708"/>
+        <w:ind w:left="708" w:firstLine="708"/>
         <w:jc w:val="both"/>
         <w:rPr>
           <w:rFonts w:ascii="Times New Roman" w:hAnsi="Times New Roman" w:cs="Times New Roman"/>
@@ -2275,13 +2638,13 @@
           <w:szCs w:val="24"/>
           <w:lang w:val="es-ES"/>
         </w:rPr>
-        <w:t>Para proyectos académicos, la gestión documental no debe limitarse a un repositorio de archivos. Debe operar con reglas institucionales: formatos aceptados, estados de revisión, permisos por rol, validación de entregas y conservación de evidencias. Un estudiante puede cargar un avance, pero no debería modificar una versión ya revisada sin que el sistema registre una nueva versión. Un revisor puede emitir observaciones, pero no debería alterar el archivo original. La coordinación puede requerir reportes de documentos pendientes, rechazados, aprobados o vencidos. Estas funciones convierten el documento en una unidad gestionable dentro de un proceso académico.</w:t>
+        <w:t>El control de proyectos no debe entenderse como vigilancia punitiva, sino como un mecanismo de acompañamiento académico. Al registrar hitos, fechas y observaciones, el sistema ayuda a que estudiantes y docentes mantengan una comunicación ordenada. El estudiante puede conocer qué documento debe entregar y cuál fue la observación recibida; el tutor puede revisar avances sin perder el historial; los revisores pueden emitir criterios de forma organizada; y la coordinación puede tomar decisiones con base en datos consolidados.</w:t>
       </w:r>
     </w:p>
     <w:p>
       <w:pPr>
         <w:spacing w:before="240" w:after="0" w:line="360" w:lineRule="auto"/>
-        <w:ind w:firstLine="708"/>
+        <w:ind w:left="708" w:firstLine="708"/>
         <w:jc w:val="both"/>
         <w:rPr>
           <w:rFonts w:ascii="Times New Roman" w:hAnsi="Times New Roman" w:cs="Times New Roman"/>
@@ -2297,371 +2660,23 @@
           <w:szCs w:val="24"/>
           <w:lang w:val="es-ES"/>
         </w:rPr>
+        <w:t xml:space="preserve">El seguimiento también requiere trazabilidad de responsabilidades. En proyectos académicos, una observación sin autor, una entrega sin fecha o una aprobación sin evidencia puede generar conflictos. Por ello, la plataforma debe registrar acciones vinculadas a usuarios y momentos específicos. Esta trazabilidad permite reconstruir el proceso y fortalecer la transparencia del trabajo académico. </w:t>
+      </w:r>
+      <w:r>
+        <w:rPr>
+          <w:rFonts w:ascii="Times New Roman" w:hAnsi="Times New Roman" w:cs="Times New Roman"/>
+          <w:sz w:val="24"/>
+          <w:szCs w:val="24"/>
+          <w:lang w:val="es-ES"/>
+        </w:rPr>
         <w:lastRenderedPageBreak/>
-        <w:t>La gestión documental digital también fortalece la calidad administrativa. Al centralizar los documentos, se reducen pérdidas de información, duplicidad de archivos, confusión entre versiones y retrasos por búsquedas manuales. Además, permite que la carrera establezca criterios uniformes para todos los proyectos, evitando que cada grupo maneje sus entregas con métodos diferentes. Esta estandarización es relevante en procesos de evaluación, acreditación o auditoría académica, donde la evidencia documental debe estar ordenada y disponible.</w:t>
+        <w:t>Asimismo, los reportes automáticos pueden apoyar reuniones de seguimiento, comités de carrera o procesos de evaluación institucional.</w:t>
       </w:r>
     </w:p>
     <w:p>
       <w:pPr>
         <w:spacing w:before="240" w:after="0" w:line="360" w:lineRule="auto"/>
-        <w:ind w:firstLine="708"/>
-        <w:jc w:val="both"/>
-        <w:rPr>
-          <w:rFonts w:ascii="Times New Roman" w:hAnsi="Times New Roman" w:cs="Times New Roman"/>
-          <w:sz w:val="24"/>
-          <w:szCs w:val="24"/>
-          <w:lang w:val="es-ES"/>
-        </w:rPr>
-      </w:pPr>
-      <w:r>
-        <w:rPr>
-          <w:rFonts w:ascii="Times New Roman" w:hAnsi="Times New Roman" w:cs="Times New Roman"/>
-          <w:sz w:val="24"/>
-          <w:szCs w:val="24"/>
-          <w:lang w:val="es-ES"/>
-        </w:rPr>
-        <w:t>En el diseño de la plataforma, la gestión documental debe incluir al menos: carga segura de archivos, metadatos básicos, clasificación por proyecto, control de versiones, historial de revisión, permisos de acceso, comentarios u observaciones, estados documentales y mecanismos de descarga. Estos elementos permiten que la revisión académica sea transparente y que cada documento tenga una relación clara con el flujo de seguimiento del proyecto. Así, el sistema deja de ser un simple contenedor de archivos y se convierte en un soporte formal para la toma de decisiones académicas.</w:t>
-      </w:r>
-    </w:p>
-    <w:p>
-      <w:pPr>
-        <w:pStyle w:val="tesis"/>
-        <w:rPr>
-          <w:sz w:val="24"/>
-          <w:szCs w:val="24"/>
-        </w:rPr>
-      </w:pPr>
-      <w:r>
-        <w:rPr>
-          <w:sz w:val="24"/>
-          <w:szCs w:val="24"/>
-        </w:rPr>
-        <w:t xml:space="preserve">       </w:t>
-      </w:r>
-      <w:r>
-        <w:rPr>
-          <w:sz w:val="24"/>
-          <w:szCs w:val="24"/>
-        </w:rPr>
-        <w:t>7.3 Seguimiento y control de proyectos académicos</w:t>
-      </w:r>
-      <w:r>
-        <w:rPr>
-          <w:sz w:val="24"/>
-          <w:szCs w:val="24"/>
-        </w:rPr>
-        <w:t>.</w:t>
-      </w:r>
-    </w:p>
-    <w:p>
-      <w:pPr>
-        <w:spacing w:before="240" w:after="0" w:line="360" w:lineRule="auto"/>
-        <w:ind w:firstLine="708"/>
-        <w:jc w:val="both"/>
-        <w:rPr>
-          <w:rFonts w:ascii="Times New Roman" w:hAnsi="Times New Roman" w:cs="Times New Roman"/>
-          <w:sz w:val="24"/>
-          <w:szCs w:val="24"/>
-          <w:lang w:val="es-ES"/>
-        </w:rPr>
-      </w:pPr>
-      <w:r>
-        <w:rPr>
-          <w:rFonts w:ascii="Times New Roman" w:hAnsi="Times New Roman" w:cs="Times New Roman"/>
-          <w:sz w:val="24"/>
-          <w:szCs w:val="24"/>
-          <w:lang w:val="es-ES"/>
-        </w:rPr>
-        <w:t>El seguimiento y control de proyectos académicos consiste en observar, registrar, evaluar y orientar el avance de una propuesta formativa o investigativa desde su inicio hasta su cierre. En la carrera de Desarrollo de Software, este seguimiento es especialmente importante porque los proyectos suelen involucrar planificación, análisis, diseño, construcción, pruebas, documentación, revisión docente y entrega final. Sin una herramienta centralizada, el control puede fragmentarse entre mensajes, hojas de cálculo, actas dispersas y archivos sin historial.</w:t>
-      </w:r>
-    </w:p>
-    <w:p>
-      <w:pPr>
-        <w:spacing w:before="240" w:after="0" w:line="360" w:lineRule="auto"/>
-        <w:ind w:firstLine="708"/>
-        <w:jc w:val="both"/>
-        <w:rPr>
-          <w:rFonts w:ascii="Times New Roman" w:hAnsi="Times New Roman" w:cs="Times New Roman"/>
-          <w:sz w:val="24"/>
-          <w:szCs w:val="24"/>
-          <w:lang w:val="es-ES"/>
-        </w:rPr>
-      </w:pPr>
-      <w:r>
-        <w:rPr>
-          <w:rFonts w:ascii="Times New Roman" w:hAnsi="Times New Roman" w:cs="Times New Roman"/>
-          <w:sz w:val="24"/>
-          <w:szCs w:val="24"/>
-          <w:lang w:val="es-ES"/>
-        </w:rPr>
-        <w:t>Una plataforma institucional debe traducir el seguimiento académico en un flujo de trabajo claro. Cada proyecto puede avanzar por estados como registrado, asignado, en desarrollo, en revisión, observado, corregido, aprobado y finalizado. Estos estados permiten que los responsables conozcan la situación actual sin depender de consultas manuales. Además, facilitan la identificación de retrasos, entregas pendientes, revisiones no atendidas y proyectos que requieren intervención de coordinación.</w:t>
-      </w:r>
-    </w:p>
-    <w:p>
-      <w:pPr>
-        <w:spacing w:before="240" w:after="0" w:line="360" w:lineRule="auto"/>
-        <w:ind w:firstLine="708"/>
-        <w:jc w:val="both"/>
-        <w:rPr>
-          <w:rFonts w:ascii="Times New Roman" w:hAnsi="Times New Roman" w:cs="Times New Roman"/>
-          <w:sz w:val="24"/>
-          <w:szCs w:val="24"/>
-          <w:lang w:val="es-ES"/>
-        </w:rPr>
-      </w:pPr>
-      <w:r>
-        <w:rPr>
-          <w:rFonts w:ascii="Times New Roman" w:hAnsi="Times New Roman" w:cs="Times New Roman"/>
-          <w:sz w:val="24"/>
-          <w:szCs w:val="24"/>
-          <w:lang w:val="es-ES"/>
-        </w:rPr>
-        <w:t xml:space="preserve">La pertinencia de utilizar sistemas de gestión de tareas y flujos se sostiene en </w:t>
-      </w:r>
-      <w:r>
-        <w:rPr>
-          <w:rFonts w:ascii="Times New Roman" w:hAnsi="Times New Roman" w:cs="Times New Roman"/>
-          <w:sz w:val="24"/>
-          <w:szCs w:val="24"/>
-          <w:lang w:val="es-ES"/>
-        </w:rPr>
-        <w:fldChar w:fldCharType="begin"/>
-      </w:r>
-      <w:r>
-        <w:rPr>
-          <w:rFonts w:ascii="Times New Roman" w:hAnsi="Times New Roman" w:cs="Times New Roman"/>
-          <w:sz w:val="24"/>
-          <w:szCs w:val="24"/>
-          <w:lang w:val="es-ES"/>
-        </w:rPr>
-        <w:instrText xml:space="preserve"> ADDIN ZOTERO_ITEM CSL_CITATION {"citationID":"7B6ivRTx","properties":{"unsorted":false,"formattedCitation":"(Almeida et\\uc0\\u160{}al., 2019)","plainCitation":"(Almeida et al., 2019)","noteIndex":0},"citationItems":[{"id":"0ccfRIuB/BskDTAdb","uris":["http://zotero.org/users/local/3NWqkcVE/items/CVY6ZES7"],"itemData":{"id":139,"type":"article-journal","container-title":"BMC Medical Informatics and Decision Making","DOI":"10.1186/s12911-019-0844-6","ISSN":"1472-6947","issue":"1","journalAbbreviation":"BMC Med Inform Decis Mak","language":"en","page":"121","source":"DOI.org (Crossref)","title":"TASKA: A modular task management system to support health research studies","title-short":"TASKA","volume":"19","author":[{"family":"Almeida","given":"João Rafael"},{"family":"Gini","given":"Rosa"},{"family":"Roberto","given":"Giuseppe"},{"family":"Rijnbeek","given":"Peter"},{"family":"Oliveira","given":"José Luís"}],"issued":{"date-parts":[["2019",12]]}}}],"schema":"https://github.com/citation-style-language/schema/raw/master/csl-citation.json"} </w:instrText>
-      </w:r>
-      <w:r>
-        <w:rPr>
-          <w:rFonts w:ascii="Times New Roman" w:hAnsi="Times New Roman" w:cs="Times New Roman"/>
-          <w:sz w:val="24"/>
-          <w:szCs w:val="24"/>
-          <w:lang w:val="es-ES"/>
-        </w:rPr>
-        <w:fldChar w:fldCharType="separate"/>
-      </w:r>
-      <w:r>
-        <w:rPr>
-          <w:rFonts w:ascii="Times New Roman" w:hAnsi="Times New Roman" w:cs="Times New Roman"/>
-          <w:kern w:val="0"/>
-          <w:sz w:val="24"/>
-          <w:szCs w:val="24"/>
-        </w:rPr>
-        <w:t>(Almeida et al., 2019)</w:t>
-      </w:r>
-      <w:r>
-        <w:rPr>
-          <w:rFonts w:ascii="Times New Roman" w:hAnsi="Times New Roman" w:cs="Times New Roman"/>
-          <w:sz w:val="24"/>
-          <w:szCs w:val="24"/>
-          <w:lang w:val="es-ES"/>
-        </w:rPr>
-        <w:fldChar w:fldCharType="end"/>
-      </w:r>
-      <w:r>
-        <w:rPr>
-          <w:rFonts w:ascii="Times New Roman" w:hAnsi="Times New Roman" w:cs="Times New Roman"/>
-          <w:sz w:val="24"/>
-          <w:szCs w:val="24"/>
-          <w:lang w:val="es-ES"/>
-        </w:rPr>
-        <w:t xml:space="preserve">, quienes explican que ciertos procesos "can be </w:t>
-      </w:r>
-      <w:proofErr w:type="spellStart"/>
-      <w:r>
-        <w:rPr>
-          <w:rFonts w:ascii="Times New Roman" w:hAnsi="Times New Roman" w:cs="Times New Roman"/>
-          <w:sz w:val="24"/>
-          <w:szCs w:val="24"/>
-          <w:lang w:val="es-ES"/>
-        </w:rPr>
-        <w:t>simplified</w:t>
-      </w:r>
-      <w:proofErr w:type="spellEnd"/>
-      <w:r>
-        <w:rPr>
-          <w:rFonts w:ascii="Times New Roman" w:hAnsi="Times New Roman" w:cs="Times New Roman"/>
-          <w:sz w:val="24"/>
-          <w:szCs w:val="24"/>
-          <w:lang w:val="es-ES"/>
-        </w:rPr>
-        <w:t xml:space="preserve"> </w:t>
-      </w:r>
-      <w:proofErr w:type="spellStart"/>
-      <w:r>
-        <w:rPr>
-          <w:rFonts w:ascii="Times New Roman" w:hAnsi="Times New Roman" w:cs="Times New Roman"/>
-          <w:sz w:val="24"/>
-          <w:szCs w:val="24"/>
-          <w:lang w:val="es-ES"/>
-        </w:rPr>
-        <w:t>by</w:t>
-      </w:r>
-      <w:proofErr w:type="spellEnd"/>
-      <w:r>
-        <w:rPr>
-          <w:rFonts w:ascii="Times New Roman" w:hAnsi="Times New Roman" w:cs="Times New Roman"/>
-          <w:sz w:val="24"/>
-          <w:szCs w:val="24"/>
-          <w:lang w:val="es-ES"/>
-        </w:rPr>
-        <w:t xml:space="preserve"> </w:t>
-      </w:r>
-      <w:proofErr w:type="spellStart"/>
-      <w:r>
-        <w:rPr>
-          <w:rFonts w:ascii="Times New Roman" w:hAnsi="Times New Roman" w:cs="Times New Roman"/>
-          <w:sz w:val="24"/>
-          <w:szCs w:val="24"/>
-          <w:lang w:val="es-ES"/>
-        </w:rPr>
-        <w:t>using</w:t>
-      </w:r>
-      <w:proofErr w:type="spellEnd"/>
-      <w:r>
-        <w:rPr>
-          <w:rFonts w:ascii="Times New Roman" w:hAnsi="Times New Roman" w:cs="Times New Roman"/>
-          <w:sz w:val="24"/>
-          <w:szCs w:val="24"/>
-          <w:lang w:val="es-ES"/>
-        </w:rPr>
-        <w:t xml:space="preserve"> </w:t>
-      </w:r>
-      <w:proofErr w:type="spellStart"/>
-      <w:r>
-        <w:rPr>
-          <w:rFonts w:ascii="Times New Roman" w:hAnsi="Times New Roman" w:cs="Times New Roman"/>
-          <w:sz w:val="24"/>
-          <w:szCs w:val="24"/>
-          <w:lang w:val="es-ES"/>
-        </w:rPr>
-        <w:lastRenderedPageBreak/>
-        <w:t>task</w:t>
-      </w:r>
-      <w:proofErr w:type="spellEnd"/>
-      <w:r>
-        <w:rPr>
-          <w:rFonts w:ascii="Times New Roman" w:hAnsi="Times New Roman" w:cs="Times New Roman"/>
-          <w:sz w:val="24"/>
-          <w:szCs w:val="24"/>
-          <w:lang w:val="es-ES"/>
-        </w:rPr>
-        <w:t xml:space="preserve"> and </w:t>
-      </w:r>
-      <w:proofErr w:type="spellStart"/>
-      <w:r>
-        <w:rPr>
-          <w:rFonts w:ascii="Times New Roman" w:hAnsi="Times New Roman" w:cs="Times New Roman"/>
-          <w:sz w:val="24"/>
-          <w:szCs w:val="24"/>
-          <w:lang w:val="es-ES"/>
-        </w:rPr>
-        <w:t>workflow</w:t>
-      </w:r>
-      <w:proofErr w:type="spellEnd"/>
-      <w:r>
-        <w:rPr>
-          <w:rFonts w:ascii="Times New Roman" w:hAnsi="Times New Roman" w:cs="Times New Roman"/>
-          <w:sz w:val="24"/>
-          <w:szCs w:val="24"/>
-          <w:lang w:val="es-ES"/>
-        </w:rPr>
-        <w:t xml:space="preserve"> </w:t>
-      </w:r>
-      <w:proofErr w:type="spellStart"/>
-      <w:r>
-        <w:rPr>
-          <w:rFonts w:ascii="Times New Roman" w:hAnsi="Times New Roman" w:cs="Times New Roman"/>
-          <w:sz w:val="24"/>
-          <w:szCs w:val="24"/>
-          <w:lang w:val="es-ES"/>
-        </w:rPr>
-        <w:t>management</w:t>
-      </w:r>
-      <w:proofErr w:type="spellEnd"/>
-      <w:r>
-        <w:rPr>
-          <w:rFonts w:ascii="Times New Roman" w:hAnsi="Times New Roman" w:cs="Times New Roman"/>
-          <w:sz w:val="24"/>
-          <w:szCs w:val="24"/>
-          <w:lang w:val="es-ES"/>
-        </w:rPr>
-        <w:t xml:space="preserve"> </w:t>
-      </w:r>
-      <w:proofErr w:type="spellStart"/>
-      <w:r>
-        <w:rPr>
-          <w:rFonts w:ascii="Times New Roman" w:hAnsi="Times New Roman" w:cs="Times New Roman"/>
-          <w:sz w:val="24"/>
-          <w:szCs w:val="24"/>
-          <w:lang w:val="es-ES"/>
-        </w:rPr>
-        <w:t>systems</w:t>
-      </w:r>
-      <w:proofErr w:type="spellEnd"/>
-      <w:r>
-        <w:rPr>
-          <w:rFonts w:ascii="Times New Roman" w:hAnsi="Times New Roman" w:cs="Times New Roman"/>
-          <w:sz w:val="24"/>
-          <w:szCs w:val="24"/>
-          <w:lang w:val="es-ES"/>
-        </w:rPr>
-        <w:t>" (p. 2). Esta afirmación resulta aplicable al seguimiento de proyectos académicos porque el avance de un proyecto no depende de una sola actividad, sino de una secuencia de tareas, responsables, entregas, revisiones y decisiones que deben coordinarse de manera ordenada.</w:t>
-      </w:r>
-    </w:p>
-    <w:p>
-      <w:pPr>
-        <w:spacing w:before="240" w:after="0" w:line="360" w:lineRule="auto"/>
-        <w:ind w:firstLine="708"/>
-        <w:jc w:val="both"/>
-        <w:rPr>
-          <w:rFonts w:ascii="Times New Roman" w:hAnsi="Times New Roman" w:cs="Times New Roman"/>
-          <w:sz w:val="24"/>
-          <w:szCs w:val="24"/>
-          <w:lang w:val="es-ES"/>
-        </w:rPr>
-      </w:pPr>
-      <w:r>
-        <w:rPr>
-          <w:rFonts w:ascii="Times New Roman" w:hAnsi="Times New Roman" w:cs="Times New Roman"/>
-          <w:sz w:val="24"/>
-          <w:szCs w:val="24"/>
-          <w:lang w:val="es-ES"/>
-        </w:rPr>
-        <w:t>El control de proyectos no debe entenderse como vigilancia punitiva, sino como un mecanismo de acompañamiento académico. Al registrar hitos, fechas y observaciones, el sistema ayuda a que estudiantes y docentes mantengan una comunicación ordenada. El estudiante puede conocer qué documento debe entregar y cuál fue la observación recibida; el tutor puede revisar avances sin perder el historial; los revisores pueden emitir criterios de forma organizada; y la coordinación puede tomar decisiones con base en datos consolidados.</w:t>
-      </w:r>
-    </w:p>
-    <w:p>
-      <w:pPr>
-        <w:spacing w:before="240" w:after="0" w:line="360" w:lineRule="auto"/>
-        <w:ind w:firstLine="708"/>
-        <w:jc w:val="both"/>
-        <w:rPr>
-          <w:rFonts w:ascii="Times New Roman" w:hAnsi="Times New Roman" w:cs="Times New Roman"/>
-          <w:sz w:val="24"/>
-          <w:szCs w:val="24"/>
-          <w:lang w:val="es-ES"/>
-        </w:rPr>
-      </w:pPr>
-      <w:r>
-        <w:rPr>
-          <w:rFonts w:ascii="Times New Roman" w:hAnsi="Times New Roman" w:cs="Times New Roman"/>
-          <w:sz w:val="24"/>
-          <w:szCs w:val="24"/>
-          <w:lang w:val="es-ES"/>
-        </w:rPr>
-        <w:t>El seguimiento también requiere trazabilidad de responsabilidades. En proyectos académicos, una observación sin autor, una entrega sin fecha o una aprobación sin evidencia puede generar conflictos. Por ello, la plataforma debe registrar acciones vinculadas a usuarios y momentos específicos. Esta trazabilidad permite reconstruir el proceso y fortalecer la transparencia del trabajo académico. Asimismo, los reportes automáticos pueden apoyar reuniones de seguimiento, comités de carrera o procesos de evaluación institucional.</w:t>
-      </w:r>
-    </w:p>
-    <w:p>
-      <w:pPr>
-        <w:spacing w:before="240" w:after="0" w:line="360" w:lineRule="auto"/>
-        <w:ind w:firstLine="708"/>
+        <w:ind w:left="708" w:firstLine="708"/>
         <w:jc w:val="both"/>
         <w:rPr>
           <w:rFonts w:ascii="Times New Roman" w:hAnsi="Times New Roman" w:cs="Times New Roman"/>
@@ -2714,33 +2729,25 @@
       <w:pPr>
         <w:pStyle w:val="parrafos"/>
         <w:spacing w:before="240" w:line="360" w:lineRule="auto"/>
-        <w:ind w:firstLine="708"/>
-        <w:rPr>
-          <w:sz w:val="24"/>
-          <w:szCs w:val="24"/>
-        </w:rPr>
-      </w:pPr>
-      <w:r>
-        <w:rPr>
-          <w:sz w:val="24"/>
-          <w:szCs w:val="24"/>
-        </w:rPr>
-        <w:t xml:space="preserve">El diseño y desarrollo de sistemas web comprende el proceso de transformar una necesidad institucional en una solución tecnológica accesible mediante navegador, organizada por capas y orientada a usuarios concretos. En una plataforma para seguimiento, revisión y gestión documental de proyectos académicos, este proceso debe iniciar con el análisis de requerimientos funcionales y no funcionales. Los requerimientos funcionales </w:t>
-      </w:r>
-      <w:r>
-        <w:rPr>
-          <w:sz w:val="24"/>
-          <w:szCs w:val="24"/>
-        </w:rPr>
-        <w:lastRenderedPageBreak/>
-        <w:t>definen qué debe hacer el sistema: registrar proyectos, administrar usuarios, cargar documentos, asignar revisores, emitir observaciones, controlar estados y generar reportes. Los requerimientos no funcionales establecen condiciones de calidad: seguridad, rendimiento, disponibilidad, usabilidad, mantenibilidad y escalabilidad.</w:t>
+        <w:ind w:left="708" w:firstLine="708"/>
+        <w:rPr>
+          <w:sz w:val="24"/>
+          <w:szCs w:val="24"/>
+        </w:rPr>
+      </w:pPr>
+      <w:r>
+        <w:rPr>
+          <w:sz w:val="24"/>
+          <w:szCs w:val="24"/>
+        </w:rPr>
+        <w:t>El diseño y desarrollo de sistemas web comprende el proceso de transformar una necesidad institucional en una solución tecnológica accesible mediante navegador, organizada por capas y orientada a usuarios concretos. En una plataforma para seguimiento, revisión y gestión documental de proyectos académicos, este proceso debe iniciar con el análisis de requerimientos funcionales y no funcionales. Los requerimientos funcionales definen qué debe hacer el sistema: registrar proyectos, administrar usuarios, cargar documentos, asignar revisores, emitir observaciones, controlar estados y generar reportes. Los requerimientos no funcionales establecen condiciones de calidad: seguridad, rendimiento, disponibilidad, usabilidad, mantenibilidad y escalabilidad.</w:t>
       </w:r>
     </w:p>
     <w:p>
       <w:pPr>
         <w:pStyle w:val="parrafos"/>
         <w:spacing w:before="240" w:line="360" w:lineRule="auto"/>
-        <w:ind w:firstLine="708"/>
+        <w:ind w:left="708" w:firstLine="708"/>
         <w:rPr>
           <w:sz w:val="24"/>
           <w:szCs w:val="24"/>
@@ -2905,25 +2912,33 @@
       <w:pPr>
         <w:pStyle w:val="parrafos"/>
         <w:spacing w:before="240" w:line="360" w:lineRule="auto"/>
-        <w:ind w:firstLine="708"/>
-        <w:rPr>
-          <w:sz w:val="24"/>
-          <w:szCs w:val="24"/>
-        </w:rPr>
-      </w:pPr>
-      <w:r>
-        <w:rPr>
-          <w:sz w:val="24"/>
-          <w:szCs w:val="24"/>
-        </w:rPr>
-        <w:t>El diseño de un sistema web debe considerar la arquitectura de la solución. Una aplicación institucional suele organizarse en una capa de presentación, una capa lógica y una capa de datos. La capa de presentación permite la interacción con estudiantes, docentes y administradores; la capa lógica implementa reglas como permisos, estados, validaciones y flujos de revisión; y la capa de datos almacena proyectos, documentos, usuarios, observaciones y registros de auditoría. Esta separación facilita el mantenimiento y reduce la dependencia entre componentes.</w:t>
+        <w:ind w:left="708" w:firstLine="708"/>
+        <w:rPr>
+          <w:sz w:val="24"/>
+          <w:szCs w:val="24"/>
+        </w:rPr>
+      </w:pPr>
+      <w:r>
+        <w:rPr>
+          <w:sz w:val="24"/>
+          <w:szCs w:val="24"/>
+        </w:rPr>
+        <w:t xml:space="preserve">El diseño de un sistema web debe considerar la arquitectura de la solución. Una aplicación institucional suele organizarse en una capa de presentación, una capa lógica y una capa de datos. La capa de presentación permite la interacción con estudiantes, docentes y administradores; la capa lógica implementa reglas como </w:t>
+      </w:r>
+      <w:r>
+        <w:rPr>
+          <w:sz w:val="24"/>
+          <w:szCs w:val="24"/>
+        </w:rPr>
+        <w:lastRenderedPageBreak/>
+        <w:t>permisos, estados, validaciones y flujos de revisión; y la capa de datos almacena proyectos, documentos, usuarios, observaciones y registros de auditoría. Esta separación facilita el mantenimiento y reduce la dependencia entre componentes.</w:t>
       </w:r>
     </w:p>
     <w:p>
       <w:pPr>
         <w:pStyle w:val="parrafos"/>
         <w:spacing w:before="240" w:line="360" w:lineRule="auto"/>
-        <w:ind w:firstLine="708"/>
+        <w:ind w:left="708" w:firstLine="708"/>
         <w:rPr>
           <w:sz w:val="24"/>
           <w:szCs w:val="24"/>
@@ -2941,7 +2956,7 @@
       <w:pPr>
         <w:pStyle w:val="parrafos"/>
         <w:spacing w:before="240" w:line="360" w:lineRule="auto"/>
-        <w:ind w:firstLine="708"/>
+        <w:ind w:left="708" w:firstLine="708"/>
         <w:rPr>
           <w:sz w:val="24"/>
           <w:szCs w:val="24"/>
@@ -2959,24 +2974,95 @@
       <w:pPr>
         <w:pStyle w:val="parrafos"/>
         <w:spacing w:before="240" w:line="360" w:lineRule="auto"/>
-        <w:ind w:firstLine="708"/>
-        <w:rPr>
-          <w:sz w:val="24"/>
-          <w:szCs w:val="24"/>
-        </w:rPr>
-      </w:pPr>
-      <w:r>
-        <w:rPr>
+        <w:ind w:left="708" w:firstLine="708"/>
+        <w:rPr>
+          <w:sz w:val="24"/>
+          <w:szCs w:val="24"/>
+        </w:rPr>
+      </w:pPr>
+      <w:r>
+        <w:rPr>
+          <w:sz w:val="24"/>
+          <w:szCs w:val="24"/>
+        </w:rPr>
+        <w:t>Finalmente, el desarrollo de sistemas web institucionales requiere una visión evolutiva. Las necesidades académicas pueden cambiar: nuevos formatos de proyecto, criterios de revisión, perfiles de usuario o reportes institucionales. Por eso, la solución debe construirse con módulos mantenibles y reglas configurables cuando sea posible. Un sistema diseñado de esta forma puede crecer sin perder estabilidad, permitiendo que la carrera incorpore mejoras progresivas y mantenga la plataforma alineada con sus procesos académicos.</w:t>
+      </w:r>
+    </w:p>
+    <w:p>
+      <w:pPr>
+        <w:pStyle w:val="parrafos"/>
+        <w:spacing w:before="240" w:line="360" w:lineRule="auto"/>
+        <w:rPr>
+          <w:sz w:val="24"/>
+          <w:szCs w:val="24"/>
+        </w:rPr>
+      </w:pPr>
+      <w:r>
+        <w:rPr>
+          <w:rFonts w:cs="Times New Roman"/>
+          <w:b/>
+          <w:bCs/>
+          <w:sz w:val="24"/>
+          <w:szCs w:val="24"/>
+        </w:rPr>
+        <w:t xml:space="preserve">     </w:t>
+      </w:r>
+      <w:r>
+        <w:rPr>
+          <w:rFonts w:cs="Times New Roman"/>
+          <w:b/>
+          <w:bCs/>
+          <w:sz w:val="24"/>
+          <w:szCs w:val="24"/>
+        </w:rPr>
+        <w:t>7.5 Validación y pruebas de software</w:t>
+      </w:r>
+      <w:r>
+        <w:rPr>
+          <w:rFonts w:cs="Times New Roman"/>
+          <w:b/>
+          <w:bCs/>
+          <w:sz w:val="24"/>
+          <w:szCs w:val="24"/>
+        </w:rPr>
+        <w:t>.</w:t>
+      </w:r>
+    </w:p>
+    <w:p>
+      <w:pPr>
+        <w:spacing w:before="240" w:line="360" w:lineRule="auto"/>
+        <w:ind w:left="708" w:firstLine="708"/>
+        <w:jc w:val="both"/>
+        <w:rPr>
+          <w:rFonts w:ascii="Times New Roman" w:hAnsi="Times New Roman" w:cs="Times New Roman"/>
+          <w:b/>
+          <w:bCs/>
+          <w:sz w:val="24"/>
+          <w:szCs w:val="24"/>
+        </w:rPr>
+      </w:pPr>
+      <w:r>
+        <w:rPr>
+          <w:rFonts w:ascii="Times New Roman" w:hAnsi="Times New Roman" w:cs="Times New Roman"/>
+          <w:sz w:val="24"/>
+          <w:szCs w:val="24"/>
+        </w:rPr>
+        <w:t xml:space="preserve">La validación y las pruebas de software son actividades orientadas a comprobar que un sistema cumple con los requerimientos establecidos y responde de forma adecuada a las necesidades de sus usuarios. En una plataforma institucional para proyectos académicos, las pruebas no se limitan a verificar que las pantallas carguen correctamente; deben comprobar que los flujos de gestión documental, </w:t>
+      </w:r>
+      <w:r>
+        <w:rPr>
+          <w:rFonts w:ascii="Times New Roman" w:hAnsi="Times New Roman" w:cs="Times New Roman"/>
           <w:sz w:val="24"/>
           <w:szCs w:val="24"/>
         </w:rPr>
         <w:lastRenderedPageBreak/>
-        <w:t>Finalmente, el desarrollo de sistemas web institucionales requiere una visión evolutiva. Las necesidades académicas pueden cambiar: nuevos formatos de proyecto, criterios de revisión, perfiles de usuario o reportes institucionales. Por eso, la solución debe construirse con módulos mantenibles y reglas configurables cuando sea posible. Un sistema diseñado de esta forma puede crecer sin perder estabilidad, permitiendo que la carrera incorpore mejoras progresivas y mantenga la plataforma alineada con sus procesos académicos.</w:t>
+        <w:t>seguimiento y revisión funcionen de acuerdo con las reglas académicas definidas por la carrera.</w:t>
       </w:r>
     </w:p>
     <w:p>
       <w:pPr>
         <w:spacing w:before="240" w:line="360" w:lineRule="auto"/>
+        <w:ind w:left="708" w:firstLine="708"/>
         <w:jc w:val="both"/>
         <w:rPr>
           <w:rFonts w:ascii="Times New Roman" w:hAnsi="Times New Roman" w:cs="Times New Roman"/>
@@ -2989,14 +3075,186 @@
       <w:r>
         <w:rPr>
           <w:rFonts w:ascii="Times New Roman" w:hAnsi="Times New Roman" w:cs="Times New Roman"/>
+          <w:sz w:val="24"/>
+          <w:szCs w:val="24"/>
+        </w:rPr>
+        <w:t>La validación responde a una pregunta central: el sistema construido, ¿resuelve el problema institucional para el que fue diseñado? Para responderla, se deben contrastar las funcionalidades con los casos de uso reales. Por ejemplo, un estudiante debe poder registrar un proyecto, cargar un documento y consultar observaciones; un tutor debe revisar avances y emitir recomendaciones; un revisor debe aprobar o devolver documentos; y la coordinación debe consultar reportes de estado. Si el sistema permite estas acciones de manera coherente, trazable y comprensible, la validación funcional se fortalece.</w:t>
+      </w:r>
+    </w:p>
+    <w:p>
+      <w:pPr>
+        <w:spacing w:before="240" w:line="360" w:lineRule="auto"/>
+        <w:ind w:left="708" w:firstLine="708"/>
+        <w:jc w:val="both"/>
+        <w:rPr>
+          <w:rFonts w:ascii="Times New Roman" w:hAnsi="Times New Roman" w:cs="Times New Roman"/>
           <w:b/>
           <w:bCs/>
           <w:sz w:val="24"/>
           <w:szCs w:val="24"/>
         </w:rPr>
-        <w:t>7.5 Validación y pruebas de software</w:t>
-      </w:r>
-      <w:r>
+      </w:pPr>
+      <w:r>
+        <w:rPr>
+          <w:rFonts w:ascii="Times New Roman" w:hAnsi="Times New Roman" w:cs="Times New Roman"/>
+          <w:sz w:val="24"/>
+          <w:szCs w:val="24"/>
+        </w:rPr>
+        <w:t xml:space="preserve">Las pruebas deben planificarse con criterio, porque </w:t>
+      </w:r>
+      <w:r>
+        <w:rPr>
+          <w:rFonts w:ascii="Times New Roman" w:hAnsi="Times New Roman" w:cs="Times New Roman"/>
+          <w:sz w:val="24"/>
+          <w:szCs w:val="24"/>
+        </w:rPr>
+        <w:fldChar w:fldCharType="begin"/>
+      </w:r>
+      <w:r>
+        <w:rPr>
+          <w:rFonts w:ascii="Times New Roman" w:hAnsi="Times New Roman" w:cs="Times New Roman"/>
+          <w:sz w:val="24"/>
+          <w:szCs w:val="24"/>
+        </w:rPr>
+        <w:instrText xml:space="preserve"> ADDIN ZOTERO_ITEM CSL_CITATION {"citationID":"UnCn2Pjh","properties":{"unsorted":false,"formattedCitation":"(Kuhn et\\uc0\\u160{}al., 2004)","plainCitation":"(Kuhn et al., 2004)","noteIndex":0},"citationItems":[{"id":3,"uris":["http://zotero.org/users/local/SB3Xbe6I/items/U3Q9CVXE"],"itemData":{"id":3,"type":"article-journal","container-title":"IEEE Transactions on Software Engineering","DOI":"10.1109/TSE.2004.24","ISSN":"0098-5589","issue":"6","journalAbbreviation":"IIEEE Trans. Software Eng.","language":"en","license":"https://ieeexplore.ieee.org/Xplorehelp/downloads/license-information/IEEE.html","page":"418-421","source":"DOI.org (Crossref)","title":"Software fault interactions and implications for software testing","volume":"30","author":[{"family":"Kuhn","given":"D.R."},{"family":"Wallace","given":"D.R."},{"family":"Gallo","given":"A.M."}],"issued":{"date-parts":[["2004",6]]}}}],"schema":"https://github.com/citation-style-language/schema/raw/master/csl-citation.json"} </w:instrText>
+      </w:r>
+      <w:r>
+        <w:rPr>
+          <w:rFonts w:ascii="Times New Roman" w:hAnsi="Times New Roman" w:cs="Times New Roman"/>
+          <w:sz w:val="24"/>
+          <w:szCs w:val="24"/>
+        </w:rPr>
+        <w:fldChar w:fldCharType="separate"/>
+      </w:r>
+      <w:r>
+        <w:rPr>
+          <w:rFonts w:ascii="Times New Roman" w:hAnsi="Times New Roman" w:cs="Times New Roman"/>
+          <w:kern w:val="0"/>
+          <w:sz w:val="24"/>
+          <w:szCs w:val="24"/>
+        </w:rPr>
+        <w:t>(Kuhn et al., 2004)</w:t>
+      </w:r>
+      <w:r>
+        <w:rPr>
+          <w:rFonts w:ascii="Times New Roman" w:hAnsi="Times New Roman" w:cs="Times New Roman"/>
+          <w:sz w:val="24"/>
+          <w:szCs w:val="24"/>
+        </w:rPr>
+        <w:fldChar w:fldCharType="end"/>
+      </w:r>
+      <w:r>
+        <w:rPr>
+          <w:rFonts w:ascii="Times New Roman" w:hAnsi="Times New Roman" w:cs="Times New Roman"/>
+          <w:sz w:val="24"/>
+          <w:szCs w:val="24"/>
+        </w:rPr>
+        <w:t xml:space="preserve"> </w:t>
+      </w:r>
+      <w:r>
+        <w:rPr>
+          <w:rFonts w:ascii="Times New Roman" w:hAnsi="Times New Roman" w:cs="Times New Roman"/>
+          <w:sz w:val="24"/>
+          <w:szCs w:val="24"/>
+        </w:rPr>
+        <w:t xml:space="preserve">recuerdan que "exhaustive </w:t>
+      </w:r>
+      <w:proofErr w:type="spellStart"/>
+      <w:r>
+        <w:rPr>
+          <w:rFonts w:ascii="Times New Roman" w:hAnsi="Times New Roman" w:cs="Times New Roman"/>
+          <w:sz w:val="24"/>
+          <w:szCs w:val="24"/>
+        </w:rPr>
+        <w:t>testing</w:t>
+      </w:r>
+      <w:proofErr w:type="spellEnd"/>
+      <w:r>
+        <w:rPr>
+          <w:rFonts w:ascii="Times New Roman" w:hAnsi="Times New Roman" w:cs="Times New Roman"/>
+          <w:sz w:val="24"/>
+          <w:szCs w:val="24"/>
+        </w:rPr>
+        <w:t xml:space="preserve"> </w:t>
+      </w:r>
+      <w:proofErr w:type="spellStart"/>
+      <w:r>
+        <w:rPr>
+          <w:rFonts w:ascii="Times New Roman" w:hAnsi="Times New Roman" w:cs="Times New Roman"/>
+          <w:sz w:val="24"/>
+          <w:szCs w:val="24"/>
+        </w:rPr>
+        <w:t>of</w:t>
+      </w:r>
+      <w:proofErr w:type="spellEnd"/>
+      <w:r>
+        <w:rPr>
+          <w:rFonts w:ascii="Times New Roman" w:hAnsi="Times New Roman" w:cs="Times New Roman"/>
+          <w:sz w:val="24"/>
+          <w:szCs w:val="24"/>
+        </w:rPr>
+        <w:t xml:space="preserve"> </w:t>
+      </w:r>
+      <w:proofErr w:type="spellStart"/>
+      <w:r>
+        <w:rPr>
+          <w:rFonts w:ascii="Times New Roman" w:hAnsi="Times New Roman" w:cs="Times New Roman"/>
+          <w:sz w:val="24"/>
+          <w:szCs w:val="24"/>
+        </w:rPr>
+        <w:t>computer</w:t>
+      </w:r>
+      <w:proofErr w:type="spellEnd"/>
+      <w:r>
+        <w:rPr>
+          <w:rFonts w:ascii="Times New Roman" w:hAnsi="Times New Roman" w:cs="Times New Roman"/>
+          <w:sz w:val="24"/>
+          <w:szCs w:val="24"/>
+        </w:rPr>
+        <w:t xml:space="preserve"> software </w:t>
+      </w:r>
+      <w:proofErr w:type="spellStart"/>
+      <w:r>
+        <w:rPr>
+          <w:rFonts w:ascii="Times New Roman" w:hAnsi="Times New Roman" w:cs="Times New Roman"/>
+          <w:sz w:val="24"/>
+          <w:szCs w:val="24"/>
+        </w:rPr>
+        <w:t>is</w:t>
+      </w:r>
+      <w:proofErr w:type="spellEnd"/>
+      <w:r>
+        <w:rPr>
+          <w:rFonts w:ascii="Times New Roman" w:hAnsi="Times New Roman" w:cs="Times New Roman"/>
+          <w:sz w:val="24"/>
+          <w:szCs w:val="24"/>
+        </w:rPr>
+        <w:t xml:space="preserve"> </w:t>
+      </w:r>
+      <w:proofErr w:type="spellStart"/>
+      <w:r>
+        <w:rPr>
+          <w:rFonts w:ascii="Times New Roman" w:hAnsi="Times New Roman" w:cs="Times New Roman"/>
+          <w:sz w:val="24"/>
+          <w:szCs w:val="24"/>
+        </w:rPr>
+        <w:t>intractable</w:t>
+      </w:r>
+      <w:proofErr w:type="spellEnd"/>
+      <w:r>
+        <w:rPr>
+          <w:rFonts w:ascii="Times New Roman" w:hAnsi="Times New Roman" w:cs="Times New Roman"/>
+          <w:sz w:val="24"/>
+          <w:szCs w:val="24"/>
+        </w:rPr>
+        <w:t>" (p. 418). Esta limitación obliga a seleccionar escenarios representativos y de alto impacto, especialmente aquellos relacionados con permisos, carga de documentos, cambios de estado, revisión de entregas y generación de reportes. En otras palabras, el sistema debe probarse en función de los riesgos más relevantes para la operación académica.</w:t>
+      </w:r>
+    </w:p>
+    <w:p>
+      <w:pPr>
+        <w:spacing w:before="240" w:line="360" w:lineRule="auto"/>
+        <w:ind w:left="708" w:firstLine="708"/>
+        <w:jc w:val="both"/>
         <w:rPr>
           <w:rFonts w:ascii="Times New Roman" w:hAnsi="Times New Roman" w:cs="Times New Roman"/>
           <w:b/>
@@ -3004,13 +3262,20 @@
           <w:sz w:val="24"/>
           <w:szCs w:val="24"/>
         </w:rPr>
-        <w:t>.</w:t>
+      </w:pPr>
+      <w:r>
+        <w:rPr>
+          <w:rFonts w:ascii="Times New Roman" w:hAnsi="Times New Roman" w:cs="Times New Roman"/>
+          <w:sz w:val="24"/>
+          <w:szCs w:val="24"/>
+        </w:rPr>
+        <w:t>Las pruebas de software pueden organizarse en varios niveles. Las pruebas unitarias revisan componentes específicos, como validaciones de campos o funciones de cambio de estado. Las pruebas de integración comprueban que módulos distintos trabajen correctamente entre sí, por ejemplo, que la carga de un documento actualice el historial del proyecto y notifique al revisor. Las pruebas de sistema evalúan la plataforma completa en condiciones similares al uso real. Las pruebas de aceptación permiten que usuarios representativos confirmen si el sistema satisface las necesidades académicas.</w:t>
       </w:r>
     </w:p>
     <w:p>
       <w:pPr>
         <w:spacing w:before="240" w:line="360" w:lineRule="auto"/>
-        <w:ind w:firstLine="708"/>
+        <w:ind w:left="708" w:firstLine="708"/>
         <w:jc w:val="both"/>
         <w:rPr>
           <w:rFonts w:ascii="Times New Roman" w:hAnsi="Times New Roman" w:cs="Times New Roman"/>
@@ -3026,13 +3291,22 @@
           <w:sz w:val="24"/>
           <w:szCs w:val="24"/>
         </w:rPr>
-        <w:t>La validación y las pruebas de software son actividades orientadas a comprobar que un sistema cumple con los requerimientos establecidos y responde de forma adecuada a las necesidades de sus usuarios. En una plataforma institucional para proyectos académicos, las pruebas no se limitan a verificar que las pantallas carguen correctamente; deben comprobar que los flujos de gestión documental, seguimiento y revisión funcionen de acuerdo con las reglas académicas definidas por la carrera.</w:t>
+        <w:t xml:space="preserve">En este tipo de plataforma, la seguridad debe formar parte de la estrategia de pruebas. Los documentos académicos pueden contener información sensible, por lo que se deben validar permisos de acceso, autenticación, restricciones por rol y protección frente a acciones no autorizadas. Un estudiante no debería acceder a documentos de otro proyecto; un revisor no debería modificar registros </w:t>
+      </w:r>
+      <w:r>
+        <w:rPr>
+          <w:rFonts w:ascii="Times New Roman" w:hAnsi="Times New Roman" w:cs="Times New Roman"/>
+          <w:sz w:val="24"/>
+          <w:szCs w:val="24"/>
+        </w:rPr>
+        <w:lastRenderedPageBreak/>
+        <w:t>administrativos; y un usuario sin sesión activa no debería consultar información interna.</w:t>
       </w:r>
     </w:p>
     <w:p>
       <w:pPr>
         <w:spacing w:before="240" w:line="360" w:lineRule="auto"/>
-        <w:ind w:firstLine="708"/>
+        <w:ind w:left="708" w:firstLine="708"/>
         <w:jc w:val="both"/>
         <w:rPr>
           <w:rFonts w:ascii="Times New Roman" w:hAnsi="Times New Roman" w:cs="Times New Roman"/>
@@ -3048,257 +3322,13 @@
           <w:sz w:val="24"/>
           <w:szCs w:val="24"/>
         </w:rPr>
-        <w:t>La validación responde a una pregunta central: el sistema construido, ¿resuelve el problema institucional para el que fue diseñado? Para responderla, se deben contrastar las funcionalidades con los casos de uso reales. Por ejemplo, un estudiante debe poder registrar un proyecto, cargar un documento y consultar observaciones; un tutor debe revisar avances y emitir recomendaciones; un revisor debe aprobar o devolver documentos; y la coordinación debe consultar reportes de estado. Si el sistema permite estas acciones de manera coherente, trazable y comprensible, la validación funcional se fortalece.</w:t>
+        <w:t>La usabilidad también debe probarse. Una plataforma puede cumplir técnicamente sus funciones y, aun así, fallar si los usuarios no entienden cómo operar el flujo. Por ello, se recomienda realizar pruebas con estudiantes, docentes y coordinadores, observando tiempos de ejecución, errores frecuentes, comprensión de etiquetas y facilidad para localizar documentos. Estas pruebas permiten corregir problemas antes de la implementación institucional.</w:t>
       </w:r>
     </w:p>
     <w:p>
       <w:pPr>
         <w:spacing w:before="240" w:line="360" w:lineRule="auto"/>
-        <w:ind w:firstLine="708"/>
-        <w:jc w:val="both"/>
-        <w:rPr>
-          <w:rFonts w:ascii="Times New Roman" w:hAnsi="Times New Roman" w:cs="Times New Roman"/>
-          <w:b/>
-          <w:bCs/>
-          <w:sz w:val="24"/>
-          <w:szCs w:val="24"/>
-        </w:rPr>
-      </w:pPr>
-      <w:r>
-        <w:rPr>
-          <w:rFonts w:ascii="Times New Roman" w:hAnsi="Times New Roman" w:cs="Times New Roman"/>
-          <w:sz w:val="24"/>
-          <w:szCs w:val="24"/>
-        </w:rPr>
-        <w:t xml:space="preserve">Las pruebas deben planificarse con criterio, porque </w:t>
-      </w:r>
-      <w:r>
-        <w:rPr>
-          <w:rFonts w:ascii="Times New Roman" w:hAnsi="Times New Roman" w:cs="Times New Roman"/>
-          <w:sz w:val="24"/>
-          <w:szCs w:val="24"/>
-        </w:rPr>
-        <w:fldChar w:fldCharType="begin"/>
-      </w:r>
-      <w:r>
-        <w:rPr>
-          <w:rFonts w:ascii="Times New Roman" w:hAnsi="Times New Roman" w:cs="Times New Roman"/>
-          <w:sz w:val="24"/>
-          <w:szCs w:val="24"/>
-        </w:rPr>
-        <w:instrText xml:space="preserve"> ADDIN ZOTERO_ITEM CSL_CITATION {"citationID":"UnCn2Pjh","properties":{"unsorted":false,"formattedCitation":"(Kuhn et\\uc0\\u160{}al., 2004)","plainCitation":"(Kuhn et al., 2004)","noteIndex":0},"citationItems":[{"id":3,"uris":["http://zotero.org/users/local/SB3Xbe6I/items/U3Q9CVXE"],"itemData":{"id":3,"type":"article-journal","container-title":"IEEE Transactions on Software Engineering","DOI":"10.1109/TSE.2004.24","ISSN":"0098-5589","issue":"6","journalAbbreviation":"IIEEE Trans. Software Eng.","language":"en","license":"https://ieeexplore.ieee.org/Xplorehelp/downloads/license-information/IEEE.html","page":"418-421","source":"DOI.org (Crossref)","title":"Software fault interactions and implications for software testing","volume":"30","author":[{"family":"Kuhn","given":"D.R."},{"family":"Wallace","given":"D.R."},{"family":"Gallo","given":"A.M."}],"issued":{"date-parts":[["2004",6]]}}}],"schema":"https://github.com/citation-style-language/schema/raw/master/csl-citation.json"} </w:instrText>
-      </w:r>
-      <w:r>
-        <w:rPr>
-          <w:rFonts w:ascii="Times New Roman" w:hAnsi="Times New Roman" w:cs="Times New Roman"/>
-          <w:sz w:val="24"/>
-          <w:szCs w:val="24"/>
-        </w:rPr>
-        <w:fldChar w:fldCharType="separate"/>
-      </w:r>
-      <w:r>
-        <w:rPr>
-          <w:rFonts w:ascii="Times New Roman" w:hAnsi="Times New Roman" w:cs="Times New Roman"/>
-          <w:kern w:val="0"/>
-          <w:sz w:val="24"/>
-          <w:szCs w:val="24"/>
-        </w:rPr>
-        <w:t>(Kuhn et al., 2004)</w:t>
-      </w:r>
-      <w:r>
-        <w:rPr>
-          <w:rFonts w:ascii="Times New Roman" w:hAnsi="Times New Roman" w:cs="Times New Roman"/>
-          <w:sz w:val="24"/>
-          <w:szCs w:val="24"/>
-        </w:rPr>
-        <w:fldChar w:fldCharType="end"/>
-      </w:r>
-      <w:r>
-        <w:rPr>
-          <w:rFonts w:ascii="Times New Roman" w:hAnsi="Times New Roman" w:cs="Times New Roman"/>
-          <w:sz w:val="24"/>
-          <w:szCs w:val="24"/>
-        </w:rPr>
-        <w:t xml:space="preserve"> </w:t>
-      </w:r>
-      <w:r>
-        <w:rPr>
-          <w:rFonts w:ascii="Times New Roman" w:hAnsi="Times New Roman" w:cs="Times New Roman"/>
-          <w:sz w:val="24"/>
-          <w:szCs w:val="24"/>
-        </w:rPr>
-        <w:t xml:space="preserve">recuerdan que "exhaustive </w:t>
-      </w:r>
-      <w:proofErr w:type="spellStart"/>
-      <w:r>
-        <w:rPr>
-          <w:rFonts w:ascii="Times New Roman" w:hAnsi="Times New Roman" w:cs="Times New Roman"/>
-          <w:sz w:val="24"/>
-          <w:szCs w:val="24"/>
-        </w:rPr>
-        <w:t>testing</w:t>
-      </w:r>
-      <w:proofErr w:type="spellEnd"/>
-      <w:r>
-        <w:rPr>
-          <w:rFonts w:ascii="Times New Roman" w:hAnsi="Times New Roman" w:cs="Times New Roman"/>
-          <w:sz w:val="24"/>
-          <w:szCs w:val="24"/>
-        </w:rPr>
-        <w:t xml:space="preserve"> </w:t>
-      </w:r>
-      <w:proofErr w:type="spellStart"/>
-      <w:r>
-        <w:rPr>
-          <w:rFonts w:ascii="Times New Roman" w:hAnsi="Times New Roman" w:cs="Times New Roman"/>
-          <w:sz w:val="24"/>
-          <w:szCs w:val="24"/>
-        </w:rPr>
-        <w:t>of</w:t>
-      </w:r>
-      <w:proofErr w:type="spellEnd"/>
-      <w:r>
-        <w:rPr>
-          <w:rFonts w:ascii="Times New Roman" w:hAnsi="Times New Roman" w:cs="Times New Roman"/>
-          <w:sz w:val="24"/>
-          <w:szCs w:val="24"/>
-        </w:rPr>
-        <w:t xml:space="preserve"> </w:t>
-      </w:r>
-      <w:proofErr w:type="spellStart"/>
-      <w:r>
-        <w:rPr>
-          <w:rFonts w:ascii="Times New Roman" w:hAnsi="Times New Roman" w:cs="Times New Roman"/>
-          <w:sz w:val="24"/>
-          <w:szCs w:val="24"/>
-        </w:rPr>
-        <w:t>computer</w:t>
-      </w:r>
-      <w:proofErr w:type="spellEnd"/>
-      <w:r>
-        <w:rPr>
-          <w:rFonts w:ascii="Times New Roman" w:hAnsi="Times New Roman" w:cs="Times New Roman"/>
-          <w:sz w:val="24"/>
-          <w:szCs w:val="24"/>
-        </w:rPr>
-        <w:t xml:space="preserve"> software </w:t>
-      </w:r>
-      <w:proofErr w:type="spellStart"/>
-      <w:r>
-        <w:rPr>
-          <w:rFonts w:ascii="Times New Roman" w:hAnsi="Times New Roman" w:cs="Times New Roman"/>
-          <w:sz w:val="24"/>
-          <w:szCs w:val="24"/>
-        </w:rPr>
-        <w:t>is</w:t>
-      </w:r>
-      <w:proofErr w:type="spellEnd"/>
-      <w:r>
-        <w:rPr>
-          <w:rFonts w:ascii="Times New Roman" w:hAnsi="Times New Roman" w:cs="Times New Roman"/>
-          <w:sz w:val="24"/>
-          <w:szCs w:val="24"/>
-        </w:rPr>
-        <w:t xml:space="preserve"> </w:t>
-      </w:r>
-      <w:proofErr w:type="spellStart"/>
-      <w:r>
-        <w:rPr>
-          <w:rFonts w:ascii="Times New Roman" w:hAnsi="Times New Roman" w:cs="Times New Roman"/>
-          <w:sz w:val="24"/>
-          <w:szCs w:val="24"/>
-        </w:rPr>
-        <w:t>intractable</w:t>
-      </w:r>
-      <w:proofErr w:type="spellEnd"/>
-      <w:r>
-        <w:rPr>
-          <w:rFonts w:ascii="Times New Roman" w:hAnsi="Times New Roman" w:cs="Times New Roman"/>
-          <w:sz w:val="24"/>
-          <w:szCs w:val="24"/>
-        </w:rPr>
-        <w:t>" (p. 418). Esta limitación obliga a seleccionar escenarios representativos y de alto impacto, especialmente aquellos relacionados con permisos, carga de documentos, cambios de estado, revisión de entregas y generación de reportes. En otras palabras, el sistema debe probarse en función de los riesgos más relevantes para la operación académica.</w:t>
-      </w:r>
-    </w:p>
-    <w:p>
-      <w:pPr>
-        <w:spacing w:before="240" w:line="360" w:lineRule="auto"/>
-        <w:ind w:firstLine="708"/>
-        <w:jc w:val="both"/>
-        <w:rPr>
-          <w:rFonts w:ascii="Times New Roman" w:hAnsi="Times New Roman" w:cs="Times New Roman"/>
-          <w:b/>
-          <w:bCs/>
-          <w:sz w:val="24"/>
-          <w:szCs w:val="24"/>
-        </w:rPr>
-      </w:pPr>
-      <w:r>
-        <w:rPr>
-          <w:rFonts w:ascii="Times New Roman" w:hAnsi="Times New Roman" w:cs="Times New Roman"/>
-          <w:sz w:val="24"/>
-          <w:szCs w:val="24"/>
-        </w:rPr>
-        <w:t xml:space="preserve">Las pruebas de software pueden organizarse en varios niveles. Las pruebas unitarias revisan componentes específicos, como validaciones de campos o funciones de cambio de estado. Las pruebas de integración comprueban que módulos distintos trabajen </w:t>
-      </w:r>
-      <w:r>
-        <w:rPr>
-          <w:rFonts w:ascii="Times New Roman" w:hAnsi="Times New Roman" w:cs="Times New Roman"/>
-          <w:sz w:val="24"/>
-          <w:szCs w:val="24"/>
-        </w:rPr>
-        <w:lastRenderedPageBreak/>
-        <w:t>correctamente entre sí, por ejemplo, que la carga de un documento actualice el historial del proyecto y notifique al revisor. Las pruebas de sistema evalúan la plataforma completa en condiciones similares al uso real. Las pruebas de aceptación permiten que usuarios representativos confirmen si el sistema satisface las necesidades académicas.</w:t>
-      </w:r>
-    </w:p>
-    <w:p>
-      <w:pPr>
-        <w:spacing w:before="240" w:line="360" w:lineRule="auto"/>
-        <w:ind w:firstLine="708"/>
-        <w:jc w:val="both"/>
-        <w:rPr>
-          <w:rFonts w:ascii="Times New Roman" w:hAnsi="Times New Roman" w:cs="Times New Roman"/>
-          <w:b/>
-          <w:bCs/>
-          <w:sz w:val="24"/>
-          <w:szCs w:val="24"/>
-        </w:rPr>
-      </w:pPr>
-      <w:r>
-        <w:rPr>
-          <w:rFonts w:ascii="Times New Roman" w:hAnsi="Times New Roman" w:cs="Times New Roman"/>
-          <w:sz w:val="24"/>
-          <w:szCs w:val="24"/>
-        </w:rPr>
-        <w:t>En este tipo de plataforma, la seguridad debe formar parte de la estrategia de pruebas. Los documentos académicos pueden contener información sensible, por lo que se deben validar permisos de acceso, autenticación, restricciones por rol y protección frente a acciones no autorizadas. Un estudiante no debería acceder a documentos de otro proyecto; un revisor no debería modificar registros administrativos; y un usuario sin sesión activa no debería consultar información interna.</w:t>
-      </w:r>
-    </w:p>
-    <w:p>
-      <w:pPr>
-        <w:spacing w:before="240" w:line="360" w:lineRule="auto"/>
-        <w:ind w:firstLine="708"/>
-        <w:jc w:val="both"/>
-        <w:rPr>
-          <w:rFonts w:ascii="Times New Roman" w:hAnsi="Times New Roman" w:cs="Times New Roman"/>
-          <w:b/>
-          <w:bCs/>
-          <w:sz w:val="24"/>
-          <w:szCs w:val="24"/>
-        </w:rPr>
-      </w:pPr>
-      <w:r>
-        <w:rPr>
-          <w:rFonts w:ascii="Times New Roman" w:hAnsi="Times New Roman" w:cs="Times New Roman"/>
-          <w:sz w:val="24"/>
-          <w:szCs w:val="24"/>
-        </w:rPr>
-        <w:t>La usabilidad también debe probarse. Una plataforma puede cumplir técnicamente sus funciones y, aun así, fallar si los usuarios no entienden cómo operar el flujo. Por ello, se recomienda realizar pruebas con estudiantes, docentes y coordinadores, observando tiempos de ejecución, errores frecuentes, comprensión de etiquetas y facilidad para localizar documentos. Estas pruebas permiten corregir problemas antes de la implementación institucional.</w:t>
-      </w:r>
-    </w:p>
-    <w:p>
-      <w:pPr>
-        <w:spacing w:before="240" w:line="360" w:lineRule="auto"/>
-        <w:ind w:firstLine="360"/>
+        <w:ind w:left="708" w:firstLine="360"/>
         <w:jc w:val="both"/>
         <w:rPr>
           <w:rFonts w:ascii="Times New Roman" w:hAnsi="Times New Roman" w:cs="Times New Roman"/>
@@ -3365,17 +3395,7 @@
           <w:szCs w:val="24"/>
           <w:lang w:val="es-ES"/>
         </w:rPr>
-        <w:t xml:space="preserve">La presente investigación se desarrolla bajo un enfoque metodológico orientado a conocer, analizar y describir la situación actual relacionada con la gestión documental de proyectos académicos en la Carrera de Desarrollo de Software del Instituto Superior Tecnológico “El Libertador”. El estudio parte de la necesidad de identificar cómo se gestionan actualmente los documentos, observaciones, avances y procesos de revisión entre </w:t>
-      </w:r>
-      <w:r>
-        <w:rPr>
-          <w:rFonts w:ascii="Times New Roman" w:hAnsi="Times New Roman" w:cs="Times New Roman"/>
-          <w:sz w:val="24"/>
-          <w:szCs w:val="24"/>
-          <w:lang w:val="es-ES"/>
-        </w:rPr>
-        <w:lastRenderedPageBreak/>
-        <w:t>estudiantes y docentes, considerando que estas actividades se realizan mediante encuentros presenciales, aplicaciones de mensajería, correos electrónicos y otros medios dispersos.</w:t>
+        <w:t>La presente investigación se desarrolla bajo un enfoque metodológico orientado a conocer, analizar y describir la situación actual relacionada con la gestión documental de proyectos académicos en la Carrera de Desarrollo de Software del Instituto Superior Tecnológico “El Libertador”. El estudio parte de la necesidad de identificar cómo se gestionan actualmente los documentos, observaciones, avances y procesos de revisión entre estudiantes y docentes, considerando que estas actividades se realizan mediante encuentros presenciales, aplicaciones de mensajería, correos electrónicos y otros medios dispersos.</w:t>
       </w:r>
     </w:p>
     <w:p>
@@ -3400,13 +3420,24 @@
           <w:szCs w:val="24"/>
           <w:lang w:val="es-ES"/>
         </w:rPr>
+        <w:t xml:space="preserve">     </w:t>
+      </w:r>
+      <w:r>
+        <w:rPr>
+          <w:rFonts w:ascii="Times New Roman" w:hAnsi="Times New Roman" w:cs="Times New Roman"/>
+          <w:b/>
+          <w:bCs/>
+          <w:sz w:val="24"/>
+          <w:szCs w:val="24"/>
+          <w:lang w:val="es-ES"/>
+        </w:rPr>
         <w:t>8.1 MÉTODOS</w:t>
       </w:r>
     </w:p>
     <w:p>
       <w:pPr>
         <w:spacing w:before="240" w:line="360" w:lineRule="auto"/>
-        <w:ind w:firstLine="708"/>
+        <w:ind w:left="708" w:firstLine="708"/>
         <w:jc w:val="both"/>
         <w:rPr>
           <w:rFonts w:ascii="Times New Roman" w:hAnsi="Times New Roman" w:cs="Times New Roman"/>
@@ -3422,13 +3453,23 @@
           <w:szCs w:val="24"/>
           <w:lang w:val="es-ES"/>
         </w:rPr>
-        <w:t>Para el desarrollo de esta investigación se aplicará el método descriptivo, debido a que permitirá caracterizar la situación actual de los procesos de gestión documental de los proyectos académicos, a través de este método se podrá identificar cómo se realizan actualmente las actividades, qué dificultades enfrentan los estudiantes y docentes, y cuáles son las necesidades que deben ser consideradas para la propuesta tecnológica.</w:t>
+        <w:t xml:space="preserve">Para el desarrollo de esta investigación se aplicará el método descriptivo, debido a que permitirá caracterizar la situación actual de los procesos de gestión documental de los proyectos académicos, a través de este método se podrá identificar cómo se realizan actualmente las actividades, qué dificultades enfrentan los </w:t>
+      </w:r>
+      <w:r>
+        <w:rPr>
+          <w:rFonts w:ascii="Times New Roman" w:hAnsi="Times New Roman" w:cs="Times New Roman"/>
+          <w:sz w:val="24"/>
+          <w:szCs w:val="24"/>
+          <w:lang w:val="es-ES"/>
+        </w:rPr>
+        <w:lastRenderedPageBreak/>
+        <w:t>estudiantes y docentes, y cuáles son las necesidades que deben ser consideradas para la propuesta tecnológica.</w:t>
       </w:r>
     </w:p>
     <w:p>
       <w:pPr>
         <w:spacing w:line="360" w:lineRule="auto"/>
-        <w:ind w:firstLine="708"/>
+        <w:ind w:left="708" w:firstLine="708"/>
         <w:jc w:val="both"/>
         <w:rPr>
           <w:rFonts w:ascii="Times New Roman" w:hAnsi="Times New Roman" w:cs="Times New Roman"/>
@@ -3450,7 +3491,7 @@
     <w:p>
       <w:pPr>
         <w:spacing w:line="360" w:lineRule="auto"/>
-        <w:ind w:firstLine="708"/>
+        <w:ind w:left="708" w:firstLine="708"/>
         <w:jc w:val="both"/>
         <w:rPr>
           <w:rFonts w:ascii="Times New Roman" w:hAnsi="Times New Roman" w:cs="Times New Roman"/>
@@ -3491,13 +3532,24 @@
           <w:szCs w:val="24"/>
           <w:lang w:val="es-ES"/>
         </w:rPr>
+        <w:t xml:space="preserve">     </w:t>
+      </w:r>
+      <w:r>
+        <w:rPr>
+          <w:rFonts w:ascii="Times New Roman" w:hAnsi="Times New Roman" w:cs="Times New Roman"/>
+          <w:b/>
+          <w:bCs/>
+          <w:sz w:val="24"/>
+          <w:szCs w:val="24"/>
+          <w:lang w:val="es-ES"/>
+        </w:rPr>
         <w:t>8.2 TÉCNICAS</w:t>
       </w:r>
     </w:p>
     <w:p>
       <w:pPr>
         <w:spacing w:before="240" w:line="360" w:lineRule="auto"/>
-        <w:ind w:firstLine="708"/>
+        <w:ind w:left="708" w:firstLine="708"/>
         <w:jc w:val="both"/>
         <w:rPr>
           <w:rFonts w:ascii="Times New Roman" w:hAnsi="Times New Roman" w:cs="Times New Roman"/>
@@ -3519,7 +3571,7 @@
     <w:p>
       <w:pPr>
         <w:spacing w:line="360" w:lineRule="auto"/>
-        <w:ind w:firstLine="708"/>
+        <w:ind w:left="708" w:firstLine="708"/>
         <w:jc w:val="both"/>
         <w:rPr>
           <w:rFonts w:ascii="Times New Roman" w:hAnsi="Times New Roman" w:cs="Times New Roman"/>
@@ -3541,7 +3593,7 @@
     <w:p>
       <w:pPr>
         <w:spacing w:before="240" w:after="0" w:line="360" w:lineRule="auto"/>
-        <w:ind w:firstLine="708"/>
+        <w:ind w:left="708" w:firstLine="708"/>
         <w:jc w:val="both"/>
         <w:rPr>
           <w:rFonts w:ascii="Times New Roman" w:hAnsi="Times New Roman" w:cs="Times New Roman"/>
@@ -3557,7 +3609,6 @@
           <w:szCs w:val="24"/>
           <w:lang w:val="es-ES"/>
         </w:rPr>
-        <w:lastRenderedPageBreak/>
         <w:t>En correspondencia con el método inductivo, se empleará la entrevista dirigida a docentes o responsables académicos vinculados con la revisión y seguimiento de proyectos, con el fin de recoger criterios, experiencias y necesidades específicas de los actores involucrados, para posteriormente establecer conclusiones generales sobre los requerimientos que debe considerar la plataforma web institucional.</w:t>
       </w:r>
     </w:p>
@@ -3583,12 +3634,25 @@
           <w:szCs w:val="24"/>
           <w:lang w:val="es-ES"/>
         </w:rPr>
+        <w:lastRenderedPageBreak/>
+        <w:t xml:space="preserve">      </w:t>
+      </w:r>
+      <w:r>
+        <w:rPr>
+          <w:rFonts w:ascii="Times New Roman" w:hAnsi="Times New Roman" w:cs="Times New Roman"/>
+          <w:b/>
+          <w:bCs/>
+          <w:sz w:val="24"/>
+          <w:szCs w:val="24"/>
+          <w:lang w:val="es-ES"/>
+        </w:rPr>
         <w:t>8.3 INSTRUMENTOS</w:t>
       </w:r>
     </w:p>
     <w:p>
       <w:pPr>
         <w:spacing w:before="240" w:line="360" w:lineRule="auto"/>
+        <w:ind w:left="708"/>
         <w:jc w:val="both"/>
         <w:rPr>
           <w:rFonts w:ascii="Times New Roman" w:hAnsi="Times New Roman" w:cs="Times New Roman"/>
@@ -3614,7 +3678,7 @@
     <w:p>
       <w:pPr>
         <w:spacing w:before="240" w:line="360" w:lineRule="auto"/>
-        <w:ind w:firstLine="708"/>
+        <w:ind w:left="708" w:firstLine="708"/>
         <w:jc w:val="both"/>
         <w:rPr>
           <w:rFonts w:ascii="Times New Roman" w:hAnsi="Times New Roman" w:cs="Times New Roman"/>
@@ -3636,6 +3700,7 @@
     <w:p>
       <w:pPr>
         <w:spacing w:line="360" w:lineRule="auto"/>
+        <w:ind w:left="708"/>
         <w:jc w:val="both"/>
         <w:rPr>
           <w:rFonts w:ascii="Times New Roman" w:hAnsi="Times New Roman" w:cs="Times New Roman"/>
@@ -3661,7 +3726,7 @@
     <w:p>
       <w:pPr>
         <w:spacing w:line="360" w:lineRule="auto"/>
-        <w:ind w:firstLine="708"/>
+        <w:ind w:left="708" w:firstLine="708"/>
         <w:jc w:val="both"/>
         <w:rPr>
           <w:rFonts w:ascii="Times New Roman" w:hAnsi="Times New Roman" w:cs="Times New Roman"/>
@@ -3683,6 +3748,7 @@
     <w:p>
       <w:pPr>
         <w:spacing w:line="360" w:lineRule="auto"/>
+        <w:ind w:left="708"/>
         <w:jc w:val="both"/>
         <w:rPr>
           <w:rFonts w:ascii="Times New Roman" w:hAnsi="Times New Roman" w:cs="Times New Roman"/>
@@ -3708,7 +3774,7 @@
     <w:p>
       <w:pPr>
         <w:spacing w:line="360" w:lineRule="auto"/>
-        <w:ind w:firstLine="360"/>
+        <w:ind w:left="708" w:firstLine="360"/>
         <w:jc w:val="both"/>
         <w:rPr>
           <w:rFonts w:ascii="Times New Roman" w:hAnsi="Times New Roman" w:cs="Times New Roman"/>
@@ -3727,50 +3793,760 @@
         <w:t>Para la técnica de entrevista se utilizará una guía de entrevista, que contendrá preguntas dirigidas a docentes o responsables académicos, con el propósito de conocer sus experiencias en la revisión de proyectos, el registro de observaciones, el control de avances y las necesidades institucionales relacionadas con la gestión documental.</w:t>
       </w:r>
     </w:p>
-    <w:p>
-      <w:pPr>
-        <w:rPr>
-          <w:rFonts w:ascii="Times New Roman" w:hAnsi="Times New Roman" w:cs="Times New Roman"/>
-          <w:sz w:val="24"/>
-          <w:szCs w:val="24"/>
-          <w:lang w:val="es-ES"/>
-        </w:rPr>
-      </w:pPr>
-      <w:r>
-        <w:rPr>
-          <w:rFonts w:ascii="Times New Roman" w:hAnsi="Times New Roman" w:cs="Times New Roman"/>
-          <w:sz w:val="24"/>
-          <w:szCs w:val="24"/>
-          <w:lang w:val="es-ES"/>
-        </w:rPr>
-        <w:br w:type="page"/>
-      </w:r>
-    </w:p>
-    <w:p>
-      <w:pPr>
-        <w:spacing w:after="0" w:line="360" w:lineRule="auto"/>
-        <w:jc w:val="both"/>
-        <w:rPr>
-          <w:rFonts w:ascii="Times New Roman" w:hAnsi="Times New Roman" w:cs="Times New Roman"/>
-          <w:sz w:val="24"/>
-          <w:szCs w:val="24"/>
-          <w:lang w:val="es-ES"/>
-        </w:rPr>
-      </w:pPr>
-    </w:p>
-    <w:p>
-      <w:pPr>
-        <w:pStyle w:val="Prrafodelista"/>
-        <w:rPr>
-          <w:rFonts w:ascii="Times New Roman" w:hAnsi="Times New Roman" w:cs="Times New Roman"/>
-          <w:b/>
-          <w:bCs/>
-          <w:sz w:val="24"/>
-          <w:szCs w:val="24"/>
-          <w:lang w:val="es-ES"/>
-        </w:rPr>
-      </w:pPr>
-    </w:p>
+    <w:tbl>
+      <w:tblPr>
+        <w:tblStyle w:val="Tablaconcuadrcula"/>
+        <w:tblpPr w:leftFromText="141" w:rightFromText="141" w:vertAnchor="text" w:horzAnchor="margin" w:tblpY="675"/>
+        <w:tblW w:w="8217" w:type="dxa"/>
+        <w:tblLook w:val="04A0" w:firstRow="1" w:lastRow="0" w:firstColumn="1" w:lastColumn="0" w:noHBand="0" w:noVBand="1"/>
+      </w:tblPr>
+      <w:tblGrid>
+        <w:gridCol w:w="5986"/>
+        <w:gridCol w:w="2231"/>
+      </w:tblGrid>
+      <w:tr>
+        <w:trPr>
+          <w:trHeight w:val="283"/>
+        </w:trPr>
+        <w:tc>
+          <w:tcPr>
+            <w:tcW w:w="5986" w:type="dxa"/>
+            <w:tcBorders>
+              <w:top w:val="single" w:sz="4" w:space="0" w:color="auto"/>
+              <w:left w:val="single" w:sz="4" w:space="0" w:color="auto"/>
+              <w:bottom w:val="single" w:sz="4" w:space="0" w:color="auto"/>
+              <w:right w:val="single" w:sz="4" w:space="0" w:color="auto"/>
+            </w:tcBorders>
+            <w:hideMark/>
+          </w:tcPr>
+          <w:p>
+            <w:pPr>
+              <w:spacing w:after="160" w:line="259" w:lineRule="auto"/>
+              <w:rPr>
+                <w:rFonts w:ascii="Times New Roman" w:hAnsi="Times New Roman" w:cs="Times New Roman"/>
+                <w:b/>
+                <w:bCs/>
+                <w:sz w:val="24"/>
+                <w:szCs w:val="24"/>
+              </w:rPr>
+            </w:pPr>
+            <w:r>
+              <w:rPr>
+                <w:rFonts w:ascii="Times New Roman" w:hAnsi="Times New Roman" w:cs="Times New Roman"/>
+                <w:b/>
+                <w:bCs/>
+                <w:sz w:val="24"/>
+                <w:szCs w:val="24"/>
+              </w:rPr>
+              <w:t>Concepto</w:t>
+            </w:r>
+          </w:p>
+        </w:tc>
+        <w:tc>
+          <w:tcPr>
+            <w:tcW w:w="2231" w:type="dxa"/>
+            <w:tcBorders>
+              <w:top w:val="single" w:sz="4" w:space="0" w:color="auto"/>
+              <w:left w:val="single" w:sz="4" w:space="0" w:color="auto"/>
+              <w:bottom w:val="single" w:sz="4" w:space="0" w:color="auto"/>
+              <w:right w:val="single" w:sz="4" w:space="0" w:color="auto"/>
+            </w:tcBorders>
+            <w:hideMark/>
+          </w:tcPr>
+          <w:p>
+            <w:pPr>
+              <w:spacing w:after="160" w:line="259" w:lineRule="auto"/>
+              <w:rPr>
+                <w:rFonts w:ascii="Times New Roman" w:hAnsi="Times New Roman" w:cs="Times New Roman"/>
+                <w:b/>
+                <w:bCs/>
+                <w:sz w:val="24"/>
+                <w:szCs w:val="24"/>
+              </w:rPr>
+            </w:pPr>
+            <w:r>
+              <w:rPr>
+                <w:rFonts w:ascii="Times New Roman" w:hAnsi="Times New Roman" w:cs="Times New Roman"/>
+                <w:b/>
+                <w:bCs/>
+                <w:sz w:val="24"/>
+                <w:szCs w:val="24"/>
+              </w:rPr>
+              <w:t>Costo (USD)</w:t>
+            </w:r>
+          </w:p>
+        </w:tc>
+      </w:tr>
+      <w:tr>
+        <w:trPr>
+          <w:trHeight w:val="416"/>
+        </w:trPr>
+        <w:tc>
+          <w:tcPr>
+            <w:tcW w:w="5986" w:type="dxa"/>
+            <w:tcBorders>
+              <w:top w:val="single" w:sz="4" w:space="0" w:color="auto"/>
+              <w:left w:val="single" w:sz="4" w:space="0" w:color="auto"/>
+              <w:bottom w:val="single" w:sz="4" w:space="0" w:color="auto"/>
+              <w:right w:val="single" w:sz="4" w:space="0" w:color="auto"/>
+            </w:tcBorders>
+            <w:hideMark/>
+          </w:tcPr>
+          <w:p>
+            <w:pPr>
+              <w:spacing w:after="160" w:line="259" w:lineRule="auto"/>
+              <w:rPr>
+                <w:rFonts w:ascii="Times New Roman" w:hAnsi="Times New Roman" w:cs="Times New Roman"/>
+                <w:b/>
+                <w:bCs/>
+                <w:sz w:val="24"/>
+                <w:szCs w:val="24"/>
+              </w:rPr>
+            </w:pPr>
+            <w:r>
+              <w:rPr>
+                <w:rFonts w:ascii="Times New Roman" w:hAnsi="Times New Roman" w:cs="Times New Roman"/>
+                <w:b/>
+                <w:bCs/>
+                <w:sz w:val="24"/>
+                <w:szCs w:val="24"/>
+              </w:rPr>
+              <w:t xml:space="preserve">Costos de Desarrollo de Software </w:t>
+            </w:r>
+          </w:p>
+        </w:tc>
+        <w:tc>
+          <w:tcPr>
+            <w:tcW w:w="2231" w:type="dxa"/>
+            <w:tcBorders>
+              <w:top w:val="single" w:sz="4" w:space="0" w:color="auto"/>
+              <w:left w:val="single" w:sz="4" w:space="0" w:color="auto"/>
+              <w:bottom w:val="single" w:sz="4" w:space="0" w:color="auto"/>
+              <w:right w:val="single" w:sz="4" w:space="0" w:color="auto"/>
+            </w:tcBorders>
+          </w:tcPr>
+          <w:p>
+            <w:pPr>
+              <w:spacing w:after="160" w:line="259" w:lineRule="auto"/>
+              <w:rPr>
+                <w:rFonts w:ascii="Times New Roman" w:hAnsi="Times New Roman" w:cs="Times New Roman"/>
+                <w:b/>
+                <w:bCs/>
+                <w:sz w:val="24"/>
+                <w:szCs w:val="24"/>
+              </w:rPr>
+            </w:pPr>
+          </w:p>
+        </w:tc>
+      </w:tr>
+      <w:tr>
+        <w:trPr>
+          <w:trHeight w:val="415"/>
+        </w:trPr>
+        <w:tc>
+          <w:tcPr>
+            <w:tcW w:w="5986" w:type="dxa"/>
+            <w:tcBorders>
+              <w:top w:val="single" w:sz="4" w:space="0" w:color="auto"/>
+              <w:left w:val="single" w:sz="4" w:space="0" w:color="auto"/>
+              <w:bottom w:val="single" w:sz="4" w:space="0" w:color="auto"/>
+              <w:right w:val="single" w:sz="4" w:space="0" w:color="auto"/>
+            </w:tcBorders>
+            <w:hideMark/>
+          </w:tcPr>
+          <w:p>
+            <w:pPr>
+              <w:spacing w:after="160" w:line="259" w:lineRule="auto"/>
+              <w:rPr>
+                <w:rFonts w:ascii="Times New Roman" w:hAnsi="Times New Roman" w:cs="Times New Roman"/>
+                <w:b/>
+                <w:bCs/>
+                <w:sz w:val="24"/>
+                <w:szCs w:val="24"/>
+              </w:rPr>
+            </w:pPr>
+            <w:r>
+              <w:rPr>
+                <w:rFonts w:ascii="Times New Roman" w:hAnsi="Times New Roman" w:cs="Times New Roman"/>
+                <w:sz w:val="24"/>
+                <w:szCs w:val="24"/>
+              </w:rPr>
+              <w:t>-</w:t>
+            </w:r>
+            <w:r>
+              <w:rPr>
+                <w:rFonts w:ascii="Times New Roman" w:hAnsi="Times New Roman" w:cs="Times New Roman"/>
+                <w:sz w:val="24"/>
+                <w:szCs w:val="24"/>
+              </w:rPr>
+              <w:t>Recursos para desarrollo y pruebas de la plataforma</w:t>
+            </w:r>
+            <w:r>
+              <w:rPr>
+                <w:rFonts w:ascii="Times New Roman" w:hAnsi="Times New Roman" w:cs="Times New Roman"/>
+                <w:b/>
+                <w:bCs/>
+                <w:sz w:val="24"/>
+                <w:szCs w:val="24"/>
+              </w:rPr>
+              <w:t xml:space="preserve"> </w:t>
+            </w:r>
+          </w:p>
+        </w:tc>
+        <w:tc>
+          <w:tcPr>
+            <w:tcW w:w="2231" w:type="dxa"/>
+            <w:tcBorders>
+              <w:top w:val="single" w:sz="4" w:space="0" w:color="auto"/>
+              <w:left w:val="single" w:sz="4" w:space="0" w:color="auto"/>
+              <w:bottom w:val="single" w:sz="4" w:space="0" w:color="auto"/>
+              <w:right w:val="single" w:sz="4" w:space="0" w:color="auto"/>
+            </w:tcBorders>
+            <w:hideMark/>
+          </w:tcPr>
+          <w:p>
+            <w:pPr>
+              <w:spacing w:after="160" w:line="259" w:lineRule="auto"/>
+              <w:rPr>
+                <w:rFonts w:ascii="Times New Roman" w:hAnsi="Times New Roman" w:cs="Times New Roman"/>
+                <w:b/>
+                <w:bCs/>
+                <w:sz w:val="24"/>
+                <w:szCs w:val="24"/>
+              </w:rPr>
+            </w:pPr>
+            <w:r>
+              <w:rPr>
+                <w:rFonts w:ascii="Times New Roman" w:hAnsi="Times New Roman" w:cs="Times New Roman"/>
+                <w:b/>
+                <w:bCs/>
+                <w:sz w:val="24"/>
+                <w:szCs w:val="24"/>
+              </w:rPr>
+              <w:t>$15</w:t>
+            </w:r>
+            <w:r>
+              <w:rPr>
+                <w:rFonts w:ascii="Times New Roman" w:hAnsi="Times New Roman" w:cs="Times New Roman"/>
+                <w:b/>
+                <w:bCs/>
+                <w:sz w:val="24"/>
+                <w:szCs w:val="24"/>
+              </w:rPr>
+              <w:t xml:space="preserve"> </w:t>
+            </w:r>
+          </w:p>
+        </w:tc>
+      </w:tr>
+      <w:tr>
+        <w:trPr>
+          <w:trHeight w:val="415"/>
+        </w:trPr>
+        <w:tc>
+          <w:tcPr>
+            <w:tcW w:w="5986" w:type="dxa"/>
+            <w:tcBorders>
+              <w:top w:val="single" w:sz="4" w:space="0" w:color="auto"/>
+              <w:left w:val="single" w:sz="4" w:space="0" w:color="auto"/>
+              <w:bottom w:val="single" w:sz="4" w:space="0" w:color="auto"/>
+              <w:right w:val="single" w:sz="4" w:space="0" w:color="auto"/>
+            </w:tcBorders>
+          </w:tcPr>
+          <w:p>
+            <w:pPr>
+              <w:rPr>
+                <w:rFonts w:ascii="Times New Roman" w:hAnsi="Times New Roman" w:cs="Times New Roman"/>
+                <w:b/>
+                <w:bCs/>
+                <w:sz w:val="24"/>
+                <w:szCs w:val="24"/>
+              </w:rPr>
+            </w:pPr>
+            <w:r>
+              <w:rPr>
+                <w:rFonts w:ascii="Times New Roman" w:hAnsi="Times New Roman" w:cs="Times New Roman"/>
+                <w:b/>
+                <w:bCs/>
+                <w:sz w:val="24"/>
+                <w:szCs w:val="24"/>
+              </w:rPr>
+              <w:t>Costos de Documentación</w:t>
+            </w:r>
+          </w:p>
+        </w:tc>
+        <w:tc>
+          <w:tcPr>
+            <w:tcW w:w="2231" w:type="dxa"/>
+            <w:tcBorders>
+              <w:top w:val="single" w:sz="4" w:space="0" w:color="auto"/>
+              <w:left w:val="single" w:sz="4" w:space="0" w:color="auto"/>
+              <w:bottom w:val="single" w:sz="4" w:space="0" w:color="auto"/>
+              <w:right w:val="single" w:sz="4" w:space="0" w:color="auto"/>
+            </w:tcBorders>
+          </w:tcPr>
+          <w:p>
+            <w:pPr>
+              <w:rPr>
+                <w:rFonts w:ascii="Times New Roman" w:hAnsi="Times New Roman" w:cs="Times New Roman"/>
+                <w:b/>
+                <w:bCs/>
+                <w:sz w:val="24"/>
+                <w:szCs w:val="24"/>
+              </w:rPr>
+            </w:pPr>
+          </w:p>
+        </w:tc>
+      </w:tr>
+      <w:tr>
+        <w:trPr>
+          <w:trHeight w:val="415"/>
+        </w:trPr>
+        <w:tc>
+          <w:tcPr>
+            <w:tcW w:w="5986" w:type="dxa"/>
+            <w:tcBorders>
+              <w:top w:val="single" w:sz="4" w:space="0" w:color="auto"/>
+              <w:left w:val="single" w:sz="4" w:space="0" w:color="auto"/>
+              <w:bottom w:val="single" w:sz="4" w:space="0" w:color="auto"/>
+              <w:right w:val="single" w:sz="4" w:space="0" w:color="auto"/>
+            </w:tcBorders>
+          </w:tcPr>
+          <w:p>
+            <w:pPr>
+              <w:rPr>
+                <w:rFonts w:ascii="Times New Roman" w:hAnsi="Times New Roman" w:cs="Times New Roman"/>
+                <w:sz w:val="24"/>
+                <w:szCs w:val="24"/>
+              </w:rPr>
+            </w:pPr>
+            <w:r>
+              <w:rPr>
+                <w:rFonts w:ascii="Times New Roman" w:hAnsi="Times New Roman" w:cs="Times New Roman"/>
+                <w:sz w:val="24"/>
+                <w:szCs w:val="24"/>
+              </w:rPr>
+              <w:t>-</w:t>
+            </w:r>
+            <w:r>
+              <w:rPr>
+                <w:rFonts w:ascii="Times New Roman" w:hAnsi="Times New Roman" w:cs="Times New Roman"/>
+                <w:sz w:val="24"/>
+                <w:szCs w:val="24"/>
+              </w:rPr>
+              <w:t>Impresión de informes y anexos del proyecto</w:t>
+            </w:r>
+          </w:p>
+        </w:tc>
+        <w:tc>
+          <w:tcPr>
+            <w:tcW w:w="2231" w:type="dxa"/>
+            <w:tcBorders>
+              <w:top w:val="single" w:sz="4" w:space="0" w:color="auto"/>
+              <w:left w:val="single" w:sz="4" w:space="0" w:color="auto"/>
+              <w:bottom w:val="single" w:sz="4" w:space="0" w:color="auto"/>
+              <w:right w:val="single" w:sz="4" w:space="0" w:color="auto"/>
+            </w:tcBorders>
+          </w:tcPr>
+          <w:p>
+            <w:pPr>
+              <w:rPr>
+                <w:rFonts w:ascii="Times New Roman" w:hAnsi="Times New Roman" w:cs="Times New Roman"/>
+                <w:b/>
+                <w:bCs/>
+                <w:sz w:val="24"/>
+                <w:szCs w:val="24"/>
+              </w:rPr>
+            </w:pPr>
+            <w:r>
+              <w:rPr>
+                <w:rFonts w:ascii="Times New Roman" w:hAnsi="Times New Roman" w:cs="Times New Roman"/>
+                <w:b/>
+                <w:bCs/>
+                <w:sz w:val="24"/>
+                <w:szCs w:val="24"/>
+              </w:rPr>
+              <w:t>$15</w:t>
+            </w:r>
+          </w:p>
+        </w:tc>
+      </w:tr>
+      <w:tr>
+        <w:trPr>
+          <w:trHeight w:val="415"/>
+        </w:trPr>
+        <w:tc>
+          <w:tcPr>
+            <w:tcW w:w="5986" w:type="dxa"/>
+            <w:tcBorders>
+              <w:top w:val="single" w:sz="4" w:space="0" w:color="auto"/>
+              <w:left w:val="single" w:sz="4" w:space="0" w:color="auto"/>
+              <w:bottom w:val="single" w:sz="4" w:space="0" w:color="auto"/>
+              <w:right w:val="single" w:sz="4" w:space="0" w:color="auto"/>
+            </w:tcBorders>
+          </w:tcPr>
+          <w:p>
+            <w:pPr>
+              <w:rPr>
+                <w:rFonts w:ascii="Times New Roman" w:hAnsi="Times New Roman" w:cs="Times New Roman"/>
+                <w:b/>
+                <w:bCs/>
+                <w:sz w:val="24"/>
+                <w:szCs w:val="24"/>
+              </w:rPr>
+            </w:pPr>
+            <w:r>
+              <w:rPr>
+                <w:rFonts w:ascii="Times New Roman" w:hAnsi="Times New Roman" w:cs="Times New Roman"/>
+                <w:b/>
+                <w:bCs/>
+                <w:sz w:val="24"/>
+                <w:szCs w:val="24"/>
+              </w:rPr>
+              <w:t>Costos de Implementación Web</w:t>
+            </w:r>
+          </w:p>
+        </w:tc>
+        <w:tc>
+          <w:tcPr>
+            <w:tcW w:w="2231" w:type="dxa"/>
+            <w:tcBorders>
+              <w:top w:val="single" w:sz="4" w:space="0" w:color="auto"/>
+              <w:left w:val="single" w:sz="4" w:space="0" w:color="auto"/>
+              <w:bottom w:val="single" w:sz="4" w:space="0" w:color="auto"/>
+              <w:right w:val="single" w:sz="4" w:space="0" w:color="auto"/>
+            </w:tcBorders>
+          </w:tcPr>
+          <w:p>
+            <w:pPr>
+              <w:rPr>
+                <w:rFonts w:ascii="Times New Roman" w:hAnsi="Times New Roman" w:cs="Times New Roman"/>
+                <w:b/>
+                <w:bCs/>
+                <w:sz w:val="24"/>
+                <w:szCs w:val="24"/>
+              </w:rPr>
+            </w:pPr>
+          </w:p>
+        </w:tc>
+      </w:tr>
+      <w:tr>
+        <w:trPr>
+          <w:trHeight w:val="415"/>
+        </w:trPr>
+        <w:tc>
+          <w:tcPr>
+            <w:tcW w:w="5986" w:type="dxa"/>
+            <w:tcBorders>
+              <w:top w:val="single" w:sz="4" w:space="0" w:color="auto"/>
+              <w:left w:val="single" w:sz="4" w:space="0" w:color="auto"/>
+              <w:bottom w:val="single" w:sz="4" w:space="0" w:color="auto"/>
+              <w:right w:val="single" w:sz="4" w:space="0" w:color="auto"/>
+            </w:tcBorders>
+          </w:tcPr>
+          <w:p>
+            <w:pPr>
+              <w:rPr>
+                <w:rFonts w:ascii="Times New Roman" w:hAnsi="Times New Roman" w:cs="Times New Roman"/>
+                <w:sz w:val="24"/>
+                <w:szCs w:val="24"/>
+              </w:rPr>
+            </w:pPr>
+            <w:r>
+              <w:rPr>
+                <w:rFonts w:ascii="Times New Roman" w:hAnsi="Times New Roman" w:cs="Times New Roman"/>
+                <w:sz w:val="24"/>
+                <w:szCs w:val="24"/>
+              </w:rPr>
+              <w:t>-</w:t>
+            </w:r>
+            <w:r>
+              <w:rPr>
+                <w:rFonts w:ascii="Times New Roman" w:hAnsi="Times New Roman" w:cs="Times New Roman"/>
+                <w:sz w:val="24"/>
+                <w:szCs w:val="24"/>
+              </w:rPr>
+              <w:t>Dominio y alojamiento web</w:t>
+            </w:r>
+          </w:p>
+        </w:tc>
+        <w:tc>
+          <w:tcPr>
+            <w:tcW w:w="2231" w:type="dxa"/>
+            <w:tcBorders>
+              <w:top w:val="single" w:sz="4" w:space="0" w:color="auto"/>
+              <w:left w:val="single" w:sz="4" w:space="0" w:color="auto"/>
+              <w:bottom w:val="single" w:sz="4" w:space="0" w:color="auto"/>
+              <w:right w:val="single" w:sz="4" w:space="0" w:color="auto"/>
+            </w:tcBorders>
+          </w:tcPr>
+          <w:p>
+            <w:pPr>
+              <w:rPr>
+                <w:rFonts w:ascii="Times New Roman" w:hAnsi="Times New Roman" w:cs="Times New Roman"/>
+                <w:b/>
+                <w:bCs/>
+                <w:sz w:val="24"/>
+                <w:szCs w:val="24"/>
+              </w:rPr>
+            </w:pPr>
+            <w:r>
+              <w:rPr>
+                <w:rFonts w:ascii="Times New Roman" w:hAnsi="Times New Roman" w:cs="Times New Roman"/>
+                <w:b/>
+                <w:bCs/>
+                <w:sz w:val="24"/>
+                <w:szCs w:val="24"/>
+              </w:rPr>
+              <w:t>$40</w:t>
+            </w:r>
+          </w:p>
+        </w:tc>
+      </w:tr>
+      <w:tr>
+        <w:trPr>
+          <w:trHeight w:val="415"/>
+        </w:trPr>
+        <w:tc>
+          <w:tcPr>
+            <w:tcW w:w="5986" w:type="dxa"/>
+            <w:tcBorders>
+              <w:top w:val="single" w:sz="4" w:space="0" w:color="auto"/>
+              <w:left w:val="single" w:sz="4" w:space="0" w:color="auto"/>
+              <w:bottom w:val="single" w:sz="4" w:space="0" w:color="auto"/>
+              <w:right w:val="single" w:sz="4" w:space="0" w:color="auto"/>
+            </w:tcBorders>
+            <w:hideMark/>
+          </w:tcPr>
+          <w:p>
+            <w:pPr>
+              <w:spacing w:after="160" w:line="259" w:lineRule="auto"/>
+              <w:rPr>
+                <w:rFonts w:ascii="Times New Roman" w:hAnsi="Times New Roman" w:cs="Times New Roman"/>
+                <w:b/>
+                <w:bCs/>
+                <w:sz w:val="24"/>
+                <w:szCs w:val="24"/>
+              </w:rPr>
+            </w:pPr>
+            <w:r>
+              <w:rPr>
+                <w:rFonts w:ascii="Times New Roman" w:hAnsi="Times New Roman" w:cs="Times New Roman"/>
+                <w:b/>
+                <w:bCs/>
+                <w:sz w:val="24"/>
+                <w:szCs w:val="24"/>
+              </w:rPr>
+              <w:t xml:space="preserve">Contingencia y Gastos Adicionales </w:t>
+            </w:r>
+          </w:p>
+        </w:tc>
+        <w:tc>
+          <w:tcPr>
+            <w:tcW w:w="2231" w:type="dxa"/>
+            <w:tcBorders>
+              <w:top w:val="single" w:sz="4" w:space="0" w:color="auto"/>
+              <w:left w:val="single" w:sz="4" w:space="0" w:color="auto"/>
+              <w:bottom w:val="single" w:sz="4" w:space="0" w:color="auto"/>
+              <w:right w:val="single" w:sz="4" w:space="0" w:color="auto"/>
+            </w:tcBorders>
+            <w:hideMark/>
+          </w:tcPr>
+          <w:p>
+            <w:pPr>
+              <w:spacing w:after="160" w:line="259" w:lineRule="auto"/>
+              <w:rPr>
+                <w:rFonts w:ascii="Times New Roman" w:hAnsi="Times New Roman" w:cs="Times New Roman"/>
+                <w:b/>
+                <w:bCs/>
+                <w:sz w:val="24"/>
+                <w:szCs w:val="24"/>
+              </w:rPr>
+            </w:pPr>
+          </w:p>
+        </w:tc>
+      </w:tr>
+      <w:tr>
+        <w:trPr>
+          <w:trHeight w:val="415"/>
+        </w:trPr>
+        <w:tc>
+          <w:tcPr>
+            <w:tcW w:w="5986" w:type="dxa"/>
+            <w:tcBorders>
+              <w:top w:val="single" w:sz="4" w:space="0" w:color="auto"/>
+              <w:left w:val="single" w:sz="4" w:space="0" w:color="auto"/>
+              <w:bottom w:val="single" w:sz="4" w:space="0" w:color="auto"/>
+              <w:right w:val="single" w:sz="4" w:space="0" w:color="auto"/>
+            </w:tcBorders>
+          </w:tcPr>
+          <w:p>
+            <w:pPr>
+              <w:rPr>
+                <w:rFonts w:ascii="Times New Roman" w:hAnsi="Times New Roman" w:cs="Times New Roman"/>
+                <w:sz w:val="24"/>
+                <w:szCs w:val="24"/>
+              </w:rPr>
+            </w:pPr>
+            <w:r>
+              <w:rPr>
+                <w:rFonts w:ascii="Times New Roman" w:hAnsi="Times New Roman" w:cs="Times New Roman"/>
+                <w:sz w:val="24"/>
+                <w:szCs w:val="24"/>
+              </w:rPr>
+              <w:t>-Reserva para imprevistos</w:t>
+            </w:r>
+          </w:p>
+        </w:tc>
+        <w:tc>
+          <w:tcPr>
+            <w:tcW w:w="2231" w:type="dxa"/>
+            <w:tcBorders>
+              <w:top w:val="single" w:sz="4" w:space="0" w:color="auto"/>
+              <w:left w:val="single" w:sz="4" w:space="0" w:color="auto"/>
+              <w:bottom w:val="single" w:sz="4" w:space="0" w:color="auto"/>
+              <w:right w:val="single" w:sz="4" w:space="0" w:color="auto"/>
+            </w:tcBorders>
+          </w:tcPr>
+          <w:p>
+            <w:pPr>
+              <w:rPr>
+                <w:rFonts w:ascii="Times New Roman" w:hAnsi="Times New Roman" w:cs="Times New Roman"/>
+                <w:b/>
+                <w:bCs/>
+                <w:sz w:val="24"/>
+                <w:szCs w:val="24"/>
+              </w:rPr>
+            </w:pPr>
+            <w:r>
+              <w:rPr>
+                <w:rFonts w:ascii="Times New Roman" w:hAnsi="Times New Roman" w:cs="Times New Roman"/>
+                <w:b/>
+                <w:bCs/>
+                <w:sz w:val="24"/>
+                <w:szCs w:val="24"/>
+              </w:rPr>
+              <w:t>$</w:t>
+            </w:r>
+            <w:r>
+              <w:rPr>
+                <w:rFonts w:ascii="Times New Roman" w:hAnsi="Times New Roman" w:cs="Times New Roman"/>
+                <w:b/>
+                <w:bCs/>
+                <w:sz w:val="24"/>
+                <w:szCs w:val="24"/>
+              </w:rPr>
+              <w:t>2</w:t>
+            </w:r>
+            <w:r>
+              <w:rPr>
+                <w:rFonts w:ascii="Times New Roman" w:hAnsi="Times New Roman" w:cs="Times New Roman"/>
+                <w:b/>
+                <w:bCs/>
+                <w:sz w:val="24"/>
+                <w:szCs w:val="24"/>
+              </w:rPr>
+              <w:t>0</w:t>
+            </w:r>
+          </w:p>
+        </w:tc>
+      </w:tr>
+      <w:tr>
+        <w:trPr>
+          <w:trHeight w:val="420"/>
+        </w:trPr>
+        <w:tc>
+          <w:tcPr>
+            <w:tcW w:w="5986" w:type="dxa"/>
+            <w:tcBorders>
+              <w:top w:val="single" w:sz="4" w:space="0" w:color="auto"/>
+              <w:left w:val="single" w:sz="4" w:space="0" w:color="auto"/>
+              <w:bottom w:val="single" w:sz="4" w:space="0" w:color="auto"/>
+              <w:right w:val="single" w:sz="4" w:space="0" w:color="auto"/>
+            </w:tcBorders>
+            <w:hideMark/>
+          </w:tcPr>
+          <w:p>
+            <w:pPr>
+              <w:spacing w:after="160" w:line="259" w:lineRule="auto"/>
+              <w:rPr>
+                <w:rFonts w:ascii="Times New Roman" w:hAnsi="Times New Roman" w:cs="Times New Roman"/>
+                <w:b/>
+                <w:bCs/>
+                <w:sz w:val="24"/>
+                <w:szCs w:val="24"/>
+              </w:rPr>
+            </w:pPr>
+            <w:proofErr w:type="gramStart"/>
+            <w:r>
+              <w:rPr>
+                <w:rFonts w:ascii="Times New Roman" w:hAnsi="Times New Roman" w:cs="Times New Roman"/>
+                <w:b/>
+                <w:bCs/>
+                <w:sz w:val="24"/>
+                <w:szCs w:val="24"/>
+              </w:rPr>
+              <w:t>Total</w:t>
+            </w:r>
+            <w:proofErr w:type="gramEnd"/>
+            <w:r>
+              <w:rPr>
+                <w:rFonts w:ascii="Times New Roman" w:hAnsi="Times New Roman" w:cs="Times New Roman"/>
+                <w:b/>
+                <w:bCs/>
+                <w:sz w:val="24"/>
+                <w:szCs w:val="24"/>
+              </w:rPr>
+              <w:t xml:space="preserve"> del Presupuesto </w:t>
+            </w:r>
+          </w:p>
+        </w:tc>
+        <w:tc>
+          <w:tcPr>
+            <w:tcW w:w="2231" w:type="dxa"/>
+            <w:tcBorders>
+              <w:top w:val="single" w:sz="4" w:space="0" w:color="auto"/>
+              <w:left w:val="single" w:sz="4" w:space="0" w:color="auto"/>
+              <w:bottom w:val="single" w:sz="4" w:space="0" w:color="auto"/>
+              <w:right w:val="single" w:sz="4" w:space="0" w:color="auto"/>
+            </w:tcBorders>
+            <w:hideMark/>
+          </w:tcPr>
+          <w:p>
+            <w:pPr>
+              <w:spacing w:after="160" w:line="259" w:lineRule="auto"/>
+              <w:rPr>
+                <w:rFonts w:ascii="Times New Roman" w:hAnsi="Times New Roman" w:cs="Times New Roman"/>
+                <w:b/>
+                <w:bCs/>
+                <w:sz w:val="24"/>
+                <w:szCs w:val="24"/>
+                <w:u w:val="single"/>
+              </w:rPr>
+            </w:pPr>
+            <w:r>
+              <w:rPr>
+                <w:rFonts w:ascii="Times New Roman" w:hAnsi="Times New Roman" w:cs="Times New Roman"/>
+                <w:b/>
+                <w:bCs/>
+                <w:sz w:val="24"/>
+                <w:szCs w:val="24"/>
+              </w:rPr>
+              <w:t>$</w:t>
+            </w:r>
+            <w:r>
+              <w:rPr>
+                <w:rFonts w:ascii="Times New Roman" w:hAnsi="Times New Roman" w:cs="Times New Roman"/>
+                <w:b/>
+                <w:bCs/>
+                <w:sz w:val="24"/>
+                <w:szCs w:val="24"/>
+              </w:rPr>
+              <w:t>80</w:t>
+            </w:r>
+          </w:p>
+        </w:tc>
+      </w:tr>
+    </w:tbl>
     <w:p>
       <w:pPr>
         <w:pStyle w:val="Prrafodelista"/>
@@ -3802,1099 +4578,6 @@
     </w:p>
     <w:p>
       <w:pPr>
-        <w:spacing w:after="0" w:line="360" w:lineRule="auto"/>
-        <w:rPr>
-          <w:rFonts w:ascii="Times New Roman" w:hAnsi="Times New Roman" w:cs="Times New Roman"/>
-          <w:sz w:val="24"/>
-          <w:szCs w:val="24"/>
-          <w:lang w:val="es-ES"/>
-        </w:rPr>
-      </w:pPr>
-      <w:r>
-        <w:rPr>
-          <w:rFonts w:ascii="Times New Roman" w:hAnsi="Times New Roman" w:cs="Times New Roman"/>
-          <w:b/>
-          <w:bCs/>
-          <w:sz w:val="24"/>
-          <w:szCs w:val="24"/>
-          <w:lang w:val="es-ES"/>
-        </w:rPr>
-        <w:t xml:space="preserve">Tabla 1 - </w:t>
-      </w:r>
-      <w:r>
-        <w:rPr>
-          <w:rFonts w:ascii="Times New Roman" w:hAnsi="Times New Roman" w:cs="Times New Roman"/>
-          <w:sz w:val="24"/>
-          <w:szCs w:val="24"/>
-          <w:lang w:val="es-ES"/>
-        </w:rPr>
-        <w:t>Presupuesto</w:t>
-      </w:r>
-    </w:p>
-    <w:tbl>
-      <w:tblPr>
-        <w:tblW w:w="0" w:type="auto"/>
-        <w:tblCellSpacing w:w="15" w:type="dxa"/>
-        <w:tblBorders>
-          <w:bottom w:val="single" w:sz="4" w:space="0" w:color="auto"/>
-        </w:tblBorders>
-        <w:tblCellMar>
-          <w:top w:w="15" w:type="dxa"/>
-          <w:left w:w="15" w:type="dxa"/>
-          <w:bottom w:w="15" w:type="dxa"/>
-          <w:right w:w="15" w:type="dxa"/>
-        </w:tblCellMar>
-        <w:tblLook w:val="04A0" w:firstRow="1" w:lastRow="0" w:firstColumn="1" w:lastColumn="0" w:noHBand="0" w:noVBand="1"/>
-      </w:tblPr>
-      <w:tblGrid>
-        <w:gridCol w:w="345"/>
-        <w:gridCol w:w="5943"/>
-        <w:gridCol w:w="1380"/>
-        <w:gridCol w:w="1119"/>
-      </w:tblGrid>
-      <w:tr>
-        <w:trPr>
-          <w:tblHeader/>
-          <w:tblCellSpacing w:w="15" w:type="dxa"/>
-        </w:trPr>
-        <w:tc>
-          <w:tcPr>
-            <w:tcW w:w="0" w:type="auto"/>
-            <w:tcBorders>
-              <w:top w:val="single" w:sz="4" w:space="0" w:color="auto"/>
-              <w:bottom w:val="single" w:sz="4" w:space="0" w:color="auto"/>
-            </w:tcBorders>
-            <w:vAlign w:val="center"/>
-            <w:hideMark/>
-          </w:tcPr>
-          <w:p>
-            <w:pPr>
-              <w:rPr>
-                <w:rFonts w:ascii="Times New Roman" w:hAnsi="Times New Roman" w:cs="Times New Roman"/>
-                <w:b/>
-                <w:bCs/>
-                <w:sz w:val="24"/>
-                <w:szCs w:val="24"/>
-              </w:rPr>
-            </w:pPr>
-            <w:r>
-              <w:rPr>
-                <w:rFonts w:ascii="Times New Roman" w:hAnsi="Times New Roman" w:cs="Times New Roman"/>
-                <w:b/>
-                <w:bCs/>
-                <w:sz w:val="24"/>
-                <w:szCs w:val="24"/>
-              </w:rPr>
-              <w:t>N°</w:t>
-            </w:r>
-          </w:p>
-        </w:tc>
-        <w:tc>
-          <w:tcPr>
-            <w:tcW w:w="0" w:type="auto"/>
-            <w:tcBorders>
-              <w:top w:val="single" w:sz="4" w:space="0" w:color="auto"/>
-              <w:bottom w:val="single" w:sz="4" w:space="0" w:color="auto"/>
-            </w:tcBorders>
-            <w:vAlign w:val="center"/>
-            <w:hideMark/>
-          </w:tcPr>
-          <w:p>
-            <w:pPr>
-              <w:rPr>
-                <w:rFonts w:ascii="Times New Roman" w:hAnsi="Times New Roman" w:cs="Times New Roman"/>
-                <w:b/>
-                <w:bCs/>
-                <w:sz w:val="24"/>
-                <w:szCs w:val="24"/>
-              </w:rPr>
-            </w:pPr>
-            <w:r>
-              <w:rPr>
-                <w:rFonts w:ascii="Times New Roman" w:hAnsi="Times New Roman" w:cs="Times New Roman"/>
-                <w:b/>
-                <w:bCs/>
-                <w:sz w:val="24"/>
-                <w:szCs w:val="24"/>
-              </w:rPr>
-              <w:t>Ítem</w:t>
-            </w:r>
-          </w:p>
-        </w:tc>
-        <w:tc>
-          <w:tcPr>
-            <w:tcW w:w="0" w:type="auto"/>
-            <w:tcBorders>
-              <w:top w:val="single" w:sz="4" w:space="0" w:color="auto"/>
-              <w:bottom w:val="single" w:sz="4" w:space="0" w:color="auto"/>
-            </w:tcBorders>
-            <w:vAlign w:val="center"/>
-            <w:hideMark/>
-          </w:tcPr>
-          <w:p>
-            <w:pPr>
-              <w:rPr>
-                <w:rFonts w:ascii="Times New Roman" w:hAnsi="Times New Roman" w:cs="Times New Roman"/>
-                <w:b/>
-                <w:bCs/>
-                <w:sz w:val="24"/>
-                <w:szCs w:val="24"/>
-              </w:rPr>
-            </w:pPr>
-            <w:r>
-              <w:rPr>
-                <w:rFonts w:ascii="Times New Roman" w:hAnsi="Times New Roman" w:cs="Times New Roman"/>
-                <w:b/>
-                <w:bCs/>
-                <w:sz w:val="24"/>
-                <w:szCs w:val="24"/>
-              </w:rPr>
-              <w:t>Valor Unitario</w:t>
-            </w:r>
-          </w:p>
-        </w:tc>
-        <w:tc>
-          <w:tcPr>
-            <w:tcW w:w="0" w:type="auto"/>
-            <w:tcBorders>
-              <w:top w:val="single" w:sz="4" w:space="0" w:color="auto"/>
-              <w:bottom w:val="single" w:sz="4" w:space="0" w:color="auto"/>
-            </w:tcBorders>
-            <w:vAlign w:val="center"/>
-            <w:hideMark/>
-          </w:tcPr>
-          <w:p>
-            <w:pPr>
-              <w:rPr>
-                <w:rFonts w:ascii="Times New Roman" w:hAnsi="Times New Roman" w:cs="Times New Roman"/>
-                <w:b/>
-                <w:bCs/>
-                <w:sz w:val="24"/>
-                <w:szCs w:val="24"/>
-              </w:rPr>
-            </w:pPr>
-            <w:r>
-              <w:rPr>
-                <w:rFonts w:ascii="Times New Roman" w:hAnsi="Times New Roman" w:cs="Times New Roman"/>
-                <w:b/>
-                <w:bCs/>
-                <w:sz w:val="24"/>
-                <w:szCs w:val="24"/>
-              </w:rPr>
-              <w:t>Valor Total</w:t>
-            </w:r>
-          </w:p>
-        </w:tc>
-      </w:tr>
-      <w:tr>
-        <w:trPr>
-          <w:tblCellSpacing w:w="15" w:type="dxa"/>
-        </w:trPr>
-        <w:tc>
-          <w:tcPr>
-            <w:tcW w:w="0" w:type="auto"/>
-            <w:vAlign w:val="center"/>
-            <w:hideMark/>
-          </w:tcPr>
-          <w:p>
-            <w:pPr>
-              <w:rPr>
-                <w:rFonts w:ascii="Times New Roman" w:hAnsi="Times New Roman" w:cs="Times New Roman"/>
-                <w:sz w:val="24"/>
-                <w:szCs w:val="24"/>
-              </w:rPr>
-            </w:pPr>
-            <w:r>
-              <w:rPr>
-                <w:rFonts w:ascii="Times New Roman" w:hAnsi="Times New Roman" w:cs="Times New Roman"/>
-                <w:sz w:val="24"/>
-                <w:szCs w:val="24"/>
-              </w:rPr>
-              <w:t>1</w:t>
-            </w:r>
-          </w:p>
-        </w:tc>
-        <w:tc>
-          <w:tcPr>
-            <w:tcW w:w="0" w:type="auto"/>
-            <w:vAlign w:val="center"/>
-            <w:hideMark/>
-          </w:tcPr>
-          <w:p>
-            <w:pPr>
-              <w:rPr>
-                <w:rFonts w:ascii="Times New Roman" w:hAnsi="Times New Roman" w:cs="Times New Roman"/>
-                <w:sz w:val="24"/>
-                <w:szCs w:val="24"/>
-              </w:rPr>
-            </w:pPr>
-            <w:r>
-              <w:rPr>
-                <w:rFonts w:ascii="Times New Roman" w:hAnsi="Times New Roman" w:cs="Times New Roman"/>
-                <w:sz w:val="24"/>
-                <w:szCs w:val="24"/>
-                <w:highlight w:val="yellow"/>
-              </w:rPr>
-              <w:t>Movilización</w:t>
-            </w:r>
-            <w:r>
-              <w:rPr>
-                <w:rFonts w:ascii="Times New Roman" w:hAnsi="Times New Roman" w:cs="Times New Roman"/>
-                <w:sz w:val="24"/>
-                <w:szCs w:val="24"/>
-              </w:rPr>
-              <w:t xml:space="preserve"> para levantamiento de información y reuniones institucionales</w:t>
-            </w:r>
-          </w:p>
-        </w:tc>
-        <w:tc>
-          <w:tcPr>
-            <w:tcW w:w="0" w:type="auto"/>
-            <w:vAlign w:val="center"/>
-            <w:hideMark/>
-          </w:tcPr>
-          <w:p>
-            <w:pPr>
-              <w:rPr>
-                <w:rFonts w:ascii="Times New Roman" w:hAnsi="Times New Roman" w:cs="Times New Roman"/>
-                <w:sz w:val="24"/>
-                <w:szCs w:val="24"/>
-              </w:rPr>
-            </w:pPr>
-            <w:r>
-              <w:rPr>
-                <w:rFonts w:ascii="Times New Roman" w:hAnsi="Times New Roman" w:cs="Times New Roman"/>
-                <w:sz w:val="24"/>
-                <w:szCs w:val="24"/>
-              </w:rPr>
-              <w:t>$40,00</w:t>
-            </w:r>
-          </w:p>
-        </w:tc>
-        <w:tc>
-          <w:tcPr>
-            <w:tcW w:w="0" w:type="auto"/>
-            <w:vAlign w:val="center"/>
-            <w:hideMark/>
-          </w:tcPr>
-          <w:p>
-            <w:pPr>
-              <w:rPr>
-                <w:rFonts w:ascii="Times New Roman" w:hAnsi="Times New Roman" w:cs="Times New Roman"/>
-                <w:sz w:val="24"/>
-                <w:szCs w:val="24"/>
-              </w:rPr>
-            </w:pPr>
-            <w:r>
-              <w:rPr>
-                <w:rFonts w:ascii="Times New Roman" w:hAnsi="Times New Roman" w:cs="Times New Roman"/>
-                <w:sz w:val="24"/>
-                <w:szCs w:val="24"/>
-              </w:rPr>
-              <w:t>$40,00</w:t>
-            </w:r>
-          </w:p>
-        </w:tc>
-      </w:tr>
-      <w:tr>
-        <w:trPr>
-          <w:tblCellSpacing w:w="15" w:type="dxa"/>
-        </w:trPr>
-        <w:tc>
-          <w:tcPr>
-            <w:tcW w:w="0" w:type="auto"/>
-            <w:vAlign w:val="center"/>
-            <w:hideMark/>
-          </w:tcPr>
-          <w:p>
-            <w:pPr>
-              <w:rPr>
-                <w:rFonts w:ascii="Times New Roman" w:hAnsi="Times New Roman" w:cs="Times New Roman"/>
-                <w:sz w:val="24"/>
-                <w:szCs w:val="24"/>
-              </w:rPr>
-            </w:pPr>
-            <w:r>
-              <w:rPr>
-                <w:rFonts w:ascii="Times New Roman" w:hAnsi="Times New Roman" w:cs="Times New Roman"/>
-                <w:sz w:val="24"/>
-                <w:szCs w:val="24"/>
-              </w:rPr>
-              <w:t>2</w:t>
-            </w:r>
-          </w:p>
-        </w:tc>
-        <w:tc>
-          <w:tcPr>
-            <w:tcW w:w="0" w:type="auto"/>
-            <w:vAlign w:val="center"/>
-            <w:hideMark/>
-          </w:tcPr>
-          <w:p>
-            <w:pPr>
-              <w:rPr>
-                <w:rFonts w:ascii="Times New Roman" w:hAnsi="Times New Roman" w:cs="Times New Roman"/>
-                <w:sz w:val="24"/>
-                <w:szCs w:val="24"/>
-              </w:rPr>
-            </w:pPr>
-            <w:r>
-              <w:rPr>
-                <w:rFonts w:ascii="Times New Roman" w:hAnsi="Times New Roman" w:cs="Times New Roman"/>
-                <w:sz w:val="24"/>
-                <w:szCs w:val="24"/>
-              </w:rPr>
-              <w:t>Impresiones de encuestas, documentos de revisión y material de validación</w:t>
-            </w:r>
-          </w:p>
-        </w:tc>
-        <w:tc>
-          <w:tcPr>
-            <w:tcW w:w="0" w:type="auto"/>
-            <w:vAlign w:val="center"/>
-            <w:hideMark/>
-          </w:tcPr>
-          <w:p>
-            <w:pPr>
-              <w:rPr>
-                <w:rFonts w:ascii="Times New Roman" w:hAnsi="Times New Roman" w:cs="Times New Roman"/>
-                <w:sz w:val="24"/>
-                <w:szCs w:val="24"/>
-              </w:rPr>
-            </w:pPr>
-            <w:r>
-              <w:rPr>
-                <w:rFonts w:ascii="Times New Roman" w:hAnsi="Times New Roman" w:cs="Times New Roman"/>
-                <w:sz w:val="24"/>
-                <w:szCs w:val="24"/>
-              </w:rPr>
-              <w:t>$30,00</w:t>
-            </w:r>
-          </w:p>
-        </w:tc>
-        <w:tc>
-          <w:tcPr>
-            <w:tcW w:w="0" w:type="auto"/>
-            <w:vAlign w:val="center"/>
-            <w:hideMark/>
-          </w:tcPr>
-          <w:p>
-            <w:pPr>
-              <w:rPr>
-                <w:rFonts w:ascii="Times New Roman" w:hAnsi="Times New Roman" w:cs="Times New Roman"/>
-                <w:sz w:val="24"/>
-                <w:szCs w:val="24"/>
-              </w:rPr>
-            </w:pPr>
-            <w:r>
-              <w:rPr>
-                <w:rFonts w:ascii="Times New Roman" w:hAnsi="Times New Roman" w:cs="Times New Roman"/>
-                <w:sz w:val="24"/>
-                <w:szCs w:val="24"/>
-              </w:rPr>
-              <w:t>$30,00</w:t>
-            </w:r>
-          </w:p>
-        </w:tc>
-      </w:tr>
-      <w:tr>
-        <w:trPr>
-          <w:tblCellSpacing w:w="15" w:type="dxa"/>
-        </w:trPr>
-        <w:tc>
-          <w:tcPr>
-            <w:tcW w:w="0" w:type="auto"/>
-            <w:vAlign w:val="center"/>
-            <w:hideMark/>
-          </w:tcPr>
-          <w:p>
-            <w:pPr>
-              <w:rPr>
-                <w:rFonts w:ascii="Times New Roman" w:hAnsi="Times New Roman" w:cs="Times New Roman"/>
-                <w:sz w:val="24"/>
-                <w:szCs w:val="24"/>
-              </w:rPr>
-            </w:pPr>
-            <w:r>
-              <w:rPr>
-                <w:rFonts w:ascii="Times New Roman" w:hAnsi="Times New Roman" w:cs="Times New Roman"/>
-                <w:sz w:val="24"/>
-                <w:szCs w:val="24"/>
-              </w:rPr>
-              <w:t>3</w:t>
-            </w:r>
-          </w:p>
-        </w:tc>
-        <w:tc>
-          <w:tcPr>
-            <w:tcW w:w="0" w:type="auto"/>
-            <w:vAlign w:val="center"/>
-            <w:hideMark/>
-          </w:tcPr>
-          <w:p>
-            <w:pPr>
-              <w:rPr>
-                <w:rFonts w:ascii="Times New Roman" w:hAnsi="Times New Roman" w:cs="Times New Roman"/>
-                <w:sz w:val="24"/>
-                <w:szCs w:val="24"/>
-              </w:rPr>
-            </w:pPr>
-            <w:r>
-              <w:rPr>
-                <w:rFonts w:ascii="Times New Roman" w:hAnsi="Times New Roman" w:cs="Times New Roman"/>
-                <w:sz w:val="24"/>
-                <w:szCs w:val="24"/>
-              </w:rPr>
-              <w:t>Papelería y suministros de oficina</w:t>
-            </w:r>
-          </w:p>
-        </w:tc>
-        <w:tc>
-          <w:tcPr>
-            <w:tcW w:w="0" w:type="auto"/>
-            <w:vAlign w:val="center"/>
-            <w:hideMark/>
-          </w:tcPr>
-          <w:p>
-            <w:pPr>
-              <w:rPr>
-                <w:rFonts w:ascii="Times New Roman" w:hAnsi="Times New Roman" w:cs="Times New Roman"/>
-                <w:sz w:val="24"/>
-                <w:szCs w:val="24"/>
-              </w:rPr>
-            </w:pPr>
-            <w:r>
-              <w:rPr>
-                <w:rFonts w:ascii="Times New Roman" w:hAnsi="Times New Roman" w:cs="Times New Roman"/>
-                <w:sz w:val="24"/>
-                <w:szCs w:val="24"/>
-              </w:rPr>
-              <w:t>$20,00</w:t>
-            </w:r>
-          </w:p>
-        </w:tc>
-        <w:tc>
-          <w:tcPr>
-            <w:tcW w:w="0" w:type="auto"/>
-            <w:vAlign w:val="center"/>
-            <w:hideMark/>
-          </w:tcPr>
-          <w:p>
-            <w:pPr>
-              <w:rPr>
-                <w:rFonts w:ascii="Times New Roman" w:hAnsi="Times New Roman" w:cs="Times New Roman"/>
-                <w:sz w:val="24"/>
-                <w:szCs w:val="24"/>
-              </w:rPr>
-            </w:pPr>
-            <w:r>
-              <w:rPr>
-                <w:rFonts w:ascii="Times New Roman" w:hAnsi="Times New Roman" w:cs="Times New Roman"/>
-                <w:sz w:val="24"/>
-                <w:szCs w:val="24"/>
-              </w:rPr>
-              <w:t>$20,00</w:t>
-            </w:r>
-          </w:p>
-        </w:tc>
-      </w:tr>
-      <w:tr>
-        <w:trPr>
-          <w:tblCellSpacing w:w="15" w:type="dxa"/>
-        </w:trPr>
-        <w:tc>
-          <w:tcPr>
-            <w:tcW w:w="0" w:type="auto"/>
-            <w:vAlign w:val="center"/>
-            <w:hideMark/>
-          </w:tcPr>
-          <w:p>
-            <w:pPr>
-              <w:rPr>
-                <w:rFonts w:ascii="Times New Roman" w:hAnsi="Times New Roman" w:cs="Times New Roman"/>
-                <w:sz w:val="24"/>
-                <w:szCs w:val="24"/>
-              </w:rPr>
-            </w:pPr>
-            <w:r>
-              <w:rPr>
-                <w:rFonts w:ascii="Times New Roman" w:hAnsi="Times New Roman" w:cs="Times New Roman"/>
-                <w:sz w:val="24"/>
-                <w:szCs w:val="24"/>
-              </w:rPr>
-              <w:t>4</w:t>
-            </w:r>
-          </w:p>
-        </w:tc>
-        <w:tc>
-          <w:tcPr>
-            <w:tcW w:w="0" w:type="auto"/>
-            <w:vAlign w:val="center"/>
-            <w:hideMark/>
-          </w:tcPr>
-          <w:p>
-            <w:pPr>
-              <w:rPr>
-                <w:rFonts w:ascii="Times New Roman" w:hAnsi="Times New Roman" w:cs="Times New Roman"/>
-                <w:sz w:val="24"/>
-                <w:szCs w:val="24"/>
-              </w:rPr>
-            </w:pPr>
-            <w:r>
-              <w:rPr>
-                <w:rFonts w:ascii="Times New Roman" w:hAnsi="Times New Roman" w:cs="Times New Roman"/>
-                <w:sz w:val="24"/>
-                <w:szCs w:val="24"/>
-              </w:rPr>
-              <w:t>Computador y recursos tecnológicos para el desarrollo del proyecto</w:t>
-            </w:r>
-          </w:p>
-        </w:tc>
-        <w:tc>
-          <w:tcPr>
-            <w:tcW w:w="0" w:type="auto"/>
-            <w:vAlign w:val="center"/>
-            <w:hideMark/>
-          </w:tcPr>
-          <w:p>
-            <w:pPr>
-              <w:rPr>
-                <w:rFonts w:ascii="Times New Roman" w:hAnsi="Times New Roman" w:cs="Times New Roman"/>
-                <w:sz w:val="24"/>
-                <w:szCs w:val="24"/>
-              </w:rPr>
-            </w:pPr>
-            <w:r>
-              <w:rPr>
-                <w:rFonts w:ascii="Times New Roman" w:hAnsi="Times New Roman" w:cs="Times New Roman"/>
-                <w:sz w:val="24"/>
-                <w:szCs w:val="24"/>
-              </w:rPr>
-              <w:t>$150,00</w:t>
-            </w:r>
-          </w:p>
-        </w:tc>
-        <w:tc>
-          <w:tcPr>
-            <w:tcW w:w="0" w:type="auto"/>
-            <w:vAlign w:val="center"/>
-            <w:hideMark/>
-          </w:tcPr>
-          <w:p>
-            <w:pPr>
-              <w:rPr>
-                <w:rFonts w:ascii="Times New Roman" w:hAnsi="Times New Roman" w:cs="Times New Roman"/>
-                <w:sz w:val="24"/>
-                <w:szCs w:val="24"/>
-              </w:rPr>
-            </w:pPr>
-            <w:r>
-              <w:rPr>
-                <w:rFonts w:ascii="Times New Roman" w:hAnsi="Times New Roman" w:cs="Times New Roman"/>
-                <w:sz w:val="24"/>
-                <w:szCs w:val="24"/>
-              </w:rPr>
-              <w:t>$150,00</w:t>
-            </w:r>
-          </w:p>
-        </w:tc>
-      </w:tr>
-      <w:tr>
-        <w:trPr>
-          <w:tblCellSpacing w:w="15" w:type="dxa"/>
-        </w:trPr>
-        <w:tc>
-          <w:tcPr>
-            <w:tcW w:w="0" w:type="auto"/>
-            <w:vAlign w:val="center"/>
-            <w:hideMark/>
-          </w:tcPr>
-          <w:p>
-            <w:pPr>
-              <w:rPr>
-                <w:rFonts w:ascii="Times New Roman" w:hAnsi="Times New Roman" w:cs="Times New Roman"/>
-                <w:sz w:val="24"/>
-                <w:szCs w:val="24"/>
-              </w:rPr>
-            </w:pPr>
-            <w:r>
-              <w:rPr>
-                <w:rFonts w:ascii="Times New Roman" w:hAnsi="Times New Roman" w:cs="Times New Roman"/>
-                <w:sz w:val="24"/>
-                <w:szCs w:val="24"/>
-              </w:rPr>
-              <w:t>5</w:t>
-            </w:r>
-          </w:p>
-        </w:tc>
-        <w:tc>
-          <w:tcPr>
-            <w:tcW w:w="0" w:type="auto"/>
-            <w:vAlign w:val="center"/>
-            <w:hideMark/>
-          </w:tcPr>
-          <w:p>
-            <w:pPr>
-              <w:rPr>
-                <w:rFonts w:ascii="Times New Roman" w:hAnsi="Times New Roman" w:cs="Times New Roman"/>
-                <w:sz w:val="24"/>
-                <w:szCs w:val="24"/>
-              </w:rPr>
-            </w:pPr>
-            <w:r>
-              <w:rPr>
-                <w:rFonts w:ascii="Times New Roman" w:hAnsi="Times New Roman" w:cs="Times New Roman"/>
-                <w:sz w:val="24"/>
-                <w:szCs w:val="24"/>
-              </w:rPr>
-              <w:t>Servidores, alojamiento web y configuración del entorno de la plataforma</w:t>
-            </w:r>
-          </w:p>
-        </w:tc>
-        <w:tc>
-          <w:tcPr>
-            <w:tcW w:w="0" w:type="auto"/>
-            <w:vAlign w:val="center"/>
-            <w:hideMark/>
-          </w:tcPr>
-          <w:p>
-            <w:pPr>
-              <w:rPr>
-                <w:rFonts w:ascii="Times New Roman" w:hAnsi="Times New Roman" w:cs="Times New Roman"/>
-                <w:sz w:val="24"/>
-                <w:szCs w:val="24"/>
-              </w:rPr>
-            </w:pPr>
-            <w:r>
-              <w:rPr>
-                <w:rFonts w:ascii="Times New Roman" w:hAnsi="Times New Roman" w:cs="Times New Roman"/>
-                <w:sz w:val="24"/>
-                <w:szCs w:val="24"/>
-              </w:rPr>
-              <w:t>$120,00</w:t>
-            </w:r>
-          </w:p>
-        </w:tc>
-        <w:tc>
-          <w:tcPr>
-            <w:tcW w:w="0" w:type="auto"/>
-            <w:vAlign w:val="center"/>
-            <w:hideMark/>
-          </w:tcPr>
-          <w:p>
-            <w:pPr>
-              <w:rPr>
-                <w:rFonts w:ascii="Times New Roman" w:hAnsi="Times New Roman" w:cs="Times New Roman"/>
-                <w:sz w:val="24"/>
-                <w:szCs w:val="24"/>
-              </w:rPr>
-            </w:pPr>
-            <w:r>
-              <w:rPr>
-                <w:rFonts w:ascii="Times New Roman" w:hAnsi="Times New Roman" w:cs="Times New Roman"/>
-                <w:sz w:val="24"/>
-                <w:szCs w:val="24"/>
-              </w:rPr>
-              <w:t>$120,00</w:t>
-            </w:r>
-          </w:p>
-        </w:tc>
-      </w:tr>
-      <w:tr>
-        <w:trPr>
-          <w:tblCellSpacing w:w="15" w:type="dxa"/>
-        </w:trPr>
-        <w:tc>
-          <w:tcPr>
-            <w:tcW w:w="0" w:type="auto"/>
-            <w:vAlign w:val="center"/>
-            <w:hideMark/>
-          </w:tcPr>
-          <w:p>
-            <w:pPr>
-              <w:rPr>
-                <w:rFonts w:ascii="Times New Roman" w:hAnsi="Times New Roman" w:cs="Times New Roman"/>
-                <w:sz w:val="24"/>
-                <w:szCs w:val="24"/>
-              </w:rPr>
-            </w:pPr>
-            <w:r>
-              <w:rPr>
-                <w:rFonts w:ascii="Times New Roman" w:hAnsi="Times New Roman" w:cs="Times New Roman"/>
-                <w:sz w:val="24"/>
-                <w:szCs w:val="24"/>
-              </w:rPr>
-              <w:t>6</w:t>
-            </w:r>
-          </w:p>
-        </w:tc>
-        <w:tc>
-          <w:tcPr>
-            <w:tcW w:w="0" w:type="auto"/>
-            <w:vAlign w:val="center"/>
-            <w:hideMark/>
-          </w:tcPr>
-          <w:p>
-            <w:pPr>
-              <w:rPr>
-                <w:rFonts w:ascii="Times New Roman" w:hAnsi="Times New Roman" w:cs="Times New Roman"/>
-                <w:sz w:val="24"/>
-                <w:szCs w:val="24"/>
-              </w:rPr>
-            </w:pPr>
-            <w:r>
-              <w:rPr>
-                <w:rFonts w:ascii="Times New Roman" w:hAnsi="Times New Roman" w:cs="Times New Roman"/>
-                <w:sz w:val="24"/>
-                <w:szCs w:val="24"/>
-              </w:rPr>
-              <w:t>Documentación técnica y manual de usuario</w:t>
-            </w:r>
-          </w:p>
-        </w:tc>
-        <w:tc>
-          <w:tcPr>
-            <w:tcW w:w="0" w:type="auto"/>
-            <w:vAlign w:val="center"/>
-            <w:hideMark/>
-          </w:tcPr>
-          <w:p>
-            <w:pPr>
-              <w:rPr>
-                <w:rFonts w:ascii="Times New Roman" w:hAnsi="Times New Roman" w:cs="Times New Roman"/>
-                <w:sz w:val="24"/>
-                <w:szCs w:val="24"/>
-              </w:rPr>
-            </w:pPr>
-            <w:r>
-              <w:rPr>
-                <w:rFonts w:ascii="Times New Roman" w:hAnsi="Times New Roman" w:cs="Times New Roman"/>
-                <w:sz w:val="24"/>
-                <w:szCs w:val="24"/>
-              </w:rPr>
-              <w:t>$40,00</w:t>
-            </w:r>
-          </w:p>
-        </w:tc>
-        <w:tc>
-          <w:tcPr>
-            <w:tcW w:w="0" w:type="auto"/>
-            <w:vAlign w:val="center"/>
-            <w:hideMark/>
-          </w:tcPr>
-          <w:p>
-            <w:pPr>
-              <w:rPr>
-                <w:rFonts w:ascii="Times New Roman" w:hAnsi="Times New Roman" w:cs="Times New Roman"/>
-                <w:sz w:val="24"/>
-                <w:szCs w:val="24"/>
-              </w:rPr>
-            </w:pPr>
-            <w:r>
-              <w:rPr>
-                <w:rFonts w:ascii="Times New Roman" w:hAnsi="Times New Roman" w:cs="Times New Roman"/>
-                <w:sz w:val="24"/>
-                <w:szCs w:val="24"/>
-              </w:rPr>
-              <w:t>$40,00</w:t>
-            </w:r>
-          </w:p>
-        </w:tc>
-      </w:tr>
-      <w:tr>
-        <w:trPr>
-          <w:tblCellSpacing w:w="15" w:type="dxa"/>
-        </w:trPr>
-        <w:tc>
-          <w:tcPr>
-            <w:tcW w:w="0" w:type="auto"/>
-            <w:vAlign w:val="center"/>
-            <w:hideMark/>
-          </w:tcPr>
-          <w:p>
-            <w:pPr>
-              <w:rPr>
-                <w:rFonts w:ascii="Times New Roman" w:hAnsi="Times New Roman" w:cs="Times New Roman"/>
-                <w:sz w:val="24"/>
-                <w:szCs w:val="24"/>
-              </w:rPr>
-            </w:pPr>
-            <w:r>
-              <w:rPr>
-                <w:rFonts w:ascii="Times New Roman" w:hAnsi="Times New Roman" w:cs="Times New Roman"/>
-                <w:sz w:val="24"/>
-                <w:szCs w:val="24"/>
-              </w:rPr>
-              <w:t>7</w:t>
-            </w:r>
-          </w:p>
-        </w:tc>
-        <w:tc>
-          <w:tcPr>
-            <w:tcW w:w="0" w:type="auto"/>
-            <w:vAlign w:val="center"/>
-            <w:hideMark/>
-          </w:tcPr>
-          <w:p>
-            <w:pPr>
-              <w:rPr>
-                <w:rFonts w:ascii="Times New Roman" w:hAnsi="Times New Roman" w:cs="Times New Roman"/>
-                <w:sz w:val="24"/>
-                <w:szCs w:val="24"/>
-              </w:rPr>
-            </w:pPr>
-            <w:r>
-              <w:rPr>
-                <w:rFonts w:ascii="Times New Roman" w:hAnsi="Times New Roman" w:cs="Times New Roman"/>
-                <w:sz w:val="24"/>
-                <w:szCs w:val="24"/>
-              </w:rPr>
-              <w:t>Internet, energía eléctrica y conectividad</w:t>
-            </w:r>
-          </w:p>
-        </w:tc>
-        <w:tc>
-          <w:tcPr>
-            <w:tcW w:w="0" w:type="auto"/>
-            <w:vAlign w:val="center"/>
-            <w:hideMark/>
-          </w:tcPr>
-          <w:p>
-            <w:pPr>
-              <w:rPr>
-                <w:rFonts w:ascii="Times New Roman" w:hAnsi="Times New Roman" w:cs="Times New Roman"/>
-                <w:sz w:val="24"/>
-                <w:szCs w:val="24"/>
-              </w:rPr>
-            </w:pPr>
-            <w:r>
-              <w:rPr>
-                <w:rFonts w:ascii="Times New Roman" w:hAnsi="Times New Roman" w:cs="Times New Roman"/>
-                <w:sz w:val="24"/>
-                <w:szCs w:val="24"/>
-              </w:rPr>
-              <w:t>$50,00</w:t>
-            </w:r>
-          </w:p>
-        </w:tc>
-        <w:tc>
-          <w:tcPr>
-            <w:tcW w:w="0" w:type="auto"/>
-            <w:vAlign w:val="center"/>
-            <w:hideMark/>
-          </w:tcPr>
-          <w:p>
-            <w:pPr>
-              <w:rPr>
-                <w:rFonts w:ascii="Times New Roman" w:hAnsi="Times New Roman" w:cs="Times New Roman"/>
-                <w:sz w:val="24"/>
-                <w:szCs w:val="24"/>
-              </w:rPr>
-            </w:pPr>
-            <w:r>
-              <w:rPr>
-                <w:rFonts w:ascii="Times New Roman" w:hAnsi="Times New Roman" w:cs="Times New Roman"/>
-                <w:sz w:val="24"/>
-                <w:szCs w:val="24"/>
-              </w:rPr>
-              <w:t>$50,00</w:t>
-            </w:r>
-          </w:p>
-        </w:tc>
-      </w:tr>
-      <w:tr>
-        <w:trPr>
-          <w:tblCellSpacing w:w="15" w:type="dxa"/>
-        </w:trPr>
-        <w:tc>
-          <w:tcPr>
-            <w:tcW w:w="0" w:type="auto"/>
-            <w:vAlign w:val="center"/>
-            <w:hideMark/>
-          </w:tcPr>
-          <w:p>
-            <w:pPr>
-              <w:rPr>
-                <w:rFonts w:ascii="Times New Roman" w:hAnsi="Times New Roman" w:cs="Times New Roman"/>
-                <w:sz w:val="24"/>
-                <w:szCs w:val="24"/>
-              </w:rPr>
-            </w:pPr>
-            <w:r>
-              <w:rPr>
-                <w:rFonts w:ascii="Times New Roman" w:hAnsi="Times New Roman" w:cs="Times New Roman"/>
-                <w:sz w:val="24"/>
-                <w:szCs w:val="24"/>
-              </w:rPr>
-              <w:t>8</w:t>
-            </w:r>
-          </w:p>
-        </w:tc>
-        <w:tc>
-          <w:tcPr>
-            <w:tcW w:w="0" w:type="auto"/>
-            <w:vAlign w:val="center"/>
-            <w:hideMark/>
-          </w:tcPr>
-          <w:p>
-            <w:pPr>
-              <w:rPr>
-                <w:rFonts w:ascii="Times New Roman" w:hAnsi="Times New Roman" w:cs="Times New Roman"/>
-                <w:sz w:val="24"/>
-                <w:szCs w:val="24"/>
-              </w:rPr>
-            </w:pPr>
-            <w:r>
-              <w:rPr>
-                <w:rFonts w:ascii="Times New Roman" w:hAnsi="Times New Roman" w:cs="Times New Roman"/>
-                <w:sz w:val="24"/>
-                <w:szCs w:val="24"/>
-              </w:rPr>
-              <w:t>Imprevistos relacionados con ajustes, recursos adicionales y soporte operativo</w:t>
-            </w:r>
-          </w:p>
-        </w:tc>
-        <w:tc>
-          <w:tcPr>
-            <w:tcW w:w="0" w:type="auto"/>
-            <w:vAlign w:val="center"/>
-            <w:hideMark/>
-          </w:tcPr>
-          <w:p>
-            <w:pPr>
-              <w:rPr>
-                <w:rFonts w:ascii="Times New Roman" w:hAnsi="Times New Roman" w:cs="Times New Roman"/>
-                <w:sz w:val="24"/>
-                <w:szCs w:val="24"/>
-              </w:rPr>
-            </w:pPr>
-            <w:r>
-              <w:rPr>
-                <w:rFonts w:ascii="Times New Roman" w:hAnsi="Times New Roman" w:cs="Times New Roman"/>
-                <w:sz w:val="24"/>
-                <w:szCs w:val="24"/>
-              </w:rPr>
-              <w:t>$50,00</w:t>
-            </w:r>
-          </w:p>
-        </w:tc>
-        <w:tc>
-          <w:tcPr>
-            <w:tcW w:w="0" w:type="auto"/>
-            <w:vAlign w:val="center"/>
-            <w:hideMark/>
-          </w:tcPr>
-          <w:p>
-            <w:pPr>
-              <w:rPr>
-                <w:rFonts w:ascii="Times New Roman" w:hAnsi="Times New Roman" w:cs="Times New Roman"/>
-                <w:sz w:val="24"/>
-                <w:szCs w:val="24"/>
-              </w:rPr>
-            </w:pPr>
-            <w:r>
-              <w:rPr>
-                <w:rFonts w:ascii="Times New Roman" w:hAnsi="Times New Roman" w:cs="Times New Roman"/>
-                <w:sz w:val="24"/>
-                <w:szCs w:val="24"/>
-              </w:rPr>
-              <w:t>$50,00</w:t>
-            </w:r>
-          </w:p>
-        </w:tc>
-      </w:tr>
-      <w:tr>
-        <w:trPr>
-          <w:tblCellSpacing w:w="15" w:type="dxa"/>
-        </w:trPr>
-        <w:tc>
-          <w:tcPr>
-            <w:tcW w:w="0" w:type="auto"/>
-            <w:vAlign w:val="center"/>
-            <w:hideMark/>
-          </w:tcPr>
-          <w:p>
-            <w:pPr>
-              <w:rPr>
-                <w:rFonts w:ascii="Times New Roman" w:hAnsi="Times New Roman" w:cs="Times New Roman"/>
-                <w:sz w:val="24"/>
-                <w:szCs w:val="24"/>
-              </w:rPr>
-            </w:pPr>
-          </w:p>
-        </w:tc>
-        <w:tc>
-          <w:tcPr>
-            <w:tcW w:w="0" w:type="auto"/>
-            <w:vAlign w:val="center"/>
-            <w:hideMark/>
-          </w:tcPr>
-          <w:p>
-            <w:pPr>
-              <w:rPr>
-                <w:rFonts w:ascii="Times New Roman" w:hAnsi="Times New Roman" w:cs="Times New Roman"/>
-                <w:sz w:val="24"/>
-                <w:szCs w:val="24"/>
-              </w:rPr>
-            </w:pPr>
-            <w:r>
-              <w:rPr>
-                <w:rFonts w:ascii="Times New Roman" w:hAnsi="Times New Roman" w:cs="Times New Roman"/>
-                <w:b/>
-                <w:bCs/>
-                <w:sz w:val="24"/>
-                <w:szCs w:val="24"/>
-              </w:rPr>
-              <w:t>Total</w:t>
-            </w:r>
-          </w:p>
-        </w:tc>
-        <w:tc>
-          <w:tcPr>
-            <w:tcW w:w="0" w:type="auto"/>
-            <w:vAlign w:val="center"/>
-            <w:hideMark/>
-          </w:tcPr>
-          <w:p>
-            <w:pPr>
-              <w:rPr>
-                <w:rFonts w:ascii="Times New Roman" w:hAnsi="Times New Roman" w:cs="Times New Roman"/>
-                <w:sz w:val="24"/>
-                <w:szCs w:val="24"/>
-              </w:rPr>
-            </w:pPr>
-          </w:p>
-        </w:tc>
-        <w:tc>
-          <w:tcPr>
-            <w:tcW w:w="0" w:type="auto"/>
-            <w:vAlign w:val="center"/>
-            <w:hideMark/>
-          </w:tcPr>
-          <w:p>
-            <w:pPr>
-              <w:rPr>
-                <w:rFonts w:ascii="Times New Roman" w:hAnsi="Times New Roman" w:cs="Times New Roman"/>
-                <w:sz w:val="24"/>
-                <w:szCs w:val="24"/>
-              </w:rPr>
-            </w:pPr>
-            <w:r>
-              <w:rPr>
-                <w:rFonts w:ascii="Times New Roman" w:hAnsi="Times New Roman" w:cs="Times New Roman"/>
-                <w:b/>
-                <w:bCs/>
-                <w:sz w:val="24"/>
-                <w:szCs w:val="24"/>
-              </w:rPr>
-              <w:t>$500,00</w:t>
-            </w:r>
-          </w:p>
-        </w:tc>
-      </w:tr>
-    </w:tbl>
-    <w:p>
-      <w:pPr>
         <w:jc w:val="center"/>
         <w:rPr>
           <w:rFonts w:ascii="Times New Roman" w:hAnsi="Times New Roman" w:cs="Times New Roman"/>
@@ -4914,6 +4597,7 @@
           <w:szCs w:val="24"/>
           <w:lang w:val="es-ES"/>
         </w:rPr>
+        <w:lastRenderedPageBreak/>
         <w:t>Nota.</w:t>
       </w:r>
       <w:r>
@@ -4925,51 +4609,6 @@
         </w:rPr>
         <w:t xml:space="preserve"> Elaborado por La Autora.</w:t>
       </w:r>
-    </w:p>
-    <w:p>
-      <w:pPr>
-        <w:rPr>
-          <w:sz w:val="24"/>
-          <w:szCs w:val="24"/>
-          <w:lang w:val="es-ES"/>
-        </w:rPr>
-      </w:pPr>
-    </w:p>
-    <w:p>
-      <w:pPr>
-        <w:rPr>
-          <w:sz w:val="24"/>
-          <w:szCs w:val="24"/>
-          <w:lang w:val="es-ES"/>
-        </w:rPr>
-      </w:pPr>
-    </w:p>
-    <w:p>
-      <w:pPr>
-        <w:rPr>
-          <w:sz w:val="24"/>
-          <w:szCs w:val="24"/>
-          <w:lang w:val="es-ES"/>
-        </w:rPr>
-      </w:pPr>
-    </w:p>
-    <w:p>
-      <w:pPr>
-        <w:rPr>
-          <w:sz w:val="24"/>
-          <w:szCs w:val="24"/>
-          <w:lang w:val="es-ES"/>
-        </w:rPr>
-      </w:pPr>
-    </w:p>
-    <w:p>
-      <w:pPr>
-        <w:rPr>
-          <w:sz w:val="24"/>
-          <w:szCs w:val="24"/>
-          <w:lang w:val="es-ES"/>
-        </w:rPr>
-      </w:pPr>
     </w:p>
     <w:p>
       <w:pPr>
@@ -5033,7 +4672,6 @@
           <w:szCs w:val="24"/>
           <w:lang w:val="es-ES"/>
         </w:rPr>
-        <w:lastRenderedPageBreak/>
         <w:t>CRONOGRAMA DE ACTIVIDADES</w:t>
       </w:r>
     </w:p>
@@ -6766,6 +6404,7 @@
                 <w:sz w:val="24"/>
                 <w:szCs w:val="24"/>
               </w:rPr>
+              <w:lastRenderedPageBreak/>
               <w:t>11</w:t>
             </w:r>
           </w:p>
@@ -8482,6 +8121,118 @@
     </w:lvl>
   </w:abstractNum>
   <w:abstractNum w:abstractNumId="1" w15:restartNumberingAfterBreak="0">
+    <w:nsid w:val="15451D35"/>
+    <w:multiLevelType w:val="hybridMultilevel"/>
+    <w:tmpl w:val="74904EC8"/>
+    <w:lvl w:ilvl="0" w:tplc="D6089CD8">
+      <w:numFmt w:val="bullet"/>
+      <w:lvlText w:val="-"/>
+      <w:lvlJc w:val="left"/>
+      <w:pPr>
+        <w:ind w:left="720" w:hanging="360"/>
+      </w:pPr>
+      <w:rPr>
+        <w:rFonts w:ascii="Times New Roman" w:eastAsiaTheme="minorHAnsi" w:hAnsi="Times New Roman" w:cs="Times New Roman" w:hint="default"/>
+      </w:rPr>
+    </w:lvl>
+    <w:lvl w:ilvl="1" w:tplc="0C0A0003" w:tentative="1">
+      <w:start w:val="1"/>
+      <w:numFmt w:val="bullet"/>
+      <w:lvlText w:val="o"/>
+      <w:lvlJc w:val="left"/>
+      <w:pPr>
+        <w:ind w:left="1440" w:hanging="360"/>
+      </w:pPr>
+      <w:rPr>
+        <w:rFonts w:ascii="Courier New" w:hAnsi="Courier New" w:cs="Courier New" w:hint="default"/>
+      </w:rPr>
+    </w:lvl>
+    <w:lvl w:ilvl="2" w:tplc="0C0A0005" w:tentative="1">
+      <w:start w:val="1"/>
+      <w:numFmt w:val="bullet"/>
+      <w:lvlText w:val=""/>
+      <w:lvlJc w:val="left"/>
+      <w:pPr>
+        <w:ind w:left="2160" w:hanging="360"/>
+      </w:pPr>
+      <w:rPr>
+        <w:rFonts w:ascii="Wingdings" w:hAnsi="Wingdings" w:hint="default"/>
+      </w:rPr>
+    </w:lvl>
+    <w:lvl w:ilvl="3" w:tplc="0C0A0001" w:tentative="1">
+      <w:start w:val="1"/>
+      <w:numFmt w:val="bullet"/>
+      <w:lvlText w:val=""/>
+      <w:lvlJc w:val="left"/>
+      <w:pPr>
+        <w:ind w:left="2880" w:hanging="360"/>
+      </w:pPr>
+      <w:rPr>
+        <w:rFonts w:ascii="Symbol" w:hAnsi="Symbol" w:hint="default"/>
+      </w:rPr>
+    </w:lvl>
+    <w:lvl w:ilvl="4" w:tplc="0C0A0003" w:tentative="1">
+      <w:start w:val="1"/>
+      <w:numFmt w:val="bullet"/>
+      <w:lvlText w:val="o"/>
+      <w:lvlJc w:val="left"/>
+      <w:pPr>
+        <w:ind w:left="3600" w:hanging="360"/>
+      </w:pPr>
+      <w:rPr>
+        <w:rFonts w:ascii="Courier New" w:hAnsi="Courier New" w:cs="Courier New" w:hint="default"/>
+      </w:rPr>
+    </w:lvl>
+    <w:lvl w:ilvl="5" w:tplc="0C0A0005" w:tentative="1">
+      <w:start w:val="1"/>
+      <w:numFmt w:val="bullet"/>
+      <w:lvlText w:val=""/>
+      <w:lvlJc w:val="left"/>
+      <w:pPr>
+        <w:ind w:left="4320" w:hanging="360"/>
+      </w:pPr>
+      <w:rPr>
+        <w:rFonts w:ascii="Wingdings" w:hAnsi="Wingdings" w:hint="default"/>
+      </w:rPr>
+    </w:lvl>
+    <w:lvl w:ilvl="6" w:tplc="0C0A0001" w:tentative="1">
+      <w:start w:val="1"/>
+      <w:numFmt w:val="bullet"/>
+      <w:lvlText w:val=""/>
+      <w:lvlJc w:val="left"/>
+      <w:pPr>
+        <w:ind w:left="5040" w:hanging="360"/>
+      </w:pPr>
+      <w:rPr>
+        <w:rFonts w:ascii="Symbol" w:hAnsi="Symbol" w:hint="default"/>
+      </w:rPr>
+    </w:lvl>
+    <w:lvl w:ilvl="7" w:tplc="0C0A0003" w:tentative="1">
+      <w:start w:val="1"/>
+      <w:numFmt w:val="bullet"/>
+      <w:lvlText w:val="o"/>
+      <w:lvlJc w:val="left"/>
+      <w:pPr>
+        <w:ind w:left="5760" w:hanging="360"/>
+      </w:pPr>
+      <w:rPr>
+        <w:rFonts w:ascii="Courier New" w:hAnsi="Courier New" w:cs="Courier New" w:hint="default"/>
+      </w:rPr>
+    </w:lvl>
+    <w:lvl w:ilvl="8" w:tplc="0C0A0005" w:tentative="1">
+      <w:start w:val="1"/>
+      <w:numFmt w:val="bullet"/>
+      <w:lvlText w:val=""/>
+      <w:lvlJc w:val="left"/>
+      <w:pPr>
+        <w:ind w:left="6480" w:hanging="360"/>
+      </w:pPr>
+      <w:rPr>
+        <w:rFonts w:ascii="Wingdings" w:hAnsi="Wingdings" w:hint="default"/>
+      </w:rPr>
+    </w:lvl>
+  </w:abstractNum>
+  <w:abstractNum w:abstractNumId="2" w15:restartNumberingAfterBreak="0">
     <w:nsid w:val="18E9680C"/>
     <w:multiLevelType w:val="hybridMultilevel"/>
     <w:tmpl w:val="B8CCF5A6"/>
@@ -8595,7 +8346,7 @@
       </w:rPr>
     </w:lvl>
   </w:abstractNum>
-  <w:abstractNum w:abstractNumId="2" w15:restartNumberingAfterBreak="0">
+  <w:abstractNum w:abstractNumId="3" w15:restartNumberingAfterBreak="0">
     <w:nsid w:val="2FDD7E72"/>
     <w:multiLevelType w:val="multilevel"/>
     <w:tmpl w:val="300A001F"/>
@@ -8708,7 +8459,7 @@
       </w:rPr>
     </w:lvl>
   </w:abstractNum>
-  <w:abstractNum w:abstractNumId="3" w15:restartNumberingAfterBreak="0">
+  <w:abstractNum w:abstractNumId="4" w15:restartNumberingAfterBreak="0">
     <w:nsid w:val="36CA1354"/>
     <w:multiLevelType w:val="multilevel"/>
     <w:tmpl w:val="5772354E"/>
@@ -8857,7 +8608,7 @@
       </w:rPr>
     </w:lvl>
   </w:abstractNum>
-  <w:abstractNum w:abstractNumId="4" w15:restartNumberingAfterBreak="0">
+  <w:abstractNum w:abstractNumId="5" w15:restartNumberingAfterBreak="0">
     <w:nsid w:val="526363A1"/>
     <w:multiLevelType w:val="hybridMultilevel"/>
     <w:tmpl w:val="C58AE036"/>
@@ -8970,7 +8721,7 @@
       </w:rPr>
     </w:lvl>
   </w:abstractNum>
-  <w:abstractNum w:abstractNumId="5" w15:restartNumberingAfterBreak="0">
+  <w:abstractNum w:abstractNumId="6" w15:restartNumberingAfterBreak="0">
     <w:nsid w:val="5BE237A4"/>
     <w:multiLevelType w:val="hybridMultilevel"/>
     <w:tmpl w:val="84482AB8"/>
@@ -9083,7 +8834,7 @@
       </w:rPr>
     </w:lvl>
   </w:abstractNum>
-  <w:abstractNum w:abstractNumId="6" w15:restartNumberingAfterBreak="0">
+  <w:abstractNum w:abstractNumId="7" w15:restartNumberingAfterBreak="0">
     <w:nsid w:val="694E2CCC"/>
     <w:multiLevelType w:val="hybridMultilevel"/>
     <w:tmpl w:val="7C3A253C"/>
@@ -9196,7 +8947,7 @@
       </w:rPr>
     </w:lvl>
   </w:abstractNum>
-  <w:abstractNum w:abstractNumId="7" w15:restartNumberingAfterBreak="0">
+  <w:abstractNum w:abstractNumId="8" w15:restartNumberingAfterBreak="0">
     <w:nsid w:val="6FDE5B98"/>
     <w:multiLevelType w:val="hybridMultilevel"/>
     <w:tmpl w:val="4A98F86E"/>
@@ -9310,28 +9061,31 @@
     </w:lvl>
   </w:abstractNum>
   <w:num w:numId="1" w16cid:durableId="1412309730">
+    <w:abstractNumId w:val="8"/>
+  </w:num>
+  <w:num w:numId="2" w16cid:durableId="1084303842">
+    <w:abstractNumId w:val="3"/>
+  </w:num>
+  <w:num w:numId="3" w16cid:durableId="986087254">
     <w:abstractNumId w:val="7"/>
   </w:num>
-  <w:num w:numId="2" w16cid:durableId="1084303842">
-    <w:abstractNumId w:val="2"/>
-  </w:num>
-  <w:num w:numId="3" w16cid:durableId="986087254">
-    <w:abstractNumId w:val="6"/>
-  </w:num>
   <w:num w:numId="4" w16cid:durableId="529954531">
-    <w:abstractNumId w:val="3"/>
+    <w:abstractNumId w:val="4"/>
   </w:num>
   <w:num w:numId="5" w16cid:durableId="1726639304">
     <w:abstractNumId w:val="0"/>
   </w:num>
   <w:num w:numId="6" w16cid:durableId="1955676362">
-    <w:abstractNumId w:val="4"/>
+    <w:abstractNumId w:val="5"/>
   </w:num>
   <w:num w:numId="7" w16cid:durableId="817306302">
-    <w:abstractNumId w:val="1"/>
+    <w:abstractNumId w:val="2"/>
   </w:num>
   <w:num w:numId="8" w16cid:durableId="1452476711">
-    <w:abstractNumId w:val="5"/>
+    <w:abstractNumId w:val="6"/>
+  </w:num>
+  <w:num w:numId="9" w16cid:durableId="213347694">
+    <w:abstractNumId w:val="1"/>
   </w:num>
 </w:numbering>
 </file>
@@ -9938,7 +9692,6 @@
   <w:style w:type="character" w:default="1" w:styleId="Fuentedeprrafopredeter">
     <w:name w:val="Default Paragraph Font"/>
     <w:uiPriority w:val="1"/>
-    <w:semiHidden/>
     <w:unhideWhenUsed/>
   </w:style>
   <w:style w:type="table" w:default="1" w:styleId="Tablanormal">
@@ -10525,6 +10278,17 @@
       <w:rFonts w:ascii="Times New Roman" w:hAnsi="Times New Roman"/>
     </w:rPr>
   </w:style>
+  <w:style w:type="character" w:styleId="Fuerte">
+    <w:name w:val="Strong"/>
+    <w:basedOn w:val="Fuentedeprrafopredeter"/>
+    <w:uiPriority w:val="22"/>
+    <w:qFormat/>
+    <w:rsid w:val="00552003"/>
+    <w:rPr>
+      <w:b/>
+      <w:bCs/>
+    </w:rPr>
+  </w:style>
 </w:styles>
 </file>
 

</xml_diff>

<commit_message>
Ajustes finales antes de la revisión
</commit_message>
<xml_diff>
--- a/2026-1_MODELO CONTENIDO PERFIL PIC2.docx
+++ b/2026-1_MODELO CONTENIDO PERFIL PIC2.docx
@@ -61,7 +61,7 @@
           <w:lang w:val="en-US"/>
         </w:rPr>
         <w:drawing>
-          <wp:inline distT="0" distB="0" distL="0" distR="0" wp14:anchorId="323F8FAD" wp14:editId="55094AB6">
+          <wp:inline distT="0" distB="0" distL="0" distR="0" wp14:anchorId="323F8FAD" wp14:editId="047B7C74">
             <wp:extent cx="2004060" cy="2004060"/>
             <wp:effectExtent l="0" t="0" r="0" b="0"/>
             <wp:docPr id="1419612950" name="Imagen 11" descr="Logotipo&#10;&#10;Descripción generada automáticamente"/>
@@ -1674,52 +1674,72 @@
           <w:szCs w:val="24"/>
           <w:lang w:val="es-ES"/>
         </w:rPr>
-        <w:t>FUNDAMENTACIÓN TEÓRICA</w:t>
-      </w:r>
-    </w:p>
-    <w:p>
-      <w:pPr>
-        <w:pStyle w:val="Ttulo2"/>
+        <w:t>FUNDAMENTACIÓN TEÓRIC</w:t>
+      </w:r>
+      <w:r>
         <w:rPr>
           <w:rFonts w:ascii="Times New Roman" w:hAnsi="Times New Roman" w:cs="Times New Roman"/>
           <w:b/>
           <w:bCs/>
-          <w:color w:val="auto"/>
-          <w:sz w:val="24"/>
-          <w:szCs w:val="24"/>
-          <w:lang w:val="es-ES"/>
-        </w:rPr>
-      </w:pPr>
-      <w:r>
+          <w:sz w:val="24"/>
+          <w:szCs w:val="24"/>
+          <w:lang w:val="es-ES"/>
+        </w:rPr>
+        <w:t>A</w:t>
+      </w:r>
+    </w:p>
+    <w:p>
+      <w:pPr>
+        <w:spacing w:before="240" w:line="360" w:lineRule="auto"/>
+        <w:ind w:left="360"/>
+        <w:jc w:val="both"/>
         <w:rPr>
           <w:rFonts w:ascii="Times New Roman" w:hAnsi="Times New Roman" w:cs="Times New Roman"/>
           <w:b/>
           <w:bCs/>
-          <w:color w:val="auto"/>
-          <w:sz w:val="24"/>
-          <w:szCs w:val="24"/>
-          <w:lang w:val="es-ES"/>
-        </w:rPr>
-        <w:t xml:space="preserve">    </w:t>
-      </w:r>
+          <w:sz w:val="24"/>
+          <w:szCs w:val="24"/>
+          <w:lang w:val="es-ES"/>
+        </w:rPr>
+      </w:pPr>
       <w:r>
         <w:rPr>
           <w:rFonts w:ascii="Times New Roman" w:hAnsi="Times New Roman" w:cs="Times New Roman"/>
           <w:b/>
           <w:bCs/>
-          <w:color w:val="auto"/>
-          <w:sz w:val="24"/>
-          <w:szCs w:val="24"/>
-          <w:lang w:val="es-ES"/>
-        </w:rPr>
-        <w:t>7.1 Plataformas web institucionales</w:t>
+          <w:sz w:val="24"/>
+          <w:szCs w:val="24"/>
+          <w:lang w:val="es-ES"/>
+        </w:rPr>
+        <w:t>7.1 P</w:t>
       </w:r>
       <w:r>
         <w:rPr>
           <w:rFonts w:ascii="Times New Roman" w:hAnsi="Times New Roman" w:cs="Times New Roman"/>
           <w:b/>
           <w:bCs/>
-          <w:color w:val="auto"/>
+          <w:sz w:val="24"/>
+          <w:szCs w:val="24"/>
+          <w:lang w:val="es-ES"/>
+        </w:rPr>
+        <w:t>latafor</w:t>
+      </w:r>
+      <w:r>
+        <w:rPr>
+          <w:rFonts w:ascii="Times New Roman" w:hAnsi="Times New Roman" w:cs="Times New Roman"/>
+          <w:b/>
+          <w:bCs/>
+          <w:sz w:val="24"/>
+          <w:szCs w:val="24"/>
+          <w:lang w:val="es-ES"/>
+        </w:rPr>
+        <w:t>mas web institucionales</w:t>
+      </w:r>
+      <w:r>
+        <w:rPr>
+          <w:rFonts w:ascii="Times New Roman" w:hAnsi="Times New Roman" w:cs="Times New Roman"/>
+          <w:b/>
+          <w:bCs/>
           <w:sz w:val="24"/>
           <w:szCs w:val="24"/>
           <w:lang w:val="es-ES"/>
@@ -1729,44 +1749,40 @@
     </w:p>
     <w:p>
       <w:pPr>
-        <w:spacing w:before="240" w:after="0" w:line="360" w:lineRule="auto"/>
-        <w:ind w:left="708" w:firstLine="708"/>
+        <w:spacing w:before="240" w:line="360" w:lineRule="auto"/>
+        <w:ind w:left="360" w:firstLine="348"/>
         <w:jc w:val="both"/>
         <w:rPr>
           <w:rFonts w:ascii="Times New Roman" w:hAnsi="Times New Roman" w:cs="Times New Roman"/>
           <w:sz w:val="24"/>
           <w:szCs w:val="24"/>
-          <w:lang w:val="es-ES"/>
-        </w:rPr>
-      </w:pPr>
-      <w:r>
-        <w:rPr>
-          <w:rFonts w:ascii="Times New Roman" w:hAnsi="Times New Roman" w:cs="Times New Roman"/>
-          <w:sz w:val="24"/>
-          <w:szCs w:val="24"/>
-          <w:lang w:val="es-ES"/>
-        </w:rPr>
-        <w:t>Las plataformas web institucionales constituyen infraestructuras digitales mediante las cuales una organización académica ordena, publica y administra servicios, información y procesos internos. En el caso de una carrera de Desarrollo de Software, una plataforma web institucional no debe entenderse solamente como un sitio informativo, sino como un entorno de interacción entre estudiantes, docentes, coordinadores, revisores y autoridades. Su valor se encuentra en centralizar operaciones que antes se desarrollaban por medios dispersos, como correos electrónicos, carpetas compartidas, formularios físicos o registros aislados.</w:t>
-      </w:r>
-    </w:p>
-    <w:p>
-      <w:pPr>
-        <w:spacing w:before="240" w:after="0" w:line="360" w:lineRule="auto"/>
-        <w:ind w:left="708" w:firstLine="708"/>
+        </w:rPr>
+      </w:pPr>
+      <w:r>
+        <w:rPr>
+          <w:rFonts w:ascii="Times New Roman" w:hAnsi="Times New Roman" w:cs="Times New Roman"/>
+          <w:sz w:val="24"/>
+          <w:szCs w:val="24"/>
+        </w:rPr>
+        <w:t>Las plataformas web institucionales constituyen infraestructuras digitales mediante las cuales una organización académica administra información, servicios y procesos internos. En una carrera de Desarrollo de Software, una plataforma web institucional no debe entenderse únicamente como un sitio informativo, sino como un entorno de interacción entre estudiantes, docentes, coordinadores y revisores, centralizando actividades que tradicionalmente se realizan mediante correos electrónicos, formularios o registros dispersos.</w:t>
+      </w:r>
+    </w:p>
+    <w:p>
+      <w:pPr>
+        <w:spacing w:before="240" w:line="360" w:lineRule="auto"/>
+        <w:ind w:left="360" w:firstLine="348"/>
         <w:jc w:val="both"/>
         <w:rPr>
           <w:rFonts w:ascii="Times New Roman" w:hAnsi="Times New Roman" w:cs="Times New Roman"/>
           <w:sz w:val="24"/>
           <w:szCs w:val="24"/>
-          <w:lang w:val="es-ES"/>
-        </w:rPr>
-      </w:pPr>
-      <w:r>
-        <w:rPr>
-          <w:rFonts w:ascii="Times New Roman" w:hAnsi="Times New Roman" w:cs="Times New Roman"/>
-          <w:sz w:val="24"/>
-          <w:szCs w:val="24"/>
-          <w:lang w:val="es-ES"/>
+        </w:rPr>
+      </w:pPr>
+      <w:r>
+        <w:rPr>
+          <w:rFonts w:ascii="Times New Roman" w:hAnsi="Times New Roman" w:cs="Times New Roman"/>
+          <w:sz w:val="24"/>
+          <w:szCs w:val="24"/>
         </w:rPr>
         <w:t xml:space="preserve">En educación superior, esta función integradora es especialmente relevante porque, como señalan </w:t>
       </w:r>
@@ -1775,7 +1791,6 @@
           <w:rFonts w:ascii="Times New Roman" w:hAnsi="Times New Roman" w:cs="Times New Roman"/>
           <w:sz w:val="24"/>
           <w:szCs w:val="24"/>
-          <w:lang w:val="es-ES"/>
         </w:rPr>
         <w:fldChar w:fldCharType="begin"/>
       </w:r>
@@ -1784,16 +1799,14 @@
           <w:rFonts w:ascii="Times New Roman" w:hAnsi="Times New Roman" w:cs="Times New Roman"/>
           <w:sz w:val="24"/>
           <w:szCs w:val="24"/>
-          <w:lang w:val="es-ES"/>
-        </w:rPr>
-        <w:instrText xml:space="preserve"> ADDIN ZOTERO_ITEM CSL_CITATION {"citationID":"WbCypLiv","properties":{"unsorted":false,"formattedCitation":"(Santana-Mancilla et\\uc0\\u160{}al., 2025)","plainCitation":"(Santana-Mancilla et al., 2025)","noteIndex":0},"citationItems":[{"id":"0ccfRIuB/ionT0b3t","uris":["http://zotero.org/users/local/3NWqkcVE/items/A94PM7G6"],"itemData":{"id":136,"type":"article-journal","abstract":"University portals serve as primary access points to academic, administrative, and communication services in higher education. However, their usability and information architecture often fail to align with users’ expectations, resulting in inefficiencies and cognitive overload. This study presents an empirical validation of the web portal of the University of Colima, focusing on the evaluation of its information architecture through a tree testing approach. The experiment involved nine representative user profiles (including students, faculty, administrative staff, and external visitors) to assess navigation efficiency, semantic consistency, and success rates across realistic information-seeking tasks. Overall results indicated moderate usability performance: while users achieved success rates above 80% for routine tasks, those requiring interpretation of institutional terminology showed considerably lower outcomes. Excessive hierarchical depth and ambiguous labeling emerged as primary barriers to efficient navigation. Cross-group analysis revealed notable differences among users, particularly between experienced institutional members and new or external visitors, highlighting the need for more inclusive and adaptive design strategies. The findings support simplifying the portal’s information hierarchy, standardizing terminology, and integrating iterative usability testing as part of continuous improvement. This work contributes to the growing body of research on university website usability and offers an evidence-based framework for designing user-centered information architectures in higher education.\n          , \n            Los portales universitarios funcionan como puntos de acceso primarios a los servicios académicos, administrativos y de comunicación en la educación superior. Sin embargo, su usabilidad y arquitectura de información con frecuencia no se alinean con las expectativas de los usuarios, generando ineficiencias y sobrecarga cognitiva. Este estudio presenta una validación empírica del portal institucional rediseñado de la Universidad de Colima, centrada en la evaluación de su arquitectura de información mediante la técnica de tree testing. El experimento involucró nueve perfiles representativos de usuarios (entre ellos estudiantes, profesorado, personal administrativo y visitantes externos) para analizar la eficiencia de navegación, la coherencia semántica y las tasas de éxito en tareas de búsqueda de información realistas. Los resultados mostraron un desempeño de usabilidad moderado: aunque los usuarios alcanzaron tasas de éxito superiores al 80 % en tareas rutinarias, aquellas que requerían interpretar terminología institucional obtuvieron resultados considerablemente menores. La profundidad excesiva de los menús y la ambigüedad de las etiquetas surgieron como las principales barreras para una navegación eficiente. El análisis entre grupos reveló diferencias notables entre usuarios con experiencia institucional y visitantes nuevos o externos, lo que evidencia la necesidad de estrategias de diseño más inclusivas y adaptativas. Los hallazgos respaldan la simplificación de la jerarquía informativa, la estandarización de la nomenclatura y la incorporación de pruebas de usabilidad iterativas como parte del proceso de mejora continua. Este trabajo contribuye al creciente cuerpo de investigación sobre la usabilidad de sitios web universitarios y ofrece un marco basado en evidencia para el diseño de arquitecturas de información centradas en las personas en el ámbito de la educación superior.","container-title":"Avances en Interacción Humano-Computadora","DOI":"10.47756/aihc.y10i1.203","ISSN":"2594-2352","issue":"1","journalAbbreviation":"Avances en IHC","license":"https://creativecommons.org/licenses/by-nc-nd/4.0","page":"60-69","source":"DOI.org (Crossref)","title":"Beyond Navigation: Understanding Semantic Gaps in the Information Architecture of a University Portal","title-short":"Beyond Navigation","volume":"10","author":[{"family":"Santana-Mancilla","given":"Pedro César"},{"family":"Fajardo-Flores","given":"Silvia Berenice"},{"family":"Rodríguez-Ortiz","given":"Miguel Ángel"},{"family":"Argenis Mondragón","given":"Emmanuel Ángel"},{"family":"Gaytán-Lugo","given":"Laura Sanely"}],"issued":{"date-parts":[["2025",11,30]]}}}],"schema":"https://github.com/citation-style-language/schema/raw/master/csl-citation.json"} </w:instrText>
-      </w:r>
-      <w:r>
-        <w:rPr>
-          <w:rFonts w:ascii="Times New Roman" w:hAnsi="Times New Roman" w:cs="Times New Roman"/>
-          <w:sz w:val="24"/>
-          <w:szCs w:val="24"/>
-          <w:lang w:val="es-ES"/>
+        </w:rPr>
+        <w:instrText xml:space="preserve"> ADDIN ZOTERO_ITEM CSL_CITATION {"citationID":"DffIKhyk","properties":{"unsorted":false,"formattedCitation":"(Santana-Mancilla et\\uc0\\u160{}al., 2025)","plainCitation":"(Santana-Mancilla et al., 2025)","noteIndex":0},"citationItems":[{"id":1,"uris":["http://zotero.org/users/local/jI0LZQ6G/items/PMYEW8HB"],"itemData":{"id":1,"type":"article-journal","abstract":"University portals serve as primary access points to academic, administrative, and communication services in higher education. However, their usability and information architecture often fail to align with users’ expectations, resulting in inefficiencies and cognitive overload. This study presents an empirical validation of the web portal of the University of Colima, focusing on the evaluation of its information architecture through a tree testing approach. The experiment involved nine representative user profiles (including students, faculty, administrative staff, and external visitors) to assess navigation efficiency, semantic consistency, and success rates across realistic information-seeking tasks. Overall results indicated moderate usability performance: while users achieved success rates above 80% for routine tasks, those requiring interpretation of institutional terminology showed considerably lower outcomes. Excessive hierarchical depth and ambiguous labeling emerged as primary barriers to efficient navigation. Cross-group analysis revealed notable differences among users, particularly between experienced institutional members and new or external visitors, highlighting the need for more inclusive and adaptive design strategies. The findings support simplifying the portal’s information hierarchy, standardizing terminology, and integrating iterative usability testing as part of continuous improvement. This work contributes to the growing body of research on university website usability and offers an evidence-based framework for designing user-centered information architectures in higher education.\n          , \n            Los portales universitarios funcionan como puntos de acceso primarios a los servicios académicos, administrativos y de comunicación en la educación superior. Sin embargo, su usabilidad y arquitectura de información con frecuencia no se alinean con las expectativas de los usuarios, generando ineficiencias y sobrecarga cognitiva. Este estudio presenta una validación empírica del portal institucional rediseñado de la Universidad de Colima, centrada en la evaluación de su arquitectura de información mediante la técnica de tree testing. El experimento involucró nueve perfiles representativos de usuarios (entre ellos estudiantes, profesorado, personal administrativo y visitantes externos) para analizar la eficiencia de navegación, la coherencia semántica y las tasas de éxito en tareas de búsqueda de información realistas. Los resultados mostraron un desempeño de usabilidad moderado: aunque los usuarios alcanzaron tasas de éxito superiores al 80 % en tareas rutinarias, aquellas que requerían interpretar terminología institucional obtuvieron resultados considerablemente menores. La profundidad excesiva de los menús y la ambigüedad de las etiquetas surgieron como las principales barreras para una navegación eficiente. El análisis entre grupos reveló diferencias notables entre usuarios con experiencia institucional y visitantes nuevos o externos, lo que evidencia la necesidad de estrategias de diseño más inclusivas y adaptativas. Los hallazgos respaldan la simplificación de la jerarquía informativa, la estandarización de la nomenclatura y la incorporación de pruebas de usabilidad iterativas como parte del proceso de mejora continua. Este trabajo contribuye al creciente cuerpo de investigación sobre la usabilidad de sitios web universitarios y ofrece un marco basado en evidencia para el diseño de arquitecturas de información centradas en las personas en el ámbito de la educación superior.","container-title":"Avances en Interacción Humano-Computadora","DOI":"10.47756/aihc.y10i1.203","ISSN":"2594-2352","issue":"1","journalAbbreviation":"Avances en IHC","license":"https://creativecommons.org/licenses/by-nc-nd/4.0","page":"60-69","source":"DOI.org (Crossref)","title":"Beyond Navigation: Understanding Semantic Gaps in the Information Architecture of a University Portal","title-short":"Beyond Navigation","volume":"10","author":[{"family":"Santana-Mancilla","given":"Pedro César"},{"family":"Fajardo-Flores","given":"Silvia Berenice"},{"family":"Rodríguez-Ortiz","given":"Miguel Ángel"},{"family":"Argenis Mondragón","given":"Emmanuel Ángel"},{"family":"Gaytán-Lugo","given":"Laura Sanely"}],"issued":{"date-parts":[["2025",11,30]]}}}],"schema":"https://github.com/citation-style-language/schema/raw/master/csl-citation.json"} </w:instrText>
+      </w:r>
+      <w:r>
+        <w:rPr>
+          <w:rFonts w:ascii="Times New Roman" w:hAnsi="Times New Roman" w:cs="Times New Roman"/>
+          <w:sz w:val="24"/>
+          <w:szCs w:val="24"/>
         </w:rPr>
         <w:fldChar w:fldCharType="separate"/>
       </w:r>
@@ -1802,7 +1815,6 @@
           <w:rFonts w:ascii="Times New Roman" w:hAnsi="Times New Roman" w:cs="Times New Roman"/>
           <w:kern w:val="0"/>
           <w:sz w:val="24"/>
-          <w:szCs w:val="24"/>
         </w:rPr>
         <w:t>(Santana-Mancilla et al., 2025)</w:t>
       </w:r>
@@ -1811,7 +1823,6 @@
           <w:rFonts w:ascii="Times New Roman" w:hAnsi="Times New Roman" w:cs="Times New Roman"/>
           <w:sz w:val="24"/>
           <w:szCs w:val="24"/>
-          <w:lang w:val="es-ES"/>
         </w:rPr>
         <w:fldChar w:fldCharType="end"/>
       </w:r>
@@ -1820,94 +1831,399 @@
           <w:rFonts w:ascii="Times New Roman" w:hAnsi="Times New Roman" w:cs="Times New Roman"/>
           <w:sz w:val="24"/>
           <w:szCs w:val="24"/>
-          <w:lang w:val="es-ES"/>
-        </w:rPr>
-        <w:t xml:space="preserve">, "los portales universitarios </w:t>
-      </w:r>
-      <w:r>
-        <w:rPr>
-          <w:rFonts w:ascii="Times New Roman" w:hAnsi="Times New Roman" w:cs="Times New Roman"/>
-          <w:sz w:val="24"/>
-          <w:szCs w:val="24"/>
-          <w:lang w:val="es-ES"/>
+        </w:rPr>
+        <w:t xml:space="preserve">"los portales universitarios funcionan como puntos de acceso primarios a los servicios académicos, administrativos y de </w:t>
+      </w:r>
+      <w:r>
+        <w:rPr>
+          <w:rFonts w:ascii="Times New Roman" w:hAnsi="Times New Roman" w:cs="Times New Roman"/>
+          <w:sz w:val="24"/>
+          <w:szCs w:val="24"/>
         </w:rPr>
         <w:lastRenderedPageBreak/>
-        <w:t>funcionan como puntos de acceso primarios a los servicios académicos, administrativos y de comunicación" (p. 60). Esta idea permite comprender que una plataforma institucional no solo comunica información, sino que organiza el acceso a servicios y procesos que sostienen la vida académica. Por ello, su diseño debe responder a necesidades reales de navegación, gestión, consulta y seguimiento.</w:t>
-      </w:r>
-    </w:p>
-    <w:p>
-      <w:pPr>
-        <w:spacing w:before="240" w:after="0" w:line="360" w:lineRule="auto"/>
-        <w:ind w:left="708" w:firstLine="708"/>
+        <w:t>comunicación" (p. 60). Esto demuestra que una plataforma institucional no solo comunica información, sino que también organiza el acceso a procesos que apoyan la actividad académica.</w:t>
+      </w:r>
+    </w:p>
+    <w:p>
+      <w:pPr>
+        <w:spacing w:before="240" w:line="360" w:lineRule="auto"/>
+        <w:ind w:left="360" w:firstLine="348"/>
         <w:jc w:val="both"/>
         <w:rPr>
           <w:rFonts w:ascii="Times New Roman" w:hAnsi="Times New Roman" w:cs="Times New Roman"/>
           <w:sz w:val="24"/>
           <w:szCs w:val="24"/>
-          <w:lang w:val="es-ES"/>
-        </w:rPr>
-      </w:pPr>
-      <w:r>
-        <w:rPr>
-          <w:rFonts w:ascii="Times New Roman" w:hAnsi="Times New Roman" w:cs="Times New Roman"/>
-          <w:sz w:val="24"/>
-          <w:szCs w:val="24"/>
-          <w:lang w:val="es-ES"/>
-        </w:rPr>
-        <w:t>Una plataforma institucional orientada al seguimiento, revisión y gestión documental de proyectos académicos debe responder a tres necesidades principales. Primero, debe facilitar el acceso organizado a información académica relevante: proyectos registrados, responsables, fechas, estados, observaciones y documentos asociados. Segundo, debe permitir la ejecución de procesos definidos, como asignación de revisores, entrega de avances, revisión de evidencias, aprobación de documentos y cierre de proyectos. Tercero, debe ofrecer trazabilidad para que cada acción realizada dentro del sistema pueda ser consultada y auditada posteriormente.</w:t>
-      </w:r>
-    </w:p>
-    <w:p>
-      <w:pPr>
-        <w:spacing w:before="240" w:after="0" w:line="360" w:lineRule="auto"/>
-        <w:ind w:left="708" w:firstLine="708"/>
+        </w:rPr>
+      </w:pPr>
+      <w:r>
+        <w:rPr>
+          <w:rFonts w:ascii="Times New Roman" w:hAnsi="Times New Roman" w:cs="Times New Roman"/>
+          <w:sz w:val="24"/>
+          <w:szCs w:val="24"/>
+        </w:rPr>
+        <w:t>Una plataforma orientada al seguimiento, revisión y gestión documental de proyectos académicos debe facilitar el acceso a información relevante, permitir la ejecución de procesos como la entrega y revisión de documentos, y garantizar la trazabilidad de las acciones realizadas dentro del sistema.</w:t>
+      </w:r>
+    </w:p>
+    <w:p>
+      <w:pPr>
+        <w:spacing w:before="240" w:line="360" w:lineRule="auto"/>
+        <w:ind w:left="360" w:firstLine="348"/>
         <w:jc w:val="both"/>
         <w:rPr>
           <w:rFonts w:ascii="Times New Roman" w:hAnsi="Times New Roman" w:cs="Times New Roman"/>
           <w:sz w:val="24"/>
           <w:szCs w:val="24"/>
-          <w:lang w:val="es-ES"/>
-        </w:rPr>
-      </w:pPr>
-      <w:r>
-        <w:rPr>
-          <w:rFonts w:ascii="Times New Roman" w:hAnsi="Times New Roman" w:cs="Times New Roman"/>
-          <w:sz w:val="24"/>
-          <w:szCs w:val="24"/>
-          <w:lang w:val="es-ES"/>
-        </w:rPr>
-        <w:t>Desde el punto de vista de la experiencia de usuario, estas plataformas requieren una arquitectura de información clara. La evidencia revisada muestra que los portales universitarios pueden generar sobrecarga cognitiva cuando su estructura no se ajusta a las expectativas de quienes los usan. Por ello, el diseño de la plataforma debe evitar menús excesivamente profundos, etiquetas ambiguas y rutas de navegación poco previsibles. En un sistema académico, la claridad terminológica es especialmente importante, porque usuarios con diferentes roles pueden interpretar de forma distinta expresiones como proyecto, avance, revisión, entrega, validación o aprobación.</w:t>
-      </w:r>
-    </w:p>
-    <w:p>
-      <w:pPr>
-        <w:spacing w:before="240" w:after="0" w:line="360" w:lineRule="auto"/>
-        <w:ind w:left="708" w:firstLine="708"/>
+        </w:rPr>
+      </w:pPr>
+      <w:r>
+        <w:rPr>
+          <w:rFonts w:ascii="Times New Roman" w:hAnsi="Times New Roman" w:cs="Times New Roman"/>
+          <w:sz w:val="24"/>
+          <w:szCs w:val="24"/>
+        </w:rPr>
+        <w:t>Asimismo, al tratarse de un entorno institucional, debe incorporar autenticación de usuarios, control de acceso y roles definidos que permitan a cada actor cumplir sus funciones dentro del proceso académico.</w:t>
+      </w:r>
+    </w:p>
+    <w:p>
+      <w:pPr>
+        <w:spacing w:before="240" w:line="360" w:lineRule="auto"/>
+        <w:ind w:left="360" w:firstLine="348"/>
         <w:jc w:val="both"/>
         <w:rPr>
           <w:rFonts w:ascii="Times New Roman" w:hAnsi="Times New Roman" w:cs="Times New Roman"/>
           <w:sz w:val="24"/>
           <w:szCs w:val="24"/>
-          <w:lang w:val="es-ES"/>
-        </w:rPr>
-      </w:pPr>
-      <w:r>
-        <w:rPr>
-          <w:rFonts w:ascii="Times New Roman" w:hAnsi="Times New Roman" w:cs="Times New Roman"/>
-          <w:sz w:val="24"/>
-          <w:szCs w:val="24"/>
-          <w:lang w:val="es-ES"/>
-        </w:rPr>
-        <w:t xml:space="preserve">La plataforma propuesta para la carrera debe ser institucional porque representa un canal formal de gestión. Esto implica autenticación de usuarios, permisos diferenciados, roles definidos y mecanismos de control sobre la información. El estudiante debe registrar y actualizar sus entregables; el docente tutor debe revisar avances; los revisores deben emitir observaciones; la coordinación debe monitorear el estado general de los proyectos; y la administración académica debe acceder a reportes consolidados. </w:t>
-      </w:r>
-    </w:p>
-    <w:p>
-      <w:pPr>
-        <w:spacing w:before="240" w:after="0" w:line="360" w:lineRule="auto"/>
-        <w:ind w:left="708"/>
+        </w:rPr>
+      </w:pPr>
+      <w:r>
+        <w:rPr>
+          <w:rFonts w:ascii="Times New Roman" w:hAnsi="Times New Roman" w:cs="Times New Roman"/>
+          <w:sz w:val="24"/>
+          <w:szCs w:val="24"/>
+        </w:rPr>
+        <w:t>En consecuencia, una plataforma web institucional para proyectos académicos debe integrar gestión de usuarios, control documental, seguimiento de estados, historial de cambios y generación de reportes, proporcionando información organizada que apoye la gestión y el seguimiento de los proyectos.</w:t>
+      </w:r>
+    </w:p>
+    <w:p>
+      <w:pPr>
+        <w:spacing w:before="240" w:line="360" w:lineRule="auto"/>
+        <w:ind w:firstLine="360"/>
         <w:jc w:val="both"/>
         <w:rPr>
           <w:rFonts w:ascii="Times New Roman" w:hAnsi="Times New Roman" w:cs="Times New Roman"/>
+          <w:b/>
+          <w:bCs/>
+          <w:sz w:val="24"/>
+          <w:szCs w:val="24"/>
+        </w:rPr>
+      </w:pPr>
+      <w:r>
+        <w:rPr>
+          <w:rFonts w:ascii="Times New Roman" w:hAnsi="Times New Roman" w:cs="Times New Roman"/>
+          <w:b/>
+          <w:bCs/>
+          <w:sz w:val="24"/>
+          <w:szCs w:val="24"/>
+        </w:rPr>
+        <w:t>7.2 Gestión documental digital</w:t>
+      </w:r>
+      <w:r>
+        <w:rPr>
+          <w:rFonts w:ascii="Times New Roman" w:hAnsi="Times New Roman" w:cs="Times New Roman"/>
+          <w:b/>
+          <w:bCs/>
+          <w:sz w:val="24"/>
+          <w:szCs w:val="24"/>
+        </w:rPr>
+        <w:t>.</w:t>
+      </w:r>
+    </w:p>
+    <w:p>
+      <w:pPr>
+        <w:spacing w:before="240" w:line="360" w:lineRule="auto"/>
+        <w:ind w:left="360" w:firstLine="348"/>
+        <w:jc w:val="both"/>
+        <w:rPr>
+          <w:rFonts w:ascii="Times New Roman" w:hAnsi="Times New Roman" w:cs="Times New Roman"/>
+          <w:sz w:val="24"/>
+          <w:szCs w:val="24"/>
+          <w:lang w:val="es-ES"/>
+        </w:rPr>
+      </w:pPr>
+      <w:r>
+        <w:rPr>
+          <w:rFonts w:ascii="Times New Roman" w:hAnsi="Times New Roman" w:cs="Times New Roman"/>
+          <w:sz w:val="24"/>
+          <w:szCs w:val="24"/>
+          <w:lang w:val="es-ES"/>
+        </w:rPr>
+        <w:t>La gestión documental digital comprende el conjunto de procesos y herramientas que permiten crear, almacenar, clasificar, revisar y consultar documentos en formato electrónico. En el ámbito académico, este componente es fundamental debido a la gran cantidad de evidencias generadas durante el desarrollo de los proyectos, como informes, avances, actas, observaciones y documentos finales.</w:t>
+      </w:r>
+    </w:p>
+    <w:p>
+      <w:pPr>
+        <w:spacing w:before="240" w:line="360" w:lineRule="auto"/>
+        <w:ind w:left="360" w:firstLine="348"/>
+        <w:jc w:val="both"/>
+        <w:rPr>
+          <w:rFonts w:ascii="Times New Roman" w:hAnsi="Times New Roman" w:cs="Times New Roman"/>
+          <w:sz w:val="24"/>
+          <w:szCs w:val="24"/>
+          <w:lang w:val="es-ES"/>
+        </w:rPr>
+      </w:pPr>
+      <w:r>
+        <w:rPr>
+          <w:rFonts w:ascii="Times New Roman" w:hAnsi="Times New Roman" w:cs="Times New Roman"/>
+          <w:sz w:val="24"/>
+          <w:szCs w:val="24"/>
+          <w:lang w:val="es-ES"/>
+        </w:rPr>
+        <w:t>Un sistema de gestión documental debe garantizar la disponibilidad de los documentos, el control de versiones y la trazabilidad de las acciones realizadas sobre ellos. Esto permite identificar responsables, fechas de actualización, revisiones efectuadas y estados asociados a cada documento.</w:t>
+      </w:r>
+    </w:p>
+    <w:p>
+      <w:pPr>
+        <w:spacing w:before="240" w:line="360" w:lineRule="auto"/>
+        <w:ind w:left="360" w:firstLine="348"/>
+        <w:jc w:val="both"/>
+        <w:rPr>
+          <w:rFonts w:ascii="Times New Roman" w:hAnsi="Times New Roman" w:cs="Times New Roman"/>
+          <w:sz w:val="24"/>
+          <w:szCs w:val="24"/>
+          <w:lang w:val="es-ES"/>
+        </w:rPr>
+      </w:pPr>
+      <w:r>
+        <w:rPr>
+          <w:rFonts w:ascii="Times New Roman" w:hAnsi="Times New Roman" w:cs="Times New Roman"/>
+          <w:sz w:val="24"/>
+          <w:szCs w:val="24"/>
+          <w:lang w:val="es-ES"/>
+        </w:rPr>
+        <w:t xml:space="preserve">Su importancia radica en que, como señala </w:t>
+      </w:r>
+      <w:r>
+        <w:rPr>
+          <w:rFonts w:ascii="Times New Roman" w:hAnsi="Times New Roman" w:cs="Times New Roman"/>
+          <w:sz w:val="24"/>
+          <w:szCs w:val="24"/>
+          <w:lang w:val="es-ES"/>
+        </w:rPr>
+        <w:fldChar w:fldCharType="begin"/>
+      </w:r>
+      <w:r>
+        <w:rPr>
+          <w:rFonts w:ascii="Times New Roman" w:hAnsi="Times New Roman" w:cs="Times New Roman"/>
+          <w:sz w:val="24"/>
+          <w:szCs w:val="24"/>
+          <w:lang w:val="es-ES"/>
+        </w:rPr>
+        <w:instrText xml:space="preserve"> ADDIN ZOTERO_ITEM CSL_CITATION {"citationID":"7Mr4VmpU","properties":{"unsorted":false,"formattedCitation":"(Kacmar, 2013)","plainCitation":"(Kacmar, 2013)","noteIndex":0},"citationItems":[{"id":3,"uris":["http://zotero.org/users/local/jI0LZQ6G/items/X6JTWPG4"],"itemData":{"id":3,"type":"article-journal","container-title":"Quality Innovation Prosperity","DOI":"10.12776/qip.v17i2.241","ISSN":"1338-984X, 1335-1745","issue":"2","journalAbbreviation":"QIP Journal","page":"77-88","source":"DOI.org (Crossref)","title":"Implementation of Link-based DMS Supporting ISO 9001 QMS: Case Study","title-short":"Implementation of Link-based DMS Supporting ISO 9001 QMS","volume":"17","author":[{"family":"Kacmar","given":"Marek"}],"issued":{"date-parts":[["2013",12,27]]}}}],"schema":"https://github.com/citation-style-language/schema/raw/master/csl-citation.json"} </w:instrText>
+      </w:r>
+      <w:r>
+        <w:rPr>
+          <w:rFonts w:ascii="Times New Roman" w:hAnsi="Times New Roman" w:cs="Times New Roman"/>
+          <w:sz w:val="24"/>
+          <w:szCs w:val="24"/>
+          <w:lang w:val="es-ES"/>
+        </w:rPr>
+        <w:fldChar w:fldCharType="separate"/>
+      </w:r>
+      <w:r>
+        <w:rPr>
+          <w:rFonts w:ascii="Times New Roman" w:hAnsi="Times New Roman" w:cs="Times New Roman"/>
+          <w:sz w:val="24"/>
+          <w:lang w:val="es-ES"/>
+        </w:rPr>
+        <w:t>(Kacmar, 2013)</w:t>
+      </w:r>
+      <w:r>
+        <w:rPr>
+          <w:rFonts w:ascii="Times New Roman" w:hAnsi="Times New Roman" w:cs="Times New Roman"/>
+          <w:sz w:val="24"/>
+          <w:szCs w:val="24"/>
+          <w:lang w:val="es-ES"/>
+        </w:rPr>
+        <w:fldChar w:fldCharType="end"/>
+      </w:r>
+      <w:r>
+        <w:rPr>
+          <w:rFonts w:ascii="Times New Roman" w:hAnsi="Times New Roman" w:cs="Times New Roman"/>
+          <w:sz w:val="24"/>
+          <w:szCs w:val="24"/>
+          <w:lang w:val="es-ES"/>
+        </w:rPr>
+        <w:t>, la gestión documental debe "</w:t>
+      </w:r>
+      <w:proofErr w:type="spellStart"/>
+      <w:r>
+        <w:rPr>
+          <w:rFonts w:ascii="Times New Roman" w:hAnsi="Times New Roman" w:cs="Times New Roman"/>
+          <w:sz w:val="24"/>
+          <w:szCs w:val="24"/>
+          <w:lang w:val="es-ES"/>
+        </w:rPr>
+        <w:t>ensure</w:t>
+      </w:r>
+      <w:proofErr w:type="spellEnd"/>
+      <w:r>
+        <w:rPr>
+          <w:rFonts w:ascii="Times New Roman" w:hAnsi="Times New Roman" w:cs="Times New Roman"/>
+          <w:sz w:val="24"/>
+          <w:szCs w:val="24"/>
+          <w:lang w:val="es-ES"/>
+        </w:rPr>
+        <w:t xml:space="preserve"> </w:t>
+      </w:r>
+      <w:proofErr w:type="spellStart"/>
+      <w:r>
+        <w:rPr>
+          <w:rFonts w:ascii="Times New Roman" w:hAnsi="Times New Roman" w:cs="Times New Roman"/>
+          <w:sz w:val="24"/>
+          <w:szCs w:val="24"/>
+          <w:lang w:val="es-ES"/>
+        </w:rPr>
+        <w:t>an</w:t>
+      </w:r>
+      <w:proofErr w:type="spellEnd"/>
+      <w:r>
+        <w:rPr>
+          <w:rFonts w:ascii="Times New Roman" w:hAnsi="Times New Roman" w:cs="Times New Roman"/>
+          <w:sz w:val="24"/>
+          <w:szCs w:val="24"/>
+          <w:lang w:val="es-ES"/>
+        </w:rPr>
+        <w:t xml:space="preserve"> </w:t>
+      </w:r>
+      <w:proofErr w:type="spellStart"/>
+      <w:r>
+        <w:rPr>
+          <w:rFonts w:ascii="Times New Roman" w:hAnsi="Times New Roman" w:cs="Times New Roman"/>
+          <w:sz w:val="24"/>
+          <w:szCs w:val="24"/>
+          <w:lang w:val="es-ES"/>
+        </w:rPr>
+        <w:t>effective</w:t>
+      </w:r>
+      <w:proofErr w:type="spellEnd"/>
+      <w:r>
+        <w:rPr>
+          <w:rFonts w:ascii="Times New Roman" w:hAnsi="Times New Roman" w:cs="Times New Roman"/>
+          <w:sz w:val="24"/>
+          <w:szCs w:val="24"/>
+          <w:lang w:val="es-ES"/>
+        </w:rPr>
+        <w:t xml:space="preserve"> and </w:t>
+      </w:r>
+      <w:proofErr w:type="spellStart"/>
+      <w:r>
+        <w:rPr>
+          <w:rFonts w:ascii="Times New Roman" w:hAnsi="Times New Roman" w:cs="Times New Roman"/>
+          <w:sz w:val="24"/>
+          <w:szCs w:val="24"/>
+          <w:lang w:val="es-ES"/>
+        </w:rPr>
+        <w:t>efficient</w:t>
+      </w:r>
+      <w:proofErr w:type="spellEnd"/>
+      <w:r>
+        <w:rPr>
+          <w:rFonts w:ascii="Times New Roman" w:hAnsi="Times New Roman" w:cs="Times New Roman"/>
+          <w:sz w:val="24"/>
+          <w:szCs w:val="24"/>
+          <w:lang w:val="es-ES"/>
+        </w:rPr>
+        <w:t xml:space="preserve"> </w:t>
+      </w:r>
+      <w:proofErr w:type="spellStart"/>
+      <w:r>
+        <w:rPr>
+          <w:rFonts w:ascii="Times New Roman" w:hAnsi="Times New Roman" w:cs="Times New Roman"/>
+          <w:sz w:val="24"/>
+          <w:szCs w:val="24"/>
+          <w:lang w:val="es-ES"/>
+        </w:rPr>
+        <w:t>application</w:t>
+      </w:r>
+      <w:proofErr w:type="spellEnd"/>
+      <w:r>
+        <w:rPr>
+          <w:rFonts w:ascii="Times New Roman" w:hAnsi="Times New Roman" w:cs="Times New Roman"/>
+          <w:sz w:val="24"/>
+          <w:szCs w:val="24"/>
+          <w:lang w:val="es-ES"/>
+        </w:rPr>
+        <w:t xml:space="preserve"> </w:t>
+      </w:r>
+      <w:proofErr w:type="spellStart"/>
+      <w:r>
+        <w:rPr>
+          <w:rFonts w:ascii="Times New Roman" w:hAnsi="Times New Roman" w:cs="Times New Roman"/>
+          <w:sz w:val="24"/>
+          <w:szCs w:val="24"/>
+          <w:lang w:val="es-ES"/>
+        </w:rPr>
+        <w:t>of</w:t>
+      </w:r>
+      <w:proofErr w:type="spellEnd"/>
+      <w:r>
+        <w:rPr>
+          <w:rFonts w:ascii="Times New Roman" w:hAnsi="Times New Roman" w:cs="Times New Roman"/>
+          <w:sz w:val="24"/>
+          <w:szCs w:val="24"/>
+          <w:lang w:val="es-ES"/>
+        </w:rPr>
+        <w:t xml:space="preserve"> </w:t>
+      </w:r>
+      <w:proofErr w:type="spellStart"/>
+      <w:r>
+        <w:rPr>
+          <w:rFonts w:ascii="Times New Roman" w:hAnsi="Times New Roman" w:cs="Times New Roman"/>
+          <w:sz w:val="24"/>
+          <w:szCs w:val="24"/>
+          <w:lang w:val="es-ES"/>
+        </w:rPr>
+        <w:t>the</w:t>
+      </w:r>
+      <w:proofErr w:type="spellEnd"/>
+      <w:r>
+        <w:rPr>
+          <w:rFonts w:ascii="Times New Roman" w:hAnsi="Times New Roman" w:cs="Times New Roman"/>
+          <w:sz w:val="24"/>
+          <w:szCs w:val="24"/>
+          <w:lang w:val="es-ES"/>
+        </w:rPr>
+        <w:t xml:space="preserve"> </w:t>
+      </w:r>
+      <w:proofErr w:type="spellStart"/>
+      <w:r>
+        <w:rPr>
+          <w:rFonts w:ascii="Times New Roman" w:hAnsi="Times New Roman" w:cs="Times New Roman"/>
+          <w:sz w:val="24"/>
+          <w:szCs w:val="24"/>
+          <w:lang w:val="es-ES"/>
+        </w:rPr>
+        <w:t>strategies</w:t>
+      </w:r>
+      <w:proofErr w:type="spellEnd"/>
+      <w:r>
+        <w:rPr>
+          <w:rFonts w:ascii="Times New Roman" w:hAnsi="Times New Roman" w:cs="Times New Roman"/>
+          <w:sz w:val="24"/>
+          <w:szCs w:val="24"/>
+          <w:lang w:val="es-ES"/>
+        </w:rPr>
+        <w:t>" (p. 78). En el contexto académico, esto implica que los documentos no solo sean almacenados, sino que formen parte de un proceso estructurado de entrega, revisión y aprobación.</w:t>
+      </w:r>
+    </w:p>
+    <w:p>
+      <w:pPr>
+        <w:spacing w:before="240" w:line="360" w:lineRule="auto"/>
+        <w:ind w:left="360" w:firstLine="348"/>
+        <w:jc w:val="both"/>
+        <w:rPr>
+          <w:rFonts w:ascii="Times New Roman" w:hAnsi="Times New Roman" w:cs="Times New Roman"/>
           <w:sz w:val="24"/>
           <w:szCs w:val="24"/>
           <w:lang w:val="es-ES"/>
@@ -1921,34 +2237,37 @@
           <w:lang w:val="es-ES"/>
         </w:rPr>
         <w:lastRenderedPageBreak/>
-        <w:tab/>
-        <w:t>En consecuencia, una plataforma web institucional para proyectos académicos debe diseñarse como un ecosistema de servicios. No basta con almacenar archivos o mostrar listados: el sistema debe integrar navegación, gestión de usuarios, control documental, seguimiento de estados, notificaciones, historial de cambios y generación de reportes. Esta integración convierte la plataforma en un punto de convergencia entre gestión académica y gestión tecnológica, permitiendo que la carrera disponga de información oportuna para tomar decisiones, detectar retrasos, identificar cuellos de botella y asegurar que los proyectos cumplan con los lineamientos establecidos.</w:t>
-      </w:r>
-    </w:p>
-    <w:p>
-      <w:pPr>
-        <w:pStyle w:val="tesis"/>
-        <w:rPr>
-          <w:sz w:val="24"/>
-          <w:szCs w:val="24"/>
-        </w:rPr>
-      </w:pPr>
-      <w:r>
-        <w:rPr>
-          <w:sz w:val="24"/>
-          <w:szCs w:val="24"/>
-        </w:rPr>
-        <w:t xml:space="preserve">      </w:t>
-      </w:r>
-      <w:r>
-        <w:rPr>
-          <w:sz w:val="24"/>
-          <w:szCs w:val="24"/>
-        </w:rPr>
-        <w:t>7.2 Gestión documental digital</w:t>
-      </w:r>
-      <w:r>
-        <w:rPr>
+        <w:t>Para ello, la plataforma debe incorporar funciones como carga segura de archivos, clasificación por proyecto, control de versiones, historial de revisión, permisos de acceso y registro de observaciones. Estas características favorecen la organización de la información, reducen errores asociados al manejo manual de documentos y facilitan el seguimiento de los proyectos académicos.</w:t>
+      </w:r>
+    </w:p>
+    <w:p>
+      <w:pPr>
+        <w:spacing w:before="240" w:line="360" w:lineRule="auto"/>
+        <w:ind w:left="360"/>
+        <w:jc w:val="both"/>
+        <w:rPr>
+          <w:rFonts w:ascii="Times New Roman" w:hAnsi="Times New Roman" w:cs="Times New Roman"/>
+          <w:b/>
+          <w:bCs/>
+          <w:sz w:val="24"/>
+          <w:szCs w:val="24"/>
+        </w:rPr>
+      </w:pPr>
+      <w:r>
+        <w:rPr>
+          <w:rFonts w:ascii="Times New Roman" w:hAnsi="Times New Roman" w:cs="Times New Roman"/>
+          <w:b/>
+          <w:bCs/>
+          <w:sz w:val="24"/>
+          <w:szCs w:val="24"/>
+        </w:rPr>
+        <w:t>7.3 Seguimiento y control de proyectos académicos</w:t>
+      </w:r>
+      <w:r>
+        <w:rPr>
+          <w:rFonts w:ascii="Times New Roman" w:hAnsi="Times New Roman" w:cs="Times New Roman"/>
+          <w:b/>
+          <w:bCs/>
           <w:sz w:val="24"/>
           <w:szCs w:val="24"/>
         </w:rPr>
@@ -1957,8 +2276,8 @@
     </w:p>
     <w:p>
       <w:pPr>
-        <w:spacing w:before="240" w:after="0" w:line="360" w:lineRule="auto"/>
-        <w:ind w:left="708" w:firstLine="708"/>
+        <w:spacing w:before="240" w:line="360" w:lineRule="auto"/>
+        <w:ind w:left="360" w:firstLine="348"/>
         <w:jc w:val="both"/>
         <w:rPr>
           <w:rFonts w:ascii="Times New Roman" w:hAnsi="Times New Roman" w:cs="Times New Roman"/>
@@ -1974,13 +2293,13 @@
           <w:szCs w:val="24"/>
           <w:lang w:val="es-ES"/>
         </w:rPr>
-        <w:t>La gestión documental digital se refiere al conjunto de procesos, reglas y herramientas que permiten crear, almacenar, clasificar, revisar, aprobar, conservar y consultar documentos en medios electrónicos. En una plataforma académica, este componente resulta esencial porque los proyectos generan múltiples evidencias: anteproyectos, cronogramas, informes de avance, versiones revisadas, actas, rúbricas, observaciones, anexos y documentos finales. Si estos archivos se manejan sin estructura, el seguimiento se vuelve dependiente de la memoria de los actores y de canales informales.</w:t>
-      </w:r>
-    </w:p>
-    <w:p>
-      <w:pPr>
-        <w:spacing w:before="240" w:after="0" w:line="360" w:lineRule="auto"/>
-        <w:ind w:left="708" w:firstLine="708"/>
+        <w:t>El seguimiento y control de proyectos académicos consiste en registrar, supervisar y evaluar el avance de las actividades desarrolladas desde el inicio hasta la finalización de un proyecto. En la carrera de Desarrollo de Software, esta actividad permite mantener organizadas las entregas, revisiones y decisiones que forman parte del proceso académico.</w:t>
+      </w:r>
+    </w:p>
+    <w:p>
+      <w:pPr>
+        <w:spacing w:before="240" w:line="360" w:lineRule="auto"/>
+        <w:ind w:left="360" w:firstLine="348"/>
         <w:jc w:val="both"/>
         <w:rPr>
           <w:rFonts w:ascii="Times New Roman" w:hAnsi="Times New Roman" w:cs="Times New Roman"/>
@@ -1996,13 +2315,13 @@
           <w:szCs w:val="24"/>
           <w:lang w:val="es-ES"/>
         </w:rPr>
-        <w:t>Un sistema de gestión documental digital debe resolver problemas de disponibilidad, control y trazabilidad. La disponibilidad implica que los documentos puedan consultarse cuando se requieren y por quienes tienen autorización. El control se relaciona con la identificación de versiones vigentes, documentos obsoletos, responsables de revisión y fechas de actualización. La trazabilidad permite reconstruir el historial de un documento: quién lo subió, cuándo fue revisado, qué observaciones recibió y cuál fue su estado final.</w:t>
-      </w:r>
-    </w:p>
-    <w:p>
-      <w:pPr>
-        <w:spacing w:before="240" w:after="0" w:line="360" w:lineRule="auto"/>
-        <w:ind w:left="708" w:firstLine="708"/>
+        <w:t>Una plataforma institucional puede representar este seguimiento mediante estados definidos que reflejen la situación actual de cada proyecto, facilitando la identificación de avances, retrasos y actividades pendientes. Esto permite a estudiantes, docentes y coordinadores disponer de información actualizada para la toma de decisiones.</w:t>
+      </w:r>
+    </w:p>
+    <w:p>
+      <w:pPr>
+        <w:spacing w:before="240" w:line="360" w:lineRule="auto"/>
+        <w:ind w:left="360" w:firstLine="348"/>
         <w:jc w:val="both"/>
         <w:rPr>
           <w:rFonts w:ascii="Times New Roman" w:hAnsi="Times New Roman" w:cs="Times New Roman"/>
@@ -2018,7 +2337,7 @@
           <w:szCs w:val="24"/>
           <w:lang w:val="es-ES"/>
         </w:rPr>
-        <w:t>La importancia de este componente se aprecia en el planteamiento de</w:t>
+        <w:t xml:space="preserve">La utilidad de este enfoque se sustenta en lo señalado por </w:t>
       </w:r>
       <w:r>
         <w:rPr>
@@ -2036,7 +2355,7 @@
           <w:szCs w:val="24"/>
           <w:lang w:val="es-ES"/>
         </w:rPr>
-        <w:instrText xml:space="preserve"> ADDIN ZOTERO_ITEM CSL_CITATION {"citationID":"UFgHbCTk","properties":{"unsorted":false,"formattedCitation":"(Kacmar, 2013)","plainCitation":"(Kacmar, 2013)","noteIndex":0},"citationItems":[{"id":"0ccfRIuB/JWg93jao","uris":["http://zotero.org/users/local/3NWqkcVE/items/PM8I9BNC"],"itemData":{"id":138,"type":"article-journal","container-title":"Quality Innovation Prosperity","DOI":"10.12776/qip.v17i2.241","ISSN":"1338-984X, 1335-1745","issue":"2","journalAbbreviation":"QIP Journal","page":"77-88","source":"DOI.org (Crossref)","title":"Implementation of Link-based DMS Supporting ISO 9001 QMS: Case Study","title-short":"Implementation of Link-based DMS Supporting ISO 9001 QMS","volume":"17","author":[{"family":"Kacmar","given":"Marek"}],"issued":{"date-parts":[["2013",12,27]]}}}],"schema":"https://github.com/citation-style-language/schema/raw/master/csl-citation.json"} </w:instrText>
+        <w:instrText xml:space="preserve"> ADDIN ZOTERO_ITEM CSL_CITATION {"citationID":"NISyo0sn","properties":{"unsorted":false,"formattedCitation":"(Almeida et\\uc0\\u160{}al., 2019)","plainCitation":"(Almeida et al., 2019)","noteIndex":0},"citationItems":[{"id":4,"uris":["http://zotero.org/users/local/jI0LZQ6G/items/XXHA4Y6H"],"itemData":{"id":4,"type":"article-journal","container-title":"BMC Medical Informatics and Decision Making","DOI":"10.1186/s12911-019-0844-6","ISSN":"1472-6947","issue":"1","journalAbbreviation":"BMC Med Inform Decis Mak","language":"en","page":"121","source":"DOI.org (Crossref)","title":"TASKA: A modular task management system to support health research studies","title-short":"TASKA","volume":"19","author":[{"family":"Almeida","given":"João Rafael"},{"family":"Gini","given":"Rosa"},{"family":"Roberto","given":"Giuseppe"},{"family":"Rijnbeek","given":"Peter"},{"family":"Oliveira","given":"José Luís"}],"issued":{"date-parts":[["2019",12]]}}}],"schema":"https://github.com/citation-style-language/schema/raw/master/csl-citation.json"} </w:instrText>
       </w:r>
       <w:r>
         <w:rPr>
@@ -2050,10 +2369,10 @@
       <w:r>
         <w:rPr>
           <w:rFonts w:ascii="Times New Roman" w:hAnsi="Times New Roman" w:cs="Times New Roman"/>
-          <w:sz w:val="24"/>
-          <w:szCs w:val="24"/>
-        </w:rPr>
-        <w:t>(Kacmar, 2013)</w:t>
+          <w:kern w:val="0"/>
+          <w:sz w:val="24"/>
+        </w:rPr>
+        <w:t>(Almeida et al., 2019)</w:t>
       </w:r>
       <w:r>
         <w:rPr>
@@ -2071,7 +2390,7 @@
           <w:szCs w:val="24"/>
           <w:lang w:val="es-ES"/>
         </w:rPr>
-        <w:t>, quien afirma que la gestión documental debe "</w:t>
+        <w:t xml:space="preserve">, quienes indican que determinados procesos "can be </w:t>
       </w:r>
       <w:proofErr w:type="spellStart"/>
       <w:r>
@@ -2081,7 +2400,7 @@
           <w:szCs w:val="24"/>
           <w:lang w:val="es-ES"/>
         </w:rPr>
-        <w:t>ensure</w:t>
+        <w:t>simplified</w:t>
       </w:r>
       <w:proofErr w:type="spellEnd"/>
       <w:r>
@@ -2101,7 +2420,7 @@
           <w:szCs w:val="24"/>
           <w:lang w:val="es-ES"/>
         </w:rPr>
-        <w:t>an</w:t>
+        <w:t>by</w:t>
       </w:r>
       <w:proofErr w:type="spellEnd"/>
       <w:r>
@@ -2121,7 +2440,7 @@
           <w:szCs w:val="24"/>
           <w:lang w:val="es-ES"/>
         </w:rPr>
-        <w:t>effective</w:t>
+        <w:t>using</w:t>
       </w:r>
       <w:proofErr w:type="spellEnd"/>
       <w:r>
@@ -2131,6 +2450,26 @@
           <w:szCs w:val="24"/>
           <w:lang w:val="es-ES"/>
         </w:rPr>
+        <w:t xml:space="preserve"> </w:t>
+      </w:r>
+      <w:proofErr w:type="spellStart"/>
+      <w:r>
+        <w:rPr>
+          <w:rFonts w:ascii="Times New Roman" w:hAnsi="Times New Roman" w:cs="Times New Roman"/>
+          <w:sz w:val="24"/>
+          <w:szCs w:val="24"/>
+          <w:lang w:val="es-ES"/>
+        </w:rPr>
+        <w:t>task</w:t>
+      </w:r>
+      <w:proofErr w:type="spellEnd"/>
+      <w:r>
+        <w:rPr>
+          <w:rFonts w:ascii="Times New Roman" w:hAnsi="Times New Roman" w:cs="Times New Roman"/>
+          <w:sz w:val="24"/>
+          <w:szCs w:val="24"/>
+          <w:lang w:val="es-ES"/>
+        </w:rPr>
         <w:t xml:space="preserve"> and </w:t>
       </w:r>
       <w:proofErr w:type="spellStart"/>
@@ -2141,7 +2480,7 @@
           <w:szCs w:val="24"/>
           <w:lang w:val="es-ES"/>
         </w:rPr>
-        <w:t>efficient</w:t>
+        <w:t>workflow</w:t>
       </w:r>
       <w:proofErr w:type="spellEnd"/>
       <w:r>
@@ -2161,7 +2500,7 @@
           <w:szCs w:val="24"/>
           <w:lang w:val="es-ES"/>
         </w:rPr>
-        <w:t>application</w:t>
+        <w:t>management</w:t>
       </w:r>
       <w:proofErr w:type="spellEnd"/>
       <w:r>
@@ -2181,1170 +2520,498 @@
           <w:szCs w:val="24"/>
           <w:lang w:val="es-ES"/>
         </w:rPr>
+        <w:t>systems</w:t>
+      </w:r>
+      <w:proofErr w:type="spellEnd"/>
+      <w:r>
+        <w:rPr>
+          <w:rFonts w:ascii="Times New Roman" w:hAnsi="Times New Roman" w:cs="Times New Roman"/>
+          <w:sz w:val="24"/>
+          <w:szCs w:val="24"/>
+          <w:lang w:val="es-ES"/>
+        </w:rPr>
+        <w:t>" (p. 2). En consecuencia, la gestión de proyectos académicos puede beneficiarse de herramientas que organicen tareas, responsables y flujos de trabajo.</w:t>
+      </w:r>
+    </w:p>
+    <w:p>
+      <w:pPr>
+        <w:spacing w:before="240" w:line="360" w:lineRule="auto"/>
+        <w:ind w:left="360" w:firstLine="348"/>
+        <w:jc w:val="both"/>
+        <w:rPr>
+          <w:rFonts w:ascii="Times New Roman" w:hAnsi="Times New Roman" w:cs="Times New Roman"/>
+          <w:sz w:val="24"/>
+          <w:szCs w:val="24"/>
+          <w:lang w:val="es-ES"/>
+        </w:rPr>
+      </w:pPr>
+      <w:r>
+        <w:rPr>
+          <w:rFonts w:ascii="Times New Roman" w:hAnsi="Times New Roman" w:cs="Times New Roman"/>
+          <w:sz w:val="24"/>
+          <w:szCs w:val="24"/>
+          <w:lang w:val="es-ES"/>
+        </w:rPr>
+        <w:t>Además, el sistema debe garantizar la trazabilidad de las acciones realizadas, registrando responsables, fechas y observaciones. De esta manera, se fortalece la transparencia del proceso y se facilita la generación de reportes que apoyen el control y seguimiento institucional.</w:t>
+      </w:r>
+    </w:p>
+    <w:p>
+      <w:pPr>
+        <w:spacing w:before="240" w:line="360" w:lineRule="auto"/>
+        <w:ind w:firstLine="360"/>
+        <w:jc w:val="both"/>
+        <w:rPr>
+          <w:rFonts w:ascii="Times New Roman" w:hAnsi="Times New Roman" w:cs="Times New Roman"/>
+          <w:b/>
+          <w:bCs/>
+          <w:sz w:val="24"/>
+          <w:szCs w:val="24"/>
+        </w:rPr>
+      </w:pPr>
+      <w:r>
+        <w:rPr>
+          <w:rFonts w:ascii="Times New Roman" w:hAnsi="Times New Roman" w:cs="Times New Roman"/>
+          <w:b/>
+          <w:bCs/>
+          <w:sz w:val="24"/>
+          <w:szCs w:val="24"/>
+        </w:rPr>
+        <w:t>7.4 Diseño y desarrollo de sistemas web</w:t>
+      </w:r>
+      <w:r>
+        <w:rPr>
+          <w:rFonts w:ascii="Times New Roman" w:hAnsi="Times New Roman" w:cs="Times New Roman"/>
+          <w:b/>
+          <w:bCs/>
+          <w:sz w:val="24"/>
+          <w:szCs w:val="24"/>
+        </w:rPr>
+        <w:t>.</w:t>
+      </w:r>
+    </w:p>
+    <w:p>
+      <w:pPr>
+        <w:spacing w:before="240" w:line="360" w:lineRule="auto"/>
+        <w:ind w:left="360" w:firstLine="348"/>
+        <w:jc w:val="both"/>
+        <w:rPr>
+          <w:rFonts w:ascii="Times New Roman" w:hAnsi="Times New Roman" w:cs="Times New Roman"/>
+          <w:sz w:val="24"/>
+          <w:szCs w:val="24"/>
+          <w:lang w:val="es-ES"/>
+        </w:rPr>
+      </w:pPr>
+      <w:r>
+        <w:rPr>
+          <w:rFonts w:ascii="Times New Roman" w:hAnsi="Times New Roman" w:cs="Times New Roman"/>
+          <w:sz w:val="24"/>
+          <w:szCs w:val="24"/>
+          <w:lang w:val="es-ES"/>
+        </w:rPr>
+        <w:t xml:space="preserve">El diseño y desarrollo de sistemas web consiste en transformar una necesidad organizacional en una solución tecnológica accesible mediante navegador. Este proceso </w:t>
+      </w:r>
+      <w:r>
+        <w:rPr>
+          <w:rFonts w:ascii="Times New Roman" w:hAnsi="Times New Roman" w:cs="Times New Roman"/>
+          <w:sz w:val="24"/>
+          <w:szCs w:val="24"/>
+          <w:lang w:val="es-ES"/>
+        </w:rPr>
+        <w:lastRenderedPageBreak/>
+        <w:t>inicia con la identificación de requerimientos funcionales y no funcionales que permitan definir las características y condiciones de calidad que debe cumplir el sistema.</w:t>
+      </w:r>
+    </w:p>
+    <w:p>
+      <w:pPr>
+        <w:spacing w:before="240" w:line="360" w:lineRule="auto"/>
+        <w:ind w:left="360" w:firstLine="348"/>
+        <w:jc w:val="both"/>
+        <w:rPr>
+          <w:rFonts w:ascii="Times New Roman" w:hAnsi="Times New Roman" w:cs="Times New Roman"/>
+          <w:sz w:val="24"/>
+          <w:szCs w:val="24"/>
+          <w:lang w:val="es-ES"/>
+        </w:rPr>
+      </w:pPr>
+      <w:r>
+        <w:rPr>
+          <w:rFonts w:ascii="Times New Roman" w:hAnsi="Times New Roman" w:cs="Times New Roman"/>
+          <w:sz w:val="24"/>
+          <w:szCs w:val="24"/>
+          <w:lang w:val="es-ES"/>
+        </w:rPr>
+        <w:t xml:space="preserve">La complejidad de estas aplicaciones se refleja en lo señalado por </w:t>
+      </w:r>
+      <w:r>
+        <w:rPr>
+          <w:rFonts w:ascii="Times New Roman" w:hAnsi="Times New Roman" w:cs="Times New Roman"/>
+          <w:sz w:val="24"/>
+          <w:szCs w:val="24"/>
+          <w:lang w:val="es-ES"/>
+        </w:rPr>
+        <w:fldChar w:fldCharType="begin"/>
+      </w:r>
+      <w:r>
+        <w:rPr>
+          <w:rFonts w:ascii="Times New Roman" w:hAnsi="Times New Roman" w:cs="Times New Roman"/>
+          <w:sz w:val="24"/>
+          <w:szCs w:val="24"/>
+          <w:lang w:val="es-ES"/>
+        </w:rPr>
+        <w:instrText xml:space="preserve"> ADDIN ZOTERO_ITEM CSL_CITATION {"citationID":"S3wooybu","properties":{"unsorted":false,"formattedCitation":"(Vuorimaa et\\uc0\\u160{}al., 2016)","plainCitation":"(Vuorimaa et al., 2016)","noteIndex":0},"citationItems":[{"id":6,"uris":["http://zotero.org/users/local/jI0LZQ6G/items/UP4X84WK"],"itemData":{"id":6,"type":"article-journal","container-title":"World Wide Web","DOI":"10.1007/s11280-015-0339-z","ISSN":"1386-145X, 1573-1413","issue":"4","journalAbbreviation":"World Wide Web","language":"en","page":"519-543","source":"DOI.org (Crossref)","title":"Leveraging declarative languages in web application development","volume":"19","author":[{"family":"Vuorimaa","given":"Petri"},{"family":"Laine","given":"Markku"},{"family":"Litvinova","given":"Evgenia"},{"family":"Shestakov","given":"Denis"}],"issued":{"date-parts":[["2016",7]]}}}],"schema":"https://github.com/citation-style-language/schema/raw/master/csl-citation.json"} </w:instrText>
+      </w:r>
+      <w:r>
+        <w:rPr>
+          <w:rFonts w:ascii="Times New Roman" w:hAnsi="Times New Roman" w:cs="Times New Roman"/>
+          <w:sz w:val="24"/>
+          <w:szCs w:val="24"/>
+          <w:lang w:val="es-ES"/>
+        </w:rPr>
+        <w:fldChar w:fldCharType="separate"/>
+      </w:r>
+      <w:r>
+        <w:rPr>
+          <w:rFonts w:ascii="Times New Roman" w:hAnsi="Times New Roman" w:cs="Times New Roman"/>
+          <w:kern w:val="0"/>
+          <w:sz w:val="24"/>
+        </w:rPr>
+        <w:t>(</w:t>
+      </w:r>
+      <w:proofErr w:type="spellStart"/>
+      <w:r>
+        <w:rPr>
+          <w:rFonts w:ascii="Times New Roman" w:hAnsi="Times New Roman" w:cs="Times New Roman"/>
+          <w:kern w:val="0"/>
+          <w:sz w:val="24"/>
+        </w:rPr>
+        <w:t>Vuorimaa</w:t>
+      </w:r>
+      <w:proofErr w:type="spellEnd"/>
+      <w:r>
+        <w:rPr>
+          <w:rFonts w:ascii="Times New Roman" w:hAnsi="Times New Roman" w:cs="Times New Roman"/>
+          <w:kern w:val="0"/>
+          <w:sz w:val="24"/>
+        </w:rPr>
+        <w:t xml:space="preserve"> et al., 2016)</w:t>
+      </w:r>
+      <w:r>
+        <w:rPr>
+          <w:rFonts w:ascii="Times New Roman" w:hAnsi="Times New Roman" w:cs="Times New Roman"/>
+          <w:sz w:val="24"/>
+          <w:szCs w:val="24"/>
+          <w:lang w:val="es-ES"/>
+        </w:rPr>
+        <w:fldChar w:fldCharType="end"/>
+      </w:r>
+      <w:r>
+        <w:rPr>
+          <w:rFonts w:ascii="Times New Roman" w:hAnsi="Times New Roman" w:cs="Times New Roman"/>
+          <w:sz w:val="24"/>
+          <w:szCs w:val="24"/>
+          <w:lang w:val="es-ES"/>
+        </w:rPr>
+        <w:t>, quienes afirman que las aplicaciones web son "</w:t>
+      </w:r>
+      <w:proofErr w:type="spellStart"/>
+      <w:r>
+        <w:rPr>
+          <w:rFonts w:ascii="Times New Roman" w:hAnsi="Times New Roman" w:cs="Times New Roman"/>
+          <w:sz w:val="24"/>
+          <w:szCs w:val="24"/>
+          <w:lang w:val="es-ES"/>
+        </w:rPr>
+        <w:t>easy</w:t>
+      </w:r>
+      <w:proofErr w:type="spellEnd"/>
+      <w:r>
+        <w:rPr>
+          <w:rFonts w:ascii="Times New Roman" w:hAnsi="Times New Roman" w:cs="Times New Roman"/>
+          <w:sz w:val="24"/>
+          <w:szCs w:val="24"/>
+          <w:lang w:val="es-ES"/>
+        </w:rPr>
+        <w:t xml:space="preserve"> </w:t>
+      </w:r>
+      <w:proofErr w:type="spellStart"/>
+      <w:r>
+        <w:rPr>
+          <w:rFonts w:ascii="Times New Roman" w:hAnsi="Times New Roman" w:cs="Times New Roman"/>
+          <w:sz w:val="24"/>
+          <w:szCs w:val="24"/>
+          <w:lang w:val="es-ES"/>
+        </w:rPr>
+        <w:t>to</w:t>
+      </w:r>
+      <w:proofErr w:type="spellEnd"/>
+      <w:r>
+        <w:rPr>
+          <w:rFonts w:ascii="Times New Roman" w:hAnsi="Times New Roman" w:cs="Times New Roman"/>
+          <w:sz w:val="24"/>
+          <w:szCs w:val="24"/>
+          <w:lang w:val="es-ES"/>
+        </w:rPr>
+        <w:t xml:space="preserve"> use, </w:t>
+      </w:r>
+      <w:proofErr w:type="spellStart"/>
+      <w:r>
+        <w:rPr>
+          <w:rFonts w:ascii="Times New Roman" w:hAnsi="Times New Roman" w:cs="Times New Roman"/>
+          <w:sz w:val="24"/>
+          <w:szCs w:val="24"/>
+          <w:lang w:val="es-ES"/>
+        </w:rPr>
+        <w:t>but</w:t>
+      </w:r>
+      <w:proofErr w:type="spellEnd"/>
+      <w:r>
+        <w:rPr>
+          <w:rFonts w:ascii="Times New Roman" w:hAnsi="Times New Roman" w:cs="Times New Roman"/>
+          <w:sz w:val="24"/>
+          <w:szCs w:val="24"/>
+          <w:lang w:val="es-ES"/>
+        </w:rPr>
+        <w:t xml:space="preserve"> </w:t>
+      </w:r>
+      <w:proofErr w:type="spellStart"/>
+      <w:r>
+        <w:rPr>
+          <w:rFonts w:ascii="Times New Roman" w:hAnsi="Times New Roman" w:cs="Times New Roman"/>
+          <w:sz w:val="24"/>
+          <w:szCs w:val="24"/>
+          <w:lang w:val="es-ES"/>
+        </w:rPr>
+        <w:t>hard</w:t>
+      </w:r>
+      <w:proofErr w:type="spellEnd"/>
+      <w:r>
+        <w:rPr>
+          <w:rFonts w:ascii="Times New Roman" w:hAnsi="Times New Roman" w:cs="Times New Roman"/>
+          <w:sz w:val="24"/>
+          <w:szCs w:val="24"/>
+          <w:lang w:val="es-ES"/>
+        </w:rPr>
+        <w:t xml:space="preserve"> </w:t>
+      </w:r>
+      <w:proofErr w:type="spellStart"/>
+      <w:r>
+        <w:rPr>
+          <w:rFonts w:ascii="Times New Roman" w:hAnsi="Times New Roman" w:cs="Times New Roman"/>
+          <w:sz w:val="24"/>
+          <w:szCs w:val="24"/>
+          <w:lang w:val="es-ES"/>
+        </w:rPr>
+        <w:t>to</w:t>
+      </w:r>
+      <w:proofErr w:type="spellEnd"/>
+      <w:r>
+        <w:rPr>
+          <w:rFonts w:ascii="Times New Roman" w:hAnsi="Times New Roman" w:cs="Times New Roman"/>
+          <w:sz w:val="24"/>
+          <w:szCs w:val="24"/>
+          <w:lang w:val="es-ES"/>
+        </w:rPr>
+        <w:t xml:space="preserve"> </w:t>
+      </w:r>
+      <w:proofErr w:type="spellStart"/>
+      <w:r>
+        <w:rPr>
+          <w:rFonts w:ascii="Times New Roman" w:hAnsi="Times New Roman" w:cs="Times New Roman"/>
+          <w:sz w:val="24"/>
+          <w:szCs w:val="24"/>
+          <w:lang w:val="es-ES"/>
+        </w:rPr>
+        <w:t>develop</w:t>
+      </w:r>
+      <w:proofErr w:type="spellEnd"/>
+      <w:r>
+        <w:rPr>
+          <w:rFonts w:ascii="Times New Roman" w:hAnsi="Times New Roman" w:cs="Times New Roman"/>
+          <w:sz w:val="24"/>
+          <w:szCs w:val="24"/>
+          <w:lang w:val="es-ES"/>
+        </w:rPr>
+        <w:t>" (p. 519). Esto evidencia que detrás de una interfaz sencilla existen procesos relacionados con seguridad, gestión de datos, control de usuarios y reglas de negocio.</w:t>
+      </w:r>
+    </w:p>
+    <w:p>
+      <w:pPr>
+        <w:spacing w:before="240" w:line="360" w:lineRule="auto"/>
+        <w:ind w:left="360" w:firstLine="348"/>
+        <w:jc w:val="both"/>
+        <w:rPr>
+          <w:rFonts w:ascii="Times New Roman" w:hAnsi="Times New Roman" w:cs="Times New Roman"/>
+          <w:sz w:val="24"/>
+          <w:szCs w:val="24"/>
+          <w:lang w:val="es-ES"/>
+        </w:rPr>
+      </w:pPr>
+      <w:r>
+        <w:rPr>
+          <w:rFonts w:ascii="Times New Roman" w:hAnsi="Times New Roman" w:cs="Times New Roman"/>
+          <w:sz w:val="24"/>
+          <w:szCs w:val="24"/>
+          <w:lang w:val="es-ES"/>
+        </w:rPr>
+        <w:t>Para garantizar un desarrollo adecuado, es necesario definir una arquitectura que organice la presentación, la lógica del sistema y el almacenamiento de datos. Esta estructura facilita el mantenimiento y la evolución de la aplicación a lo largo del tiempo.</w:t>
+      </w:r>
+    </w:p>
+    <w:p>
+      <w:pPr>
+        <w:spacing w:before="240" w:line="360" w:lineRule="auto"/>
+        <w:ind w:left="360" w:firstLine="348"/>
+        <w:jc w:val="both"/>
+        <w:rPr>
+          <w:rFonts w:ascii="Times New Roman" w:hAnsi="Times New Roman" w:cs="Times New Roman"/>
+          <w:sz w:val="24"/>
+          <w:szCs w:val="24"/>
+          <w:lang w:val="es-ES"/>
+        </w:rPr>
+      </w:pPr>
+      <w:r>
+        <w:rPr>
+          <w:rFonts w:ascii="Times New Roman" w:hAnsi="Times New Roman" w:cs="Times New Roman"/>
+          <w:sz w:val="24"/>
+          <w:szCs w:val="24"/>
+          <w:lang w:val="es-ES"/>
+        </w:rPr>
+        <w:t>Asimismo, el desarrollo debe considerar aspectos como usabilidad, seguridad, validación de datos y control de versiones, permitiendo construir una plataforma que responda de manera eficiente a las necesidades académicas de la institución.</w:t>
+      </w:r>
+    </w:p>
+    <w:p>
+      <w:pPr>
+        <w:spacing w:before="240" w:line="360" w:lineRule="auto"/>
+        <w:ind w:firstLine="360"/>
+        <w:jc w:val="both"/>
+        <w:rPr>
+          <w:rFonts w:ascii="Times New Roman" w:hAnsi="Times New Roman" w:cs="Times New Roman"/>
+          <w:sz w:val="24"/>
+          <w:szCs w:val="24"/>
+          <w:lang w:val="es-ES"/>
+        </w:rPr>
+      </w:pPr>
+      <w:r>
+        <w:rPr>
+          <w:rFonts w:ascii="Times New Roman" w:hAnsi="Times New Roman" w:cs="Times New Roman"/>
+          <w:b/>
+          <w:bCs/>
+          <w:sz w:val="24"/>
+          <w:szCs w:val="24"/>
+        </w:rPr>
+        <w:t>7.5 Validación y pruebas de software</w:t>
+      </w:r>
+      <w:r>
+        <w:rPr>
+          <w:rFonts w:ascii="Times New Roman" w:hAnsi="Times New Roman" w:cs="Times New Roman"/>
+          <w:b/>
+          <w:bCs/>
+          <w:sz w:val="24"/>
+          <w:szCs w:val="24"/>
+        </w:rPr>
+        <w:t>.</w:t>
+      </w:r>
+    </w:p>
+    <w:p>
+      <w:pPr>
+        <w:pStyle w:val="isselectedend"/>
+        <w:spacing w:line="360" w:lineRule="auto"/>
+        <w:ind w:left="360" w:firstLine="348"/>
+        <w:jc w:val="both"/>
+      </w:pPr>
+      <w:r>
+        <w:t>La validación y las pruebas de software tienen como finalidad comprobar que un sistema cumple los requerimientos establecidos y satisface las necesidades de sus usuarios. En una plataforma académica, estas actividades permiten verificar el correcto funcionamiento de procesos relacionados con la gestión documental, el seguimiento de proyectos y la administración de usuarios.</w:t>
+      </w:r>
+    </w:p>
+    <w:p>
+      <w:pPr>
+        <w:pStyle w:val="isselectedend"/>
+        <w:spacing w:line="360" w:lineRule="auto"/>
+        <w:ind w:left="360" w:firstLine="348"/>
+        <w:jc w:val="both"/>
+      </w:pPr>
+      <w:r>
+        <w:t xml:space="preserve">La importancia de una adecuada estrategia de pruebas se evidencia en lo planteado por </w:t>
+      </w:r>
+      <w:r>
+        <w:fldChar w:fldCharType="begin"/>
+      </w:r>
+      <w:r>
+        <w:instrText xml:space="preserve"> ADDIN ZOTERO_ITEM CSL_CITATION {"citationID":"ltcyzwfo","properties":{"unsorted":false,"formattedCitation":"(Kuhn et\\uc0\\u160{}al., 2004)","plainCitation":"(Kuhn et al., 2004)","noteIndex":0},"citationItems":[{"id":8,"uris":["http://zotero.org/users/local/jI0LZQ6G/items/N5H5BTQH"],"itemData":{"id":8,"type":"article-journal","container-title":"IEEE Transactions on Software Engineering","DOI":"10.1109/TSE.2004.24","ISSN":"0098-5589","issue":"6","journalAbbreviation":"IIEEE Trans. Software Eng.","language":"en","license":"https://ieeexplore.ieee.org/Xplorehelp/downloads/license-information/IEEE.html","page":"418-421","source":"DOI.org (Crossref)","title":"Software fault interactions and implications for software testing","volume":"30","author":[{"family":"Kuhn","given":"D.R."},{"family":"Wallace","given":"D.R."},{"family":"Gallo","given":"A.M."}],"issued":{"date-parts":[["2004",6]]}}}],"schema":"https://github.com/citation-style-language/schema/raw/master/csl-citation.json"} </w:instrText>
+      </w:r>
+      <w:r>
+        <w:fldChar w:fldCharType="separate"/>
+      </w:r>
+      <w:r>
+        <w:t>(Kuhn et al., 2004)</w:t>
+      </w:r>
+      <w:r>
+        <w:fldChar w:fldCharType="end"/>
+      </w:r>
+      <w:r>
+        <w:t xml:space="preserve">, quienes señalan que "exhaustive </w:t>
+      </w:r>
+      <w:proofErr w:type="spellStart"/>
+      <w:r>
+        <w:t>testing</w:t>
+      </w:r>
+      <w:proofErr w:type="spellEnd"/>
+      <w:r>
+        <w:t xml:space="preserve"> </w:t>
+      </w:r>
+      <w:proofErr w:type="spellStart"/>
+      <w:r>
         <w:t>of</w:t>
       </w:r>
       <w:proofErr w:type="spellEnd"/>
       <w:r>
-        <w:rPr>
-          <w:rFonts w:ascii="Times New Roman" w:hAnsi="Times New Roman" w:cs="Times New Roman"/>
-          <w:sz w:val="24"/>
-          <w:szCs w:val="24"/>
-          <w:lang w:val="es-ES"/>
-        </w:rPr>
         <w:t xml:space="preserve"> </w:t>
       </w:r>
       <w:proofErr w:type="spellStart"/>
       <w:r>
-        <w:rPr>
-          <w:rFonts w:ascii="Times New Roman" w:hAnsi="Times New Roman" w:cs="Times New Roman"/>
-          <w:sz w:val="24"/>
-          <w:szCs w:val="24"/>
-          <w:lang w:val="es-ES"/>
-        </w:rPr>
-        <w:t>the</w:t>
+        <w:t>computer</w:t>
       </w:r>
       <w:proofErr w:type="spellEnd"/>
       <w:r>
-        <w:rPr>
-          <w:rFonts w:ascii="Times New Roman" w:hAnsi="Times New Roman" w:cs="Times New Roman"/>
-          <w:sz w:val="24"/>
-          <w:szCs w:val="24"/>
-          <w:lang w:val="es-ES"/>
-        </w:rPr>
+        <w:t xml:space="preserve"> software </w:t>
+      </w:r>
+      <w:proofErr w:type="spellStart"/>
+      <w:r>
+        <w:t>is</w:t>
+      </w:r>
+      <w:proofErr w:type="spellEnd"/>
+      <w:r>
         <w:t xml:space="preserve"> </w:t>
       </w:r>
       <w:proofErr w:type="spellStart"/>
       <w:r>
-        <w:rPr>
-          <w:rFonts w:ascii="Times New Roman" w:hAnsi="Times New Roman" w:cs="Times New Roman"/>
-          <w:sz w:val="24"/>
-          <w:szCs w:val="24"/>
-          <w:lang w:val="es-ES"/>
-        </w:rPr>
-        <w:t>strategies</w:t>
+        <w:t>intractable</w:t>
       </w:r>
       <w:proofErr w:type="spellEnd"/>
       <w:r>
-        <w:rPr>
-          <w:rFonts w:ascii="Times New Roman" w:hAnsi="Times New Roman" w:cs="Times New Roman"/>
-          <w:sz w:val="24"/>
-          <w:szCs w:val="24"/>
-          <w:lang w:val="es-ES"/>
-        </w:rPr>
-        <w:t>" (p. 78). En el contexto de proyectos académicos, esta eficiencia no se reduce al almacenamiento de archivos, sino que implica alinear los documentos con las reglas institucionales de entrega, revisión,</w:t>
-      </w:r>
-      <w:r>
-        <w:rPr>
-          <w:rFonts w:ascii="Times New Roman" w:hAnsi="Times New Roman" w:cs="Times New Roman"/>
-          <w:sz w:val="24"/>
-          <w:szCs w:val="24"/>
-          <w:lang w:val="es-ES"/>
-        </w:rPr>
-        <w:t xml:space="preserve"> </w:t>
-      </w:r>
-      <w:r>
-        <w:rPr>
-          <w:rFonts w:ascii="Times New Roman" w:hAnsi="Times New Roman" w:cs="Times New Roman"/>
-          <w:sz w:val="24"/>
-          <w:szCs w:val="24"/>
-          <w:lang w:val="es-ES"/>
-        </w:rPr>
+        <w:t>" (p. 418). Debido a ello, resulta necesario seleccionar escenarios representativos que permitan evaluar las funcionalidades más críticas del sistema.</w:t>
+      </w:r>
+    </w:p>
+    <w:p>
+      <w:pPr>
+        <w:pStyle w:val="isselectedend"/>
+        <w:spacing w:line="360" w:lineRule="auto"/>
+        <w:ind w:left="360" w:firstLine="348"/>
+        <w:jc w:val="both"/>
+      </w:pPr>
+      <w:r>
+        <w:t>Las pruebas pueden desarrollarse en diferentes niveles, incluyendo pruebas unitarias, de integración, de sistema y de aceptación. Estas permiten identificar errores, validar el funcionamiento de los módulos y comprobar que los procesos operan de acuerdo con los requerimientos definidos.</w:t>
+      </w:r>
+    </w:p>
+    <w:p>
+      <w:pPr>
+        <w:pStyle w:val="NormalWeb"/>
+        <w:spacing w:line="360" w:lineRule="auto"/>
+        <w:ind w:left="360" w:firstLine="348"/>
+        <w:jc w:val="both"/>
+      </w:pPr>
+      <w:r>
         <w:lastRenderedPageBreak/>
-        <w:t>corrección y aprobación. De ese modo, cada documento se convierte en evidencia verificable del avance del proyecto.</w:t>
-      </w:r>
-    </w:p>
-    <w:p>
-      <w:pPr>
-        <w:spacing w:before="240" w:after="0" w:line="360" w:lineRule="auto"/>
-        <w:ind w:left="708" w:firstLine="708"/>
-        <w:jc w:val="both"/>
-        <w:rPr>
-          <w:rFonts w:ascii="Times New Roman" w:hAnsi="Times New Roman" w:cs="Times New Roman"/>
-          <w:sz w:val="24"/>
-          <w:szCs w:val="24"/>
-          <w:lang w:val="es-ES"/>
-        </w:rPr>
-      </w:pPr>
-      <w:r>
-        <w:rPr>
-          <w:rFonts w:ascii="Times New Roman" w:hAnsi="Times New Roman" w:cs="Times New Roman"/>
-          <w:sz w:val="24"/>
-          <w:szCs w:val="24"/>
-          <w:lang w:val="es-ES"/>
-        </w:rPr>
-        <w:t>Para proyectos académicos, la gestión documental no debe limitarse a un repositorio de archivos. Debe operar con reglas institucionales: formatos aceptados, estados de revisión, permisos por rol, validación de entregas y conservación de evidencias. Un estudiante puede cargar un avance, pero no debería modificar una versión ya revisada sin que el sistema registre una nueva versión. Un revisor puede emitir observaciones, pero no debería alterar el archivo original. La coordinación puede requerir reportes de documentos pendientes, rechazados, aprobados o vencidos. Estas funciones convierten el documento en una unidad gestionable dentro de un proceso académico.</w:t>
-      </w:r>
-    </w:p>
-    <w:p>
-      <w:pPr>
-        <w:spacing w:before="240" w:after="0" w:line="360" w:lineRule="auto"/>
-        <w:ind w:left="708" w:firstLine="708"/>
-        <w:jc w:val="both"/>
-        <w:rPr>
-          <w:rFonts w:ascii="Times New Roman" w:hAnsi="Times New Roman" w:cs="Times New Roman"/>
-          <w:sz w:val="24"/>
-          <w:szCs w:val="24"/>
-          <w:lang w:val="es-ES"/>
-        </w:rPr>
-      </w:pPr>
-      <w:r>
-        <w:rPr>
-          <w:rFonts w:ascii="Times New Roman" w:hAnsi="Times New Roman" w:cs="Times New Roman"/>
-          <w:sz w:val="24"/>
-          <w:szCs w:val="24"/>
-          <w:lang w:val="es-ES"/>
-        </w:rPr>
-        <w:t>La gestión documental digital también fortalece la calidad administrativa. Al centralizar los documentos, se reducen pérdidas de información, duplicidad de archivos, confusión entre versiones y retrasos por búsquedas manuales. Además, permite que la carrera establezca criterios uniformes para todos los proyectos, evitando que cada grupo maneje sus entregas con métodos diferentes. Esta estandarización es relevante en procesos de evaluación, acreditación o auditoría académica, donde la evidencia documental debe estar ordenada y disponible.</w:t>
-      </w:r>
-    </w:p>
-    <w:p>
-      <w:pPr>
-        <w:spacing w:before="240" w:after="0" w:line="360" w:lineRule="auto"/>
-        <w:ind w:left="708" w:firstLine="708"/>
-        <w:jc w:val="both"/>
-        <w:rPr>
-          <w:rFonts w:ascii="Times New Roman" w:hAnsi="Times New Roman" w:cs="Times New Roman"/>
-          <w:sz w:val="24"/>
-          <w:szCs w:val="24"/>
-          <w:lang w:val="es-ES"/>
-        </w:rPr>
-      </w:pPr>
-      <w:r>
-        <w:rPr>
-          <w:rFonts w:ascii="Times New Roman" w:hAnsi="Times New Roman" w:cs="Times New Roman"/>
-          <w:sz w:val="24"/>
-          <w:szCs w:val="24"/>
-          <w:lang w:val="es-ES"/>
-        </w:rPr>
-        <w:t>En el diseño de la plataforma, la gestión documental debe incluir al menos: carga segura de archivos, metadatos básicos, clasificación por proyecto, control de versiones, historial de revisión, permisos de acceso, comentarios u observaciones, estados documentales y mecanismos de descarga. Estos elementos permiten que la revisión académica sea transparente y que cada documento tenga una relación clara con el flujo de seguimiento del proyecto. Así, el sistema deja de ser un simple contenedor de archivos y se convierte en un soporte formal para la toma de decisiones académicas.</w:t>
-      </w:r>
-    </w:p>
-    <w:p>
-      <w:pPr>
-        <w:pStyle w:val="tesis"/>
-        <w:rPr>
-          <w:sz w:val="24"/>
-          <w:szCs w:val="24"/>
-        </w:rPr>
-      </w:pPr>
-      <w:r>
-        <w:rPr>
-          <w:sz w:val="24"/>
-          <w:szCs w:val="24"/>
-        </w:rPr>
-        <w:t xml:space="preserve">       </w:t>
-      </w:r>
-      <w:r>
-        <w:rPr>
-          <w:sz w:val="24"/>
-          <w:szCs w:val="24"/>
-        </w:rPr>
-        <w:t>7.3 Seguimiento y control de proyectos académicos</w:t>
-      </w:r>
-      <w:r>
-        <w:rPr>
-          <w:sz w:val="24"/>
-          <w:szCs w:val="24"/>
-        </w:rPr>
-        <w:t>.</w:t>
-      </w:r>
-    </w:p>
-    <w:p>
-      <w:pPr>
-        <w:spacing w:before="240" w:after="0" w:line="360" w:lineRule="auto"/>
-        <w:ind w:left="708" w:firstLine="708"/>
-        <w:jc w:val="both"/>
-        <w:rPr>
-          <w:rFonts w:ascii="Times New Roman" w:hAnsi="Times New Roman" w:cs="Times New Roman"/>
-          <w:sz w:val="24"/>
-          <w:szCs w:val="24"/>
-          <w:lang w:val="es-ES"/>
-        </w:rPr>
-      </w:pPr>
-      <w:r>
-        <w:rPr>
-          <w:rFonts w:ascii="Times New Roman" w:hAnsi="Times New Roman" w:cs="Times New Roman"/>
-          <w:sz w:val="24"/>
-          <w:szCs w:val="24"/>
-          <w:lang w:val="es-ES"/>
-        </w:rPr>
-        <w:t xml:space="preserve">El seguimiento y control de proyectos académicos consiste en observar, registrar, evaluar y orientar el avance de una propuesta formativa o investigativa desde su inicio hasta su cierre. En la carrera de Desarrollo de Software, este </w:t>
-      </w:r>
-      <w:r>
-        <w:rPr>
-          <w:rFonts w:ascii="Times New Roman" w:hAnsi="Times New Roman" w:cs="Times New Roman"/>
-          <w:sz w:val="24"/>
-          <w:szCs w:val="24"/>
-          <w:lang w:val="es-ES"/>
-        </w:rPr>
-        <w:lastRenderedPageBreak/>
-        <w:t>seguimiento es especialmente importante porque los proyectos suelen involucrar planificación, análisis, diseño, construcción, pruebas, documentación, revisión docente y entrega final. Sin una herramienta centralizada, el control puede fragmentarse entre mensajes, hojas de cálculo, actas dispersas y archivos sin historial.</w:t>
-      </w:r>
-    </w:p>
-    <w:p>
-      <w:pPr>
-        <w:spacing w:before="240" w:after="0" w:line="360" w:lineRule="auto"/>
-        <w:ind w:left="708" w:firstLine="708"/>
-        <w:jc w:val="both"/>
-        <w:rPr>
-          <w:rFonts w:ascii="Times New Roman" w:hAnsi="Times New Roman" w:cs="Times New Roman"/>
-          <w:sz w:val="24"/>
-          <w:szCs w:val="24"/>
-          <w:lang w:val="es-ES"/>
-        </w:rPr>
-      </w:pPr>
-      <w:r>
-        <w:rPr>
-          <w:rFonts w:ascii="Times New Roman" w:hAnsi="Times New Roman" w:cs="Times New Roman"/>
-          <w:sz w:val="24"/>
-          <w:szCs w:val="24"/>
-          <w:lang w:val="es-ES"/>
-        </w:rPr>
-        <w:t>Una plataforma institucional debe traducir el seguimiento académico en un flujo de trabajo claro. Cada proyecto puede avanzar por estados como registrado, asignado, en desarrollo, en revisión, observado, corregido, aprobado y finalizado. Estos estados permiten que los responsables conozcan la situación actual sin depender de consultas manuales. Además, facilitan la identificación de retrasos, entregas pendientes, revisiones no atendidas y proyectos que requieren intervención de coordinación.</w:t>
-      </w:r>
-    </w:p>
-    <w:p>
-      <w:pPr>
-        <w:spacing w:before="240" w:after="0" w:line="360" w:lineRule="auto"/>
-        <w:ind w:left="708" w:firstLine="708"/>
-        <w:jc w:val="both"/>
-        <w:rPr>
-          <w:rFonts w:ascii="Times New Roman" w:hAnsi="Times New Roman" w:cs="Times New Roman"/>
-          <w:sz w:val="24"/>
-          <w:szCs w:val="24"/>
-          <w:lang w:val="es-ES"/>
-        </w:rPr>
-      </w:pPr>
-      <w:r>
-        <w:rPr>
-          <w:rFonts w:ascii="Times New Roman" w:hAnsi="Times New Roman" w:cs="Times New Roman"/>
-          <w:sz w:val="24"/>
-          <w:szCs w:val="24"/>
-          <w:lang w:val="es-ES"/>
-        </w:rPr>
-        <w:t xml:space="preserve">La pertinencia de utilizar sistemas de gestión de tareas y flujos se sostiene en </w:t>
-      </w:r>
-      <w:r>
-        <w:rPr>
-          <w:rFonts w:ascii="Times New Roman" w:hAnsi="Times New Roman" w:cs="Times New Roman"/>
-          <w:sz w:val="24"/>
-          <w:szCs w:val="24"/>
-          <w:lang w:val="es-ES"/>
-        </w:rPr>
-        <w:fldChar w:fldCharType="begin"/>
-      </w:r>
-      <w:r>
-        <w:rPr>
-          <w:rFonts w:ascii="Times New Roman" w:hAnsi="Times New Roman" w:cs="Times New Roman"/>
-          <w:sz w:val="24"/>
-          <w:szCs w:val="24"/>
-          <w:lang w:val="es-ES"/>
-        </w:rPr>
-        <w:instrText xml:space="preserve"> ADDIN ZOTERO_ITEM CSL_CITATION {"citationID":"7B6ivRTx","properties":{"unsorted":false,"formattedCitation":"(Almeida et\\uc0\\u160{}al., 2019)","plainCitation":"(Almeida et al., 2019)","noteIndex":0},"citationItems":[{"id":"0ccfRIuB/BskDTAdb","uris":["http://zotero.org/users/local/3NWqkcVE/items/CVY6ZES7"],"itemData":{"id":139,"type":"article-journal","container-title":"BMC Medical Informatics and Decision Making","DOI":"10.1186/s12911-019-0844-6","ISSN":"1472-6947","issue":"1","journalAbbreviation":"BMC Med Inform Decis Mak","language":"en","page":"121","source":"DOI.org (Crossref)","title":"TASKA: A modular task management system to support health research studies","title-short":"TASKA","volume":"19","author":[{"family":"Almeida","given":"João Rafael"},{"family":"Gini","given":"Rosa"},{"family":"Roberto","given":"Giuseppe"},{"family":"Rijnbeek","given":"Peter"},{"family":"Oliveira","given":"José Luís"}],"issued":{"date-parts":[["2019",12]]}}}],"schema":"https://github.com/citation-style-language/schema/raw/master/csl-citation.json"} </w:instrText>
-      </w:r>
-      <w:r>
-        <w:rPr>
-          <w:rFonts w:ascii="Times New Roman" w:hAnsi="Times New Roman" w:cs="Times New Roman"/>
-          <w:sz w:val="24"/>
-          <w:szCs w:val="24"/>
-          <w:lang w:val="es-ES"/>
-        </w:rPr>
-        <w:fldChar w:fldCharType="separate"/>
-      </w:r>
-      <w:r>
-        <w:rPr>
-          <w:rFonts w:ascii="Times New Roman" w:hAnsi="Times New Roman" w:cs="Times New Roman"/>
-          <w:kern w:val="0"/>
-          <w:sz w:val="24"/>
-          <w:szCs w:val="24"/>
-        </w:rPr>
-        <w:t>(Almeida et al., 2019)</w:t>
-      </w:r>
-      <w:r>
-        <w:rPr>
-          <w:rFonts w:ascii="Times New Roman" w:hAnsi="Times New Roman" w:cs="Times New Roman"/>
-          <w:sz w:val="24"/>
-          <w:szCs w:val="24"/>
-          <w:lang w:val="es-ES"/>
-        </w:rPr>
-        <w:fldChar w:fldCharType="end"/>
-      </w:r>
-      <w:r>
-        <w:rPr>
-          <w:rFonts w:ascii="Times New Roman" w:hAnsi="Times New Roman" w:cs="Times New Roman"/>
-          <w:sz w:val="24"/>
-          <w:szCs w:val="24"/>
-          <w:lang w:val="es-ES"/>
-        </w:rPr>
-        <w:t xml:space="preserve">, quienes explican que ciertos procesos "can be </w:t>
-      </w:r>
-      <w:proofErr w:type="spellStart"/>
-      <w:r>
-        <w:rPr>
-          <w:rFonts w:ascii="Times New Roman" w:hAnsi="Times New Roman" w:cs="Times New Roman"/>
-          <w:sz w:val="24"/>
-          <w:szCs w:val="24"/>
-          <w:lang w:val="es-ES"/>
-        </w:rPr>
-        <w:t>simplified</w:t>
-      </w:r>
-      <w:proofErr w:type="spellEnd"/>
-      <w:r>
-        <w:rPr>
-          <w:rFonts w:ascii="Times New Roman" w:hAnsi="Times New Roman" w:cs="Times New Roman"/>
-          <w:sz w:val="24"/>
-          <w:szCs w:val="24"/>
-          <w:lang w:val="es-ES"/>
-        </w:rPr>
-        <w:t xml:space="preserve"> </w:t>
-      </w:r>
-      <w:proofErr w:type="spellStart"/>
-      <w:r>
-        <w:rPr>
-          <w:rFonts w:ascii="Times New Roman" w:hAnsi="Times New Roman" w:cs="Times New Roman"/>
-          <w:sz w:val="24"/>
-          <w:szCs w:val="24"/>
-          <w:lang w:val="es-ES"/>
-        </w:rPr>
-        <w:t>by</w:t>
-      </w:r>
-      <w:proofErr w:type="spellEnd"/>
-      <w:r>
-        <w:rPr>
-          <w:rFonts w:ascii="Times New Roman" w:hAnsi="Times New Roman" w:cs="Times New Roman"/>
-          <w:sz w:val="24"/>
-          <w:szCs w:val="24"/>
-          <w:lang w:val="es-ES"/>
-        </w:rPr>
-        <w:t xml:space="preserve"> </w:t>
-      </w:r>
-      <w:proofErr w:type="spellStart"/>
-      <w:r>
-        <w:rPr>
-          <w:rFonts w:ascii="Times New Roman" w:hAnsi="Times New Roman" w:cs="Times New Roman"/>
-          <w:sz w:val="24"/>
-          <w:szCs w:val="24"/>
-          <w:lang w:val="es-ES"/>
-        </w:rPr>
-        <w:t>using</w:t>
-      </w:r>
-      <w:proofErr w:type="spellEnd"/>
-      <w:r>
-        <w:rPr>
-          <w:rFonts w:ascii="Times New Roman" w:hAnsi="Times New Roman" w:cs="Times New Roman"/>
-          <w:sz w:val="24"/>
-          <w:szCs w:val="24"/>
-          <w:lang w:val="es-ES"/>
-        </w:rPr>
-        <w:t xml:space="preserve"> </w:t>
-      </w:r>
-      <w:proofErr w:type="spellStart"/>
-      <w:r>
-        <w:rPr>
-          <w:rFonts w:ascii="Times New Roman" w:hAnsi="Times New Roman" w:cs="Times New Roman"/>
-          <w:sz w:val="24"/>
-          <w:szCs w:val="24"/>
-          <w:lang w:val="es-ES"/>
-        </w:rPr>
-        <w:t>task</w:t>
-      </w:r>
-      <w:proofErr w:type="spellEnd"/>
-      <w:r>
-        <w:rPr>
-          <w:rFonts w:ascii="Times New Roman" w:hAnsi="Times New Roman" w:cs="Times New Roman"/>
-          <w:sz w:val="24"/>
-          <w:szCs w:val="24"/>
-          <w:lang w:val="es-ES"/>
-        </w:rPr>
-        <w:t xml:space="preserve"> and </w:t>
-      </w:r>
-      <w:proofErr w:type="spellStart"/>
-      <w:r>
-        <w:rPr>
-          <w:rFonts w:ascii="Times New Roman" w:hAnsi="Times New Roman" w:cs="Times New Roman"/>
-          <w:sz w:val="24"/>
-          <w:szCs w:val="24"/>
-          <w:lang w:val="es-ES"/>
-        </w:rPr>
-        <w:t>workflow</w:t>
-      </w:r>
-      <w:proofErr w:type="spellEnd"/>
-      <w:r>
-        <w:rPr>
-          <w:rFonts w:ascii="Times New Roman" w:hAnsi="Times New Roman" w:cs="Times New Roman"/>
-          <w:sz w:val="24"/>
-          <w:szCs w:val="24"/>
-          <w:lang w:val="es-ES"/>
-        </w:rPr>
-        <w:t xml:space="preserve"> </w:t>
-      </w:r>
-      <w:proofErr w:type="spellStart"/>
-      <w:r>
-        <w:rPr>
-          <w:rFonts w:ascii="Times New Roman" w:hAnsi="Times New Roman" w:cs="Times New Roman"/>
-          <w:sz w:val="24"/>
-          <w:szCs w:val="24"/>
-          <w:lang w:val="es-ES"/>
-        </w:rPr>
-        <w:t>management</w:t>
-      </w:r>
-      <w:proofErr w:type="spellEnd"/>
-      <w:r>
-        <w:rPr>
-          <w:rFonts w:ascii="Times New Roman" w:hAnsi="Times New Roman" w:cs="Times New Roman"/>
-          <w:sz w:val="24"/>
-          <w:szCs w:val="24"/>
-          <w:lang w:val="es-ES"/>
-        </w:rPr>
-        <w:t xml:space="preserve"> </w:t>
-      </w:r>
-      <w:proofErr w:type="spellStart"/>
-      <w:r>
-        <w:rPr>
-          <w:rFonts w:ascii="Times New Roman" w:hAnsi="Times New Roman" w:cs="Times New Roman"/>
-          <w:sz w:val="24"/>
-          <w:szCs w:val="24"/>
-          <w:lang w:val="es-ES"/>
-        </w:rPr>
-        <w:t>systems</w:t>
-      </w:r>
-      <w:proofErr w:type="spellEnd"/>
-      <w:r>
-        <w:rPr>
-          <w:rFonts w:ascii="Times New Roman" w:hAnsi="Times New Roman" w:cs="Times New Roman"/>
-          <w:sz w:val="24"/>
-          <w:szCs w:val="24"/>
-          <w:lang w:val="es-ES"/>
-        </w:rPr>
-        <w:t>" (p. 2). Esta afirmación resulta aplicable al seguimiento de proyectos académicos porque el avance de un proyecto no depende de una sola actividad, sino de una secuencia de tareas, responsables, entregas, revisiones y decisiones que deben coordinarse de manera ordenada.</w:t>
-      </w:r>
-    </w:p>
-    <w:p>
-      <w:pPr>
-        <w:spacing w:before="240" w:after="0" w:line="360" w:lineRule="auto"/>
-        <w:ind w:left="708" w:firstLine="708"/>
-        <w:jc w:val="both"/>
-        <w:rPr>
-          <w:rFonts w:ascii="Times New Roman" w:hAnsi="Times New Roman" w:cs="Times New Roman"/>
-          <w:sz w:val="24"/>
-          <w:szCs w:val="24"/>
-          <w:lang w:val="es-ES"/>
-        </w:rPr>
-      </w:pPr>
-      <w:r>
-        <w:rPr>
-          <w:rFonts w:ascii="Times New Roman" w:hAnsi="Times New Roman" w:cs="Times New Roman"/>
-          <w:sz w:val="24"/>
-          <w:szCs w:val="24"/>
-          <w:lang w:val="es-ES"/>
-        </w:rPr>
-        <w:t>El control de proyectos no debe entenderse como vigilancia punitiva, sino como un mecanismo de acompañamiento académico. Al registrar hitos, fechas y observaciones, el sistema ayuda a que estudiantes y docentes mantengan una comunicación ordenada. El estudiante puede conocer qué documento debe entregar y cuál fue la observación recibida; el tutor puede revisar avances sin perder el historial; los revisores pueden emitir criterios de forma organizada; y la coordinación puede tomar decisiones con base en datos consolidados.</w:t>
-      </w:r>
-    </w:p>
-    <w:p>
-      <w:pPr>
-        <w:spacing w:before="240" w:after="0" w:line="360" w:lineRule="auto"/>
-        <w:ind w:left="708" w:firstLine="708"/>
-        <w:jc w:val="both"/>
-        <w:rPr>
-          <w:rFonts w:ascii="Times New Roman" w:hAnsi="Times New Roman" w:cs="Times New Roman"/>
-          <w:sz w:val="24"/>
-          <w:szCs w:val="24"/>
-          <w:lang w:val="es-ES"/>
-        </w:rPr>
-      </w:pPr>
-      <w:r>
-        <w:rPr>
-          <w:rFonts w:ascii="Times New Roman" w:hAnsi="Times New Roman" w:cs="Times New Roman"/>
-          <w:sz w:val="24"/>
-          <w:szCs w:val="24"/>
-          <w:lang w:val="es-ES"/>
-        </w:rPr>
-        <w:t xml:space="preserve">El seguimiento también requiere trazabilidad de responsabilidades. En proyectos académicos, una observación sin autor, una entrega sin fecha o una aprobación sin evidencia puede generar conflictos. Por ello, la plataforma debe registrar acciones vinculadas a usuarios y momentos específicos. Esta trazabilidad permite reconstruir el proceso y fortalecer la transparencia del trabajo académico. </w:t>
-      </w:r>
-      <w:r>
-        <w:rPr>
-          <w:rFonts w:ascii="Times New Roman" w:hAnsi="Times New Roman" w:cs="Times New Roman"/>
-          <w:sz w:val="24"/>
-          <w:szCs w:val="24"/>
-          <w:lang w:val="es-ES"/>
-        </w:rPr>
-        <w:lastRenderedPageBreak/>
-        <w:t>Asimismo, los reportes automáticos pueden apoyar reuniones de seguimiento, comités de carrera o procesos de evaluación institucional.</w:t>
-      </w:r>
-    </w:p>
-    <w:p>
-      <w:pPr>
-        <w:spacing w:before="240" w:after="0" w:line="360" w:lineRule="auto"/>
-        <w:ind w:left="708" w:firstLine="708"/>
-        <w:jc w:val="both"/>
-        <w:rPr>
-          <w:rFonts w:ascii="Times New Roman" w:hAnsi="Times New Roman" w:cs="Times New Roman"/>
-          <w:sz w:val="24"/>
-          <w:szCs w:val="24"/>
-          <w:lang w:val="es-ES"/>
-        </w:rPr>
-      </w:pPr>
-      <w:r>
-        <w:rPr>
-          <w:rFonts w:ascii="Times New Roman" w:hAnsi="Times New Roman" w:cs="Times New Roman"/>
-          <w:sz w:val="24"/>
-          <w:szCs w:val="24"/>
-          <w:lang w:val="es-ES"/>
-        </w:rPr>
-        <w:t>El control debe apoyarse en indicadores básicos: número de proyectos activos, porcentaje de entregas aprobadas, documentos pendientes de revisión, tiempos promedio de respuesta, proyectos con retraso y frecuencia de observaciones. Estos indicadores no sustituyen el juicio académico, pero ayudan a priorizar acciones. En una carrera de Desarrollo de Software, donde los proyectos pueden convertirse en productos funcionales, prototipos o soluciones institucionales, el seguimiento sistemático favorece una cultura de planificación, evidencia y mejora continua.</w:t>
-      </w:r>
-    </w:p>
-    <w:p>
-      <w:pPr>
-        <w:pStyle w:val="tesis"/>
-        <w:rPr>
-          <w:sz w:val="24"/>
-          <w:szCs w:val="24"/>
-        </w:rPr>
-      </w:pPr>
-      <w:r>
-        <w:rPr>
-          <w:sz w:val="24"/>
-          <w:szCs w:val="24"/>
-        </w:rPr>
-        <w:t xml:space="preserve">      </w:t>
-      </w:r>
-      <w:r>
-        <w:rPr>
-          <w:sz w:val="24"/>
-          <w:szCs w:val="24"/>
-        </w:rPr>
-        <w:t>7.4 Diseño y desarrollo de sistemas web</w:t>
-      </w:r>
-      <w:r>
-        <w:rPr>
-          <w:sz w:val="24"/>
-          <w:szCs w:val="24"/>
-        </w:rPr>
-        <w:t>.</w:t>
-      </w:r>
-    </w:p>
-    <w:p>
-      <w:pPr>
-        <w:pStyle w:val="parrafos"/>
-        <w:spacing w:before="240" w:line="360" w:lineRule="auto"/>
-        <w:ind w:left="708" w:firstLine="708"/>
-        <w:rPr>
-          <w:sz w:val="24"/>
-          <w:szCs w:val="24"/>
-        </w:rPr>
-      </w:pPr>
-      <w:r>
-        <w:rPr>
-          <w:sz w:val="24"/>
-          <w:szCs w:val="24"/>
-        </w:rPr>
-        <w:t>El diseño y desarrollo de sistemas web comprende el proceso de transformar una necesidad institucional en una solución tecnológica accesible mediante navegador, organizada por capas y orientada a usuarios concretos. En una plataforma para seguimiento, revisión y gestión documental de proyectos académicos, este proceso debe iniciar con el análisis de requerimientos funcionales y no funcionales. Los requerimientos funcionales definen qué debe hacer el sistema: registrar proyectos, administrar usuarios, cargar documentos, asignar revisores, emitir observaciones, controlar estados y generar reportes. Los requerimientos no funcionales establecen condiciones de calidad: seguridad, rendimiento, disponibilidad, usabilidad, mantenibilidad y escalabilidad.</w:t>
-      </w:r>
-    </w:p>
-    <w:p>
-      <w:pPr>
-        <w:pStyle w:val="parrafos"/>
-        <w:spacing w:before="240" w:line="360" w:lineRule="auto"/>
-        <w:ind w:left="708" w:firstLine="708"/>
-        <w:rPr>
-          <w:sz w:val="24"/>
-          <w:szCs w:val="24"/>
-        </w:rPr>
-      </w:pPr>
-      <w:r>
-        <w:rPr>
-          <w:sz w:val="24"/>
-          <w:szCs w:val="24"/>
-        </w:rPr>
-        <w:t xml:space="preserve">La complejidad de este proceso se relaciona con la naturaleza misma de las aplicaciones web. </w:t>
-      </w:r>
-      <w:r>
-        <w:rPr>
-          <w:sz w:val="24"/>
-          <w:szCs w:val="24"/>
-        </w:rPr>
-        <w:fldChar w:fldCharType="begin"/>
-      </w:r>
-      <w:r>
-        <w:rPr>
-          <w:sz w:val="24"/>
-          <w:szCs w:val="24"/>
-        </w:rPr>
-        <w:instrText xml:space="preserve"> ADDIN ZOTERO_ITEM CSL_CITATION {"citationID":"d5JlSMAw","properties":{"unsorted":false,"formattedCitation":"(Vuorimaa et\\uc0\\u160{}al., 2016)","plainCitation":"(Vuorimaa et al., 2016)","noteIndex":0},"citationItems":[{"id":1,"uris":["http://zotero.org/users/local/SB3Xbe6I/items/FVRNL63X"],"itemData":{"id":1,"type":"article-journal","container-title":"World Wide Web","DOI":"10.1007/s11280-015-0339-z","ISSN":"1386-145X, 1573-1413","issue":"4","journalAbbreviation":"World Wide Web","language":"en","page":"519-543","source":"DOI.org (Crossref)","title":"Leveraging declarative languages in web application development","volume":"19","author":[{"family":"Vuorimaa","given":"Petri"},{"family":"Laine","given":"Markku"},{"family":"Litvinova","given":"Evgenia"},{"family":"Shestakov","given":"Denis"}],"issued":{"date-parts":[["2016",7]]}}}],"schema":"https://github.com/citation-style-language/schema/raw/master/csl-citation.json"} </w:instrText>
-      </w:r>
-      <w:r>
-        <w:rPr>
-          <w:sz w:val="24"/>
-          <w:szCs w:val="24"/>
-        </w:rPr>
-        <w:fldChar w:fldCharType="separate"/>
-      </w:r>
-      <w:r>
-        <w:rPr>
-          <w:rFonts w:cs="Times New Roman"/>
-          <w:kern w:val="0"/>
-          <w:sz w:val="24"/>
-          <w:szCs w:val="24"/>
-        </w:rPr>
-        <w:t>(Vuorimaa et al., 2016)</w:t>
-      </w:r>
-      <w:r>
-        <w:rPr>
-          <w:sz w:val="24"/>
-          <w:szCs w:val="24"/>
-        </w:rPr>
-        <w:fldChar w:fldCharType="end"/>
-      </w:r>
-      <w:r>
-        <w:rPr>
-          <w:sz w:val="24"/>
-          <w:szCs w:val="24"/>
-        </w:rPr>
-        <w:t xml:space="preserve"> </w:t>
-      </w:r>
-      <w:r>
-        <w:rPr>
-          <w:sz w:val="24"/>
-          <w:szCs w:val="24"/>
-        </w:rPr>
-        <w:t>advierten que las aplicaciones web son "</w:t>
-      </w:r>
-      <w:proofErr w:type="spellStart"/>
-      <w:r>
-        <w:rPr>
-          <w:sz w:val="24"/>
-          <w:szCs w:val="24"/>
-        </w:rPr>
-        <w:t>easy</w:t>
-      </w:r>
-      <w:proofErr w:type="spellEnd"/>
-      <w:r>
-        <w:rPr>
-          <w:sz w:val="24"/>
-          <w:szCs w:val="24"/>
-        </w:rPr>
-        <w:t xml:space="preserve"> </w:t>
-      </w:r>
-      <w:proofErr w:type="spellStart"/>
-      <w:r>
-        <w:rPr>
-          <w:sz w:val="24"/>
-          <w:szCs w:val="24"/>
-        </w:rPr>
-        <w:t>to</w:t>
-      </w:r>
-      <w:proofErr w:type="spellEnd"/>
-      <w:r>
-        <w:rPr>
-          <w:sz w:val="24"/>
-          <w:szCs w:val="24"/>
-        </w:rPr>
-        <w:t xml:space="preserve"> use, </w:t>
-      </w:r>
-      <w:proofErr w:type="spellStart"/>
-      <w:r>
-        <w:rPr>
-          <w:sz w:val="24"/>
-          <w:szCs w:val="24"/>
-        </w:rPr>
-        <w:t>but</w:t>
-      </w:r>
-      <w:proofErr w:type="spellEnd"/>
-      <w:r>
-        <w:rPr>
-          <w:sz w:val="24"/>
-          <w:szCs w:val="24"/>
-        </w:rPr>
-        <w:t xml:space="preserve"> </w:t>
-      </w:r>
-      <w:proofErr w:type="spellStart"/>
-      <w:r>
-        <w:rPr>
-          <w:sz w:val="24"/>
-          <w:szCs w:val="24"/>
-        </w:rPr>
-        <w:t>hard</w:t>
-      </w:r>
-      <w:proofErr w:type="spellEnd"/>
-      <w:r>
-        <w:rPr>
-          <w:sz w:val="24"/>
-          <w:szCs w:val="24"/>
-        </w:rPr>
-        <w:t xml:space="preserve"> </w:t>
-      </w:r>
-      <w:proofErr w:type="spellStart"/>
-      <w:r>
-        <w:rPr>
-          <w:sz w:val="24"/>
-          <w:szCs w:val="24"/>
-        </w:rPr>
-        <w:t>to</w:t>
-      </w:r>
-      <w:proofErr w:type="spellEnd"/>
-      <w:r>
-        <w:rPr>
-          <w:sz w:val="24"/>
-          <w:szCs w:val="24"/>
-        </w:rPr>
-        <w:t xml:space="preserve"> </w:t>
-      </w:r>
-      <w:proofErr w:type="spellStart"/>
-      <w:r>
-        <w:rPr>
-          <w:sz w:val="24"/>
-          <w:szCs w:val="24"/>
-        </w:rPr>
-        <w:t>develop</w:t>
-      </w:r>
-      <w:proofErr w:type="spellEnd"/>
-      <w:r>
-        <w:rPr>
-          <w:sz w:val="24"/>
-          <w:szCs w:val="24"/>
-        </w:rPr>
-        <w:t>" (p. 519), lo que permite distinguir entre la simplicidad esperada por el usuario final y la complejidad técnica que debe resolverse durante el desarrollo. En una plataforma académica, esa complejidad incluye permisos, datos, documentos, flujos de revisión, seguridad y reportes institucionales.</w:t>
-      </w:r>
-    </w:p>
-    <w:p>
-      <w:pPr>
-        <w:pStyle w:val="parrafos"/>
-        <w:spacing w:before="240" w:line="360" w:lineRule="auto"/>
-        <w:ind w:left="708" w:firstLine="708"/>
-        <w:rPr>
-          <w:sz w:val="24"/>
-          <w:szCs w:val="24"/>
-        </w:rPr>
-      </w:pPr>
-      <w:r>
-        <w:rPr>
-          <w:sz w:val="24"/>
-          <w:szCs w:val="24"/>
-        </w:rPr>
-        <w:t xml:space="preserve">El diseño de un sistema web debe considerar la arquitectura de la solución. Una aplicación institucional suele organizarse en una capa de presentación, una capa lógica y una capa de datos. La capa de presentación permite la interacción con estudiantes, docentes y administradores; la capa lógica implementa reglas como </w:t>
-      </w:r>
-      <w:r>
-        <w:rPr>
-          <w:sz w:val="24"/>
-          <w:szCs w:val="24"/>
-        </w:rPr>
-        <w:lastRenderedPageBreak/>
-        <w:t>permisos, estados, validaciones y flujos de revisión; y la capa de datos almacena proyectos, documentos, usuarios, observaciones y registros de auditoría. Esta separación facilita el mantenimiento y reduce la dependencia entre componentes.</w:t>
-      </w:r>
-    </w:p>
-    <w:p>
-      <w:pPr>
-        <w:pStyle w:val="parrafos"/>
-        <w:spacing w:before="240" w:line="360" w:lineRule="auto"/>
-        <w:ind w:left="708" w:firstLine="708"/>
-        <w:rPr>
-          <w:sz w:val="24"/>
-          <w:szCs w:val="24"/>
-        </w:rPr>
-      </w:pPr>
-      <w:r>
-        <w:rPr>
-          <w:sz w:val="24"/>
-          <w:szCs w:val="24"/>
-        </w:rPr>
-        <w:t>La etapa de diseño también implica modelar procesos. Para el caso propuesto, no basta con diseñar pantallas: se deben representar los flujos de entrega, revisión, devolución y aprobación. El modelo de procesos ayuda a definir qué usuario puede ejecutar cada acción, qué estados cambian después de una revisión, qué notificaciones se generan y qué restricciones se aplican sobre los documentos. De esta manera, el sistema refleja la dinámica académica real y evita que la tecnología imponga procedimientos ambiguos.</w:t>
-      </w:r>
-    </w:p>
-    <w:p>
-      <w:pPr>
-        <w:pStyle w:val="parrafos"/>
-        <w:spacing w:before="240" w:line="360" w:lineRule="auto"/>
-        <w:ind w:left="708" w:firstLine="708"/>
-        <w:rPr>
-          <w:sz w:val="24"/>
-          <w:szCs w:val="24"/>
-        </w:rPr>
-      </w:pPr>
-      <w:r>
-        <w:rPr>
-          <w:sz w:val="24"/>
-          <w:szCs w:val="24"/>
-        </w:rPr>
-        <w:t>Durante el desarrollo, se deben aplicar prácticas de ingeniería de software: control de versiones, pruebas unitarias, validación de formularios, manejo seguro de sesiones, protección de datos y documentación técnica. Además, el desarrollo debe atender la usabilidad. Una interfaz académica debe ser clara, consistente y eficiente. Los usuarios no deberían necesitar conocimientos técnicos para registrar avances, revisar documentos o consultar observaciones. La plataforma debe reducir pasos innecesarios y mostrar información prioritaria según el rol de cada usuario.</w:t>
-      </w:r>
-    </w:p>
-    <w:p>
-      <w:pPr>
-        <w:pStyle w:val="parrafos"/>
-        <w:spacing w:before="240" w:line="360" w:lineRule="auto"/>
-        <w:ind w:left="708" w:firstLine="708"/>
-        <w:rPr>
-          <w:sz w:val="24"/>
-          <w:szCs w:val="24"/>
-        </w:rPr>
-      </w:pPr>
-      <w:r>
-        <w:rPr>
-          <w:sz w:val="24"/>
-          <w:szCs w:val="24"/>
-        </w:rPr>
-        <w:t>Finalmente, el desarrollo de sistemas web institucionales requiere una visión evolutiva. Las necesidades académicas pueden cambiar: nuevos formatos de proyecto, criterios de revisión, perfiles de usuario o reportes institucionales. Por eso, la solución debe construirse con módulos mantenibles y reglas configurables cuando sea posible. Un sistema diseñado de esta forma puede crecer sin perder estabilidad, permitiendo que la carrera incorpore mejoras progresivas y mantenga la plataforma alineada con sus procesos académicos.</w:t>
-      </w:r>
-    </w:p>
-    <w:p>
-      <w:pPr>
-        <w:pStyle w:val="parrafos"/>
-        <w:spacing w:before="240" w:line="360" w:lineRule="auto"/>
-        <w:rPr>
-          <w:sz w:val="24"/>
-          <w:szCs w:val="24"/>
-        </w:rPr>
-      </w:pPr>
-      <w:r>
-        <w:rPr>
-          <w:rFonts w:cs="Times New Roman"/>
-          <w:b/>
-          <w:bCs/>
-          <w:sz w:val="24"/>
-          <w:szCs w:val="24"/>
-        </w:rPr>
-        <w:t xml:space="preserve">     </w:t>
-      </w:r>
-      <w:r>
-        <w:rPr>
-          <w:rFonts w:cs="Times New Roman"/>
-          <w:b/>
-          <w:bCs/>
-          <w:sz w:val="24"/>
-          <w:szCs w:val="24"/>
-        </w:rPr>
-        <w:t>7.5 Validación y pruebas de software</w:t>
-      </w:r>
-      <w:r>
-        <w:rPr>
-          <w:rFonts w:cs="Times New Roman"/>
-          <w:b/>
-          <w:bCs/>
-          <w:sz w:val="24"/>
-          <w:szCs w:val="24"/>
-        </w:rPr>
-        <w:t>.</w:t>
-      </w:r>
-    </w:p>
-    <w:p>
-      <w:pPr>
-        <w:spacing w:before="240" w:line="360" w:lineRule="auto"/>
-        <w:ind w:left="708" w:firstLine="708"/>
-        <w:jc w:val="both"/>
-        <w:rPr>
-          <w:rFonts w:ascii="Times New Roman" w:hAnsi="Times New Roman" w:cs="Times New Roman"/>
-          <w:b/>
-          <w:bCs/>
-          <w:sz w:val="24"/>
-          <w:szCs w:val="24"/>
-        </w:rPr>
-      </w:pPr>
-      <w:r>
-        <w:rPr>
-          <w:rFonts w:ascii="Times New Roman" w:hAnsi="Times New Roman" w:cs="Times New Roman"/>
-          <w:sz w:val="24"/>
-          <w:szCs w:val="24"/>
-        </w:rPr>
-        <w:t xml:space="preserve">La validación y las pruebas de software son actividades orientadas a comprobar que un sistema cumple con los requerimientos establecidos y responde de forma adecuada a las necesidades de sus usuarios. En una plataforma institucional para proyectos académicos, las pruebas no se limitan a verificar que las pantallas carguen correctamente; deben comprobar que los flujos de gestión documental, </w:t>
-      </w:r>
-      <w:r>
-        <w:rPr>
-          <w:rFonts w:ascii="Times New Roman" w:hAnsi="Times New Roman" w:cs="Times New Roman"/>
-          <w:sz w:val="24"/>
-          <w:szCs w:val="24"/>
-        </w:rPr>
-        <w:lastRenderedPageBreak/>
-        <w:t>seguimiento y revisión funcionen de acuerdo con las reglas académicas definidas por la carrera.</w:t>
-      </w:r>
-    </w:p>
-    <w:p>
-      <w:pPr>
-        <w:spacing w:before="240" w:line="360" w:lineRule="auto"/>
-        <w:ind w:left="708" w:firstLine="708"/>
-        <w:jc w:val="both"/>
-        <w:rPr>
-          <w:rFonts w:ascii="Times New Roman" w:hAnsi="Times New Roman" w:cs="Times New Roman"/>
-          <w:b/>
-          <w:bCs/>
-          <w:sz w:val="24"/>
-          <w:szCs w:val="24"/>
-        </w:rPr>
-      </w:pPr>
-      <w:r>
-        <w:rPr>
-          <w:rFonts w:ascii="Times New Roman" w:hAnsi="Times New Roman" w:cs="Times New Roman"/>
-          <w:sz w:val="24"/>
-          <w:szCs w:val="24"/>
-        </w:rPr>
-        <w:t>La validación responde a una pregunta central: el sistema construido, ¿resuelve el problema institucional para el que fue diseñado? Para responderla, se deben contrastar las funcionalidades con los casos de uso reales. Por ejemplo, un estudiante debe poder registrar un proyecto, cargar un documento y consultar observaciones; un tutor debe revisar avances y emitir recomendaciones; un revisor debe aprobar o devolver documentos; y la coordinación debe consultar reportes de estado. Si el sistema permite estas acciones de manera coherente, trazable y comprensible, la validación funcional se fortalece.</w:t>
-      </w:r>
-    </w:p>
-    <w:p>
-      <w:pPr>
-        <w:spacing w:before="240" w:line="360" w:lineRule="auto"/>
-        <w:ind w:left="708" w:firstLine="708"/>
-        <w:jc w:val="both"/>
-        <w:rPr>
-          <w:rFonts w:ascii="Times New Roman" w:hAnsi="Times New Roman" w:cs="Times New Roman"/>
-          <w:b/>
-          <w:bCs/>
-          <w:sz w:val="24"/>
-          <w:szCs w:val="24"/>
-        </w:rPr>
-      </w:pPr>
-      <w:r>
-        <w:rPr>
-          <w:rFonts w:ascii="Times New Roman" w:hAnsi="Times New Roman" w:cs="Times New Roman"/>
-          <w:sz w:val="24"/>
-          <w:szCs w:val="24"/>
-        </w:rPr>
-        <w:t xml:space="preserve">Las pruebas deben planificarse con criterio, porque </w:t>
-      </w:r>
-      <w:r>
-        <w:rPr>
-          <w:rFonts w:ascii="Times New Roman" w:hAnsi="Times New Roman" w:cs="Times New Roman"/>
-          <w:sz w:val="24"/>
-          <w:szCs w:val="24"/>
-        </w:rPr>
-        <w:fldChar w:fldCharType="begin"/>
-      </w:r>
-      <w:r>
-        <w:rPr>
-          <w:rFonts w:ascii="Times New Roman" w:hAnsi="Times New Roman" w:cs="Times New Roman"/>
-          <w:sz w:val="24"/>
-          <w:szCs w:val="24"/>
-        </w:rPr>
-        <w:instrText xml:space="preserve"> ADDIN ZOTERO_ITEM CSL_CITATION {"citationID":"UnCn2Pjh","properties":{"unsorted":false,"formattedCitation":"(Kuhn et\\uc0\\u160{}al., 2004)","plainCitation":"(Kuhn et al., 2004)","noteIndex":0},"citationItems":[{"id":3,"uris":["http://zotero.org/users/local/SB3Xbe6I/items/U3Q9CVXE"],"itemData":{"id":3,"type":"article-journal","container-title":"IEEE Transactions on Software Engineering","DOI":"10.1109/TSE.2004.24","ISSN":"0098-5589","issue":"6","journalAbbreviation":"IIEEE Trans. Software Eng.","language":"en","license":"https://ieeexplore.ieee.org/Xplorehelp/downloads/license-information/IEEE.html","page":"418-421","source":"DOI.org (Crossref)","title":"Software fault interactions and implications for software testing","volume":"30","author":[{"family":"Kuhn","given":"D.R."},{"family":"Wallace","given":"D.R."},{"family":"Gallo","given":"A.M."}],"issued":{"date-parts":[["2004",6]]}}}],"schema":"https://github.com/citation-style-language/schema/raw/master/csl-citation.json"} </w:instrText>
-      </w:r>
-      <w:r>
-        <w:rPr>
-          <w:rFonts w:ascii="Times New Roman" w:hAnsi="Times New Roman" w:cs="Times New Roman"/>
-          <w:sz w:val="24"/>
-          <w:szCs w:val="24"/>
-        </w:rPr>
-        <w:fldChar w:fldCharType="separate"/>
-      </w:r>
-      <w:r>
-        <w:rPr>
-          <w:rFonts w:ascii="Times New Roman" w:hAnsi="Times New Roman" w:cs="Times New Roman"/>
-          <w:kern w:val="0"/>
-          <w:sz w:val="24"/>
-          <w:szCs w:val="24"/>
-        </w:rPr>
-        <w:t>(Kuhn et al., 2004)</w:t>
-      </w:r>
-      <w:r>
-        <w:rPr>
-          <w:rFonts w:ascii="Times New Roman" w:hAnsi="Times New Roman" w:cs="Times New Roman"/>
-          <w:sz w:val="24"/>
-          <w:szCs w:val="24"/>
-        </w:rPr>
-        <w:fldChar w:fldCharType="end"/>
-      </w:r>
-      <w:r>
-        <w:rPr>
-          <w:rFonts w:ascii="Times New Roman" w:hAnsi="Times New Roman" w:cs="Times New Roman"/>
-          <w:sz w:val="24"/>
-          <w:szCs w:val="24"/>
-        </w:rPr>
-        <w:t xml:space="preserve"> </w:t>
-      </w:r>
-      <w:r>
-        <w:rPr>
-          <w:rFonts w:ascii="Times New Roman" w:hAnsi="Times New Roman" w:cs="Times New Roman"/>
-          <w:sz w:val="24"/>
-          <w:szCs w:val="24"/>
-        </w:rPr>
-        <w:t xml:space="preserve">recuerdan que "exhaustive </w:t>
-      </w:r>
-      <w:proofErr w:type="spellStart"/>
-      <w:r>
-        <w:rPr>
-          <w:rFonts w:ascii="Times New Roman" w:hAnsi="Times New Roman" w:cs="Times New Roman"/>
-          <w:sz w:val="24"/>
-          <w:szCs w:val="24"/>
-        </w:rPr>
-        <w:t>testing</w:t>
-      </w:r>
-      <w:proofErr w:type="spellEnd"/>
-      <w:r>
-        <w:rPr>
-          <w:rFonts w:ascii="Times New Roman" w:hAnsi="Times New Roman" w:cs="Times New Roman"/>
-          <w:sz w:val="24"/>
-          <w:szCs w:val="24"/>
-        </w:rPr>
-        <w:t xml:space="preserve"> </w:t>
-      </w:r>
-      <w:proofErr w:type="spellStart"/>
-      <w:r>
-        <w:rPr>
-          <w:rFonts w:ascii="Times New Roman" w:hAnsi="Times New Roman" w:cs="Times New Roman"/>
-          <w:sz w:val="24"/>
-          <w:szCs w:val="24"/>
-        </w:rPr>
-        <w:t>of</w:t>
-      </w:r>
-      <w:proofErr w:type="spellEnd"/>
-      <w:r>
-        <w:rPr>
-          <w:rFonts w:ascii="Times New Roman" w:hAnsi="Times New Roman" w:cs="Times New Roman"/>
-          <w:sz w:val="24"/>
-          <w:szCs w:val="24"/>
-        </w:rPr>
-        <w:t xml:space="preserve"> </w:t>
-      </w:r>
-      <w:proofErr w:type="spellStart"/>
-      <w:r>
-        <w:rPr>
-          <w:rFonts w:ascii="Times New Roman" w:hAnsi="Times New Roman" w:cs="Times New Roman"/>
-          <w:sz w:val="24"/>
-          <w:szCs w:val="24"/>
-        </w:rPr>
-        <w:t>computer</w:t>
-      </w:r>
-      <w:proofErr w:type="spellEnd"/>
-      <w:r>
-        <w:rPr>
-          <w:rFonts w:ascii="Times New Roman" w:hAnsi="Times New Roman" w:cs="Times New Roman"/>
-          <w:sz w:val="24"/>
-          <w:szCs w:val="24"/>
-        </w:rPr>
-        <w:t xml:space="preserve"> software </w:t>
-      </w:r>
-      <w:proofErr w:type="spellStart"/>
-      <w:r>
-        <w:rPr>
-          <w:rFonts w:ascii="Times New Roman" w:hAnsi="Times New Roman" w:cs="Times New Roman"/>
-          <w:sz w:val="24"/>
-          <w:szCs w:val="24"/>
-        </w:rPr>
-        <w:t>is</w:t>
-      </w:r>
-      <w:proofErr w:type="spellEnd"/>
-      <w:r>
-        <w:rPr>
-          <w:rFonts w:ascii="Times New Roman" w:hAnsi="Times New Roman" w:cs="Times New Roman"/>
-          <w:sz w:val="24"/>
-          <w:szCs w:val="24"/>
-        </w:rPr>
-        <w:t xml:space="preserve"> </w:t>
-      </w:r>
-      <w:proofErr w:type="spellStart"/>
-      <w:r>
-        <w:rPr>
-          <w:rFonts w:ascii="Times New Roman" w:hAnsi="Times New Roman" w:cs="Times New Roman"/>
-          <w:sz w:val="24"/>
-          <w:szCs w:val="24"/>
-        </w:rPr>
-        <w:t>intractable</w:t>
-      </w:r>
-      <w:proofErr w:type="spellEnd"/>
-      <w:r>
-        <w:rPr>
-          <w:rFonts w:ascii="Times New Roman" w:hAnsi="Times New Roman" w:cs="Times New Roman"/>
-          <w:sz w:val="24"/>
-          <w:szCs w:val="24"/>
-        </w:rPr>
-        <w:t>" (p. 418). Esta limitación obliga a seleccionar escenarios representativos y de alto impacto, especialmente aquellos relacionados con permisos, carga de documentos, cambios de estado, revisión de entregas y generación de reportes. En otras palabras, el sistema debe probarse en función de los riesgos más relevantes para la operación académica.</w:t>
-      </w:r>
-    </w:p>
-    <w:p>
-      <w:pPr>
-        <w:spacing w:before="240" w:line="360" w:lineRule="auto"/>
-        <w:ind w:left="708" w:firstLine="708"/>
-        <w:jc w:val="both"/>
-        <w:rPr>
-          <w:rFonts w:ascii="Times New Roman" w:hAnsi="Times New Roman" w:cs="Times New Roman"/>
-          <w:b/>
-          <w:bCs/>
-          <w:sz w:val="24"/>
-          <w:szCs w:val="24"/>
-        </w:rPr>
-      </w:pPr>
-      <w:r>
-        <w:rPr>
-          <w:rFonts w:ascii="Times New Roman" w:hAnsi="Times New Roman" w:cs="Times New Roman"/>
-          <w:sz w:val="24"/>
-          <w:szCs w:val="24"/>
-        </w:rPr>
-        <w:t>Las pruebas de software pueden organizarse en varios niveles. Las pruebas unitarias revisan componentes específicos, como validaciones de campos o funciones de cambio de estado. Las pruebas de integración comprueban que módulos distintos trabajen correctamente entre sí, por ejemplo, que la carga de un documento actualice el historial del proyecto y notifique al revisor. Las pruebas de sistema evalúan la plataforma completa en condiciones similares al uso real. Las pruebas de aceptación permiten que usuarios representativos confirmen si el sistema satisface las necesidades académicas.</w:t>
-      </w:r>
-    </w:p>
-    <w:p>
-      <w:pPr>
-        <w:spacing w:before="240" w:line="360" w:lineRule="auto"/>
-        <w:ind w:left="708" w:firstLine="708"/>
-        <w:jc w:val="both"/>
-        <w:rPr>
-          <w:rFonts w:ascii="Times New Roman" w:hAnsi="Times New Roman" w:cs="Times New Roman"/>
-          <w:b/>
-          <w:bCs/>
-          <w:sz w:val="24"/>
-          <w:szCs w:val="24"/>
-        </w:rPr>
-      </w:pPr>
-      <w:r>
-        <w:rPr>
-          <w:rFonts w:ascii="Times New Roman" w:hAnsi="Times New Roman" w:cs="Times New Roman"/>
-          <w:sz w:val="24"/>
-          <w:szCs w:val="24"/>
-        </w:rPr>
-        <w:t xml:space="preserve">En este tipo de plataforma, la seguridad debe formar parte de la estrategia de pruebas. Los documentos académicos pueden contener información sensible, por lo que se deben validar permisos de acceso, autenticación, restricciones por rol y protección frente a acciones no autorizadas. Un estudiante no debería acceder a documentos de otro proyecto; un revisor no debería modificar registros </w:t>
-      </w:r>
-      <w:r>
-        <w:rPr>
-          <w:rFonts w:ascii="Times New Roman" w:hAnsi="Times New Roman" w:cs="Times New Roman"/>
-          <w:sz w:val="24"/>
-          <w:szCs w:val="24"/>
-        </w:rPr>
-        <w:lastRenderedPageBreak/>
-        <w:t>administrativos; y un usuario sin sesión activa no debería consultar información interna.</w:t>
-      </w:r>
-    </w:p>
-    <w:p>
-      <w:pPr>
-        <w:spacing w:before="240" w:line="360" w:lineRule="auto"/>
-        <w:ind w:left="708" w:firstLine="708"/>
-        <w:jc w:val="both"/>
-        <w:rPr>
-          <w:rFonts w:ascii="Times New Roman" w:hAnsi="Times New Roman" w:cs="Times New Roman"/>
-          <w:b/>
-          <w:bCs/>
-          <w:sz w:val="24"/>
-          <w:szCs w:val="24"/>
-        </w:rPr>
-      </w:pPr>
-      <w:r>
-        <w:rPr>
-          <w:rFonts w:ascii="Times New Roman" w:hAnsi="Times New Roman" w:cs="Times New Roman"/>
-          <w:sz w:val="24"/>
-          <w:szCs w:val="24"/>
-        </w:rPr>
-        <w:t>La usabilidad también debe probarse. Una plataforma puede cumplir técnicamente sus funciones y, aun así, fallar si los usuarios no entienden cómo operar el flujo. Por ello, se recomienda realizar pruebas con estudiantes, docentes y coordinadores, observando tiempos de ejecución, errores frecuentes, comprensión de etiquetas y facilidad para localizar documentos. Estas pruebas permiten corregir problemas antes de la implementación institucional.</w:t>
-      </w:r>
-    </w:p>
-    <w:p>
-      <w:pPr>
-        <w:spacing w:before="240" w:line="360" w:lineRule="auto"/>
-        <w:ind w:left="708" w:firstLine="360"/>
-        <w:jc w:val="both"/>
-        <w:rPr>
-          <w:rFonts w:ascii="Times New Roman" w:hAnsi="Times New Roman" w:cs="Times New Roman"/>
-          <w:b/>
-          <w:bCs/>
-          <w:sz w:val="24"/>
-          <w:szCs w:val="24"/>
-        </w:rPr>
-      </w:pPr>
-      <w:r>
-        <w:rPr>
-          <w:rFonts w:ascii="Times New Roman" w:hAnsi="Times New Roman" w:cs="Times New Roman"/>
-          <w:sz w:val="24"/>
-          <w:szCs w:val="24"/>
-        </w:rPr>
-        <w:t>Debido a que las pruebas exhaustivas no son viables, la estrategia debe priorizar escenarios críticos: registro de proyecto, carga de documentos, control de versiones, asignación de revisores, emisión de observaciones, cambio de estados, generación de reportes y cierre del proyecto. Esta selección permite concentrar recursos en los puntos donde un error tendría mayor impacto académico o administrativo. La validación final debe documentar evidencias, resultados, incidencias corregidas y criterios de aceptación, de modo que la implementación se realice con mayor confiabilidad.</w:t>
+        <w:t>Además, la validación debe considerar aspectos de seguridad y usabilidad, garantizando que cada usuario acceda únicamente a las funciones autorizadas y que la plataforma pueda utilizarse de manera clara y eficiente. De esta forma, se incrementa la confiabilidad del sistema antes de su implementación.</w:t>
       </w:r>
     </w:p>
     <w:p>
@@ -3453,17 +3120,7 @@
           <w:szCs w:val="24"/>
           <w:lang w:val="es-ES"/>
         </w:rPr>
-        <w:t xml:space="preserve">Para el desarrollo de esta investigación se aplicará el método descriptivo, debido a que permitirá caracterizar la situación actual de los procesos de gestión documental de los proyectos académicos, a través de este método se podrá identificar cómo se realizan actualmente las actividades, qué dificultades enfrentan los </w:t>
-      </w:r>
-      <w:r>
-        <w:rPr>
-          <w:rFonts w:ascii="Times New Roman" w:hAnsi="Times New Roman" w:cs="Times New Roman"/>
-          <w:sz w:val="24"/>
-          <w:szCs w:val="24"/>
-          <w:lang w:val="es-ES"/>
-        </w:rPr>
-        <w:lastRenderedPageBreak/>
-        <w:t>estudiantes y docentes, y cuáles son las necesidades que deben ser consideradas para la propuesta tecnológica.</w:t>
+        <w:t>Para el desarrollo de esta investigación se aplicará el método descriptivo, debido a que permitirá caracterizar la situación actual de los procesos de gestión documental de los proyectos académicos, a través de este método se podrá identificar cómo se realizan actualmente las actividades, qué dificultades enfrentan los estudiantes y docentes, y cuáles son las necesidades que deben ser consideradas para la propuesta tecnológica.</w:t>
       </w:r>
     </w:p>
     <w:p>
@@ -3507,7 +3164,17 @@
           <w:szCs w:val="24"/>
           <w:lang w:val="es-ES"/>
         </w:rPr>
-        <w:t>Se empleará el método inductivo, porque a partir de la información obtenida de los estudiantes, docentes y responsables académicos se podrán establecer conclusiones generales sobre las necesidades de la carrera en cuanto a la gestión documental y seguimiento de proyectos académicos. Este método permitirá fundamentar la propuesta a partir de la realidad observada en el entorno institucional.</w:t>
+        <w:t xml:space="preserve">Se empleará el método inductivo, porque a partir de la información obtenida de los estudiantes, docentes y responsables académicos se podrán establecer conclusiones generales sobre las necesidades de la carrera en cuanto a la gestión </w:t>
+      </w:r>
+      <w:r>
+        <w:rPr>
+          <w:rFonts w:ascii="Times New Roman" w:hAnsi="Times New Roman" w:cs="Times New Roman"/>
+          <w:sz w:val="24"/>
+          <w:szCs w:val="24"/>
+          <w:lang w:val="es-ES"/>
+        </w:rPr>
+        <w:lastRenderedPageBreak/>
+        <w:t>documental y seguimiento de proyectos académicos. Este método permitirá fundamentar la propuesta a partir de la realidad observada en el entorno institucional.</w:t>
       </w:r>
     </w:p>
     <w:p>
@@ -3634,7 +3301,6 @@
           <w:szCs w:val="24"/>
           <w:lang w:val="es-ES"/>
         </w:rPr>
-        <w:lastRenderedPageBreak/>
         <w:t xml:space="preserve">      </w:t>
       </w:r>
       <w:r>
@@ -3742,7 +3408,17 @@
           <w:szCs w:val="24"/>
           <w:lang w:val="es-ES"/>
         </w:rPr>
-        <w:t>Para la revisión documental, se empleará una ficha de análisis documental, que permitirá registrar los tipos de documentos revisados, su función dentro del proceso académico, su forma de almacenamiento, disponibilidad, nivel de organización y utilidad para el seguimiento de los proyectos.</w:t>
+        <w:t xml:space="preserve">Para la revisión documental, se empleará una ficha de análisis documental, que permitirá registrar los tipos de documentos revisados, su función dentro del </w:t>
+      </w:r>
+      <w:r>
+        <w:rPr>
+          <w:rFonts w:ascii="Times New Roman" w:hAnsi="Times New Roman" w:cs="Times New Roman"/>
+          <w:sz w:val="24"/>
+          <w:szCs w:val="24"/>
+          <w:lang w:val="es-ES"/>
+        </w:rPr>
+        <w:lastRenderedPageBreak/>
+        <w:t>proceso académico, su forma de almacenamiento, disponibilidad, nivel de organización y utilidad para el seguimiento de los proyectos.</w:t>
       </w:r>
     </w:p>
     <w:p>
@@ -4297,7 +3973,27 @@
                 <w:sz w:val="24"/>
                 <w:szCs w:val="24"/>
               </w:rPr>
-              <w:t>$40</w:t>
+              <w:t>$</w:t>
+            </w:r>
+            <w:r>
+              <w:rPr>
+                <w:rFonts w:ascii="Times New Roman" w:hAnsi="Times New Roman" w:cs="Times New Roman"/>
+                <w:b/>
+                <w:bCs/>
+                <w:sz w:val="24"/>
+                <w:szCs w:val="24"/>
+              </w:rPr>
+              <w:t>12</w:t>
+            </w:r>
+            <w:r>
+              <w:rPr>
+                <w:rFonts w:ascii="Times New Roman" w:hAnsi="Times New Roman" w:cs="Times New Roman"/>
+                <w:b/>
+                <w:bCs/>
+                <w:sz w:val="24"/>
+                <w:szCs w:val="24"/>
+              </w:rPr>
+              <w:t>0</w:t>
             </w:r>
           </w:p>
         </w:tc>
@@ -4541,7 +4237,7 @@
                 <w:sz w:val="24"/>
                 <w:szCs w:val="24"/>
               </w:rPr>
-              <w:t>80</w:t>
+              <w:t>170</w:t>
             </w:r>
           </w:p>
         </w:tc>
@@ -4597,7 +4293,6 @@
           <w:szCs w:val="24"/>
           <w:lang w:val="es-ES"/>
         </w:rPr>
-        <w:lastRenderedPageBreak/>
         <w:t>Nota.</w:t>
       </w:r>
       <w:r>
@@ -4636,6 +4331,23 @@
           <w:lang w:val="es-ES"/>
         </w:rPr>
       </w:pPr>
+    </w:p>
+    <w:p>
+      <w:pPr>
+        <w:rPr>
+          <w:sz w:val="24"/>
+          <w:szCs w:val="24"/>
+          <w:lang w:val="es-ES"/>
+        </w:rPr>
+      </w:pPr>
+      <w:r>
+        <w:rPr>
+          <w:sz w:val="24"/>
+          <w:szCs w:val="24"/>
+          <w:lang w:val="es-ES"/>
+        </w:rPr>
+        <w:br w:type="page"/>
+      </w:r>
     </w:p>
     <w:p>
       <w:pPr>
@@ -6404,7 +6116,6 @@
                 <w:sz w:val="24"/>
                 <w:szCs w:val="24"/>
               </w:rPr>
-              <w:lastRenderedPageBreak/>
               <w:t>11</w:t>
             </w:r>
           </w:p>
@@ -6658,367 +6369,406 @@
         <w:t>A</w:t>
       </w:r>
     </w:p>
-    <w:p>
-      <w:pPr>
-        <w:pStyle w:val="Prrafodelista"/>
+    <w:sdt>
+      <w:sdtPr>
+        <w:id w:val="111145805"/>
+        <w:bibliography/>
+      </w:sdtPr>
+      <w:sdtContent>
+        <w:p>
+          <w:pPr>
+            <w:pStyle w:val="Bibliografa"/>
+            <w:rPr>
+              <w:noProof/>
+              <w:kern w:val="0"/>
+              <w:sz w:val="24"/>
+              <w:szCs w:val="24"/>
+              <w14:ligatures w14:val="none"/>
+            </w:rPr>
+          </w:pPr>
+          <w:r>
+            <w:fldChar w:fldCharType="begin"/>
+          </w:r>
+          <w:r>
+            <w:instrText>BIBLIOGRAPHY</w:instrText>
+          </w:r>
+          <w:r>
+            <w:fldChar w:fldCharType="separate"/>
+          </w:r>
+          <w:r>
+            <w:rPr>
+              <w:noProof/>
+            </w:rPr>
+            <w:t xml:space="preserve">Avalos Salinas y Salas Araujo. (2025). </w:t>
+          </w:r>
+          <w:r>
+            <w:rPr>
+              <w:i/>
+              <w:iCs/>
+              <w:noProof/>
+            </w:rPr>
+            <w:t>Plataforma digital y su influencia en la gestión documentaria de la oficina de grados y títulos de la Universidad Tecnológica de los Andes – Abancay, 2023.</w:t>
+          </w:r>
+          <w:r>
+            <w:rPr>
+              <w:noProof/>
+            </w:rPr>
+            <w:t xml:space="preserve"> Abancay: Universidad Tecnológica de los Andes.</w:t>
+          </w:r>
+        </w:p>
+        <w:p>
+          <w:pPr>
+            <w:pStyle w:val="Bibliografa"/>
+            <w:rPr>
+              <w:noProof/>
+            </w:rPr>
+          </w:pPr>
+          <w:r>
+            <w:rPr>
+              <w:noProof/>
+            </w:rPr>
+            <w:t xml:space="preserve">Carrión Rojas y Gómez Muje. (2024). </w:t>
+          </w:r>
+          <w:r>
+            <w:rPr>
+              <w:i/>
+              <w:iCs/>
+              <w:noProof/>
+            </w:rPr>
+            <w:t>Plataforma web para la mejora de la gestión documental en la Universidad Tecnológica de los Andes, Abancay – 2023.</w:t>
+          </w:r>
+          <w:r>
+            <w:rPr>
+              <w:noProof/>
+            </w:rPr>
+            <w:t xml:space="preserve"> Abancay: Universidad Tecnológica de los Andes.</w:t>
+          </w:r>
+        </w:p>
+        <w:p>
+          <w:pPr>
+            <w:pStyle w:val="Bibliografa"/>
+            <w:rPr>
+              <w:noProof/>
+            </w:rPr>
+          </w:pPr>
+          <w:r>
+            <w:rPr>
+              <w:noProof/>
+            </w:rPr>
+            <w:t xml:space="preserve">Melgar, C. (2018). </w:t>
+          </w:r>
+          <w:r>
+            <w:rPr>
+              <w:i/>
+              <w:iCs/>
+              <w:noProof/>
+            </w:rPr>
+            <w:t>Desarrollo del sistema de control de tutorías y seguimiento de proyectos para el proceso de titulación de la Facultad de Ingeniería Industrial.</w:t>
+          </w:r>
+          <w:r>
+            <w:rPr>
+              <w:noProof/>
+            </w:rPr>
+            <w:t xml:space="preserve"> Guayaquil: Universidad de Guayaquil.</w:t>
+          </w:r>
+        </w:p>
+        <w:p>
+          <w:pPr>
+            <w:pStyle w:val="Bibliografa"/>
+            <w:rPr>
+              <w:noProof/>
+            </w:rPr>
+          </w:pPr>
+          <w:r>
+            <w:rPr>
+              <w:noProof/>
+            </w:rPr>
+            <w:t xml:space="preserve">Pérez Jácome y Bucheli Franco. (2024). </w:t>
+          </w:r>
+          <w:r>
+            <w:rPr>
+              <w:i/>
+              <w:iCs/>
+              <w:noProof/>
+            </w:rPr>
+            <w:t>Desarrollo de una plataforma web para la administración de proyectos en organizaciones.</w:t>
+          </w:r>
+          <w:r>
+            <w:rPr>
+              <w:noProof/>
+            </w:rPr>
+            <w:t xml:space="preserve"> Guayaquil: Escuela Superior Politécnica del Litoral (ESPOL).</w:t>
+          </w:r>
+        </w:p>
+        <w:p>
+          <w:pPr>
+            <w:pStyle w:val="Bibliografa"/>
+            <w:rPr>
+              <w:lang w:val="en-US"/>
+            </w:rPr>
+          </w:pPr>
+          <w:r>
+            <w:t xml:space="preserve">Almeida, J. R., Gini, R., Roberto, G., </w:t>
+          </w:r>
+          <w:proofErr w:type="spellStart"/>
+          <w:r>
+            <w:t>Rijnbeek</w:t>
+          </w:r>
+          <w:proofErr w:type="spellEnd"/>
+          <w:r>
+            <w:t xml:space="preserve">, P., &amp; Oliveira, J. L. (2019). </w:t>
+          </w:r>
+          <w:r>
+            <w:rPr>
+              <w:lang w:val="en-US"/>
+            </w:rPr>
+            <w:t xml:space="preserve">TASKA: A modular task management system to support health research studies. </w:t>
+          </w:r>
+          <w:r>
+            <w:rPr>
+              <w:i/>
+              <w:iCs/>
+              <w:lang w:val="en-US"/>
+            </w:rPr>
+            <w:t>BMC Medical Informatics and Decision Making</w:t>
+          </w:r>
+          <w:r>
+            <w:rPr>
+              <w:lang w:val="en-US"/>
+            </w:rPr>
+            <w:t xml:space="preserve">, </w:t>
+          </w:r>
+          <w:r>
+            <w:rPr>
+              <w:i/>
+              <w:iCs/>
+              <w:lang w:val="en-US"/>
+            </w:rPr>
+            <w:t>19</w:t>
+          </w:r>
+          <w:r>
+            <w:rPr>
+              <w:lang w:val="en-US"/>
+            </w:rPr>
+            <w:t>(1), 121. https://doi.org/10.1186/s12911-019-0844-6</w:t>
+          </w:r>
+        </w:p>
+        <w:p>
+          <w:pPr>
+            <w:pStyle w:val="Bibliografa"/>
+            <w:rPr>
+              <w:lang w:val="en-US"/>
+            </w:rPr>
+          </w:pPr>
+          <w:r>
+            <w:rPr>
+              <w:lang w:val="en-US"/>
+            </w:rPr>
+            <w:t xml:space="preserve">Kacmar, M. (2013). Implementation of Link-based DMS Supporting ISO 9001 QMS: Case Study. </w:t>
+          </w:r>
+          <w:r>
+            <w:rPr>
+              <w:i/>
+              <w:iCs/>
+              <w:lang w:val="en-US"/>
+            </w:rPr>
+            <w:t>Quality Innovation Prosperity</w:t>
+          </w:r>
+          <w:r>
+            <w:rPr>
+              <w:lang w:val="en-US"/>
+            </w:rPr>
+            <w:t xml:space="preserve">, </w:t>
+          </w:r>
+          <w:r>
+            <w:rPr>
+              <w:i/>
+              <w:iCs/>
+              <w:lang w:val="en-US"/>
+            </w:rPr>
+            <w:t>17</w:t>
+          </w:r>
+          <w:r>
+            <w:rPr>
+              <w:lang w:val="en-US"/>
+            </w:rPr>
+            <w:t>(2), 77–88. https://doi.org/10.12776/qip.v17i2.241</w:t>
+          </w:r>
+        </w:p>
+        <w:p>
+          <w:pPr>
+            <w:pStyle w:val="Bibliografa"/>
+            <w:rPr>
+              <w:lang w:val="en-US"/>
+            </w:rPr>
+          </w:pPr>
+          <w:r>
+            <w:rPr>
+              <w:lang w:val="en-US"/>
+            </w:rPr>
+            <w:t xml:space="preserve">Kuhn, D. R., Wallace, D. R., &amp; Gallo, A. M. (2004). Software fault interactions and implications for software testing. </w:t>
+          </w:r>
+          <w:r>
+            <w:rPr>
+              <w:i/>
+              <w:iCs/>
+              <w:lang w:val="en-US"/>
+            </w:rPr>
+            <w:t>IEEE Transactions on Software Engineering</w:t>
+          </w:r>
+          <w:r>
+            <w:rPr>
+              <w:lang w:val="en-US"/>
+            </w:rPr>
+            <w:t xml:space="preserve">, </w:t>
+          </w:r>
+          <w:r>
+            <w:rPr>
+              <w:i/>
+              <w:iCs/>
+              <w:lang w:val="en-US"/>
+            </w:rPr>
+            <w:t>30</w:t>
+          </w:r>
+          <w:r>
+            <w:rPr>
+              <w:lang w:val="en-US"/>
+            </w:rPr>
+            <w:t>(6), 418–421. https://doi.org/10.1109/TSE.2004.24</w:t>
+          </w:r>
+        </w:p>
+        <w:p>
+          <w:pPr>
+            <w:rPr>
+              <w:lang w:val="en-US"/>
+            </w:rPr>
+          </w:pPr>
+          <w:r>
+            <w:rPr>
+              <w:lang w:val="en-US"/>
+            </w:rPr>
+            <w:br w:type="page"/>
+          </w:r>
+        </w:p>
+        <w:p>
+          <w:pPr>
+            <w:pStyle w:val="Bibliografa"/>
+            <w:rPr>
+              <w:lang w:val="en-US"/>
+            </w:rPr>
+          </w:pPr>
+        </w:p>
+        <w:p>
+          <w:pPr>
+            <w:pStyle w:val="Bibliografa"/>
+          </w:pPr>
+          <w:r>
+            <w:rPr>
+              <w:lang w:val="en-US"/>
+            </w:rPr>
+            <w:t xml:space="preserve">Santana-Mancilla, P. C., Fajardo-Flores, S. B., Rodríguez-Ortiz, M. Á., Argenis Mondragón, E. Á., &amp; </w:t>
+          </w:r>
+          <w:proofErr w:type="spellStart"/>
+          <w:r>
+            <w:rPr>
+              <w:lang w:val="en-US"/>
+            </w:rPr>
+            <w:t>Gaytán</w:t>
+          </w:r>
+          <w:proofErr w:type="spellEnd"/>
+          <w:r>
+            <w:rPr>
+              <w:lang w:val="en-US"/>
+            </w:rPr>
+            <w:t xml:space="preserve">-Lugo, L. S. (2025). Beyond Navigation: Understanding Semantic Gaps in the Information Architecture of a University Portal. </w:t>
+          </w:r>
+          <w:r>
+            <w:rPr>
+              <w:i/>
+              <w:iCs/>
+            </w:rPr>
+            <w:t>Avances en Interacción Humano-Computadora</w:t>
+          </w:r>
+          <w:r>
+            <w:t xml:space="preserve">, </w:t>
+          </w:r>
+          <w:r>
+            <w:rPr>
+              <w:i/>
+              <w:iCs/>
+            </w:rPr>
+            <w:t>10</w:t>
+          </w:r>
+          <w:r>
+            <w:t>(1), 60–69. https://doi.org/10.47756/aihc.y10i1.203</w:t>
+          </w:r>
+        </w:p>
+        <w:p>
+          <w:pPr>
+            <w:pStyle w:val="Bibliografa"/>
+          </w:pPr>
+          <w:proofErr w:type="spellStart"/>
+          <w:r>
+            <w:rPr>
+              <w:lang w:val="en-US"/>
+            </w:rPr>
+            <w:t>Vuorimaa</w:t>
+          </w:r>
+          <w:proofErr w:type="spellEnd"/>
+          <w:r>
+            <w:rPr>
+              <w:lang w:val="en-US"/>
+            </w:rPr>
+            <w:t xml:space="preserve">, P., Laine, M., Litvinova, E., &amp; Shestakov, D. (2016). Leveraging declarative languages in web application development. </w:t>
+          </w:r>
+          <w:r>
+            <w:rPr>
+              <w:i/>
+              <w:iCs/>
+            </w:rPr>
+            <w:t>World Wide Web</w:t>
+          </w:r>
+          <w:r>
+            <w:t xml:space="preserve">, </w:t>
+          </w:r>
+          <w:r>
+            <w:rPr>
+              <w:i/>
+              <w:iCs/>
+            </w:rPr>
+            <w:t>19</w:t>
+          </w:r>
+          <w:r>
+            <w:t>(4), 519–543. https://doi.org/10.1007/s11280-015-0339-z</w:t>
+          </w:r>
+        </w:p>
+        <w:p/>
+        <w:p>
+          <w:r>
+            <w:rPr>
+              <w:b/>
+              <w:bCs/>
+            </w:rPr>
+            <w:fldChar w:fldCharType="end"/>
+          </w:r>
+        </w:p>
+      </w:sdtContent>
+    </w:sdt>
+    <w:p>
+      <w:pPr>
+        <w:pStyle w:val="Bibliografa"/>
+      </w:pPr>
+    </w:p>
+    <w:p>
+      <w:pPr>
         <w:spacing w:after="0" w:line="360" w:lineRule="auto"/>
-        <w:ind w:left="360"/>
         <w:rPr>
           <w:rFonts w:ascii="Times New Roman" w:hAnsi="Times New Roman" w:cs="Times New Roman"/>
           <w:b/>
           <w:bCs/>
-          <w:sz w:val="24"/>
-          <w:szCs w:val="24"/>
-          <w:lang w:val="es-ES"/>
-        </w:rPr>
-      </w:pPr>
-    </w:p>
-    <w:p>
-      <w:pPr>
-        <w:pStyle w:val="Bibliografa"/>
-        <w:rPr>
-          <w:sz w:val="24"/>
-          <w:szCs w:val="24"/>
-          <w:lang w:val="en-US"/>
-        </w:rPr>
-      </w:pPr>
-      <w:r>
-        <w:rPr>
-          <w:b/>
-          <w:bCs/>
-          <w:sz w:val="24"/>
-          <w:szCs w:val="24"/>
-          <w:lang w:val="es-ES"/>
-        </w:rPr>
-        <w:fldChar w:fldCharType="begin"/>
-      </w:r>
-      <w:r>
-        <w:rPr>
-          <w:b/>
-          <w:bCs/>
-          <w:sz w:val="24"/>
-          <w:szCs w:val="24"/>
-          <w:lang w:val="es-ES"/>
-        </w:rPr>
-        <w:instrText xml:space="preserve"> ADDIN ZOTERO_BIBL {"uncited":[],"omitted":[],"custom":[]} CSL_BIBLIOGRAPHY </w:instrText>
-      </w:r>
-      <w:r>
-        <w:rPr>
-          <w:b/>
-          <w:bCs/>
-          <w:sz w:val="24"/>
-          <w:szCs w:val="24"/>
-          <w:lang w:val="es-ES"/>
-        </w:rPr>
-        <w:fldChar w:fldCharType="separate"/>
-      </w:r>
-      <w:r>
-        <w:rPr>
-          <w:sz w:val="24"/>
-          <w:szCs w:val="24"/>
-        </w:rPr>
-        <w:t xml:space="preserve">Almeida, J. R., Gini, R., Roberto, G., Rijnbeek, P., &amp; Oliveira, J. L. (2019). </w:t>
-      </w:r>
-      <w:r>
-        <w:rPr>
-          <w:sz w:val="24"/>
-          <w:szCs w:val="24"/>
-          <w:lang w:val="en-US"/>
-        </w:rPr>
-        <w:t xml:space="preserve">TASKA: A modular task management system to support health research studies. </w:t>
-      </w:r>
-      <w:r>
-        <w:rPr>
-          <w:i/>
-          <w:iCs/>
-          <w:sz w:val="24"/>
-          <w:szCs w:val="24"/>
-          <w:lang w:val="en-US"/>
-        </w:rPr>
-        <w:t>BMC Medical Informatics and Decision Making</w:t>
-      </w:r>
-      <w:r>
-        <w:rPr>
-          <w:sz w:val="24"/>
-          <w:szCs w:val="24"/>
-          <w:lang w:val="en-US"/>
-        </w:rPr>
-        <w:t xml:space="preserve">, </w:t>
-      </w:r>
-      <w:r>
-        <w:rPr>
-          <w:i/>
-          <w:iCs/>
-          <w:sz w:val="24"/>
-          <w:szCs w:val="24"/>
-          <w:lang w:val="en-US"/>
-        </w:rPr>
-        <w:t>19</w:t>
-      </w:r>
-      <w:r>
-        <w:rPr>
-          <w:sz w:val="24"/>
-          <w:szCs w:val="24"/>
-          <w:lang w:val="en-US"/>
-        </w:rPr>
-        <w:t>(1), 121. https://doi.org/10.1186/s12911-019-0844-6</w:t>
-      </w:r>
-    </w:p>
-    <w:p>
-      <w:pPr>
-        <w:pStyle w:val="Bibliografa"/>
-        <w:rPr>
-          <w:sz w:val="24"/>
-          <w:szCs w:val="24"/>
-          <w:lang w:val="en-US"/>
-        </w:rPr>
-      </w:pPr>
-      <w:r>
-        <w:rPr>
-          <w:sz w:val="24"/>
-          <w:szCs w:val="24"/>
-          <w:lang w:val="en-US"/>
-        </w:rPr>
-        <w:t xml:space="preserve">Kacmar, M. (2013). Implementation of Link-based DMS Supporting ISO 9001 QMS: Case Study. </w:t>
-      </w:r>
-      <w:r>
-        <w:rPr>
-          <w:i/>
-          <w:iCs/>
-          <w:sz w:val="24"/>
-          <w:szCs w:val="24"/>
-          <w:lang w:val="en-US"/>
-        </w:rPr>
-        <w:t>Quality Innovation Prosperity</w:t>
-      </w:r>
-      <w:r>
-        <w:rPr>
-          <w:sz w:val="24"/>
-          <w:szCs w:val="24"/>
-          <w:lang w:val="en-US"/>
-        </w:rPr>
-        <w:t xml:space="preserve">, </w:t>
-      </w:r>
-      <w:r>
-        <w:rPr>
-          <w:i/>
-          <w:iCs/>
-          <w:sz w:val="24"/>
-          <w:szCs w:val="24"/>
-          <w:lang w:val="en-US"/>
-        </w:rPr>
-        <w:t>17</w:t>
-      </w:r>
-      <w:r>
-        <w:rPr>
-          <w:sz w:val="24"/>
-          <w:szCs w:val="24"/>
-          <w:lang w:val="en-US"/>
-        </w:rPr>
-        <w:t>(2), 77–88. https://doi.org/10.12776/qip.v17i2.241</w:t>
-      </w:r>
-    </w:p>
-    <w:p>
-      <w:pPr>
-        <w:pStyle w:val="Bibliografa"/>
-        <w:rPr>
-          <w:sz w:val="24"/>
-          <w:szCs w:val="24"/>
-          <w:lang w:val="en-US"/>
-        </w:rPr>
-      </w:pPr>
-      <w:r>
-        <w:rPr>
-          <w:sz w:val="24"/>
-          <w:szCs w:val="24"/>
-          <w:lang w:val="en-US"/>
-        </w:rPr>
-        <w:t xml:space="preserve">Kuhn, D. R., Wallace, D. R., &amp; Gallo, A. M. (2004). Software fault interactions and implications for software testing. </w:t>
-      </w:r>
-      <w:r>
-        <w:rPr>
-          <w:i/>
-          <w:iCs/>
-          <w:sz w:val="24"/>
-          <w:szCs w:val="24"/>
-          <w:lang w:val="en-US"/>
-        </w:rPr>
-        <w:t>IEEE Transactions on Software Engineering</w:t>
-      </w:r>
-      <w:r>
-        <w:rPr>
-          <w:sz w:val="24"/>
-          <w:szCs w:val="24"/>
-          <w:lang w:val="en-US"/>
-        </w:rPr>
-        <w:t xml:space="preserve">, </w:t>
-      </w:r>
-      <w:r>
-        <w:rPr>
-          <w:i/>
-          <w:iCs/>
-          <w:sz w:val="24"/>
-          <w:szCs w:val="24"/>
-          <w:lang w:val="en-US"/>
-        </w:rPr>
-        <w:t>30</w:t>
-      </w:r>
-      <w:r>
-        <w:rPr>
-          <w:sz w:val="24"/>
-          <w:szCs w:val="24"/>
-          <w:lang w:val="en-US"/>
-        </w:rPr>
-        <w:t>(6), 418–421. https://doi.org/10.1109/TSE.2004.24</w:t>
-      </w:r>
-    </w:p>
-    <w:p>
-      <w:pPr>
-        <w:pStyle w:val="Bibliografa"/>
-        <w:rPr>
-          <w:sz w:val="24"/>
-          <w:szCs w:val="24"/>
-        </w:rPr>
-      </w:pPr>
-      <w:r>
-        <w:rPr>
-          <w:sz w:val="24"/>
-          <w:szCs w:val="24"/>
-          <w:lang w:val="en-US"/>
-        </w:rPr>
-        <w:t xml:space="preserve">Santana-Mancilla, P. C., Fajardo-Flores, S. B., Rodríguez-Ortiz, M. Á., Argenis Mondragón, E. Á., &amp; </w:t>
-      </w:r>
-      <w:proofErr w:type="spellStart"/>
-      <w:r>
-        <w:rPr>
-          <w:sz w:val="24"/>
-          <w:szCs w:val="24"/>
-          <w:lang w:val="en-US"/>
-        </w:rPr>
-        <w:t>Gaytán</w:t>
-      </w:r>
-      <w:proofErr w:type="spellEnd"/>
-      <w:r>
-        <w:rPr>
-          <w:sz w:val="24"/>
-          <w:szCs w:val="24"/>
-          <w:lang w:val="en-US"/>
-        </w:rPr>
-        <w:t xml:space="preserve">-Lugo, L. S. (2025). Beyond Navigation: Understanding Semantic Gaps in the Information Architecture of a University Portal. </w:t>
-      </w:r>
-      <w:r>
-        <w:rPr>
-          <w:i/>
-          <w:iCs/>
-          <w:sz w:val="24"/>
-          <w:szCs w:val="24"/>
-        </w:rPr>
-        <w:t>Avances en Interacción Humano-Computadora</w:t>
-      </w:r>
-      <w:r>
-        <w:rPr>
-          <w:sz w:val="24"/>
-          <w:szCs w:val="24"/>
-        </w:rPr>
-        <w:t xml:space="preserve">, </w:t>
-      </w:r>
-      <w:r>
-        <w:rPr>
-          <w:i/>
-          <w:iCs/>
-          <w:sz w:val="24"/>
-          <w:szCs w:val="24"/>
-        </w:rPr>
-        <w:t>10</w:t>
-      </w:r>
-      <w:r>
-        <w:rPr>
-          <w:sz w:val="24"/>
-          <w:szCs w:val="24"/>
-        </w:rPr>
-        <w:t>(1), 60–69. https://doi.org/10.47756/aihc.y10i1.203</w:t>
-      </w:r>
-    </w:p>
-    <w:p>
-      <w:pPr>
-        <w:pStyle w:val="Bibliografa"/>
-        <w:rPr>
-          <w:sz w:val="24"/>
-          <w:szCs w:val="24"/>
-        </w:rPr>
-      </w:pPr>
-      <w:proofErr w:type="spellStart"/>
-      <w:r>
-        <w:rPr>
-          <w:sz w:val="24"/>
-          <w:szCs w:val="24"/>
-          <w:lang w:val="en-US"/>
-        </w:rPr>
-        <w:t>Vuorimaa</w:t>
-      </w:r>
-      <w:proofErr w:type="spellEnd"/>
-      <w:r>
-        <w:rPr>
-          <w:sz w:val="24"/>
-          <w:szCs w:val="24"/>
-          <w:lang w:val="en-US"/>
-        </w:rPr>
-        <w:t xml:space="preserve">, P., Laine, M., Litvinova, E., &amp; Shestakov, D. (2016). Leveraging declarative languages in web application development. </w:t>
-      </w:r>
-      <w:r>
-        <w:rPr>
-          <w:i/>
-          <w:iCs/>
-          <w:sz w:val="24"/>
-          <w:szCs w:val="24"/>
-        </w:rPr>
-        <w:t>World Wide Web</w:t>
-      </w:r>
-      <w:r>
-        <w:rPr>
-          <w:sz w:val="24"/>
-          <w:szCs w:val="24"/>
-        </w:rPr>
-        <w:t xml:space="preserve">, </w:t>
-      </w:r>
-      <w:r>
-        <w:rPr>
-          <w:i/>
-          <w:iCs/>
-          <w:sz w:val="24"/>
-          <w:szCs w:val="24"/>
-        </w:rPr>
-        <w:t>19</w:t>
-      </w:r>
-      <w:r>
-        <w:rPr>
-          <w:sz w:val="24"/>
-          <w:szCs w:val="24"/>
-        </w:rPr>
-        <w:t>(4), 519–543. https://doi.org/10.1007/s11280-015-0339-z</w:t>
-      </w:r>
-    </w:p>
-    <w:p>
-      <w:pPr>
-        <w:spacing w:after="0" w:line="360" w:lineRule="auto"/>
-        <w:rPr>
-          <w:rFonts w:ascii="Times New Roman" w:hAnsi="Times New Roman" w:cs="Times New Roman"/>
-          <w:b/>
-          <w:bCs/>
-          <w:lang w:val="es-ES"/>
-        </w:rPr>
-      </w:pPr>
-      <w:r>
-        <w:rPr>
-          <w:rFonts w:ascii="Times New Roman" w:hAnsi="Times New Roman" w:cs="Times New Roman"/>
-          <w:b/>
-          <w:bCs/>
-          <w:sz w:val="24"/>
-          <w:szCs w:val="24"/>
-          <w:lang w:val="es-ES"/>
-        </w:rPr>
-        <w:fldChar w:fldCharType="end"/>
-      </w:r>
+          <w:lang w:val="es-ES"/>
+        </w:rPr>
+      </w:pPr>
     </w:p>
     <w:sectPr>
       <w:headerReference w:type="default" r:id="rId10"/>

</xml_diff>

<commit_message>
Resumen y cambio de presupuesto
</commit_message>
<xml_diff>
--- a/2026-1_MODELO CONTENIDO PERFIL PIC2.docx
+++ b/2026-1_MODELO CONTENIDO PERFIL PIC2.docx
@@ -61,7 +61,7 @@
           <w:lang w:val="en-US"/>
         </w:rPr>
         <w:drawing>
-          <wp:inline distT="0" distB="0" distL="0" distR="0" wp14:anchorId="323F8FAD" wp14:editId="047B7C74">
+          <wp:inline distT="0" distB="0" distL="0" distR="0" wp14:anchorId="323F8FAD" wp14:editId="2CE2AC42">
             <wp:extent cx="2004060" cy="2004060"/>
             <wp:effectExtent l="0" t="0" r="0" b="0"/>
             <wp:docPr id="1419612950" name="Imagen 11" descr="Logotipo&#10;&#10;Descripción generada automáticamente"/>
@@ -2675,25 +2675,7 @@
           <w:kern w:val="0"/>
           <w:sz w:val="24"/>
         </w:rPr>
-        <w:t>(</w:t>
-      </w:r>
-      <w:proofErr w:type="spellStart"/>
-      <w:r>
-        <w:rPr>
-          <w:rFonts w:ascii="Times New Roman" w:hAnsi="Times New Roman" w:cs="Times New Roman"/>
-          <w:kern w:val="0"/>
-          <w:sz w:val="24"/>
-        </w:rPr>
-        <w:t>Vuorimaa</w:t>
-      </w:r>
-      <w:proofErr w:type="spellEnd"/>
-      <w:r>
-        <w:rPr>
-          <w:rFonts w:ascii="Times New Roman" w:hAnsi="Times New Roman" w:cs="Times New Roman"/>
-          <w:kern w:val="0"/>
-          <w:sz w:val="24"/>
-        </w:rPr>
-        <w:t xml:space="preserve"> et al., 2016)</w:t>
+        <w:t>(Vuorimaa et al., 2016)</w:t>
       </w:r>
       <w:r>
         <w:rPr>
@@ -3469,780 +3451,6 @@
         <w:t>Para la técnica de entrevista se utilizará una guía de entrevista, que contendrá preguntas dirigidas a docentes o responsables académicos, con el propósito de conocer sus experiencias en la revisión de proyectos, el registro de observaciones, el control de avances y las necesidades institucionales relacionadas con la gestión documental.</w:t>
       </w:r>
     </w:p>
-    <w:tbl>
-      <w:tblPr>
-        <w:tblStyle w:val="Tablaconcuadrcula"/>
-        <w:tblpPr w:leftFromText="141" w:rightFromText="141" w:vertAnchor="text" w:horzAnchor="margin" w:tblpY="675"/>
-        <w:tblW w:w="8217" w:type="dxa"/>
-        <w:tblLook w:val="04A0" w:firstRow="1" w:lastRow="0" w:firstColumn="1" w:lastColumn="0" w:noHBand="0" w:noVBand="1"/>
-      </w:tblPr>
-      <w:tblGrid>
-        <w:gridCol w:w="5986"/>
-        <w:gridCol w:w="2231"/>
-      </w:tblGrid>
-      <w:tr>
-        <w:trPr>
-          <w:trHeight w:val="283"/>
-        </w:trPr>
-        <w:tc>
-          <w:tcPr>
-            <w:tcW w:w="5986" w:type="dxa"/>
-            <w:tcBorders>
-              <w:top w:val="single" w:sz="4" w:space="0" w:color="auto"/>
-              <w:left w:val="single" w:sz="4" w:space="0" w:color="auto"/>
-              <w:bottom w:val="single" w:sz="4" w:space="0" w:color="auto"/>
-              <w:right w:val="single" w:sz="4" w:space="0" w:color="auto"/>
-            </w:tcBorders>
-            <w:hideMark/>
-          </w:tcPr>
-          <w:p>
-            <w:pPr>
-              <w:spacing w:after="160" w:line="259" w:lineRule="auto"/>
-              <w:rPr>
-                <w:rFonts w:ascii="Times New Roman" w:hAnsi="Times New Roman" w:cs="Times New Roman"/>
-                <w:b/>
-                <w:bCs/>
-                <w:sz w:val="24"/>
-                <w:szCs w:val="24"/>
-              </w:rPr>
-            </w:pPr>
-            <w:r>
-              <w:rPr>
-                <w:rFonts w:ascii="Times New Roman" w:hAnsi="Times New Roman" w:cs="Times New Roman"/>
-                <w:b/>
-                <w:bCs/>
-                <w:sz w:val="24"/>
-                <w:szCs w:val="24"/>
-              </w:rPr>
-              <w:t>Concepto</w:t>
-            </w:r>
-          </w:p>
-        </w:tc>
-        <w:tc>
-          <w:tcPr>
-            <w:tcW w:w="2231" w:type="dxa"/>
-            <w:tcBorders>
-              <w:top w:val="single" w:sz="4" w:space="0" w:color="auto"/>
-              <w:left w:val="single" w:sz="4" w:space="0" w:color="auto"/>
-              <w:bottom w:val="single" w:sz="4" w:space="0" w:color="auto"/>
-              <w:right w:val="single" w:sz="4" w:space="0" w:color="auto"/>
-            </w:tcBorders>
-            <w:hideMark/>
-          </w:tcPr>
-          <w:p>
-            <w:pPr>
-              <w:spacing w:after="160" w:line="259" w:lineRule="auto"/>
-              <w:rPr>
-                <w:rFonts w:ascii="Times New Roman" w:hAnsi="Times New Roman" w:cs="Times New Roman"/>
-                <w:b/>
-                <w:bCs/>
-                <w:sz w:val="24"/>
-                <w:szCs w:val="24"/>
-              </w:rPr>
-            </w:pPr>
-            <w:r>
-              <w:rPr>
-                <w:rFonts w:ascii="Times New Roman" w:hAnsi="Times New Roman" w:cs="Times New Roman"/>
-                <w:b/>
-                <w:bCs/>
-                <w:sz w:val="24"/>
-                <w:szCs w:val="24"/>
-              </w:rPr>
-              <w:t>Costo (USD)</w:t>
-            </w:r>
-          </w:p>
-        </w:tc>
-      </w:tr>
-      <w:tr>
-        <w:trPr>
-          <w:trHeight w:val="416"/>
-        </w:trPr>
-        <w:tc>
-          <w:tcPr>
-            <w:tcW w:w="5986" w:type="dxa"/>
-            <w:tcBorders>
-              <w:top w:val="single" w:sz="4" w:space="0" w:color="auto"/>
-              <w:left w:val="single" w:sz="4" w:space="0" w:color="auto"/>
-              <w:bottom w:val="single" w:sz="4" w:space="0" w:color="auto"/>
-              <w:right w:val="single" w:sz="4" w:space="0" w:color="auto"/>
-            </w:tcBorders>
-            <w:hideMark/>
-          </w:tcPr>
-          <w:p>
-            <w:pPr>
-              <w:spacing w:after="160" w:line="259" w:lineRule="auto"/>
-              <w:rPr>
-                <w:rFonts w:ascii="Times New Roman" w:hAnsi="Times New Roman" w:cs="Times New Roman"/>
-                <w:b/>
-                <w:bCs/>
-                <w:sz w:val="24"/>
-                <w:szCs w:val="24"/>
-              </w:rPr>
-            </w:pPr>
-            <w:r>
-              <w:rPr>
-                <w:rFonts w:ascii="Times New Roman" w:hAnsi="Times New Roman" w:cs="Times New Roman"/>
-                <w:b/>
-                <w:bCs/>
-                <w:sz w:val="24"/>
-                <w:szCs w:val="24"/>
-              </w:rPr>
-              <w:t xml:space="preserve">Costos de Desarrollo de Software </w:t>
-            </w:r>
-          </w:p>
-        </w:tc>
-        <w:tc>
-          <w:tcPr>
-            <w:tcW w:w="2231" w:type="dxa"/>
-            <w:tcBorders>
-              <w:top w:val="single" w:sz="4" w:space="0" w:color="auto"/>
-              <w:left w:val="single" w:sz="4" w:space="0" w:color="auto"/>
-              <w:bottom w:val="single" w:sz="4" w:space="0" w:color="auto"/>
-              <w:right w:val="single" w:sz="4" w:space="0" w:color="auto"/>
-            </w:tcBorders>
-          </w:tcPr>
-          <w:p>
-            <w:pPr>
-              <w:spacing w:after="160" w:line="259" w:lineRule="auto"/>
-              <w:rPr>
-                <w:rFonts w:ascii="Times New Roman" w:hAnsi="Times New Roman" w:cs="Times New Roman"/>
-                <w:b/>
-                <w:bCs/>
-                <w:sz w:val="24"/>
-                <w:szCs w:val="24"/>
-              </w:rPr>
-            </w:pPr>
-          </w:p>
-        </w:tc>
-      </w:tr>
-      <w:tr>
-        <w:trPr>
-          <w:trHeight w:val="415"/>
-        </w:trPr>
-        <w:tc>
-          <w:tcPr>
-            <w:tcW w:w="5986" w:type="dxa"/>
-            <w:tcBorders>
-              <w:top w:val="single" w:sz="4" w:space="0" w:color="auto"/>
-              <w:left w:val="single" w:sz="4" w:space="0" w:color="auto"/>
-              <w:bottom w:val="single" w:sz="4" w:space="0" w:color="auto"/>
-              <w:right w:val="single" w:sz="4" w:space="0" w:color="auto"/>
-            </w:tcBorders>
-            <w:hideMark/>
-          </w:tcPr>
-          <w:p>
-            <w:pPr>
-              <w:spacing w:after="160" w:line="259" w:lineRule="auto"/>
-              <w:rPr>
-                <w:rFonts w:ascii="Times New Roman" w:hAnsi="Times New Roman" w:cs="Times New Roman"/>
-                <w:b/>
-                <w:bCs/>
-                <w:sz w:val="24"/>
-                <w:szCs w:val="24"/>
-              </w:rPr>
-            </w:pPr>
-            <w:r>
-              <w:rPr>
-                <w:rFonts w:ascii="Times New Roman" w:hAnsi="Times New Roman" w:cs="Times New Roman"/>
-                <w:sz w:val="24"/>
-                <w:szCs w:val="24"/>
-              </w:rPr>
-              <w:t>-</w:t>
-            </w:r>
-            <w:r>
-              <w:rPr>
-                <w:rFonts w:ascii="Times New Roman" w:hAnsi="Times New Roman" w:cs="Times New Roman"/>
-                <w:sz w:val="24"/>
-                <w:szCs w:val="24"/>
-              </w:rPr>
-              <w:t>Recursos para desarrollo y pruebas de la plataforma</w:t>
-            </w:r>
-            <w:r>
-              <w:rPr>
-                <w:rFonts w:ascii="Times New Roman" w:hAnsi="Times New Roman" w:cs="Times New Roman"/>
-                <w:b/>
-                <w:bCs/>
-                <w:sz w:val="24"/>
-                <w:szCs w:val="24"/>
-              </w:rPr>
-              <w:t xml:space="preserve"> </w:t>
-            </w:r>
-          </w:p>
-        </w:tc>
-        <w:tc>
-          <w:tcPr>
-            <w:tcW w:w="2231" w:type="dxa"/>
-            <w:tcBorders>
-              <w:top w:val="single" w:sz="4" w:space="0" w:color="auto"/>
-              <w:left w:val="single" w:sz="4" w:space="0" w:color="auto"/>
-              <w:bottom w:val="single" w:sz="4" w:space="0" w:color="auto"/>
-              <w:right w:val="single" w:sz="4" w:space="0" w:color="auto"/>
-            </w:tcBorders>
-            <w:hideMark/>
-          </w:tcPr>
-          <w:p>
-            <w:pPr>
-              <w:spacing w:after="160" w:line="259" w:lineRule="auto"/>
-              <w:rPr>
-                <w:rFonts w:ascii="Times New Roman" w:hAnsi="Times New Roman" w:cs="Times New Roman"/>
-                <w:b/>
-                <w:bCs/>
-                <w:sz w:val="24"/>
-                <w:szCs w:val="24"/>
-              </w:rPr>
-            </w:pPr>
-            <w:r>
-              <w:rPr>
-                <w:rFonts w:ascii="Times New Roman" w:hAnsi="Times New Roman" w:cs="Times New Roman"/>
-                <w:b/>
-                <w:bCs/>
-                <w:sz w:val="24"/>
-                <w:szCs w:val="24"/>
-              </w:rPr>
-              <w:t>$15</w:t>
-            </w:r>
-            <w:r>
-              <w:rPr>
-                <w:rFonts w:ascii="Times New Roman" w:hAnsi="Times New Roman" w:cs="Times New Roman"/>
-                <w:b/>
-                <w:bCs/>
-                <w:sz w:val="24"/>
-                <w:szCs w:val="24"/>
-              </w:rPr>
-              <w:t xml:space="preserve"> </w:t>
-            </w:r>
-          </w:p>
-        </w:tc>
-      </w:tr>
-      <w:tr>
-        <w:trPr>
-          <w:trHeight w:val="415"/>
-        </w:trPr>
-        <w:tc>
-          <w:tcPr>
-            <w:tcW w:w="5986" w:type="dxa"/>
-            <w:tcBorders>
-              <w:top w:val="single" w:sz="4" w:space="0" w:color="auto"/>
-              <w:left w:val="single" w:sz="4" w:space="0" w:color="auto"/>
-              <w:bottom w:val="single" w:sz="4" w:space="0" w:color="auto"/>
-              <w:right w:val="single" w:sz="4" w:space="0" w:color="auto"/>
-            </w:tcBorders>
-          </w:tcPr>
-          <w:p>
-            <w:pPr>
-              <w:rPr>
-                <w:rFonts w:ascii="Times New Roman" w:hAnsi="Times New Roman" w:cs="Times New Roman"/>
-                <w:b/>
-                <w:bCs/>
-                <w:sz w:val="24"/>
-                <w:szCs w:val="24"/>
-              </w:rPr>
-            </w:pPr>
-            <w:r>
-              <w:rPr>
-                <w:rFonts w:ascii="Times New Roman" w:hAnsi="Times New Roman" w:cs="Times New Roman"/>
-                <w:b/>
-                <w:bCs/>
-                <w:sz w:val="24"/>
-                <w:szCs w:val="24"/>
-              </w:rPr>
-              <w:t>Costos de Documentación</w:t>
-            </w:r>
-          </w:p>
-        </w:tc>
-        <w:tc>
-          <w:tcPr>
-            <w:tcW w:w="2231" w:type="dxa"/>
-            <w:tcBorders>
-              <w:top w:val="single" w:sz="4" w:space="0" w:color="auto"/>
-              <w:left w:val="single" w:sz="4" w:space="0" w:color="auto"/>
-              <w:bottom w:val="single" w:sz="4" w:space="0" w:color="auto"/>
-              <w:right w:val="single" w:sz="4" w:space="0" w:color="auto"/>
-            </w:tcBorders>
-          </w:tcPr>
-          <w:p>
-            <w:pPr>
-              <w:rPr>
-                <w:rFonts w:ascii="Times New Roman" w:hAnsi="Times New Roman" w:cs="Times New Roman"/>
-                <w:b/>
-                <w:bCs/>
-                <w:sz w:val="24"/>
-                <w:szCs w:val="24"/>
-              </w:rPr>
-            </w:pPr>
-          </w:p>
-        </w:tc>
-      </w:tr>
-      <w:tr>
-        <w:trPr>
-          <w:trHeight w:val="415"/>
-        </w:trPr>
-        <w:tc>
-          <w:tcPr>
-            <w:tcW w:w="5986" w:type="dxa"/>
-            <w:tcBorders>
-              <w:top w:val="single" w:sz="4" w:space="0" w:color="auto"/>
-              <w:left w:val="single" w:sz="4" w:space="0" w:color="auto"/>
-              <w:bottom w:val="single" w:sz="4" w:space="0" w:color="auto"/>
-              <w:right w:val="single" w:sz="4" w:space="0" w:color="auto"/>
-            </w:tcBorders>
-          </w:tcPr>
-          <w:p>
-            <w:pPr>
-              <w:rPr>
-                <w:rFonts w:ascii="Times New Roman" w:hAnsi="Times New Roman" w:cs="Times New Roman"/>
-                <w:sz w:val="24"/>
-                <w:szCs w:val="24"/>
-              </w:rPr>
-            </w:pPr>
-            <w:r>
-              <w:rPr>
-                <w:rFonts w:ascii="Times New Roman" w:hAnsi="Times New Roman" w:cs="Times New Roman"/>
-                <w:sz w:val="24"/>
-                <w:szCs w:val="24"/>
-              </w:rPr>
-              <w:t>-</w:t>
-            </w:r>
-            <w:r>
-              <w:rPr>
-                <w:rFonts w:ascii="Times New Roman" w:hAnsi="Times New Roman" w:cs="Times New Roman"/>
-                <w:sz w:val="24"/>
-                <w:szCs w:val="24"/>
-              </w:rPr>
-              <w:t>Impresión de informes y anexos del proyecto</w:t>
-            </w:r>
-          </w:p>
-        </w:tc>
-        <w:tc>
-          <w:tcPr>
-            <w:tcW w:w="2231" w:type="dxa"/>
-            <w:tcBorders>
-              <w:top w:val="single" w:sz="4" w:space="0" w:color="auto"/>
-              <w:left w:val="single" w:sz="4" w:space="0" w:color="auto"/>
-              <w:bottom w:val="single" w:sz="4" w:space="0" w:color="auto"/>
-              <w:right w:val="single" w:sz="4" w:space="0" w:color="auto"/>
-            </w:tcBorders>
-          </w:tcPr>
-          <w:p>
-            <w:pPr>
-              <w:rPr>
-                <w:rFonts w:ascii="Times New Roman" w:hAnsi="Times New Roman" w:cs="Times New Roman"/>
-                <w:b/>
-                <w:bCs/>
-                <w:sz w:val="24"/>
-                <w:szCs w:val="24"/>
-              </w:rPr>
-            </w:pPr>
-            <w:r>
-              <w:rPr>
-                <w:rFonts w:ascii="Times New Roman" w:hAnsi="Times New Roman" w:cs="Times New Roman"/>
-                <w:b/>
-                <w:bCs/>
-                <w:sz w:val="24"/>
-                <w:szCs w:val="24"/>
-              </w:rPr>
-              <w:t>$15</w:t>
-            </w:r>
-          </w:p>
-        </w:tc>
-      </w:tr>
-      <w:tr>
-        <w:trPr>
-          <w:trHeight w:val="415"/>
-        </w:trPr>
-        <w:tc>
-          <w:tcPr>
-            <w:tcW w:w="5986" w:type="dxa"/>
-            <w:tcBorders>
-              <w:top w:val="single" w:sz="4" w:space="0" w:color="auto"/>
-              <w:left w:val="single" w:sz="4" w:space="0" w:color="auto"/>
-              <w:bottom w:val="single" w:sz="4" w:space="0" w:color="auto"/>
-              <w:right w:val="single" w:sz="4" w:space="0" w:color="auto"/>
-            </w:tcBorders>
-          </w:tcPr>
-          <w:p>
-            <w:pPr>
-              <w:rPr>
-                <w:rFonts w:ascii="Times New Roman" w:hAnsi="Times New Roman" w:cs="Times New Roman"/>
-                <w:b/>
-                <w:bCs/>
-                <w:sz w:val="24"/>
-                <w:szCs w:val="24"/>
-              </w:rPr>
-            </w:pPr>
-            <w:r>
-              <w:rPr>
-                <w:rFonts w:ascii="Times New Roman" w:hAnsi="Times New Roman" w:cs="Times New Roman"/>
-                <w:b/>
-                <w:bCs/>
-                <w:sz w:val="24"/>
-                <w:szCs w:val="24"/>
-              </w:rPr>
-              <w:t>Costos de Implementación Web</w:t>
-            </w:r>
-          </w:p>
-        </w:tc>
-        <w:tc>
-          <w:tcPr>
-            <w:tcW w:w="2231" w:type="dxa"/>
-            <w:tcBorders>
-              <w:top w:val="single" w:sz="4" w:space="0" w:color="auto"/>
-              <w:left w:val="single" w:sz="4" w:space="0" w:color="auto"/>
-              <w:bottom w:val="single" w:sz="4" w:space="0" w:color="auto"/>
-              <w:right w:val="single" w:sz="4" w:space="0" w:color="auto"/>
-            </w:tcBorders>
-          </w:tcPr>
-          <w:p>
-            <w:pPr>
-              <w:rPr>
-                <w:rFonts w:ascii="Times New Roman" w:hAnsi="Times New Roman" w:cs="Times New Roman"/>
-                <w:b/>
-                <w:bCs/>
-                <w:sz w:val="24"/>
-                <w:szCs w:val="24"/>
-              </w:rPr>
-            </w:pPr>
-          </w:p>
-        </w:tc>
-      </w:tr>
-      <w:tr>
-        <w:trPr>
-          <w:trHeight w:val="415"/>
-        </w:trPr>
-        <w:tc>
-          <w:tcPr>
-            <w:tcW w:w="5986" w:type="dxa"/>
-            <w:tcBorders>
-              <w:top w:val="single" w:sz="4" w:space="0" w:color="auto"/>
-              <w:left w:val="single" w:sz="4" w:space="0" w:color="auto"/>
-              <w:bottom w:val="single" w:sz="4" w:space="0" w:color="auto"/>
-              <w:right w:val="single" w:sz="4" w:space="0" w:color="auto"/>
-            </w:tcBorders>
-          </w:tcPr>
-          <w:p>
-            <w:pPr>
-              <w:rPr>
-                <w:rFonts w:ascii="Times New Roman" w:hAnsi="Times New Roman" w:cs="Times New Roman"/>
-                <w:sz w:val="24"/>
-                <w:szCs w:val="24"/>
-              </w:rPr>
-            </w:pPr>
-            <w:r>
-              <w:rPr>
-                <w:rFonts w:ascii="Times New Roman" w:hAnsi="Times New Roman" w:cs="Times New Roman"/>
-                <w:sz w:val="24"/>
-                <w:szCs w:val="24"/>
-              </w:rPr>
-              <w:t>-</w:t>
-            </w:r>
-            <w:r>
-              <w:rPr>
-                <w:rFonts w:ascii="Times New Roman" w:hAnsi="Times New Roman" w:cs="Times New Roman"/>
-                <w:sz w:val="24"/>
-                <w:szCs w:val="24"/>
-              </w:rPr>
-              <w:t>Dominio y alojamiento web</w:t>
-            </w:r>
-          </w:p>
-        </w:tc>
-        <w:tc>
-          <w:tcPr>
-            <w:tcW w:w="2231" w:type="dxa"/>
-            <w:tcBorders>
-              <w:top w:val="single" w:sz="4" w:space="0" w:color="auto"/>
-              <w:left w:val="single" w:sz="4" w:space="0" w:color="auto"/>
-              <w:bottom w:val="single" w:sz="4" w:space="0" w:color="auto"/>
-              <w:right w:val="single" w:sz="4" w:space="0" w:color="auto"/>
-            </w:tcBorders>
-          </w:tcPr>
-          <w:p>
-            <w:pPr>
-              <w:rPr>
-                <w:rFonts w:ascii="Times New Roman" w:hAnsi="Times New Roman" w:cs="Times New Roman"/>
-                <w:b/>
-                <w:bCs/>
-                <w:sz w:val="24"/>
-                <w:szCs w:val="24"/>
-              </w:rPr>
-            </w:pPr>
-            <w:r>
-              <w:rPr>
-                <w:rFonts w:ascii="Times New Roman" w:hAnsi="Times New Roman" w:cs="Times New Roman"/>
-                <w:b/>
-                <w:bCs/>
-                <w:sz w:val="24"/>
-                <w:szCs w:val="24"/>
-              </w:rPr>
-              <w:t>$</w:t>
-            </w:r>
-            <w:r>
-              <w:rPr>
-                <w:rFonts w:ascii="Times New Roman" w:hAnsi="Times New Roman" w:cs="Times New Roman"/>
-                <w:b/>
-                <w:bCs/>
-                <w:sz w:val="24"/>
-                <w:szCs w:val="24"/>
-              </w:rPr>
-              <w:t>12</w:t>
-            </w:r>
-            <w:r>
-              <w:rPr>
-                <w:rFonts w:ascii="Times New Roman" w:hAnsi="Times New Roman" w:cs="Times New Roman"/>
-                <w:b/>
-                <w:bCs/>
-                <w:sz w:val="24"/>
-                <w:szCs w:val="24"/>
-              </w:rPr>
-              <w:t>0</w:t>
-            </w:r>
-          </w:p>
-        </w:tc>
-      </w:tr>
-      <w:tr>
-        <w:trPr>
-          <w:trHeight w:val="415"/>
-        </w:trPr>
-        <w:tc>
-          <w:tcPr>
-            <w:tcW w:w="5986" w:type="dxa"/>
-            <w:tcBorders>
-              <w:top w:val="single" w:sz="4" w:space="0" w:color="auto"/>
-              <w:left w:val="single" w:sz="4" w:space="0" w:color="auto"/>
-              <w:bottom w:val="single" w:sz="4" w:space="0" w:color="auto"/>
-              <w:right w:val="single" w:sz="4" w:space="0" w:color="auto"/>
-            </w:tcBorders>
-            <w:hideMark/>
-          </w:tcPr>
-          <w:p>
-            <w:pPr>
-              <w:spacing w:after="160" w:line="259" w:lineRule="auto"/>
-              <w:rPr>
-                <w:rFonts w:ascii="Times New Roman" w:hAnsi="Times New Roman" w:cs="Times New Roman"/>
-                <w:b/>
-                <w:bCs/>
-                <w:sz w:val="24"/>
-                <w:szCs w:val="24"/>
-              </w:rPr>
-            </w:pPr>
-            <w:r>
-              <w:rPr>
-                <w:rFonts w:ascii="Times New Roman" w:hAnsi="Times New Roman" w:cs="Times New Roman"/>
-                <w:b/>
-                <w:bCs/>
-                <w:sz w:val="24"/>
-                <w:szCs w:val="24"/>
-              </w:rPr>
-              <w:t xml:space="preserve">Contingencia y Gastos Adicionales </w:t>
-            </w:r>
-          </w:p>
-        </w:tc>
-        <w:tc>
-          <w:tcPr>
-            <w:tcW w:w="2231" w:type="dxa"/>
-            <w:tcBorders>
-              <w:top w:val="single" w:sz="4" w:space="0" w:color="auto"/>
-              <w:left w:val="single" w:sz="4" w:space="0" w:color="auto"/>
-              <w:bottom w:val="single" w:sz="4" w:space="0" w:color="auto"/>
-              <w:right w:val="single" w:sz="4" w:space="0" w:color="auto"/>
-            </w:tcBorders>
-            <w:hideMark/>
-          </w:tcPr>
-          <w:p>
-            <w:pPr>
-              <w:spacing w:after="160" w:line="259" w:lineRule="auto"/>
-              <w:rPr>
-                <w:rFonts w:ascii="Times New Roman" w:hAnsi="Times New Roman" w:cs="Times New Roman"/>
-                <w:b/>
-                <w:bCs/>
-                <w:sz w:val="24"/>
-                <w:szCs w:val="24"/>
-              </w:rPr>
-            </w:pPr>
-          </w:p>
-        </w:tc>
-      </w:tr>
-      <w:tr>
-        <w:trPr>
-          <w:trHeight w:val="415"/>
-        </w:trPr>
-        <w:tc>
-          <w:tcPr>
-            <w:tcW w:w="5986" w:type="dxa"/>
-            <w:tcBorders>
-              <w:top w:val="single" w:sz="4" w:space="0" w:color="auto"/>
-              <w:left w:val="single" w:sz="4" w:space="0" w:color="auto"/>
-              <w:bottom w:val="single" w:sz="4" w:space="0" w:color="auto"/>
-              <w:right w:val="single" w:sz="4" w:space="0" w:color="auto"/>
-            </w:tcBorders>
-          </w:tcPr>
-          <w:p>
-            <w:pPr>
-              <w:rPr>
-                <w:rFonts w:ascii="Times New Roman" w:hAnsi="Times New Roman" w:cs="Times New Roman"/>
-                <w:sz w:val="24"/>
-                <w:szCs w:val="24"/>
-              </w:rPr>
-            </w:pPr>
-            <w:r>
-              <w:rPr>
-                <w:rFonts w:ascii="Times New Roman" w:hAnsi="Times New Roman" w:cs="Times New Roman"/>
-                <w:sz w:val="24"/>
-                <w:szCs w:val="24"/>
-              </w:rPr>
-              <w:t>-Reserva para imprevistos</w:t>
-            </w:r>
-          </w:p>
-        </w:tc>
-        <w:tc>
-          <w:tcPr>
-            <w:tcW w:w="2231" w:type="dxa"/>
-            <w:tcBorders>
-              <w:top w:val="single" w:sz="4" w:space="0" w:color="auto"/>
-              <w:left w:val="single" w:sz="4" w:space="0" w:color="auto"/>
-              <w:bottom w:val="single" w:sz="4" w:space="0" w:color="auto"/>
-              <w:right w:val="single" w:sz="4" w:space="0" w:color="auto"/>
-            </w:tcBorders>
-          </w:tcPr>
-          <w:p>
-            <w:pPr>
-              <w:rPr>
-                <w:rFonts w:ascii="Times New Roman" w:hAnsi="Times New Roman" w:cs="Times New Roman"/>
-                <w:b/>
-                <w:bCs/>
-                <w:sz w:val="24"/>
-                <w:szCs w:val="24"/>
-              </w:rPr>
-            </w:pPr>
-            <w:r>
-              <w:rPr>
-                <w:rFonts w:ascii="Times New Roman" w:hAnsi="Times New Roman" w:cs="Times New Roman"/>
-                <w:b/>
-                <w:bCs/>
-                <w:sz w:val="24"/>
-                <w:szCs w:val="24"/>
-              </w:rPr>
-              <w:t>$</w:t>
-            </w:r>
-            <w:r>
-              <w:rPr>
-                <w:rFonts w:ascii="Times New Roman" w:hAnsi="Times New Roman" w:cs="Times New Roman"/>
-                <w:b/>
-                <w:bCs/>
-                <w:sz w:val="24"/>
-                <w:szCs w:val="24"/>
-              </w:rPr>
-              <w:t>2</w:t>
-            </w:r>
-            <w:r>
-              <w:rPr>
-                <w:rFonts w:ascii="Times New Roman" w:hAnsi="Times New Roman" w:cs="Times New Roman"/>
-                <w:b/>
-                <w:bCs/>
-                <w:sz w:val="24"/>
-                <w:szCs w:val="24"/>
-              </w:rPr>
-              <w:t>0</w:t>
-            </w:r>
-          </w:p>
-        </w:tc>
-      </w:tr>
-      <w:tr>
-        <w:trPr>
-          <w:trHeight w:val="420"/>
-        </w:trPr>
-        <w:tc>
-          <w:tcPr>
-            <w:tcW w:w="5986" w:type="dxa"/>
-            <w:tcBorders>
-              <w:top w:val="single" w:sz="4" w:space="0" w:color="auto"/>
-              <w:left w:val="single" w:sz="4" w:space="0" w:color="auto"/>
-              <w:bottom w:val="single" w:sz="4" w:space="0" w:color="auto"/>
-              <w:right w:val="single" w:sz="4" w:space="0" w:color="auto"/>
-            </w:tcBorders>
-            <w:hideMark/>
-          </w:tcPr>
-          <w:p>
-            <w:pPr>
-              <w:spacing w:after="160" w:line="259" w:lineRule="auto"/>
-              <w:rPr>
-                <w:rFonts w:ascii="Times New Roman" w:hAnsi="Times New Roman" w:cs="Times New Roman"/>
-                <w:b/>
-                <w:bCs/>
-                <w:sz w:val="24"/>
-                <w:szCs w:val="24"/>
-              </w:rPr>
-            </w:pPr>
-            <w:proofErr w:type="gramStart"/>
-            <w:r>
-              <w:rPr>
-                <w:rFonts w:ascii="Times New Roman" w:hAnsi="Times New Roman" w:cs="Times New Roman"/>
-                <w:b/>
-                <w:bCs/>
-                <w:sz w:val="24"/>
-                <w:szCs w:val="24"/>
-              </w:rPr>
-              <w:t>Total</w:t>
-            </w:r>
-            <w:proofErr w:type="gramEnd"/>
-            <w:r>
-              <w:rPr>
-                <w:rFonts w:ascii="Times New Roman" w:hAnsi="Times New Roman" w:cs="Times New Roman"/>
-                <w:b/>
-                <w:bCs/>
-                <w:sz w:val="24"/>
-                <w:szCs w:val="24"/>
-              </w:rPr>
-              <w:t xml:space="preserve"> del Presupuesto </w:t>
-            </w:r>
-          </w:p>
-        </w:tc>
-        <w:tc>
-          <w:tcPr>
-            <w:tcW w:w="2231" w:type="dxa"/>
-            <w:tcBorders>
-              <w:top w:val="single" w:sz="4" w:space="0" w:color="auto"/>
-              <w:left w:val="single" w:sz="4" w:space="0" w:color="auto"/>
-              <w:bottom w:val="single" w:sz="4" w:space="0" w:color="auto"/>
-              <w:right w:val="single" w:sz="4" w:space="0" w:color="auto"/>
-            </w:tcBorders>
-            <w:hideMark/>
-          </w:tcPr>
-          <w:p>
-            <w:pPr>
-              <w:spacing w:after="160" w:line="259" w:lineRule="auto"/>
-              <w:rPr>
-                <w:rFonts w:ascii="Times New Roman" w:hAnsi="Times New Roman" w:cs="Times New Roman"/>
-                <w:b/>
-                <w:bCs/>
-                <w:sz w:val="24"/>
-                <w:szCs w:val="24"/>
-                <w:u w:val="single"/>
-              </w:rPr>
-            </w:pPr>
-            <w:r>
-              <w:rPr>
-                <w:rFonts w:ascii="Times New Roman" w:hAnsi="Times New Roman" w:cs="Times New Roman"/>
-                <w:b/>
-                <w:bCs/>
-                <w:sz w:val="24"/>
-                <w:szCs w:val="24"/>
-              </w:rPr>
-              <w:t>$</w:t>
-            </w:r>
-            <w:r>
-              <w:rPr>
-                <w:rFonts w:ascii="Times New Roman" w:hAnsi="Times New Roman" w:cs="Times New Roman"/>
-                <w:b/>
-                <w:bCs/>
-                <w:sz w:val="24"/>
-                <w:szCs w:val="24"/>
-              </w:rPr>
-              <w:t>170</w:t>
-            </w:r>
-          </w:p>
-        </w:tc>
-      </w:tr>
-    </w:tbl>
     <w:p>
       <w:pPr>
         <w:pStyle w:val="Prrafodelista"/>
@@ -4272,47 +3480,822 @@
         <w:t>PRESUPUESTO</w:t>
       </w:r>
     </w:p>
-    <w:p>
-      <w:pPr>
+    <w:tbl>
+      <w:tblPr>
+        <w:tblW w:w="9209" w:type="dxa"/>
+        <w:tblInd w:w="-360" w:type="dxa"/>
+        <w:tblBorders>
+          <w:top w:val="single" w:sz="4" w:space="0" w:color="auto"/>
+          <w:left w:val="single" w:sz="4" w:space="0" w:color="auto"/>
+          <w:bottom w:val="single" w:sz="4" w:space="0" w:color="auto"/>
+          <w:right w:val="single" w:sz="4" w:space="0" w:color="auto"/>
+          <w:insideH w:val="single" w:sz="4" w:space="0" w:color="auto"/>
+          <w:insideV w:val="single" w:sz="4" w:space="0" w:color="auto"/>
+        </w:tblBorders>
+        <w:tblCellMar>
+          <w:top w:w="15" w:type="dxa"/>
+          <w:left w:w="15" w:type="dxa"/>
+          <w:bottom w:w="15" w:type="dxa"/>
+          <w:right w:w="15" w:type="dxa"/>
+        </w:tblCellMar>
+        <w:tblLook w:val="04A0" w:firstRow="1" w:lastRow="0" w:firstColumn="1" w:lastColumn="0" w:noHBand="0" w:noVBand="1"/>
+      </w:tblPr>
+      <w:tblGrid>
+        <w:gridCol w:w="2966"/>
+        <w:gridCol w:w="1262"/>
+        <w:gridCol w:w="4981"/>
+      </w:tblGrid>
+      <w:tr>
+        <w:trPr>
+          <w:trHeight w:val="626"/>
+          <w:tblHeader/>
+        </w:trPr>
+        <w:tc>
+          <w:tcPr>
+            <w:tcW w:w="2927" w:type="dxa"/>
+            <w:vAlign w:val="center"/>
+            <w:hideMark/>
+          </w:tcPr>
+          <w:p>
+            <w:pPr>
+              <w:pStyle w:val="Prrafodelista"/>
+              <w:spacing w:line="360" w:lineRule="auto"/>
+              <w:ind w:left="360"/>
+              <w:rPr>
+                <w:rFonts w:ascii="Times New Roman" w:hAnsi="Times New Roman" w:cs="Times New Roman"/>
+                <w:b/>
+                <w:bCs/>
+                <w:sz w:val="24"/>
+                <w:szCs w:val="24"/>
+                <w:lang w:val="es-ES"/>
+              </w:rPr>
+            </w:pPr>
+            <w:r>
+              <w:rPr>
+                <w:rFonts w:ascii="Times New Roman" w:hAnsi="Times New Roman" w:cs="Times New Roman"/>
+                <w:b/>
+                <w:bCs/>
+                <w:sz w:val="24"/>
+                <w:szCs w:val="24"/>
+                <w:lang w:val="es-ES"/>
+              </w:rPr>
+              <w:t>Rubro / Descripción</w:t>
+            </w:r>
+          </w:p>
+        </w:tc>
+        <w:tc>
+          <w:tcPr>
+            <w:tcW w:w="1246" w:type="dxa"/>
+            <w:vAlign w:val="center"/>
+            <w:hideMark/>
+          </w:tcPr>
+          <w:p>
+            <w:pPr>
+              <w:pStyle w:val="Prrafodelista"/>
+              <w:spacing w:line="360" w:lineRule="auto"/>
+              <w:ind w:left="360"/>
+              <w:rPr>
+                <w:rFonts w:ascii="Times New Roman" w:hAnsi="Times New Roman" w:cs="Times New Roman"/>
+                <w:b/>
+                <w:bCs/>
+                <w:sz w:val="24"/>
+                <w:szCs w:val="24"/>
+                <w:lang w:val="es-ES"/>
+              </w:rPr>
+            </w:pPr>
+            <w:r>
+              <w:rPr>
+                <w:rFonts w:ascii="Times New Roman" w:hAnsi="Times New Roman" w:cs="Times New Roman"/>
+                <w:b/>
+                <w:bCs/>
+                <w:sz w:val="24"/>
+                <w:szCs w:val="24"/>
+                <w:lang w:val="es-ES"/>
+              </w:rPr>
+              <w:t>Costo (USD)</w:t>
+            </w:r>
+          </w:p>
+        </w:tc>
+        <w:tc>
+          <w:tcPr>
+            <w:tcW w:w="4916" w:type="dxa"/>
+            <w:vAlign w:val="center"/>
+            <w:hideMark/>
+          </w:tcPr>
+          <w:p>
+            <w:pPr>
+              <w:pStyle w:val="Prrafodelista"/>
+              <w:spacing w:line="360" w:lineRule="auto"/>
+              <w:ind w:left="360"/>
+              <w:rPr>
+                <w:rFonts w:ascii="Times New Roman" w:hAnsi="Times New Roman" w:cs="Times New Roman"/>
+                <w:b/>
+                <w:bCs/>
+                <w:sz w:val="24"/>
+                <w:szCs w:val="24"/>
+                <w:lang w:val="es-ES"/>
+              </w:rPr>
+            </w:pPr>
+            <w:r>
+              <w:rPr>
+                <w:rFonts w:ascii="Times New Roman" w:hAnsi="Times New Roman" w:cs="Times New Roman"/>
+                <w:b/>
+                <w:bCs/>
+                <w:sz w:val="24"/>
+                <w:szCs w:val="24"/>
+                <w:lang w:val="es-ES"/>
+              </w:rPr>
+              <w:t>Justificación / Uso en el Proyecto</w:t>
+            </w:r>
+          </w:p>
+        </w:tc>
+      </w:tr>
+      <w:tr>
+        <w:trPr>
+          <w:trHeight w:val="1064"/>
+        </w:trPr>
+        <w:tc>
+          <w:tcPr>
+            <w:tcW w:w="2927" w:type="dxa"/>
+            <w:vAlign w:val="center"/>
+            <w:hideMark/>
+          </w:tcPr>
+          <w:p>
+            <w:pPr>
+              <w:pStyle w:val="Prrafodelista"/>
+              <w:spacing w:line="360" w:lineRule="auto"/>
+              <w:ind w:left="360"/>
+              <w:rPr>
+                <w:rFonts w:ascii="Times New Roman" w:hAnsi="Times New Roman" w:cs="Times New Roman"/>
+                <w:sz w:val="24"/>
+                <w:szCs w:val="24"/>
+                <w:lang w:val="es-ES"/>
+              </w:rPr>
+            </w:pPr>
+            <w:r>
+              <w:rPr>
+                <w:rFonts w:ascii="Times New Roman" w:hAnsi="Times New Roman" w:cs="Times New Roman"/>
+                <w:sz w:val="24"/>
+                <w:szCs w:val="24"/>
+                <w:lang w:val="es-ES"/>
+              </w:rPr>
+              <w:t>Materiales de oficina (impresiones y documentación)</w:t>
+            </w:r>
+          </w:p>
+        </w:tc>
+        <w:tc>
+          <w:tcPr>
+            <w:tcW w:w="1246" w:type="dxa"/>
+            <w:vAlign w:val="center"/>
+            <w:hideMark/>
+          </w:tcPr>
+          <w:p>
+            <w:pPr>
+              <w:pStyle w:val="Prrafodelista"/>
+              <w:spacing w:line="360" w:lineRule="auto"/>
+              <w:ind w:left="360"/>
+              <w:rPr>
+                <w:rFonts w:ascii="Times New Roman" w:hAnsi="Times New Roman" w:cs="Times New Roman"/>
+                <w:sz w:val="24"/>
+                <w:szCs w:val="24"/>
+                <w:lang w:val="es-ES"/>
+              </w:rPr>
+            </w:pPr>
+            <w:r>
+              <w:rPr>
+                <w:rFonts w:ascii="Times New Roman" w:hAnsi="Times New Roman" w:cs="Times New Roman"/>
+                <w:sz w:val="24"/>
+                <w:szCs w:val="24"/>
+                <w:lang w:val="es-ES"/>
+              </w:rPr>
+              <w:t>$15.00</w:t>
+            </w:r>
+          </w:p>
+        </w:tc>
+        <w:tc>
+          <w:tcPr>
+            <w:tcW w:w="4916" w:type="dxa"/>
+            <w:vAlign w:val="center"/>
+            <w:hideMark/>
+          </w:tcPr>
+          <w:p>
+            <w:pPr>
+              <w:pStyle w:val="Prrafodelista"/>
+              <w:spacing w:line="360" w:lineRule="auto"/>
+              <w:ind w:left="360"/>
+              <w:rPr>
+                <w:rFonts w:ascii="Times New Roman" w:hAnsi="Times New Roman" w:cs="Times New Roman"/>
+                <w:sz w:val="24"/>
+                <w:szCs w:val="24"/>
+                <w:lang w:val="es-ES"/>
+              </w:rPr>
+            </w:pPr>
+            <w:r>
+              <w:rPr>
+                <w:rFonts w:ascii="Times New Roman" w:hAnsi="Times New Roman" w:cs="Times New Roman"/>
+                <w:sz w:val="24"/>
+                <w:szCs w:val="24"/>
+                <w:lang w:val="es-ES"/>
+              </w:rPr>
+              <w:t>Utilizados para la elaboración y presentación de la documentación del proyecto.</w:t>
+            </w:r>
+          </w:p>
+        </w:tc>
+      </w:tr>
+      <w:tr>
+        <w:trPr>
+          <w:trHeight w:val="1064"/>
+        </w:trPr>
+        <w:tc>
+          <w:tcPr>
+            <w:tcW w:w="2927" w:type="dxa"/>
+            <w:vAlign w:val="center"/>
+            <w:hideMark/>
+          </w:tcPr>
+          <w:p>
+            <w:pPr>
+              <w:pStyle w:val="Prrafodelista"/>
+              <w:spacing w:line="360" w:lineRule="auto"/>
+              <w:ind w:left="360"/>
+              <w:rPr>
+                <w:rFonts w:ascii="Times New Roman" w:hAnsi="Times New Roman" w:cs="Times New Roman"/>
+                <w:sz w:val="24"/>
+                <w:szCs w:val="24"/>
+                <w:lang w:val="es-ES"/>
+              </w:rPr>
+            </w:pPr>
+            <w:r>
+              <w:rPr>
+                <w:rFonts w:ascii="Times New Roman" w:hAnsi="Times New Roman" w:cs="Times New Roman"/>
+                <w:sz w:val="24"/>
+                <w:szCs w:val="24"/>
+                <w:lang w:val="es-ES"/>
+              </w:rPr>
+              <w:t xml:space="preserve">Hosting web y base de datos </w:t>
+            </w:r>
+          </w:p>
+        </w:tc>
+        <w:tc>
+          <w:tcPr>
+            <w:tcW w:w="1246" w:type="dxa"/>
+            <w:vAlign w:val="center"/>
+            <w:hideMark/>
+          </w:tcPr>
+          <w:p>
+            <w:pPr>
+              <w:pStyle w:val="Prrafodelista"/>
+              <w:spacing w:line="360" w:lineRule="auto"/>
+              <w:ind w:left="360"/>
+              <w:rPr>
+                <w:rFonts w:ascii="Times New Roman" w:hAnsi="Times New Roman" w:cs="Times New Roman"/>
+                <w:sz w:val="24"/>
+                <w:szCs w:val="24"/>
+                <w:lang w:val="es-ES"/>
+              </w:rPr>
+            </w:pPr>
+            <w:r>
+              <w:rPr>
+                <w:rFonts w:ascii="Times New Roman" w:hAnsi="Times New Roman" w:cs="Times New Roman"/>
+                <w:sz w:val="24"/>
+                <w:szCs w:val="24"/>
+                <w:lang w:val="es-ES"/>
+              </w:rPr>
+              <w:t>$65.00</w:t>
+            </w:r>
+          </w:p>
+        </w:tc>
+        <w:tc>
+          <w:tcPr>
+            <w:tcW w:w="4916" w:type="dxa"/>
+            <w:vAlign w:val="center"/>
+            <w:hideMark/>
+          </w:tcPr>
+          <w:p>
+            <w:pPr>
+              <w:pStyle w:val="Prrafodelista"/>
+              <w:spacing w:line="360" w:lineRule="auto"/>
+              <w:ind w:left="360"/>
+              <w:rPr>
+                <w:rFonts w:ascii="Times New Roman" w:hAnsi="Times New Roman" w:cs="Times New Roman"/>
+                <w:sz w:val="24"/>
+                <w:szCs w:val="24"/>
+                <w:lang w:val="es-ES"/>
+              </w:rPr>
+            </w:pPr>
+            <w:r>
+              <w:rPr>
+                <w:rFonts w:ascii="Times New Roman" w:hAnsi="Times New Roman" w:cs="Times New Roman"/>
+                <w:sz w:val="24"/>
+                <w:szCs w:val="24"/>
+                <w:lang w:val="es-ES"/>
+              </w:rPr>
+              <w:t>Alojamiento de la plataforma web institucional para pruebas e implementación.</w:t>
+            </w:r>
+          </w:p>
+        </w:tc>
+      </w:tr>
+      <w:tr>
+        <w:trPr>
+          <w:trHeight w:val="744"/>
+        </w:trPr>
+        <w:tc>
+          <w:tcPr>
+            <w:tcW w:w="2927" w:type="dxa"/>
+            <w:vAlign w:val="center"/>
+            <w:hideMark/>
+          </w:tcPr>
+          <w:p>
+            <w:pPr>
+              <w:pStyle w:val="Prrafodelista"/>
+              <w:spacing w:line="360" w:lineRule="auto"/>
+              <w:ind w:left="360"/>
+              <w:rPr>
+                <w:rFonts w:ascii="Times New Roman" w:hAnsi="Times New Roman" w:cs="Times New Roman"/>
+                <w:sz w:val="24"/>
+                <w:szCs w:val="24"/>
+                <w:lang w:val="es-ES"/>
+              </w:rPr>
+            </w:pPr>
+            <w:r>
+              <w:rPr>
+                <w:rFonts w:ascii="Times New Roman" w:hAnsi="Times New Roman" w:cs="Times New Roman"/>
+                <w:sz w:val="24"/>
+                <w:szCs w:val="24"/>
+                <w:lang w:val="es-ES"/>
+              </w:rPr>
+              <w:t>Dominio web (.</w:t>
+            </w:r>
+            <w:proofErr w:type="spellStart"/>
+            <w:r>
+              <w:rPr>
+                <w:rFonts w:ascii="Times New Roman" w:hAnsi="Times New Roman" w:cs="Times New Roman"/>
+                <w:sz w:val="24"/>
+                <w:szCs w:val="24"/>
+                <w:lang w:val="es-ES"/>
+              </w:rPr>
+              <w:t>com</w:t>
+            </w:r>
+            <w:proofErr w:type="spellEnd"/>
+            <w:r>
+              <w:rPr>
+                <w:rFonts w:ascii="Times New Roman" w:hAnsi="Times New Roman" w:cs="Times New Roman"/>
+                <w:sz w:val="24"/>
+                <w:szCs w:val="24"/>
+                <w:lang w:val="es-ES"/>
+              </w:rPr>
+              <w:t xml:space="preserve">) </w:t>
+            </w:r>
+          </w:p>
+        </w:tc>
+        <w:tc>
+          <w:tcPr>
+            <w:tcW w:w="1246" w:type="dxa"/>
+            <w:vAlign w:val="center"/>
+            <w:hideMark/>
+          </w:tcPr>
+          <w:p>
+            <w:pPr>
+              <w:pStyle w:val="Prrafodelista"/>
+              <w:spacing w:line="360" w:lineRule="auto"/>
+              <w:ind w:left="360"/>
+              <w:rPr>
+                <w:rFonts w:ascii="Times New Roman" w:hAnsi="Times New Roman" w:cs="Times New Roman"/>
+                <w:sz w:val="24"/>
+                <w:szCs w:val="24"/>
+                <w:lang w:val="es-ES"/>
+              </w:rPr>
+            </w:pPr>
+            <w:r>
+              <w:rPr>
+                <w:rFonts w:ascii="Times New Roman" w:hAnsi="Times New Roman" w:cs="Times New Roman"/>
+                <w:sz w:val="24"/>
+                <w:szCs w:val="24"/>
+                <w:lang w:val="es-ES"/>
+              </w:rPr>
+              <w:t>$15.00</w:t>
+            </w:r>
+          </w:p>
+        </w:tc>
+        <w:tc>
+          <w:tcPr>
+            <w:tcW w:w="4916" w:type="dxa"/>
+            <w:vAlign w:val="center"/>
+            <w:hideMark/>
+          </w:tcPr>
+          <w:p>
+            <w:pPr>
+              <w:pStyle w:val="Prrafodelista"/>
+              <w:spacing w:line="360" w:lineRule="auto"/>
+              <w:ind w:left="360"/>
+              <w:rPr>
+                <w:rFonts w:ascii="Times New Roman" w:hAnsi="Times New Roman" w:cs="Times New Roman"/>
+                <w:sz w:val="24"/>
+                <w:szCs w:val="24"/>
+                <w:lang w:val="es-ES"/>
+              </w:rPr>
+            </w:pPr>
+            <w:r>
+              <w:rPr>
+                <w:rFonts w:ascii="Times New Roman" w:hAnsi="Times New Roman" w:cs="Times New Roman"/>
+                <w:sz w:val="24"/>
+                <w:szCs w:val="24"/>
+                <w:lang w:val="es-ES"/>
+              </w:rPr>
+              <w:t>Dirección de acceso a la plataforma para estudiantes y docentes.</w:t>
+            </w:r>
+          </w:p>
+        </w:tc>
+      </w:tr>
+      <w:tr>
+        <w:trPr>
+          <w:trHeight w:val="1064"/>
+        </w:trPr>
+        <w:tc>
+          <w:tcPr>
+            <w:tcW w:w="2927" w:type="dxa"/>
+            <w:vAlign w:val="center"/>
+            <w:hideMark/>
+          </w:tcPr>
+          <w:p>
+            <w:pPr>
+              <w:pStyle w:val="Prrafodelista"/>
+              <w:spacing w:line="360" w:lineRule="auto"/>
+              <w:ind w:left="360"/>
+              <w:rPr>
+                <w:rFonts w:ascii="Times New Roman" w:hAnsi="Times New Roman" w:cs="Times New Roman"/>
+                <w:sz w:val="24"/>
+                <w:szCs w:val="24"/>
+                <w:lang w:val="es-ES"/>
+              </w:rPr>
+            </w:pPr>
+            <w:r>
+              <w:rPr>
+                <w:rFonts w:ascii="Times New Roman" w:hAnsi="Times New Roman" w:cs="Times New Roman"/>
+                <w:sz w:val="24"/>
+                <w:szCs w:val="24"/>
+                <w:lang w:val="es-ES"/>
+              </w:rPr>
+              <w:t>Certificado SSL (</w:t>
+            </w:r>
+            <w:proofErr w:type="spellStart"/>
+            <w:r>
+              <w:rPr>
+                <w:rFonts w:ascii="Times New Roman" w:hAnsi="Times New Roman" w:cs="Times New Roman"/>
+                <w:sz w:val="24"/>
+                <w:szCs w:val="24"/>
+                <w:lang w:val="es-ES"/>
+              </w:rPr>
+              <w:t>Let's</w:t>
+            </w:r>
+            <w:proofErr w:type="spellEnd"/>
+            <w:r>
+              <w:rPr>
+                <w:rFonts w:ascii="Times New Roman" w:hAnsi="Times New Roman" w:cs="Times New Roman"/>
+                <w:sz w:val="24"/>
+                <w:szCs w:val="24"/>
+                <w:lang w:val="es-ES"/>
+              </w:rPr>
+              <w:t xml:space="preserve"> </w:t>
+            </w:r>
+            <w:proofErr w:type="spellStart"/>
+            <w:r>
+              <w:rPr>
+                <w:rFonts w:ascii="Times New Roman" w:hAnsi="Times New Roman" w:cs="Times New Roman"/>
+                <w:sz w:val="24"/>
+                <w:szCs w:val="24"/>
+                <w:lang w:val="es-ES"/>
+              </w:rPr>
+              <w:t>Encrypt</w:t>
+            </w:r>
+            <w:proofErr w:type="spellEnd"/>
+            <w:r>
+              <w:rPr>
+                <w:rFonts w:ascii="Times New Roman" w:hAnsi="Times New Roman" w:cs="Times New Roman"/>
+                <w:sz w:val="24"/>
+                <w:szCs w:val="24"/>
+                <w:lang w:val="es-ES"/>
+              </w:rPr>
+              <w:t>)</w:t>
+            </w:r>
+          </w:p>
+        </w:tc>
+        <w:tc>
+          <w:tcPr>
+            <w:tcW w:w="1246" w:type="dxa"/>
+            <w:vAlign w:val="center"/>
+            <w:hideMark/>
+          </w:tcPr>
+          <w:p>
+            <w:pPr>
+              <w:pStyle w:val="Prrafodelista"/>
+              <w:spacing w:line="360" w:lineRule="auto"/>
+              <w:ind w:left="360"/>
+              <w:rPr>
+                <w:rFonts w:ascii="Times New Roman" w:hAnsi="Times New Roman" w:cs="Times New Roman"/>
+                <w:sz w:val="24"/>
+                <w:szCs w:val="24"/>
+                <w:lang w:val="es-ES"/>
+              </w:rPr>
+            </w:pPr>
+            <w:r>
+              <w:rPr>
+                <w:rFonts w:ascii="Times New Roman" w:hAnsi="Times New Roman" w:cs="Times New Roman"/>
+                <w:sz w:val="24"/>
+                <w:szCs w:val="24"/>
+                <w:lang w:val="es-ES"/>
+              </w:rPr>
+              <w:t>$0.00</w:t>
+            </w:r>
+          </w:p>
+        </w:tc>
+        <w:tc>
+          <w:tcPr>
+            <w:tcW w:w="4916" w:type="dxa"/>
+            <w:vAlign w:val="center"/>
+            <w:hideMark/>
+          </w:tcPr>
+          <w:p>
+            <w:pPr>
+              <w:pStyle w:val="Prrafodelista"/>
+              <w:spacing w:line="360" w:lineRule="auto"/>
+              <w:ind w:left="360"/>
+              <w:rPr>
+                <w:rFonts w:ascii="Times New Roman" w:hAnsi="Times New Roman" w:cs="Times New Roman"/>
+                <w:sz w:val="24"/>
+                <w:szCs w:val="24"/>
+                <w:lang w:val="es-ES"/>
+              </w:rPr>
+            </w:pPr>
+            <w:r>
+              <w:rPr>
+                <w:rFonts w:ascii="Times New Roman" w:hAnsi="Times New Roman" w:cs="Times New Roman"/>
+                <w:sz w:val="24"/>
+                <w:szCs w:val="24"/>
+                <w:lang w:val="es-ES"/>
+              </w:rPr>
+              <w:t>Implementación de conexión segura HTTPS para la protección de la información.</w:t>
+            </w:r>
+          </w:p>
+        </w:tc>
+      </w:tr>
+      <w:tr>
+        <w:trPr>
+          <w:trHeight w:val="911"/>
+        </w:trPr>
+        <w:tc>
+          <w:tcPr>
+            <w:tcW w:w="2927" w:type="dxa"/>
+            <w:vAlign w:val="center"/>
+            <w:hideMark/>
+          </w:tcPr>
+          <w:p>
+            <w:pPr>
+              <w:pStyle w:val="Prrafodelista"/>
+              <w:spacing w:line="360" w:lineRule="auto"/>
+              <w:ind w:left="360"/>
+              <w:rPr>
+                <w:rFonts w:ascii="Times New Roman" w:hAnsi="Times New Roman" w:cs="Times New Roman"/>
+                <w:sz w:val="24"/>
+                <w:szCs w:val="24"/>
+                <w:lang w:val="es-ES"/>
+              </w:rPr>
+            </w:pPr>
+            <w:r>
+              <w:rPr>
+                <w:rFonts w:ascii="Times New Roman" w:hAnsi="Times New Roman" w:cs="Times New Roman"/>
+                <w:sz w:val="24"/>
+                <w:szCs w:val="24"/>
+                <w:lang w:val="es-ES"/>
+              </w:rPr>
+              <w:t>Reserva para contingencias</w:t>
+            </w:r>
+          </w:p>
+        </w:tc>
+        <w:tc>
+          <w:tcPr>
+            <w:tcW w:w="1246" w:type="dxa"/>
+            <w:vAlign w:val="center"/>
+            <w:hideMark/>
+          </w:tcPr>
+          <w:p>
+            <w:pPr>
+              <w:pStyle w:val="Prrafodelista"/>
+              <w:spacing w:line="360" w:lineRule="auto"/>
+              <w:ind w:left="360"/>
+              <w:rPr>
+                <w:rFonts w:ascii="Times New Roman" w:hAnsi="Times New Roman" w:cs="Times New Roman"/>
+                <w:sz w:val="24"/>
+                <w:szCs w:val="24"/>
+                <w:lang w:val="es-ES"/>
+              </w:rPr>
+            </w:pPr>
+            <w:r>
+              <w:rPr>
+                <w:rFonts w:ascii="Times New Roman" w:hAnsi="Times New Roman" w:cs="Times New Roman"/>
+                <w:sz w:val="24"/>
+                <w:szCs w:val="24"/>
+                <w:lang w:val="es-ES"/>
+              </w:rPr>
+              <w:t>$20.00</w:t>
+            </w:r>
+          </w:p>
+        </w:tc>
+        <w:tc>
+          <w:tcPr>
+            <w:tcW w:w="4916" w:type="dxa"/>
+            <w:vAlign w:val="center"/>
+            <w:hideMark/>
+          </w:tcPr>
+          <w:p>
+            <w:pPr>
+              <w:pStyle w:val="Prrafodelista"/>
+              <w:spacing w:line="360" w:lineRule="auto"/>
+              <w:ind w:left="360"/>
+              <w:rPr>
+                <w:rFonts w:ascii="Times New Roman" w:hAnsi="Times New Roman" w:cs="Times New Roman"/>
+                <w:sz w:val="24"/>
+                <w:szCs w:val="24"/>
+                <w:lang w:val="es-ES"/>
+              </w:rPr>
+            </w:pPr>
+            <w:r>
+              <w:rPr>
+                <w:rFonts w:ascii="Times New Roman" w:hAnsi="Times New Roman" w:cs="Times New Roman"/>
+                <w:sz w:val="24"/>
+                <w:szCs w:val="24"/>
+                <w:lang w:val="es-ES"/>
+              </w:rPr>
+              <w:t>Cobertura de gastos no previstos durante el desarrollo del proyecto.</w:t>
+            </w:r>
+          </w:p>
+        </w:tc>
+      </w:tr>
+      <w:tr>
+        <w:trPr>
+          <w:trHeight w:val="556"/>
+        </w:trPr>
+        <w:tc>
+          <w:tcPr>
+            <w:tcW w:w="2927" w:type="dxa"/>
+            <w:vAlign w:val="center"/>
+            <w:hideMark/>
+          </w:tcPr>
+          <w:p>
+            <w:pPr>
+              <w:pStyle w:val="Prrafodelista"/>
+              <w:spacing w:line="360" w:lineRule="auto"/>
+              <w:ind w:left="360"/>
+              <w:rPr>
+                <w:rFonts w:ascii="Times New Roman" w:hAnsi="Times New Roman" w:cs="Times New Roman"/>
+                <w:b/>
+                <w:bCs/>
+                <w:sz w:val="24"/>
+                <w:szCs w:val="24"/>
+                <w:lang w:val="es-ES"/>
+              </w:rPr>
+            </w:pPr>
+            <w:r>
+              <w:rPr>
+                <w:rFonts w:ascii="Times New Roman" w:hAnsi="Times New Roman" w:cs="Times New Roman"/>
+                <w:b/>
+                <w:bCs/>
+                <w:sz w:val="24"/>
+                <w:szCs w:val="24"/>
+                <w:lang w:val="es-ES"/>
+              </w:rPr>
+              <w:t>TOTAL</w:t>
+            </w:r>
+          </w:p>
+        </w:tc>
+        <w:tc>
+          <w:tcPr>
+            <w:tcW w:w="1246" w:type="dxa"/>
+            <w:vAlign w:val="center"/>
+            <w:hideMark/>
+          </w:tcPr>
+          <w:p>
+            <w:pPr>
+              <w:pStyle w:val="Prrafodelista"/>
+              <w:spacing w:line="360" w:lineRule="auto"/>
+              <w:ind w:left="360"/>
+              <w:rPr>
+                <w:rFonts w:ascii="Times New Roman" w:hAnsi="Times New Roman" w:cs="Times New Roman"/>
+                <w:b/>
+                <w:bCs/>
+                <w:sz w:val="24"/>
+                <w:szCs w:val="24"/>
+                <w:lang w:val="es-ES"/>
+              </w:rPr>
+            </w:pPr>
+            <w:r>
+              <w:rPr>
+                <w:rFonts w:ascii="Times New Roman" w:hAnsi="Times New Roman" w:cs="Times New Roman"/>
+                <w:b/>
+                <w:bCs/>
+                <w:sz w:val="24"/>
+                <w:szCs w:val="24"/>
+                <w:lang w:val="es-ES"/>
+              </w:rPr>
+              <w:t>$115.00</w:t>
+            </w:r>
+          </w:p>
+        </w:tc>
+        <w:tc>
+          <w:tcPr>
+            <w:tcW w:w="4916" w:type="dxa"/>
+            <w:vAlign w:val="center"/>
+            <w:hideMark/>
+          </w:tcPr>
+          <w:p>
+            <w:pPr>
+              <w:pStyle w:val="Prrafodelista"/>
+              <w:keepNext/>
+              <w:spacing w:line="360" w:lineRule="auto"/>
+              <w:ind w:left="360"/>
+              <w:rPr>
+                <w:rFonts w:ascii="Times New Roman" w:hAnsi="Times New Roman" w:cs="Times New Roman"/>
+                <w:b/>
+                <w:bCs/>
+                <w:sz w:val="24"/>
+                <w:szCs w:val="24"/>
+                <w:lang w:val="es-ES"/>
+              </w:rPr>
+            </w:pPr>
+            <w:r>
+              <w:rPr>
+                <w:rFonts w:ascii="Times New Roman" w:hAnsi="Times New Roman" w:cs="Times New Roman"/>
+                <w:b/>
+                <w:bCs/>
+                <w:sz w:val="24"/>
+                <w:szCs w:val="24"/>
+                <w:lang w:val="es-ES"/>
+              </w:rPr>
+              <w:t>Presupuesto total estimado del proyecto.</w:t>
+            </w:r>
+          </w:p>
+        </w:tc>
+      </w:tr>
+    </w:tbl>
+    <w:p>
+      <w:pPr>
+        <w:pStyle w:val="Descripcin"/>
         <w:jc w:val="center"/>
         <w:rPr>
-          <w:rFonts w:ascii="Times New Roman" w:hAnsi="Times New Roman" w:cs="Times New Roman"/>
-          <w:sz w:val="24"/>
-          <w:szCs w:val="24"/>
-          <w:lang w:val="es-ES"/>
-        </w:rPr>
-      </w:pPr>
-      <w:r>
-        <w:rPr>
-          <w:rFonts w:ascii="Times New Roman" w:hAnsi="Times New Roman" w:cs="Times New Roman"/>
-          <w:b/>
-          <w:bCs/>
-          <w:i/>
-          <w:iCs/>
-          <w:sz w:val="24"/>
-          <w:szCs w:val="24"/>
-          <w:lang w:val="es-ES"/>
-        </w:rPr>
-        <w:t>Nota.</w:t>
-      </w:r>
-      <w:r>
-        <w:rPr>
-          <w:rFonts w:ascii="Times New Roman" w:hAnsi="Times New Roman" w:cs="Times New Roman"/>
-          <w:sz w:val="24"/>
-          <w:szCs w:val="24"/>
-          <w:lang w:val="es-ES"/>
-        </w:rPr>
-        <w:t xml:space="preserve"> Elaborado por La Autora.</w:t>
-      </w:r>
-    </w:p>
-    <w:p>
-      <w:pPr>
-        <w:rPr>
-          <w:sz w:val="24"/>
-          <w:szCs w:val="24"/>
-          <w:lang w:val="es-ES"/>
-        </w:rPr>
-      </w:pPr>
+          <w:color w:val="000000" w:themeColor="text1"/>
+          <w:sz w:val="24"/>
+          <w:szCs w:val="24"/>
+          <w:lang w:val="es-ES"/>
+        </w:rPr>
+      </w:pPr>
+      <w:r>
+        <w:rPr>
+          <w:color w:val="000000" w:themeColor="text1"/>
+        </w:rPr>
+        <w:t xml:space="preserve">Tabla </w:t>
+      </w:r>
+      <w:r>
+        <w:rPr>
+          <w:color w:val="000000" w:themeColor="text1"/>
+        </w:rPr>
+        <w:fldChar w:fldCharType="begin"/>
+      </w:r>
+      <w:r>
+        <w:rPr>
+          <w:color w:val="000000" w:themeColor="text1"/>
+        </w:rPr>
+        <w:instrText xml:space="preserve"> SEQ Tabla \* ARABIC </w:instrText>
+      </w:r>
+      <w:r>
+        <w:rPr>
+          <w:color w:val="000000" w:themeColor="text1"/>
+        </w:rPr>
+        <w:fldChar w:fldCharType="separate"/>
+      </w:r>
+      <w:r>
+        <w:rPr>
+          <w:noProof/>
+          <w:color w:val="000000" w:themeColor="text1"/>
+        </w:rPr>
+        <w:t>1</w:t>
+      </w:r>
+      <w:r>
+        <w:rPr>
+          <w:color w:val="000000" w:themeColor="text1"/>
+        </w:rPr>
+        <w:fldChar w:fldCharType="end"/>
+      </w:r>
+      <w:r>
+        <w:rPr>
+          <w:color w:val="000000" w:themeColor="text1"/>
+        </w:rPr>
+        <w:t xml:space="preserve">:  </w:t>
+      </w:r>
+      <w:r>
+        <w:rPr>
+          <w:color w:val="000000" w:themeColor="text1"/>
+        </w:rPr>
+        <w:t>Presupuesto</w:t>
+      </w:r>
     </w:p>
     <w:p>
       <w:pPr>
@@ -4385,37 +4368,6 @@
           <w:lang w:val="es-ES"/>
         </w:rPr>
         <w:t>CRONOGRAMA DE ACTIVIDADES</w:t>
-      </w:r>
-    </w:p>
-    <w:p>
-      <w:pPr>
-        <w:spacing w:after="0" w:line="360" w:lineRule="auto"/>
-        <w:rPr>
-          <w:rFonts w:ascii="Times New Roman" w:hAnsi="Times New Roman" w:cs="Times New Roman"/>
-          <w:sz w:val="24"/>
-          <w:szCs w:val="24"/>
-          <w:lang w:val="es-ES"/>
-        </w:rPr>
-      </w:pPr>
-      <w:r>
-        <w:rPr>
-          <w:rFonts w:ascii="Times New Roman" w:hAnsi="Times New Roman" w:cs="Times New Roman"/>
-          <w:b/>
-          <w:bCs/>
-          <w:sz w:val="24"/>
-          <w:szCs w:val="24"/>
-          <w:lang w:val="es-ES"/>
-        </w:rPr>
-        <w:t xml:space="preserve">Tabla 2 – </w:t>
-      </w:r>
-      <w:r>
-        <w:rPr>
-          <w:rFonts w:ascii="Times New Roman" w:hAnsi="Times New Roman" w:cs="Times New Roman"/>
-          <w:sz w:val="24"/>
-          <w:szCs w:val="24"/>
-          <w:lang w:val="es-ES"/>
-        </w:rPr>
-        <w:t>Cronograma de actividades</w:t>
       </w:r>
     </w:p>
     <w:tbl>
@@ -6214,6 +6166,7 @@
           </w:tcPr>
           <w:p>
             <w:pPr>
+              <w:keepNext/>
               <w:spacing w:line="360" w:lineRule="auto"/>
               <w:cnfStyle w:val="000000000000" w:firstRow="0" w:lastRow="0" w:firstColumn="0" w:lastColumn="0" w:oddVBand="0" w:evenVBand="0" w:oddHBand="0" w:evenHBand="0" w:firstRowFirstColumn="0" w:firstRowLastColumn="0" w:lastRowFirstColumn="0" w:lastRowLastColumn="0"/>
               <w:rPr>
@@ -6236,36 +6189,60 @@
     </w:tbl>
     <w:p>
       <w:pPr>
-        <w:spacing w:after="0" w:line="360" w:lineRule="auto"/>
+        <w:pStyle w:val="Descripcin"/>
         <w:jc w:val="center"/>
         <w:rPr>
           <w:rFonts w:ascii="Times New Roman" w:hAnsi="Times New Roman" w:cs="Times New Roman"/>
           <w:b/>
           <w:bCs/>
-          <w:sz w:val="24"/>
-          <w:szCs w:val="24"/>
-          <w:lang w:val="es-ES"/>
-        </w:rPr>
-      </w:pPr>
-      <w:r>
-        <w:rPr>
-          <w:rFonts w:ascii="Times New Roman" w:hAnsi="Times New Roman" w:cs="Times New Roman"/>
-          <w:b/>
-          <w:bCs/>
-          <w:sz w:val="24"/>
-          <w:szCs w:val="24"/>
-          <w:lang w:val="es-ES"/>
-        </w:rPr>
-        <w:t xml:space="preserve">Nota. </w:t>
-      </w:r>
-      <w:r>
-        <w:rPr>
-          <w:rFonts w:ascii="Times New Roman" w:hAnsi="Times New Roman" w:cs="Times New Roman"/>
-          <w:sz w:val="24"/>
-          <w:szCs w:val="24"/>
-          <w:lang w:val="es-ES"/>
-        </w:rPr>
-        <w:t>Elaborado por La Autora.</w:t>
+          <w:color w:val="000000" w:themeColor="text1"/>
+          <w:sz w:val="24"/>
+          <w:szCs w:val="24"/>
+          <w:lang w:val="es-ES"/>
+        </w:rPr>
+      </w:pPr>
+      <w:r>
+        <w:rPr>
+          <w:color w:val="000000" w:themeColor="text1"/>
+        </w:rPr>
+        <w:t xml:space="preserve">Tabla </w:t>
+      </w:r>
+      <w:r>
+        <w:rPr>
+          <w:color w:val="000000" w:themeColor="text1"/>
+        </w:rPr>
+        <w:fldChar w:fldCharType="begin"/>
+      </w:r>
+      <w:r>
+        <w:rPr>
+          <w:color w:val="000000" w:themeColor="text1"/>
+        </w:rPr>
+        <w:instrText xml:space="preserve"> SEQ Tabla \* ARABIC </w:instrText>
+      </w:r>
+      <w:r>
+        <w:rPr>
+          <w:color w:val="000000" w:themeColor="text1"/>
+        </w:rPr>
+        <w:fldChar w:fldCharType="separate"/>
+      </w:r>
+      <w:r>
+        <w:rPr>
+          <w:noProof/>
+          <w:color w:val="000000" w:themeColor="text1"/>
+        </w:rPr>
+        <w:t>2</w:t>
+      </w:r>
+      <w:r>
+        <w:rPr>
+          <w:color w:val="000000" w:themeColor="text1"/>
+        </w:rPr>
+        <w:fldChar w:fldCharType="end"/>
+      </w:r>
+      <w:r>
+        <w:rPr>
+          <w:color w:val="000000" w:themeColor="text1"/>
+        </w:rPr>
+        <w:t>: Cronograma de actividades</w:t>
       </w:r>
     </w:p>
     <w:p>
@@ -6508,15 +6485,7 @@
             </w:rPr>
           </w:pPr>
           <w:r>
-            <w:t xml:space="preserve">Almeida, J. R., Gini, R., Roberto, G., </w:t>
-          </w:r>
-          <w:proofErr w:type="spellStart"/>
-          <w:r>
-            <w:t>Rijnbeek</w:t>
-          </w:r>
-          <w:proofErr w:type="spellEnd"/>
-          <w:r>
-            <w:t xml:space="preserve">, P., &amp; Oliveira, J. L. (2019). </w:t>
+            <w:t xml:space="preserve">Almeida, J. R., Gini, R., Roberto, G., Rijnbeek, P., &amp; Oliveira, J. L. (2019). </w:t>
           </w:r>
           <w:r>
             <w:rPr>
@@ -6666,21 +6635,7 @@
             <w:rPr>
               <w:lang w:val="en-US"/>
             </w:rPr>
-            <w:t xml:space="preserve">Santana-Mancilla, P. C., Fajardo-Flores, S. B., Rodríguez-Ortiz, M. Á., Argenis Mondragón, E. Á., &amp; </w:t>
-          </w:r>
-          <w:proofErr w:type="spellStart"/>
-          <w:r>
-            <w:rPr>
-              <w:lang w:val="en-US"/>
-            </w:rPr>
-            <w:t>Gaytán</w:t>
-          </w:r>
-          <w:proofErr w:type="spellEnd"/>
-          <w:r>
-            <w:rPr>
-              <w:lang w:val="en-US"/>
-            </w:rPr>
-            <w:t xml:space="preserve">-Lugo, L. S. (2025). Beyond Navigation: Understanding Semantic Gaps in the Information Architecture of a University Portal. </w:t>
+            <w:t xml:space="preserve">Santana-Mancilla, P. C., Fajardo-Flores, S. B., Rodríguez-Ortiz, M. Á., Argenis Mondragón, E. Á., &amp; Gaytán-Lugo, L. S. (2025). Beyond Navigation: Understanding Semantic Gaps in the Information Architecture of a University Portal. </w:t>
           </w:r>
           <w:r>
             <w:rPr>
@@ -6707,19 +6662,11 @@
           <w:pPr>
             <w:pStyle w:val="Bibliografa"/>
           </w:pPr>
-          <w:proofErr w:type="spellStart"/>
           <w:r>
             <w:rPr>
               <w:lang w:val="en-US"/>
             </w:rPr>
-            <w:t>Vuorimaa</w:t>
-          </w:r>
-          <w:proofErr w:type="spellEnd"/>
-          <w:r>
-            <w:rPr>
-              <w:lang w:val="en-US"/>
-            </w:rPr>
-            <w:t xml:space="preserve">, P., Laine, M., Litvinova, E., &amp; Shestakov, D. (2016). Leveraging declarative languages in web application development. </w:t>
+            <w:t xml:space="preserve">Vuorimaa, P., Laine, M., Litvinova, E., &amp; Shestakov, D. (2016). Leveraging declarative languages in web application development. </w:t>
           </w:r>
           <w:r>
             <w:rPr>
@@ -10039,6 +9986,25 @@
       <w:bCs/>
     </w:rPr>
   </w:style>
+  <w:style w:type="paragraph" w:styleId="Descripcin">
+    <w:name w:val="caption"/>
+    <w:basedOn w:val="Normal"/>
+    <w:next w:val="Normal"/>
+    <w:uiPriority w:val="35"/>
+    <w:unhideWhenUsed/>
+    <w:qFormat/>
+    <w:rsid w:val="00B54504"/>
+    <w:pPr>
+      <w:spacing w:after="200" w:line="240" w:lineRule="auto"/>
+    </w:pPr>
+    <w:rPr>
+      <w:i/>
+      <w:iCs/>
+      <w:color w:val="0E2841" w:themeColor="text2"/>
+      <w:sz w:val="18"/>
+      <w:szCs w:val="18"/>
+    </w:rPr>
+  </w:style>
 </w:styles>
 </file>
 

</xml_diff>